<commit_message>
Renombrar la empresa a Crestline Group y reescribir el contexto
La empresa pasa a ser una firma extranjera que abre sedes nuevas en Bolivia
con 300 equipos desde el inicio. Se agrega la sección Contexto de la empresa,
se reemplaza el diagnóstico por el planteamiento del problema y se renombran
R-CEA, cea.local y el archivo .pkt.

Co-Authored-By: Claude Sonnet 5.5 <noreply@anthropic.com>
</commit_message>
<xml_diff>
--- a/ProyectoFinal-Redes-ACT6-APA7.docx
+++ b/ProyectoFinal-Redes-ACT6-APA7.docx
@@ -182,7 +182,7 @@
           </w:pPr>
           <w:hyperlink w:anchor="_Toc202" w:history="1">
             <w:r>
-              <w:t xml:space="preserve">Diagnóstico del problema</w:t>
+              <w:t xml:space="preserve">Contexto de la empresa</w:t>
             </w:r>
             <w:r>
               <w:tab/>
@@ -202,7 +202,7 @@
           </w:pPr>
           <w:hyperlink w:anchor="_Toc203" w:history="1">
             <w:r>
-              <w:t xml:space="preserve">Objetivos</w:t>
+              <w:t xml:space="preserve">Planteamiento del problema</w:t>
             </w:r>
             <w:r>
               <w:tab/>
@@ -220,15 +220,15 @@
             </w:tabs>
             <w:spacing w:line="360" w:lineRule="auto"/>
           </w:pPr>
-          <w:hyperlink w:anchor="_Toc206" w:history="1">
-            <w:r>
-              <w:t xml:space="preserve">Justificación</w:t>
+          <w:hyperlink w:anchor="_Toc204" w:history="1">
+            <w:r>
+              <w:t xml:space="preserve">Objetivos</w:t>
             </w:r>
             <w:r>
               <w:tab/>
             </w:r>
             <w:r>
-              <w:t>7</w:t>
+              <w:t>6</w:t>
             </w:r>
           </w:hyperlink>
         </w:p>
@@ -242,7 +242,7 @@
           </w:pPr>
           <w:hyperlink w:anchor="_Toc207" w:history="1">
             <w:r>
-              <w:t xml:space="preserve">Alcance y limitaciones</w:t>
+              <w:t xml:space="preserve">Justificación</w:t>
             </w:r>
             <w:r>
               <w:tab/>
@@ -262,6 +262,26 @@
           </w:pPr>
           <w:hyperlink w:anchor="_Toc208" w:history="1">
             <w:r>
+              <w:t xml:space="preserve">Alcance y limitaciones</w:t>
+            </w:r>
+            <w:r>
+              <w:tab/>
+            </w:r>
+            <w:r>
+              <w:t>8</w:t>
+            </w:r>
+          </w:hyperlink>
+        </w:p>
+        <w:p>
+          <w:pPr>
+            <w:pStyle w:val="TOC2"/>
+            <w:tabs>
+              <w:tab w:val="right" w:leader="dot" w:pos="9350"/>
+            </w:tabs>
+            <w:spacing w:line="360" w:lineRule="auto"/>
+          </w:pPr>
+          <w:hyperlink w:anchor="_Toc209" w:history="1">
+            <w:r>
               <w:t xml:space="preserve">Marco conceptual</w:t>
             </w:r>
             <w:r>
@@ -328,7 +348,7 @@
               <w:tab/>
             </w:r>
             <w:r>
-              <w:t>9</w:t>
+              <w:t>10</w:t>
             </w:r>
           </w:hyperlink>
         </w:p>
@@ -388,7 +408,7 @@
               <w:tab/>
             </w:r>
             <w:r>
-              <w:t>11</w:t>
+              <w:t>12</w:t>
             </w:r>
           </w:hyperlink>
         </w:p>
@@ -408,7 +428,7 @@
               <w:tab/>
             </w:r>
             <w:r>
-              <w:t>12</w:t>
+              <w:t>13</w:t>
             </w:r>
           </w:hyperlink>
         </w:p>
@@ -428,7 +448,7 @@
               <w:tab/>
             </w:r>
             <w:r>
-              <w:t>13</w:t>
+              <w:t>14</w:t>
             </w:r>
           </w:hyperlink>
         </w:p>
@@ -448,7 +468,7 @@
               <w:tab/>
             </w:r>
             <w:r>
-              <w:t>14</w:t>
+              <w:t>15</w:t>
             </w:r>
           </w:hyperlink>
         </w:p>
@@ -468,7 +488,7 @@
               <w:tab/>
             </w:r>
             <w:r>
-              <w:t>14</w:t>
+              <w:t>15</w:t>
             </w:r>
           </w:hyperlink>
         </w:p>
@@ -482,7 +502,7 @@
           </w:pPr>
           <w:hyperlink w:anchor="_Toc14" w:history="1">
             <w:r>
-              <w:t xml:space="preserve">Paso 6. Gateways de la sede central en R-CEA (router-on-a-stick)</w:t>
+              <w:t xml:space="preserve">Paso 6. Gateways de la sede central en R-CRG (router-on-a-stick)</w:t>
             </w:r>
             <w:r>
               <w:tab/>
@@ -508,7 +528,7 @@
               <w:tab/>
             </w:r>
             <w:r>
-              <w:t>19</w:t>
+              <w:t>20</w:t>
             </w:r>
           </w:hyperlink>
         </w:p>
@@ -528,7 +548,7 @@
               <w:tab/>
             </w:r>
             <w:r>
-              <w:t>22</w:t>
+              <w:t>23</w:t>
             </w:r>
           </w:hyperlink>
         </w:p>
@@ -542,7 +562,7 @@
           </w:pPr>
           <w:hyperlink w:anchor="_Toc17" w:history="1">
             <w:r>
-              <w:t xml:space="preserve">Paso 9. DHCP centralizado en R-CEA</w:t>
+              <w:t xml:space="preserve">Paso 9. DHCP centralizado en R-CRG</w:t>
             </w:r>
             <w:r>
               <w:tab/>
@@ -588,7 +608,7 @@
               <w:tab/>
             </w:r>
             <w:r>
-              <w:t>25</w:t>
+              <w:t>26</w:t>
             </w:r>
           </w:hyperlink>
         </w:p>
@@ -608,7 +628,7 @@
               <w:tab/>
             </w:r>
             <w:r>
-              <w:t>26</w:t>
+              <w:t>27</w:t>
             </w:r>
           </w:hyperlink>
         </w:p>
@@ -628,7 +648,7 @@
               <w:tab/>
             </w:r>
             <w:r>
-              <w:t>27</w:t>
+              <w:t>28</w:t>
             </w:r>
           </w:hyperlink>
         </w:p>
@@ -648,7 +668,7 @@
               <w:tab/>
             </w:r>
             <w:r>
-              <w:t>28</w:t>
+              <w:t>29</w:t>
             </w:r>
           </w:hyperlink>
         </w:p>
@@ -668,7 +688,7 @@
               <w:tab/>
             </w:r>
             <w:r>
-              <w:t>28</w:t>
+              <w:t>29</w:t>
             </w:r>
           </w:hyperlink>
         </w:p>
@@ -688,7 +708,7 @@
               <w:tab/>
             </w:r>
             <w:r>
-              <w:t>34</w:t>
+              <w:t>35</w:t>
             </w:r>
           </w:hyperlink>
         </w:p>
@@ -700,7 +720,7 @@
             </w:tabs>
             <w:spacing w:line="360" w:lineRule="auto"/>
           </w:pPr>
-          <w:hyperlink w:anchor="_Toc209" w:history="1">
+          <w:hyperlink w:anchor="_Toc210" w:history="1">
             <w:r>
               <w:t xml:space="preserve">Dimensionamiento de equipos para una implementación real</w:t>
             </w:r>
@@ -708,7 +728,7 @@
               <w:tab/>
             </w:r>
             <w:r>
-              <w:t>34</w:t>
+              <w:t>35</w:t>
             </w:r>
           </w:hyperlink>
         </w:p>
@@ -728,7 +748,7 @@
               <w:tab/>
             </w:r>
             <w:r>
-              <w:t>35</w:t>
+              <w:t>36</w:t>
             </w:r>
           </w:hyperlink>
         </w:p>
@@ -740,7 +760,7 @@
             </w:tabs>
             <w:spacing w:line="360" w:lineRule="auto"/>
           </w:pPr>
-          <w:hyperlink w:anchor="_Toc210" w:history="1">
+          <w:hyperlink w:anchor="_Toc211" w:history="1">
             <w:r>
               <w:t xml:space="preserve">Recomendaciones</w:t>
             </w:r>
@@ -748,7 +768,7 @@
               <w:tab/>
             </w:r>
             <w:r>
-              <w:t>36</w:t>
+              <w:t>37</w:t>
             </w:r>
           </w:hyperlink>
         </w:p>
@@ -768,7 +788,7 @@
               <w:tab/>
             </w:r>
             <w:r>
-              <w:t>38</w:t>
+              <w:t>39</w:t>
             </w:r>
           </w:hyperlink>
         </w:p>
@@ -780,7 +800,7 @@
             </w:tabs>
             <w:spacing w:line="360" w:lineRule="auto"/>
           </w:pPr>
-          <w:hyperlink w:anchor="_Toc211" w:history="1">
+          <w:hyperlink w:anchor="_Toc212" w:history="1">
             <w:r>
               <w:t xml:space="preserve">Anexo A</w:t>
             </w:r>
@@ -788,7 +808,7 @@
               <w:tab/>
             </w:r>
             <w:r>
-              <w:t>40</w:t>
+              <w:t>41</w:t>
             </w:r>
           </w:hyperlink>
           <w:r>
@@ -815,7 +835,7 @@
     <w:p>
       <w:pPr/>
       <w:r>
-        <w:t xml:space="preserve">El presente trabajo documenta el diseño, la implementación y la validación en Cisco Packet Tracer de la red del Centro Empresarial Andino (CEA), una empresa ficticia con una sede central y tres oficinas regionales que operaba con una red plana de 300 computadoras, direcciones IP configuradas manualmente y enlaces regionales inestables. A partir del diagnóstico del problema se definieron objetivos de segmentación, direccionamiento, interconexión y seguridad. La solución separa ocho grupos de usuarios mediante VLAN, asigna ocho subredes calculadas con VLSM a partir del bloque 10.20.0.0/23, une las sedes con tres enlaces WAN seriales /30 y utiliza enrutamiento OSPF de área única. Además, incorpora DHCP centralizado con reenvío desde las regionales, que reemplaza la configuración manual de direcciones, resolución de nombres internos con DNS, salida a una red externa simulada mediante NAT y una lista de control de acceso (ACL) que protege al área de Finanzas. El documento describe la construcción paso a paso con los comandos utilizados y capturas del archivo terminado, estima los equipos necesarios para una instalación física y registra once pruebas de aceptación, todas con el resultado esperado. Se concluye que la segmentación y la automatización del direccionamiento resuelven los problemas identificados; también se señalan las limitaciones de la simulación y las mejoras recomendadas para un despliegue real.</w:t>
+        <w:t xml:space="preserve">El presente trabajo documenta el diseño, la implementación y la validación en Cisco Packet Tracer de la red de Crestline Group, una empresa ficticia de servicios corporativos que llega del extranjero para abrir sus oficinas en Bolivia: una sede central y tres oficinas regionales, todas nuevas, que iniciarán operaciones con 300 computadoras. Como no existe una red previa, el diseño parte de cero y busca evitar desde el inicio los problemas de una red plana: exceso de tráfico de difusión, direcciones IP repetidas y falta de separación entre áreas. La solución separa ocho grupos de usuarios mediante VLAN, asigna ocho subredes calculadas con VLSM a partir del bloque 10.20.0.0/23, une las sedes con tres enlaces WAN seriales /30 y utiliza enrutamiento OSPF de área única. Además, incorpora DHCP centralizado con reenvío desde las regionales, resolución de nombres internos con DNS, salida a una red externa simulada mediante NAT y una lista de control de acceso (ACL) que protege al área de Finanzas. El documento describe la construcción paso a paso con los comandos utilizados y capturas del archivo terminado, estima los equipos necesarios para una instalación física y registra once pruebas de aceptación, todas con el resultado esperado. Se concluye que la segmentación y la automatización del direccionamiento permiten poner en marcha la red de forma ordenada y segura; también se señalan las limitaciones de la simulación y las mejoras recomendadas para un despliegue real.</w:t>
       </w:r>
     </w:p>
     <w:p>
@@ -859,7 +879,7 @@
         <w:ind w:firstLine="720"/>
       </w:pPr>
       <w:r>
-        <w:t xml:space="preserve">El Centro Empresarial Andino (CEA) tiene 300 computadoras conectadas a una sola red «plana»: todas están mezcladas, las direcciones IP se ponen a mano y se repiten, y las oficinas regionales se caen seguido. La solución es ordenar la red: separar a los usuarios en grupos (VLAN), darle a cada grupo su propio rango de direcciones (subred), unir las sedes con enlaces WAN y automatizar la entrega de direcciones.</w:t>
+        <w:t xml:space="preserve">Crestline Group (CRG) es una empresa ficticia de servicios corporativos que llega del extranjero a abrir sus oficinas en Bolivia. Como sus cuatro sedes son nuevas, la red se construye desde cero y se aprovecha para hacerla bien desde el inicio: separar a los usuarios en grupos (VLAN), darle a cada grupo su propio rango de direcciones (subred), unir las sedes con enlaces WAN y automatizar la entrega de direcciones.</w:t>
       </w:r>
     </w:p>
     <w:p>
@@ -886,7 +906,7 @@
       </w:pPr>
       <w:bookmarkStart w:name="_Toc202" w:id="202"/>
       <w:r>
-        <w:t xml:space="preserve">Diagnóstico del problema</w:t>
+        <w:t xml:space="preserve">Contexto de la empresa</w:t>
       </w:r>
       <w:bookmarkEnd w:id="202"/>
     </w:p>
@@ -895,7 +915,7 @@
         <w:ind w:firstLine="720"/>
       </w:pPr>
       <w:r>
-        <w:t xml:space="preserve">En la situación inicial, las 300 computadoras del CEA comparten un único dominio de difusión. Cada mensaje de difusión, como las consultas ARP, llega a todos los equipos, consume ancho de banda y procesamiento, y hace que una falla en un punto afecte a toda la organización. Las direcciones IP se configuran a mano y sin un registro central, por lo que aparecen direcciones duplicadas y resulta difícil saber qué equipo usa cada dirección.</w:t>
+        <w:t xml:space="preserve">Crestline Group es una empresa ficticia de servicios corporativos con casa matriz en el extranjero que decidió abrir operaciones en Bolivia. Su sede central se instala en Cochabamba y se organiza en cinco áreas: Ventas, Operaciones, Capacitación, Administración y TI, y Finanzas. Para atender a clientes de todo el país abre, además, tres oficinas regionales: Norte, Sur y Este.</w:t>
       </w:r>
     </w:p>
     <w:p>
@@ -903,7 +923,7 @@
         <w:ind w:firstLine="720"/>
       </w:pPr>
       <w:r>
-        <w:t xml:space="preserve">En las oficinas regionales, los enlaces con la sede central no tienen un esquema de direccionamiento y enrutamiento documentado, lo que provoca cortes frecuentes y diagnósticos lentos. Tampoco existe separación entre áreas: un equipo de cualquier grupo, incluida Capacitación, puede llegar a los equipos de Finanzas, donde se maneja información sensible, y cualquier usuario puede intentar administrar los routers.</w:t>
+        <w:t xml:space="preserve">Las cuatro sedes son nuevas: los locales se acaban de habilitar y ninguna cuenta con infraestructura de red. La empresa no quiere crecer de a poco, sino iniciar operaciones con todo el personal ya instalado: 300 computadoras repartidas en tres áreas de 60 equipos (Ventas, Operaciones y Capacitación) y cinco grupos de 24 (Administración y TI, Finanzas y las tres regionales).</w:t>
       </w:r>
     </w:p>
     <w:p>
@@ -911,7 +931,7 @@
         <w:ind w:firstLine="720"/>
       </w:pPr>
       <w:r>
-        <w:t xml:space="preserve">A partir de este diagnóstico se definieron los requisitos de la nueva red: atender a 300 computadoras repartidas en ocho grupos (tres de 60 y cinco de 24), dar a cada grupo una subred propia, entregar las direcciones de forma automática, conectar las tres regionales con la sede central, permitir la salida hacia una red externa, impedir el tráfico de Capacitación hacia Finanzas y limitar la administración remota al personal de TI.</w:t>
+        <w:t xml:space="preserve">La casa matriz exige además condiciones que la red debe cumplir desde el primer día: que cada área esté separada, que el área de Finanzas no sea accesible desde Capacitación, que solo el personal de TI administre los equipos de red y que las oficinas regionales se comuniquen con la sede central y puedan salir a una red externa.</w:t>
       </w:r>
     </w:p>
     <w:p>
@@ -920,37 +940,63 @@
       </w:pPr>
       <w:bookmarkStart w:name="_Toc203" w:id="203"/>
       <w:r>
+        <w:t xml:space="preserve">Planteamiento del problema</w:t>
+      </w:r>
+      <w:bookmarkEnd w:id="203"/>
+    </w:p>
+    <w:p>
+      <w:pPr>
+        <w:ind w:firstLine="720"/>
+      </w:pPr>
+      <w:r>
+        <w:t xml:space="preserve">Como se trata de una empresa nueva, no hay una red que corregir; el reto es construirla bien desde el inicio. Si las 300 computadoras se conectaran sin planificación a una sola red plana, todos los mensajes de difusión, como las consultas ARP, llegarían a todos los equipos y consumirían ancho de banda. Las direcciones IP tendrían que configurarse una por una, con el riesgo de repetirlas, y no habría separación entre áreas: cualquier equipo, incluido uno de Capacitación, podría llegar a Finanzas, donde se maneja información sensible.</w:t>
+      </w:r>
+    </w:p>
+    <w:p>
+      <w:pPr>
+        <w:ind w:firstLine="720"/>
+      </w:pPr>
+      <w:r>
+        <w:t xml:space="preserve">Las oficinas regionales, por su parte, necesitan un esquema de direccionamiento y enrutamiento documentado para comunicarse con la sede central. A partir del contexto se definieron los requisitos de la nueva red: atender a 300 computadoras repartidas en ocho grupos, dar a cada grupo una subred propia, entregar las direcciones de forma automática, conectar las tres regionales con la sede central, permitir la salida hacia una red externa, impedir el tráfico de Capacitación hacia Finanzas y limitar la administración remota al personal de TI.</w:t>
+      </w:r>
+    </w:p>
+    <w:p>
+      <w:pPr>
+        <w:pStyle w:val="Heading2"/>
+      </w:pPr>
+      <w:bookmarkStart w:name="_Toc204" w:id="204"/>
+      <w:r>
         <w:t xml:space="preserve">Objetivos</w:t>
       </w:r>
-      <w:bookmarkEnd w:id="203"/>
+      <w:bookmarkEnd w:id="204"/>
     </w:p>
     <w:p>
       <w:pPr>
         <w:pStyle w:val="Heading3"/>
       </w:pPr>
-      <w:bookmarkStart w:name="_Toc204" w:id="204"/>
+      <w:bookmarkStart w:name="_Toc205" w:id="205"/>
       <w:r>
         <w:t xml:space="preserve">Objetivo general</w:t>
       </w:r>
-      <w:bookmarkEnd w:id="204"/>
+      <w:bookmarkEnd w:id="205"/>
     </w:p>
     <w:p>
       <w:pPr>
         <w:ind w:firstLine="720"/>
       </w:pPr>
       <w:r>
-        <w:t xml:space="preserve">Diseñar, implementar y validar en Cisco Packet Tracer una red LAN empresarial segmentada mediante VLAN y VLSM, con interconexión WAN entre la sede central y tres oficinas regionales, que mejore la organización, la administración y la seguridad de la red del CEA.</w:t>
+        <w:t xml:space="preserve">Diseñar, implementar y validar en Cisco Packet Tracer una red LAN empresarial segmentada mediante VLAN y VLSM, con interconexión WAN entre la sede central y tres oficinas regionales, que mejore la organización, la administración y la seguridad de la red del CRG.</w:t>
       </w:r>
     </w:p>
     <w:p>
       <w:pPr>
         <w:pStyle w:val="Heading3"/>
       </w:pPr>
-      <w:bookmarkStart w:name="_Toc205" w:id="205"/>
+      <w:bookmarkStart w:name="_Toc206" w:id="206"/>
       <w:r>
         <w:t xml:space="preserve">Objetivos específicos</w:t>
       </w:r>
-      <w:bookmarkEnd w:id="205"/>
+      <w:bookmarkEnd w:id="206"/>
     </w:p>
     <w:p>
       <w:pPr>
@@ -961,7 +1007,7 @@
         </w:numPr>
       </w:pPr>
       <w:r>
-        <w:t xml:space="preserve">Diagnosticar las deficiencias de la red plana actual y definir los requisitos de la nueva red.</w:t>
+        <w:t xml:space="preserve">Analizar el contexto de la empresa y definir los requisitos de la nueva red.</w:t>
       </w:r>
     </w:p>
     <w:p>
@@ -1040,11 +1086,11 @@
       <w:pPr>
         <w:pStyle w:val="Heading2"/>
       </w:pPr>
-      <w:bookmarkStart w:name="_Toc206" w:id="206"/>
+      <w:bookmarkStart w:name="_Toc207" w:id="207"/>
       <w:r>
         <w:t xml:space="preserve">Justificación</w:t>
       </w:r>
-      <w:bookmarkEnd w:id="206"/>
+      <w:bookmarkEnd w:id="207"/>
     </w:p>
     <w:p>
       <w:pPr>
@@ -1059,18 +1105,18 @@
         <w:ind w:firstLine="720"/>
       </w:pPr>
       <w:r>
-        <w:t xml:space="preserve">Se eligió el modelo jerárquico de acceso y distribución porque separa funciones, facilita localizar fallas y permite crecer agregando switches de acceso sin rediseñar el resto de la red (Cisco, 2024). Para el enrutamiento entre VLAN se usó router-on-a-stick, que necesita un solo enlace físico entre el router y el switch central y es suficiente para el tráfico de la simulación. OSPF se prefirió a las rutas estáticas porque actualiza las rutas de forma automática cuando cambia la topología y permite sumar sedes sin reconfigurar cada router (Moy, 1998). Por último, el DHCP centralizado elimina las direcciones duplicadas (Droms, 1997) y NAT permite que todas las computadoras compartan una sola dirección pública (Srisuresh &amp; Egevang, 2001).</w:t>
+        <w:t xml:space="preserve">Se eligió el modelo jerárquico de acceso y distribución porque separa funciones, facilita localizar fallas y permite crecer agregando switches de acceso sin rediseñar el resto de la red (Cisco, 2024). Para el enrutamiento entre VLAN se usó router-on-a-stick, que necesita un solo enlace físico entre el router y el switch central y es suficiente para el tráfico de la simulación. OSPF se prefirió a las rutas estáticas porque actualiza las rutas de forma automática cuando cambia la topología y permite sumar sedes sin reconfigurar cada router (Moy, 1998). Por último, el DHCP centralizado evita las direcciones duplicadas (Droms, 1997) y NAT permite que todas las computadoras compartan una sola dirección pública (Srisuresh &amp; Egevang, 2001).</w:t>
       </w:r>
     </w:p>
     <w:p>
       <w:pPr>
         <w:pStyle w:val="Heading2"/>
       </w:pPr>
-      <w:bookmarkStart w:name="_Toc207" w:id="207"/>
+      <w:bookmarkStart w:name="_Toc208" w:id="208"/>
       <w:r>
         <w:t xml:space="preserve">Alcance y limitaciones</w:t>
       </w:r>
-      <w:bookmarkEnd w:id="207"/>
+      <w:bookmarkEnd w:id="208"/>
     </w:p>
     <w:p>
       <w:pPr>
@@ -1092,11 +1138,11 @@
       <w:pPr>
         <w:pStyle w:val="Heading2"/>
       </w:pPr>
-      <w:bookmarkStart w:name="_Toc208" w:id="208"/>
+      <w:bookmarkStart w:name="_Toc209" w:id="209"/>
       <w:r>
         <w:t xml:space="preserve">Marco conceptual</w:t>
       </w:r>
-      <w:bookmarkEnd w:id="208"/>
+      <w:bookmarkEnd w:id="209"/>
     </w:p>
     <w:p>
       <w:pPr>
@@ -1928,7 +1974,7 @@
                 <w:sz w:val="21"/>
                 <w:szCs w:val="21"/>
               </w:rPr>
-              <w:t xml:space="preserve">Traduce nombres (intranet.cea.local) a direcciones IP (10.20.0.194; Mockapetris, 1987).</w:t>
+              <w:t xml:space="preserve">Traduce nombres (intranet.crg.local) a direcciones IP (10.20.0.194; Mockapetris, 1987).</w:t>
             </w:r>
           </w:p>
         </w:tc>
@@ -2087,7 +2133,7 @@
           <w:b/>
           <w:bCs/>
         </w:rPr>
-        <w:t xml:space="preserve">R-CEA</w:t>
+        <w:t xml:space="preserve">R-CRG</w:t>
       </w:r>
       <w:r>
         <w:t xml:space="preserve">), un switch central (</w:t>
@@ -2174,7 +2220,7 @@
           <w:i/>
           <w:iCs/>
         </w:rPr>
-        <w:t xml:space="preserve">Topología final de la red del CEA en Packet Tracer</w:t>
+        <w:t xml:space="preserve">Topología final de la red del CRG en Packet Tracer</w:t>
       </w:r>
     </w:p>
     <w:p>
@@ -4177,7 +4223,7 @@
                 <w:sz w:val="21"/>
                 <w:szCs w:val="21"/>
               </w:rPr>
-              <w:t xml:space="preserve">R-CEA S0/0/0: 172.31.255.1</w:t>
+              <w:t xml:space="preserve">R-CRG S0/0/0: 172.31.255.1</w:t>
             </w:r>
           </w:p>
         </w:tc>
@@ -4295,7 +4341,7 @@
                 <w:sz w:val="21"/>
                 <w:szCs w:val="21"/>
               </w:rPr>
-              <w:t xml:space="preserve">R-CEA S0/0/1: 172.31.255.5</w:t>
+              <w:t xml:space="preserve">R-CRG S0/0/1: 172.31.255.5</w:t>
             </w:r>
           </w:p>
         </w:tc>
@@ -4413,7 +4459,7 @@
                 <w:sz w:val="21"/>
                 <w:szCs w:val="21"/>
               </w:rPr>
-              <w:t xml:space="preserve">R-CEA S0/1/0: 172.31.255.9</w:t>
+              <w:t xml:space="preserve">R-CRG S0/1/0: 172.31.255.9</w:t>
             </w:r>
           </w:p>
         </w:tc>
@@ -4531,7 +4577,7 @@
                 <w:sz w:val="21"/>
                 <w:szCs w:val="21"/>
               </w:rPr>
-              <w:t xml:space="preserve">R-CEA G0/1: 203.0.113.1</w:t>
+              <w:t xml:space="preserve">R-CRG G0/1: 203.0.113.1</w:t>
             </w:r>
           </w:p>
         </w:tc>
@@ -5193,7 +5239,7 @@
                 <w:sz w:val="21"/>
                 <w:szCs w:val="21"/>
               </w:rPr>
-              <w:t xml:space="preserve">R-CEA, R-NORTE, R-SUR, R-ESTE, ISP</w:t>
+              <w:t xml:space="preserve">R-CRG, R-NORTE, R-SUR, R-ESTE, ISP</w:t>
             </w:r>
           </w:p>
         </w:tc>
@@ -5579,7 +5625,7 @@
         <w:t xml:space="preserve">HWIC-2T</w:t>
       </w:r>
       <w:r>
-        <w:t xml:space="preserve"> (cada una trae 2 puertos seriales). R-CEA necesita </w:t>
+        <w:t xml:space="preserve"> (cada una trae 2 puertos seriales). R-CRG necesita </w:t>
       </w:r>
       <w:r>
         <w:rPr>
@@ -5677,7 +5723,7 @@
         </w:numPr>
       </w:pPr>
       <w:r>
-        <w:t xml:space="preserve">Arrástrala a la primera ranura vacía de la parte trasera del router (ranura 0). En R-CEA arrastra otra a la ranura 1.</w:t>
+        <w:t xml:space="preserve">Arrástrala a la primera ranura vacía de la parte trasera del router (ranura 0). En R-CRG arrastra otra a la ranura 1.</w:t>
       </w:r>
     </w:p>
     <w:p>
@@ -5713,7 +5759,7 @@
           <w:i/>
           <w:iCs/>
         </w:rPr>
-        <w:t xml:space="preserve">Router R-CEA con dos tarjetas HWIC-2T instaladas</w:t>
+        <w:t xml:space="preserve">Router R-CRG con dos tarjetas HWIC-2T instaladas</w:t>
       </w:r>
     </w:p>
     <w:p>
@@ -5970,7 +6016,7 @@
                 <w:sz w:val="21"/>
                 <w:szCs w:val="21"/>
               </w:rPr>
-              <w:t xml:space="preserve">R-CEA GigabitEthernet0/0</w:t>
+              <w:t xml:space="preserve">R-CRG GigabitEthernet0/0</w:t>
             </w:r>
           </w:p>
         </w:tc>
@@ -6860,7 +6906,7 @@
                 <w:sz w:val="21"/>
                 <w:szCs w:val="21"/>
               </w:rPr>
-              <w:t xml:space="preserve">R-CEA Serial0/0/0</w:t>
+              <w:t xml:space="preserve">R-CRG Serial0/0/0</w:t>
             </w:r>
           </w:p>
         </w:tc>
@@ -6918,7 +6964,7 @@
                 <w:sz w:val="21"/>
                 <w:szCs w:val="21"/>
               </w:rPr>
-              <w:t xml:space="preserve">Serial DCE (clic primero en R-CEA)</w:t>
+              <w:t xml:space="preserve">Serial DCE (clic primero en R-CRG)</w:t>
             </w:r>
           </w:p>
         </w:tc>
@@ -6949,7 +6995,7 @@
                 <w:sz w:val="21"/>
                 <w:szCs w:val="21"/>
               </w:rPr>
-              <w:t xml:space="preserve">R-CEA Serial0/0/1</w:t>
+              <w:t xml:space="preserve">R-CRG Serial0/0/1</w:t>
             </w:r>
           </w:p>
         </w:tc>
@@ -7007,7 +7053,7 @@
                 <w:sz w:val="21"/>
                 <w:szCs w:val="21"/>
               </w:rPr>
-              <w:t xml:space="preserve">Serial DCE (clic primero en R-CEA)</w:t>
+              <w:t xml:space="preserve">Serial DCE (clic primero en R-CRG)</w:t>
             </w:r>
           </w:p>
         </w:tc>
@@ -7038,7 +7084,7 @@
                 <w:sz w:val="21"/>
                 <w:szCs w:val="21"/>
               </w:rPr>
-              <w:t xml:space="preserve">R-CEA Serial0/1/0</w:t>
+              <w:t xml:space="preserve">R-CRG Serial0/1/0</w:t>
             </w:r>
           </w:p>
         </w:tc>
@@ -7096,7 +7142,7 @@
                 <w:sz w:val="21"/>
                 <w:szCs w:val="21"/>
               </w:rPr>
-              <w:t xml:space="preserve">Serial DCE (clic primero en R-CEA)</w:t>
+              <w:t xml:space="preserve">Serial DCE (clic primero en R-CRG)</w:t>
             </w:r>
           </w:p>
         </w:tc>
@@ -7305,7 +7351,7 @@
                 <w:sz w:val="21"/>
                 <w:szCs w:val="21"/>
               </w:rPr>
-              <w:t xml:space="preserve">R-CEA GigabitEthernet0/1</w:t>
+              <w:t xml:space="preserve">R-CRG GigabitEthernet0/1</w:t>
             </w:r>
           </w:p>
         </w:tc>
@@ -7571,7 +7617,7 @@
           <w:sz w:val="19"/>
           <w:szCs w:val="19"/>
         </w:rPr>
-        <w:t xml:space="preserve">hostname R-CEA</w:t>
+        <w:t xml:space="preserve">hostname R-CRG</w:t>
       </w:r>
     </w:p>
     <w:p>
@@ -7646,7 +7692,7 @@
           <w:sz w:val="19"/>
           <w:szCs w:val="19"/>
         </w:rPr>
-        <w:t xml:space="preserve">banner motd #Acceso restringido - Centro Empresarial Andino#</w:t>
+        <w:t xml:space="preserve">banner motd #Acceso restringido - Crestline Group#</w:t>
       </w:r>
     </w:p>
     <w:p>
@@ -7912,7 +7958,7 @@
           <w:sz w:val="19"/>
           <w:szCs w:val="19"/>
         </w:rPr>
-        <w:t xml:space="preserve"> description Troncal a R-CEA</w:t>
+        <w:t xml:space="preserve"> description Troncal a R-CRG</w:t>
       </w:r>
     </w:p>
     <w:p>
@@ -9431,7 +9477,7 @@
       </w:pPr>
       <w:bookmarkStart w:name="_Toc14" w:id="14"/>
       <w:r>
-        <w:t xml:space="preserve">Paso 6. Gateways de la sede central en R-CEA (router-on-a-stick)</w:t>
+        <w:t xml:space="preserve">Paso 6. Gateways de la sede central en R-CRG (router-on-a-stick)</w:t>
       </w:r>
       <w:bookmarkEnd w:id="14"/>
     </w:p>
@@ -9440,7 +9486,7 @@
         <w:ind w:firstLine="720"/>
       </w:pPr>
       <w:r>
-        <w:t xml:space="preserve">El cable G0/0 de R-CEA lleva las cinco VLAN. Se divide en cinco «subinterfaces» (G0/0.10, G0/0.20, etc.), una por VLAN. La interfaz física G0/0 se enciende pero </w:t>
+        <w:t xml:space="preserve">El cable G0/0 de R-CRG lleva las cinco VLAN. Se divide en cinco «subinterfaces» (G0/0.10, G0/0.20, etc.), una por VLAN. La interfaz física G0/0 se enciende pero </w:t>
       </w:r>
       <w:r>
         <w:rPr>
@@ -9929,7 +9975,7 @@
         <w:pStyle w:val="Heading3"/>
       </w:pPr>
       <w:r>
-        <w:t xml:space="preserve">7.1 En R-CEA</w:t>
+        <w:t xml:space="preserve">7.1 En R-CRG</w:t>
       </w:r>
     </w:p>
     <w:p>
@@ -9937,7 +9983,7 @@
         <w:ind w:firstLine="720"/>
       </w:pPr>
       <w:r>
-        <w:t xml:space="preserve">Como R-CEA es el lado DCE de los tres cables seriales, también lleva </w:t>
+        <w:t xml:space="preserve">Como R-CRG es el lado DCE de los tres cables seriales, también lleva </w:t>
       </w:r>
       <w:r>
         <w:rPr>
@@ -10480,7 +10526,7 @@
           <w:sz w:val="19"/>
           <w:szCs w:val="19"/>
         </w:rPr>
-        <w:t xml:space="preserve"> description WAN a R-CEA</w:t>
+        <w:t xml:space="preserve"> description WAN a R-CRG</w:t>
       </w:r>
     </w:p>
     <w:p>
@@ -11314,7 +11360,7 @@
           <w:i/>
           <w:iCs/>
         </w:rPr>
-        <w:t xml:space="preserve">Resultado de show ip interface brief en R-CEA</w:t>
+        <w:t xml:space="preserve">Resultado de show ip interface brief en R-CRG</w:t>
       </w:r>
     </w:p>
     <w:p>
@@ -11559,7 +11605,7 @@
         <w:pStyle w:val="Heading3"/>
       </w:pPr>
       <w:r>
-        <w:t xml:space="preserve">8.1 En R-CEA</w:t>
+        <w:t xml:space="preserve">8.1 En R-CRG</w:t>
       </w:r>
     </w:p>
     <w:p>
@@ -11567,7 +11613,7 @@
         <w:ind w:firstLine="720"/>
       </w:pPr>
       <w:r>
-        <w:t xml:space="preserve">R-CEA además tiene la ruta por defecto hacia el ISP y, con </w:t>
+        <w:t xml:space="preserve">R-CRG además tiene la ruta por defecto hacia el ISP y, con </w:t>
       </w:r>
       <w:r>
         <w:rPr>
@@ -11946,7 +11992,7 @@
         <w:ind w:firstLine="720"/>
       </w:pPr>
       <w:r>
-        <w:t xml:space="preserve">Espera unos 40 segundos (o presiona el botón de adelantar tiempo, abajo a la izquierda). En R-CEA escribe </w:t>
+        <w:t xml:space="preserve">Espera unos 40 segundos (o presiona el botón de adelantar tiempo, abajo a la izquierda). En R-CRG escribe </w:t>
       </w:r>
       <w:r>
         <w:rPr>
@@ -12012,7 +12058,7 @@
           <w:i/>
           <w:iCs/>
         </w:rPr>
-        <w:t xml:space="preserve">Vecinos OSPF de R-CEA</w:t>
+        <w:t xml:space="preserve">Vecinos OSPF de R-CRG</w:t>
       </w:r>
     </w:p>
     <w:p>
@@ -12082,7 +12128,7 @@
           <w:i/>
           <w:iCs/>
         </w:rPr>
-        <w:t xml:space="preserve">Rutas aprendidas por OSPF en R-CEA</w:t>
+        <w:t xml:space="preserve">Rutas aprendidas por OSPF en R-CRG</w:t>
       </w:r>
     </w:p>
     <w:p>
@@ -12137,7 +12183,7 @@
       </w:pPr>
       <w:bookmarkStart w:name="_Toc17" w:id="17"/>
       <w:r>
-        <w:t xml:space="preserve">Paso 9. DHCP centralizado en R-CEA</w:t>
+        <w:t xml:space="preserve">Paso 9. DHCP centralizado en R-CRG</w:t>
       </w:r>
       <w:bookmarkEnd w:id="17"/>
     </w:p>
@@ -12146,7 +12192,7 @@
         <w:ind w:firstLine="720"/>
       </w:pPr>
       <w:r>
-        <w:t xml:space="preserve">R-CEA reparte direcciones a las </w:t>
+        <w:t xml:space="preserve">R-CRG reparte direcciones a las </w:t>
       </w:r>
       <w:r>
         <w:rPr>
@@ -12351,7 +12397,7 @@
           <w:sz w:val="19"/>
           <w:szCs w:val="19"/>
         </w:rPr>
-        <w:t xml:space="preserve"> domain-name cea.local</w:t>
+        <w:t xml:space="preserve"> domain-name crg.local</w:t>
       </w:r>
     </w:p>
     <w:p>
@@ -13268,7 +13314,7 @@
           <w:sz w:val="22"/>
           <w:szCs w:val="22"/>
         </w:rPr>
-        <w:t xml:space="preserve">domain-name cea.local</w:t>
+        <w:t xml:space="preserve">domain-name crg.local</w:t>
       </w:r>
       <w:r>
         <w:t xml:space="preserve">.</w:t>
@@ -13290,7 +13336,7 @@
         <w:t xml:space="preserve">ip helper-address</w:t>
       </w:r>
       <w:r>
-        <w:t xml:space="preserve"> del Paso 7.2: el router regional recibe el pedido de la PC y lo reenvía a R-CEA por el enlace WAN.</w:t>
+        <w:t xml:space="preserve"> del Paso 7.2: el router regional recibe el pedido de la PC y lo reenvía a R-CRG por el enlace WAN.</w:t>
       </w:r>
     </w:p>
     <w:p>
@@ -13468,7 +13514,7 @@
           <w:sz w:val="22"/>
           <w:szCs w:val="22"/>
         </w:rPr>
-        <w:t xml:space="preserve">intranet.cea.local</w:t>
+        <w:t xml:space="preserve">intranet.crg.local</w:t>
       </w:r>
       <w:r>
         <w:t xml:space="preserve">, en </w:t>
@@ -13522,7 +13568,7 @@
           <w:sz w:val="22"/>
           <w:szCs w:val="22"/>
         </w:rPr>
-        <w:t xml:space="preserve">archivos.cea.local</w:t>
+        <w:t xml:space="preserve">archivos.crg.local</w:t>
       </w:r>
       <w:r>
         <w:t xml:space="preserve"> → </w:t>
@@ -13745,7 +13791,7 @@
           <w:sz w:val="19"/>
           <w:szCs w:val="19"/>
         </w:rPr>
-        <w:t xml:space="preserve"> description Enlace a R-CEA</w:t>
+        <w:t xml:space="preserve"> description Enlace a R-CRG</w:t>
       </w:r>
     </w:p>
     <w:p>
@@ -13873,7 +13919,7 @@
         <w:pStyle w:val="Heading3"/>
       </w:pPr>
       <w:r>
-        <w:t xml:space="preserve">11.2 NAT en R-CEA</w:t>
+        <w:t xml:space="preserve">11.2 NAT en R-CRG</w:t>
       </w:r>
     </w:p>
     <w:p>
@@ -14517,7 +14563,7 @@
         <w:ind w:firstLine="720"/>
       </w:pPr>
       <w:r>
-        <w:t xml:space="preserve">En R-CEA, </w:t>
+        <w:t xml:space="preserve">En R-CRG, </w:t>
       </w:r>
       <w:r>
         <w:rPr>
@@ -14552,7 +14598,7 @@
           <w:i/>
           <w:iCs/>
         </w:rPr>
-        <w:t xml:space="preserve">Direcciones entregadas por el DHCP de R-CEA</w:t>
+        <w:t xml:space="preserve">Direcciones entregadas por el DHCP de R-CRG</w:t>
       </w:r>
     </w:p>
     <w:p>
@@ -14634,7 +14680,7 @@
           <w:sz w:val="22"/>
           <w:szCs w:val="22"/>
         </w:rPr>
-        <w:t xml:space="preserve">CEA_Red_Empresarial.pkt</w:t>
+        <w:t xml:space="preserve">CRG_Red_Empresarial.pkt</w:t>
       </w:r>
       <w:r>
         <w:t xml:space="preserve">. Guarda seguido; Packet Tracer a veces se cierra solo.</w:t>
@@ -14665,7 +14711,7 @@
         <w:t xml:space="preserve">Desktop &gt; Command Prompt</w:t>
       </w:r>
       <w:r>
-        <w:t xml:space="preserve"> de cada PC y desde la CLI de R-CEA. Nota importante: en el primer ping a un destino nuevo es normal que se pierda el primer paquete; es el tiempo que tarda el equipo en averiguar la dirección física (ARP). No es una falla.</w:t>
+        <w:t xml:space="preserve"> de cada PC y desde la CLI de R-CRG. Nota importante: en el primer ping a un destino nuevo es normal que se pierda el primer paquete; es el tiempo que tarda el equipo en averiguar la dirección física (ARP). No es una falla.</w:t>
       </w:r>
     </w:p>
     <w:p>
@@ -15220,7 +15266,7 @@
                 <w:sz w:val="21"/>
                 <w:szCs w:val="21"/>
               </w:rPr>
-              <w:t xml:space="preserve">PC-VEN1 resuelve intranet.cea.local</w:t>
+              <w:t xml:space="preserve">PC-VEN1 resuelve intranet.crg.local</w:t>
             </w:r>
           </w:p>
         </w:tc>
@@ -15984,7 +16030,7 @@
                 <w:sz w:val="21"/>
                 <w:szCs w:val="21"/>
               </w:rPr>
-              <w:t xml:space="preserve">Rutas O en R-CEA y ruta por defecto en regionales</w:t>
+              <w:t xml:space="preserve">Rutas O en R-CRG y ruta por defecto en regionales</w:t>
             </w:r>
           </w:p>
         </w:tc>
@@ -16931,7 +16977,7 @@
           <w:i/>
           <w:iCs/>
         </w:rPr>
-        <w:t xml:space="preserve">Tabla de traducciones NAT en R-CEA</w:t>
+        <w:t xml:space="preserve">Tabla de traducciones NAT en R-CRG</w:t>
       </w:r>
     </w:p>
     <w:p>
@@ -17171,7 +17217,7 @@
           <w:i/>
           <w:iCs/>
         </w:rPr>
-        <w:t xml:space="preserve">Contadores de las listas de acceso en R-CEA</w:t>
+        <w:t xml:space="preserve">Contadores de las listas de acceso en R-CRG</w:t>
       </w:r>
     </w:p>
     <w:p>
@@ -18052,11 +18098,11 @@
       <w:pPr>
         <w:pStyle w:val="Heading1"/>
       </w:pPr>
-      <w:bookmarkStart w:name="_Toc209" w:id="209"/>
+      <w:bookmarkStart w:name="_Toc210" w:id="210"/>
       <w:r>
         <w:t xml:space="preserve">Dimensionamiento de equipos para una implementación real</w:t>
       </w:r>
-      <w:bookmarkEnd w:id="209"/>
+      <w:bookmarkEnd w:id="210"/>
     </w:p>
     <w:p>
       <w:pPr>
@@ -18468,7 +18514,7 @@
                 <w:sz w:val="21"/>
                 <w:szCs w:val="21"/>
               </w:rPr>
-              <w:t xml:space="preserve">R-CEA y un router por regional; R-CEA también hace NAT y DHCP.</w:t>
+              <w:t xml:space="preserve">R-CRG y un router por regional; R-CRG también hace NAT y DHCP.</w:t>
             </w:r>
           </w:p>
         </w:tc>
@@ -19148,7 +19194,7 @@
         <w:ind w:firstLine="720"/>
       </w:pPr>
       <w:r>
-        <w:t xml:space="preserve">Se construyó en Packet Tracer la red completa del CEA según el diseño: ocho VLAN con sus ocho subredes VLSM, tres enlaces WAN seriales /30, enrutamiento OSPF de área única, DHCP centralizado con reenvío desde las regionales, DNS interno, NAT hacia una red externa simulada y una ACL que protege a Finanzas. Las once pruebas de la matriz de aceptación dieron el resultado esperado y quedaron registradas con capturas.</w:t>
+        <w:t xml:space="preserve">Se construyó en Packet Tracer la red completa del CRG según el diseño: ocho VLAN con sus ocho subredes VLSM, tres enlaces WAN seriales /30, enrutamiento OSPF de área única, DHCP centralizado con reenvío desde las regionales, DNS interno, NAT hacia una red externa simulada y una ACL que protege a Finanzas. Las once pruebas de la matriz de aceptación dieron el resultado esperado y quedaron registradas con capturas.</w:t>
       </w:r>
     </w:p>
     <w:p>
@@ -19156,7 +19202,7 @@
         <w:ind w:firstLine="720"/>
       </w:pPr>
       <w:r>
-        <w:t xml:space="preserve">En relación con los objetivos, se cumplieron el objetivo general y los siete específicos: el diagnóstico definió los requisitos de la red; el plan VLSM de la Tabla 2 cubre la demanda de 300 equipos; las VLAN, las troncales y las subinterfaces funcionan según las Figuras 3 a 6; OSPF formó adyacencia con las tres regionales (Figura 9); DHCP, DNS, NAT y la ACL respondieron como se esperaba en la matriz de la Tabla 8; y la Tabla 10 estima los equipos para una instalación real.</w:t>
+        <w:t xml:space="preserve">En relación con los objetivos, se cumplieron el objetivo general y los siete específicos: el análisis del contexto definió los requisitos de la red; el plan VLSM de la Tabla 2 cubre la demanda de 300 equipos; las VLAN, las troncales y las subinterfaces funcionan según las Figuras 3 a 6; OSPF formó adyacencia con las tres regionales (Figura 9); DHCP, DNS, NAT y la ACL respondieron como se esperaba en la matriz de la Tabla 8; y la Tabla 10 estima los equipos para una instalación real.</w:t>
       </w:r>
     </w:p>
     <w:p>
@@ -19164,18 +19210,18 @@
         <w:ind w:firstLine="720"/>
       </w:pPr>
       <w:r>
-        <w:t xml:space="preserve">La separación en VLAN redujo el tamaño de cada dominio de difusión, el DHCP eliminó las direcciones duplicadas y OSPF permite agregar nuevas sedes sin escribir rutas a mano. Como limitación, el simulador usa dos PC por grupo en lugar de 300 equipos y no mide rendimiento real; para una instalación real haría falta un estudio del sitio, cotizaciones formales y pruebas de carga.</w:t>
+        <w:t xml:space="preserve">La separación en VLAN limita el tamaño de cada dominio de difusión, el DHCP evita las direcciones duplicadas y OSPF permite agregar nuevas sedes sin escribir rutas a mano. Como limitación, el simulador usa dos PC por grupo en lugar de 300 equipos y no mide rendimiento real; para una instalación real haría falta un estudio del sitio, cotizaciones formales y pruebas de carga.</w:t>
       </w:r>
     </w:p>
     <w:p>
       <w:pPr>
         <w:pStyle w:val="Heading1"/>
       </w:pPr>
-      <w:bookmarkStart w:name="_Toc210" w:id="210"/>
+      <w:bookmarkStart w:name="_Toc211" w:id="211"/>
       <w:r>
         <w:t xml:space="preserve">Recomendaciones</w:t>
       </w:r>
-      <w:bookmarkEnd w:id="210"/>
+      <w:bookmarkEnd w:id="211"/>
     </w:p>
     <w:p>
       <w:pPr>
@@ -19522,11 +19568,11 @@
       <w:pPr>
         <w:pStyle w:val="Heading1"/>
       </w:pPr>
-      <w:bookmarkStart w:name="_Toc211" w:id="211"/>
+      <w:bookmarkStart w:name="_Toc212" w:id="212"/>
       <w:r>
         <w:t xml:space="preserve">Anexo A</w:t>
       </w:r>
-      <w:bookmarkEnd w:id="211"/>
+      <w:bookmarkEnd w:id="212"/>
     </w:p>
     <w:p>
       <w:pPr>
@@ -19545,7 +19591,7 @@
         <w:ind w:firstLine="720"/>
       </w:pPr>
       <w:r>
-        <w:t xml:space="preserve">La Tabla A1 muestra, para cada subred, la demanda de computadoras, el rango de direcciones útiles, la dirección de broadcast, la capacidad y la cantidad de direcciones que entrega el pool DHCP configurado en R-CEA.</w:t>
+        <w:t xml:space="preserve">La Tabla A1 muestra, para cada subred, la demanda de computadoras, el rango de direcciones útiles, la dirección de broadcast, la capacidad y la cantidad de direcciones que entrega el pool DHCP configurado en R-CRG.</w:t>
       </w:r>
     </w:p>
     <w:p>

</xml_diff>

<commit_message>
Rehacer capturas con los nombres de Crestline Group
Se actualizan las 11 figuras que mostraban CEA (topología, salidas de
R-CRG, pruebas DNS/NAT y registros DNS) y se limpian notas vacías del .pkt.

Co-Authored-By: Claude Opus 5.5 <noreply@anthropic.com>
</commit_message>
<xml_diff>
--- a/ProyectoFinal-Redes-ACT6-APA7.docx
+++ b/ProyectoFinal-Redes-ACT6-APA7.docx
@@ -648,7 +648,7 @@
               <w:tab/>
             </w:r>
             <w:r>
-              <w:t>28</w:t>
+              <w:t>27</w:t>
             </w:r>
           </w:hyperlink>
         </w:p>
@@ -668,7 +668,7 @@
               <w:tab/>
             </w:r>
             <w:r>
-              <w:t>29</w:t>
+              <w:t>28</w:t>
             </w:r>
           </w:hyperlink>
         </w:p>
@@ -708,7 +708,7 @@
               <w:tab/>
             </w:r>
             <w:r>
-              <w:t>35</w:t>
+              <w:t>34</w:t>
             </w:r>
           </w:hyperlink>
         </w:p>
@@ -728,7 +728,7 @@
               <w:tab/>
             </w:r>
             <w:r>
-              <w:t>35</w:t>
+              <w:t>34</w:t>
             </w:r>
           </w:hyperlink>
         </w:p>
@@ -748,7 +748,7 @@
               <w:tab/>
             </w:r>
             <w:r>
-              <w:t>36</w:t>
+              <w:t>35</w:t>
             </w:r>
           </w:hyperlink>
         </w:p>
@@ -768,7 +768,7 @@
               <w:tab/>
             </w:r>
             <w:r>
-              <w:t>37</w:t>
+              <w:t>36</w:t>
             </w:r>
           </w:hyperlink>
         </w:p>
@@ -788,7 +788,7 @@
               <w:tab/>
             </w:r>
             <w:r>
-              <w:t>39</w:t>
+              <w:t>38</w:t>
             </w:r>
           </w:hyperlink>
         </w:p>
@@ -808,7 +808,7 @@
               <w:tab/>
             </w:r>
             <w:r>
-              <w:t>41</w:t>
+              <w:t>40</w:t>
             </w:r>
           </w:hyperlink>
           <w:r>
@@ -2231,7 +2231,7 @@
       <w:r>
         <w:drawing>
           <wp:inline distT="0" distB="0" distL="0" distR="0">
-            <wp:extent cx="5810250" cy="2257425"/>
+            <wp:extent cx="5810250" cy="2257787"/>
             <wp:effectExtent t="0" r="0" b="0" l="0"/>
             <wp:docPr id="1" name=""/>
             <wp:cNvGraphicFramePr>
@@ -2256,7 +2256,7 @@
                   <pic:spPr bwMode="auto">
                     <a:xfrm>
                       <a:off x="0" y="0"/>
-                      <a:ext cx="5810250" cy="2257425"/>
+                      <a:ext cx="5810250" cy="2257787"/>
                     </a:xfrm>
                     <a:prstGeom prst="rect">
                       <a:avLst/>
@@ -11371,7 +11371,7 @@
       <w:r>
         <w:drawing>
           <wp:inline distT="0" distB="0" distL="0" distR="0">
-            <wp:extent cx="5810250" cy="2200275"/>
+            <wp:extent cx="5810250" cy="2200204"/>
             <wp:effectExtent t="0" r="0" b="0" l="0"/>
             <wp:docPr id="6" name=""/>
             <wp:cNvGraphicFramePr>
@@ -11396,7 +11396,7 @@
                   <pic:spPr bwMode="auto">
                     <a:xfrm>
                       <a:off x="0" y="0"/>
-                      <a:ext cx="5810250" cy="2200275"/>
+                      <a:ext cx="5810250" cy="2200204"/>
                     </a:xfrm>
                     <a:prstGeom prst="rect">
                       <a:avLst/>
@@ -12069,7 +12069,7 @@
       <w:r>
         <w:drawing>
           <wp:inline distT="0" distB="0" distL="0" distR="0">
-            <wp:extent cx="5753100" cy="1257300"/>
+            <wp:extent cx="5753100" cy="1117745"/>
             <wp:effectExtent t="0" r="0" b="0" l="0"/>
             <wp:docPr id="9" name=""/>
             <wp:cNvGraphicFramePr>
@@ -12094,7 +12094,7 @@
                   <pic:spPr bwMode="auto">
                     <a:xfrm>
                       <a:off x="0" y="0"/>
-                      <a:ext cx="5753100" cy="1257300"/>
+                      <a:ext cx="5753100" cy="1117745"/>
                     </a:xfrm>
                     <a:prstGeom prst="rect">
                       <a:avLst/>
@@ -12139,7 +12139,7 @@
       <w:r>
         <w:drawing>
           <wp:inline distT="0" distB="0" distL="0" distR="0">
-            <wp:extent cx="5105400" cy="971550"/>
+            <wp:extent cx="5105400" cy="975065"/>
             <wp:effectExtent t="0" r="0" b="0" l="0"/>
             <wp:docPr id="10" name=""/>
             <wp:cNvGraphicFramePr>
@@ -12164,7 +12164,7 @@
                   <pic:spPr bwMode="auto">
                     <a:xfrm>
                       <a:off x="0" y="0"/>
-                      <a:ext cx="5105400" cy="971550"/>
+                      <a:ext cx="5105400" cy="975065"/>
                     </a:xfrm>
                     <a:prstGeom prst="rect">
                       <a:avLst/>
@@ -13639,7 +13639,7 @@
       <w:r>
         <w:drawing>
           <wp:inline distT="0" distB="0" distL="0" distR="0">
-            <wp:extent cx="5810250" cy="2257425"/>
+            <wp:extent cx="5810250" cy="2253672"/>
             <wp:effectExtent t="0" r="0" b="0" l="0"/>
             <wp:docPr id="11" name=""/>
             <wp:cNvGraphicFramePr>
@@ -13664,7 +13664,7 @@
                   <pic:spPr bwMode="auto">
                     <a:xfrm>
                       <a:off x="0" y="0"/>
-                      <a:ext cx="5810250" cy="2257425"/>
+                      <a:ext cx="5810250" cy="2253672"/>
                     </a:xfrm>
                     <a:prstGeom prst="rect">
                       <a:avLst/>
@@ -14609,7 +14609,7 @@
       <w:r>
         <w:drawing>
           <wp:inline distT="0" distB="0" distL="0" distR="0">
-            <wp:extent cx="5534025" cy="2828925"/>
+            <wp:extent cx="5534025" cy="2827284"/>
             <wp:effectExtent t="0" r="0" b="0" l="0"/>
             <wp:docPr id="13" name=""/>
             <wp:cNvGraphicFramePr>
@@ -14634,7 +14634,7 @@
                   <pic:spPr bwMode="auto">
                     <a:xfrm>
                       <a:off x="0" y="0"/>
-                      <a:ext cx="5534025" cy="2828925"/>
+                      <a:ext cx="5534025" cy="2827284"/>
                     </a:xfrm>
                     <a:prstGeom prst="rect">
                       <a:avLst/>
@@ -16638,7 +16638,7 @@
       <w:r>
         <w:drawing>
           <wp:inline distT="0" distB="0" distL="0" distR="0">
-            <wp:extent cx="2419350" cy="1419225"/>
+            <wp:extent cx="2627348" cy="1466935"/>
             <wp:effectExtent t="0" r="0" b="0" l="0"/>
             <wp:docPr id="15" name=""/>
             <wp:cNvGraphicFramePr>
@@ -16663,7 +16663,7 @@
                   <pic:spPr bwMode="auto">
                     <a:xfrm>
                       <a:off x="0" y="0"/>
-                      <a:ext cx="2419350" cy="1419225"/>
+                      <a:ext cx="2627348" cy="1466935"/>
                     </a:xfrm>
                     <a:prstGeom prst="rect">
                       <a:avLst/>
@@ -16708,7 +16708,7 @@
       <w:r>
         <w:drawing>
           <wp:inline distT="0" distB="0" distL="0" distR="0">
-            <wp:extent cx="4191000" cy="2133600"/>
+            <wp:extent cx="4267597" cy="2177568"/>
             <wp:effectExtent t="0" r="0" b="0" l="0"/>
             <wp:docPr id="16" name=""/>
             <wp:cNvGraphicFramePr>
@@ -16733,7 +16733,7 @@
                   <pic:spPr bwMode="auto">
                     <a:xfrm>
                       <a:off x="0" y="0"/>
-                      <a:ext cx="4191000" cy="2133600"/>
+                      <a:ext cx="4267597" cy="2177568"/>
                     </a:xfrm>
                     <a:prstGeom prst="rect">
                       <a:avLst/>
@@ -16778,7 +16778,7 @@
       <w:r>
         <w:drawing>
           <wp:inline distT="0" distB="0" distL="0" distR="0">
-            <wp:extent cx="4324350" cy="2181225"/>
+            <wp:extent cx="4324350" cy="2178596"/>
             <wp:effectExtent t="0" r="0" b="0" l="0"/>
             <wp:docPr id="17" name=""/>
             <wp:cNvGraphicFramePr>
@@ -16803,7 +16803,7 @@
                   <pic:spPr bwMode="auto">
                     <a:xfrm>
                       <a:off x="0" y="0"/>
-                      <a:ext cx="4324350" cy="2181225"/>
+                      <a:ext cx="4324350" cy="2178596"/>
                     </a:xfrm>
                     <a:prstGeom prst="rect">
                       <a:avLst/>
@@ -16988,7 +16988,7 @@
       <w:r>
         <w:drawing>
           <wp:inline distT="0" distB="0" distL="0" distR="0">
-            <wp:extent cx="5810250" cy="1914525"/>
+            <wp:extent cx="4766220" cy="962322"/>
             <wp:effectExtent t="0" r="0" b="0" l="0"/>
             <wp:docPr id="20" name=""/>
             <wp:cNvGraphicFramePr>
@@ -17013,7 +17013,7 @@
                   <pic:spPr bwMode="auto">
                     <a:xfrm>
                       <a:off x="0" y="0"/>
-                      <a:ext cx="5810250" cy="1914525"/>
+                      <a:ext cx="4766220" cy="962322"/>
                     </a:xfrm>
                     <a:prstGeom prst="rect">
                       <a:avLst/>
@@ -17228,7 +17228,7 @@
       <w:r>
         <w:drawing>
           <wp:inline distT="0" distB="0" distL="0" distR="0">
-            <wp:extent cx="5229225" cy="1400175"/>
+            <wp:extent cx="5229225" cy="1403230"/>
             <wp:effectExtent t="0" r="0" b="0" l="0"/>
             <wp:docPr id="23" name=""/>
             <wp:cNvGraphicFramePr>
@@ -17253,7 +17253,7 @@
                   <pic:spPr bwMode="auto">
                     <a:xfrm>
                       <a:off x="0" y="0"/>
-                      <a:ext cx="5229225" cy="1400175"/>
+                      <a:ext cx="5229225" cy="1403230"/>
                     </a:xfrm>
                     <a:prstGeom prst="rect">
                       <a:avLst/>

</xml_diff>

<commit_message>
Usar rutas estáticas y quitar DNS y ACL
OSPF se reemplaza por rutas estáticas (tres rutas en R-CRG y una ruta por
defecto en cada regional). Se quitan el servicio DNS, la ACL de Finanzas y la
restricción de Telnet, tanto del .pkt como del documento; las pruebas pasan
de once a nueve y se rehacen las capturas afectadas.

Co-Authored-By: Claude Opus 5.5 <noreply@anthropic.com>
</commit_message>
<xml_diff>
--- a/ProyectoFinal-Redes-ACT6-APA7.docx
+++ b/ProyectoFinal-Redes-ACT6-APA7.docx
@@ -542,13 +542,13 @@
           </w:pPr>
           <w:hyperlink w:anchor="_Toc16" w:history="1">
             <w:r>
-              <w:t xml:space="preserve">Paso 8. Enrutamiento con OSPF</w:t>
+              <w:t xml:space="preserve">Paso 8. Enrutamiento con rutas estáticas</w:t>
             </w:r>
             <w:r>
               <w:tab/>
             </w:r>
             <w:r>
-              <w:t>23</w:t>
+              <w:t>22</w:t>
             </w:r>
           </w:hyperlink>
         </w:p>
@@ -582,7 +582,7 @@
           </w:pPr>
           <w:hyperlink w:anchor="_Toc18" w:history="1">
             <w:r>
-              <w:t xml:space="preserve">Paso 10. Servidor SRV-TI (DNS)</w:t>
+              <w:t xml:space="preserve">Paso 10. IP fija de los servidores</w:t>
             </w:r>
             <w:r>
               <w:tab/>
@@ -608,27 +608,7 @@
               <w:tab/>
             </w:r>
             <w:r>
-              <w:t>26</w:t>
-            </w:r>
-          </w:hyperlink>
-        </w:p>
-        <w:p>
-          <w:pPr>
-            <w:pStyle w:val="TOC2"/>
-            <w:tabs>
-              <w:tab w:val="right" w:leader="dot" w:pos="9350"/>
-            </w:tabs>
-            <w:spacing w:line="360" w:lineRule="auto"/>
-          </w:pPr>
-          <w:hyperlink w:anchor="_Toc20" w:history="1">
-            <w:r>
-              <w:t xml:space="preserve">Paso 12. Seguridad: ACL y acceso remoto</w:t>
-            </w:r>
-            <w:r>
-              <w:tab/>
-            </w:r>
-            <w:r>
-              <w:t>27</w:t>
+              <w:t>25</w:t>
             </w:r>
           </w:hyperlink>
         </w:p>
@@ -642,13 +622,13 @@
           </w:pPr>
           <w:hyperlink w:anchor="_Toc21" w:history="1">
             <w:r>
-              <w:t xml:space="preserve">Paso 13. Poner las PC en DHCP</w:t>
+              <w:t xml:space="preserve">Paso 12. Poner las PC en DHCP</w:t>
             </w:r>
             <w:r>
               <w:tab/>
             </w:r>
             <w:r>
-              <w:t>27</w:t>
+              <w:t>26</w:t>
             </w:r>
           </w:hyperlink>
         </w:p>
@@ -662,13 +642,13 @@
           </w:pPr>
           <w:hyperlink w:anchor="_Toc22" w:history="1">
             <w:r>
-              <w:t xml:space="preserve">Paso 14. Guardar</w:t>
+              <w:t xml:space="preserve">Paso 13. Guardar</w:t>
             </w:r>
             <w:r>
               <w:tab/>
             </w:r>
             <w:r>
-              <w:t>28</w:t>
+              <w:t>27</w:t>
             </w:r>
           </w:hyperlink>
         </w:p>
@@ -688,7 +668,7 @@
               <w:tab/>
             </w:r>
             <w:r>
-              <w:t>29</w:t>
+              <w:t>27</w:t>
             </w:r>
           </w:hyperlink>
         </w:p>
@@ -708,7 +688,7 @@
               <w:tab/>
             </w:r>
             <w:r>
-              <w:t>34</w:t>
+              <w:t>31</w:t>
             </w:r>
           </w:hyperlink>
         </w:p>
@@ -728,7 +708,7 @@
               <w:tab/>
             </w:r>
             <w:r>
-              <w:t>34</w:t>
+              <w:t>31</w:t>
             </w:r>
           </w:hyperlink>
         </w:p>
@@ -748,7 +728,7 @@
               <w:tab/>
             </w:r>
             <w:r>
-              <w:t>35</w:t>
+              <w:t>32</w:t>
             </w:r>
           </w:hyperlink>
         </w:p>
@@ -768,7 +748,7 @@
               <w:tab/>
             </w:r>
             <w:r>
-              <w:t>36</w:t>
+              <w:t>33</w:t>
             </w:r>
           </w:hyperlink>
         </w:p>
@@ -788,7 +768,7 @@
               <w:tab/>
             </w:r>
             <w:r>
-              <w:t>38</w:t>
+              <w:t>35</w:t>
             </w:r>
           </w:hyperlink>
         </w:p>
@@ -808,7 +788,7 @@
               <w:tab/>
             </w:r>
             <w:r>
-              <w:t>40</w:t>
+              <w:t>37</w:t>
             </w:r>
           </w:hyperlink>
           <w:r>
@@ -835,7 +815,7 @@
     <w:p>
       <w:pPr/>
       <w:r>
-        <w:t xml:space="preserve">El presente trabajo documenta el diseño, la implementación y la validación en Cisco Packet Tracer de la red de Crestline Group, una empresa ficticia de servicios corporativos que llega del extranjero para abrir sus oficinas en Bolivia: una sede central y tres oficinas regionales, todas nuevas, que iniciarán operaciones con 300 computadoras. Como no existe una red previa, el diseño parte de cero y busca evitar desde el inicio los problemas de una red plana: exceso de tráfico de difusión, direcciones IP repetidas y falta de separación entre áreas. La solución separa ocho grupos de usuarios mediante VLAN, asigna ocho subredes calculadas con VLSM a partir del bloque 10.20.0.0/23, une las sedes con tres enlaces WAN seriales /30 y utiliza enrutamiento OSPF de área única. Además, incorpora DHCP centralizado con reenvío desde las regionales, resolución de nombres internos con DNS, salida a una red externa simulada mediante NAT y una lista de control de acceso (ACL) que protege al área de Finanzas. El documento describe la construcción paso a paso con los comandos utilizados y capturas del archivo terminado, estima los equipos necesarios para una instalación física y registra once pruebas de aceptación, todas con el resultado esperado. Se concluye que la segmentación y la automatización del direccionamiento permiten poner en marcha la red de forma ordenada y segura; también se señalan las limitaciones de la simulación y las mejoras recomendadas para un despliegue real.</w:t>
+        <w:t xml:space="preserve">El presente trabajo documenta el diseño, la implementación y la validación en Cisco Packet Tracer de la red de Crestline Group, una empresa ficticia de servicios corporativos que llega del extranjero para abrir sus oficinas en Bolivia: una sede central y tres oficinas regionales, todas nuevas, que iniciarán operaciones con 300 computadoras. Como no existe una red previa, el diseño parte de cero y busca evitar desde el inicio los problemas de una red plana: exceso de tráfico de difusión, direcciones IP repetidas y falta de separación entre áreas. La solución separa ocho grupos de usuarios mediante VLAN, asigna ocho subredes calculadas con VLSM a partir del bloque 10.20.0.0/23, une las sedes con tres enlaces WAN seriales /30 y utiliza rutas estáticas. Además, incorpora DHCP centralizado con reenvío desde las regionales y salida a una red externa simulada mediante NAT. El documento describe la construcción paso a paso con los comandos utilizados y capturas del archivo terminado, estima los equipos necesarios para una instalación física y registra nueve pruebas de aceptación, todas con el resultado esperado. Se concluye que la segmentación y la automatización del direccionamiento permiten poner en marcha la red de forma ordenada y segura; también se señalan las limitaciones de la simulación y las mejoras recomendadas para un despliegue real.</w:t>
       </w:r>
     </w:p>
     <w:p>
@@ -850,7 +830,7 @@
         <w:t xml:space="preserve">Palabras clave:</w:t>
       </w:r>
       <w:r>
-        <w:t xml:space="preserve"> VLAN, VLSM, OSPF, DHCP, NAT, ACL, Packet Tracer</w:t>
+        <w:t xml:space="preserve"> VLAN, VLSM, rutas estáticas, DHCP, NAT, Packet Tracer</w:t>
       </w:r>
     </w:p>
     <w:p>
@@ -931,7 +911,7 @@
         <w:ind w:firstLine="720"/>
       </w:pPr>
       <w:r>
-        <w:t xml:space="preserve">La casa matriz exige además condiciones que la red debe cumplir desde el primer día: que cada área esté separada, que el área de Finanzas no sea accesible desde Capacitación, que solo el personal de TI administre los equipos de red y que las oficinas regionales se comuniquen con la sede central y puedan salir a una red externa.</w:t>
+        <w:t xml:space="preserve">La casa matriz exige además condiciones que la red debe cumplir desde el primer día: que cada área tenga su propia red, que las direcciones se asignen de forma automática y que las oficinas regionales se comuniquen con la sede central y puedan salir a una red externa.</w:t>
       </w:r>
     </w:p>
     <w:p>
@@ -949,7 +929,7 @@
         <w:ind w:firstLine="720"/>
       </w:pPr>
       <w:r>
-        <w:t xml:space="preserve">Como se trata de una empresa nueva, no hay una red que corregir; el reto es construirla bien desde el inicio. Si las 300 computadoras se conectaran sin planificación a una sola red plana, todos los mensajes de difusión, como las consultas ARP, llegarían a todos los equipos y consumirían ancho de banda. Las direcciones IP tendrían que configurarse una por una, con el riesgo de repetirlas, y no habría separación entre áreas: cualquier equipo, incluido uno de Capacitación, podría llegar a Finanzas, donde se maneja información sensible.</w:t>
+        <w:t xml:space="preserve">Como se trata de una empresa nueva, no hay una red que corregir; el reto es construirla bien desde el inicio. Si las 300 computadoras se conectaran sin planificación a una sola red plana, todos los mensajes de difusión, como las consultas ARP, llegarían a todos los equipos y consumirían ancho de banda. Las direcciones IP tendrían que configurarse una por una, con el riesgo de repetirlas, y no habría separación entre áreas, por lo que un problema en una de ellas afectaría a todas.</w:t>
       </w:r>
     </w:p>
     <w:p>
@@ -957,7 +937,7 @@
         <w:ind w:firstLine="720"/>
       </w:pPr>
       <w:r>
-        <w:t xml:space="preserve">Las oficinas regionales, por su parte, necesitan un esquema de direccionamiento y enrutamiento documentado para comunicarse con la sede central. A partir del contexto se definieron los requisitos de la nueva red: atender a 300 computadoras repartidas en ocho grupos, dar a cada grupo una subred propia, entregar las direcciones de forma automática, conectar las tres regionales con la sede central, permitir la salida hacia una red externa, impedir el tráfico de Capacitación hacia Finanzas y limitar la administración remota al personal de TI.</w:t>
+        <w:t xml:space="preserve">Las oficinas regionales, por su parte, necesitan un esquema de direccionamiento y enrutamiento documentado para comunicarse con la sede central. A partir del contexto se definieron los requisitos de la nueva red: atender a 300 computadoras repartidas en ocho grupos, dar a cada grupo una subred propia, entregar las direcciones de forma automática, conectar las tres regionales con la sede central y permitir la salida hacia una red externa.</w:t>
       </w:r>
     </w:p>
     <w:p>
@@ -1043,7 +1023,7 @@
         </w:numPr>
       </w:pPr>
       <w:r>
-        <w:t xml:space="preserve">Interconectar la sede central con las tres regionales mediante enlaces WAN seriales y enrutamiento OSPF.</w:t>
+        <w:t xml:space="preserve">Interconectar la sede central con las tres regionales mediante enlaces WAN seriales y rutas estáticas.</w:t>
       </w:r>
     </w:p>
     <w:p>
@@ -1055,7 +1035,7 @@
         </w:numPr>
       </w:pPr>
       <w:r>
-        <w:t xml:space="preserve">Implementar los servicios DHCP, DNS y NAT, y controles de seguridad con listas de control de acceso.</w:t>
+        <w:t xml:space="preserve">Implementar los servicios DHCP y NAT.</w:t>
       </w:r>
     </w:p>
     <w:p>
@@ -1105,7 +1085,7 @@
         <w:ind w:firstLine="720"/>
       </w:pPr>
       <w:r>
-        <w:t xml:space="preserve">Se eligió el modelo jerárquico de acceso y distribución porque separa funciones, facilita localizar fallas y permite crecer agregando switches de acceso sin rediseñar el resto de la red (Cisco, 2024). Para el enrutamiento entre VLAN se usó router-on-a-stick, que necesita un solo enlace físico entre el router y el switch central y es suficiente para el tráfico de la simulación. OSPF se prefirió a las rutas estáticas porque actualiza las rutas de forma automática cuando cambia la topología y permite sumar sedes sin reconfigurar cada router (Moy, 1998). Por último, el DHCP centralizado evita las direcciones duplicadas (Droms, 1997) y NAT permite que todas las computadoras compartan una sola dirección pública (Srisuresh &amp; Egevang, 2001).</w:t>
+        <w:t xml:space="preserve">Se eligió el modelo jerárquico de acceso y distribución porque separa funciones, facilita localizar fallas y permite crecer agregando switches de acceso sin rediseñar el resto de la red (Cisco, 2024). Para el enrutamiento entre VLAN se usó router-on-a-stick, que necesita un solo enlace físico entre el router y el switch central y es suficiente para el tráfico de la simulación. Para el enrutamiento entre sedes se usaron rutas estáticas: como todas las regionales se conectan solo con la sede central, cada regional necesita una única ruta por defecto y el router central una ruta por regional, lo que mantiene la configuración simple y fácil de verificar. Por último, el DHCP centralizado evita las direcciones duplicadas (Droms, 1997) y NAT permite que todas las computadoras compartan una sola dirección pública (Srisuresh &amp; Egevang, 2001).</w:t>
       </w:r>
     </w:p>
     <w:p>
@@ -1123,7 +1103,7 @@
         <w:ind w:firstLine="720"/>
       </w:pPr>
       <w:r>
-        <w:t xml:space="preserve">El proyecto abarca el diseño lógico, la configuración y las pruebas de la red en Cisco Packet Tracer 9.0.1 (Cisco Networking Academy, s. f.). Comprende IPv4, VLAN, enrutamiento OSPF, DHCP, DNS, NAT y listas de control de acceso. Para mantener la simulación manejable se colocaron dos computadoras por grupo en lugar de las 24 o 60 reales; el plan de direccionamiento, en cambio, está calculado para la cantidad total de equipos.</w:t>
+        <w:t xml:space="preserve">El proyecto abarca el diseño lógico, la configuración y las pruebas de la red en Cisco Packet Tracer 9.0.1 (Cisco Networking Academy, s. f.). Comprende IPv4, VLAN, rutas estáticas, DHCP y NAT. Para mantener la simulación manejable se colocaron dos computadoras por grupo en lugar de las 24 o 60 reales; el plan de direccionamiento, en cambio, está calculado para la cantidad total de equipos.</w:t>
       </w:r>
     </w:p>
     <w:p>
@@ -1131,7 +1111,7 @@
         <w:ind w:firstLine="720"/>
       </w:pPr>
       <w:r>
-        <w:t xml:space="preserve">No forman parte del alcance la instalación física del cableado, la red inalámbrica, IPv6, la redundancia de enlaces ni la contratación de servicios WAN reales. Packet Tracer reproduce el comportamiento lógico de los equipos Cisco, pero no mide el rendimiento real, por lo que los tiempos de respuesta de las pruebas solo sirven como referencia.</w:t>
+        <w:t xml:space="preserve">No forman parte del alcance la resolución de nombres (DNS), los controles de seguridad como las listas de control de acceso, la instalación física del cableado, la red inalámbrica, IPv6, la redundancia de enlaces ni la contratación de servicios WAN reales. Packet Tracer reproduce el comportamiento lógico de los equipos Cisco, pero no mide el rendimiento real, por lo que los tiempos de respuesta de las pruebas solo sirven como referencia.</w:t>
       </w:r>
     </w:p>
     <w:p>
@@ -1825,7 +1805,7 @@
                 <w:sz w:val="21"/>
                 <w:szCs w:val="21"/>
               </w:rPr>
-              <w:t xml:space="preserve">OSPF</w:t>
+              <w:t xml:space="preserve">Ruta estática</w:t>
             </w:r>
           </w:p>
         </w:tc>
@@ -1854,7 +1834,7 @@
                 <w:sz w:val="21"/>
                 <w:szCs w:val="21"/>
               </w:rPr>
-              <w:t xml:space="preserve">Protocolo para que los routers se cuenten entre sí qué redes conocen, sin escribir rutas a mano (Moy, 1998).</w:t>
+              <w:t xml:space="preserve">Ruta escrita a mano en el router: «para llegar a tal red, manda los paquetes a tal vecino».</w:t>
             </w:r>
           </w:p>
         </w:tc>
@@ -1914,7 +1894,7 @@
                 <w:sz w:val="21"/>
                 <w:szCs w:val="21"/>
               </w:rPr>
-              <w:t xml:space="preserve">Servicio que le da a cada PC su IP, máscara, gateway y DNS automáticamente (Droms, 1997).</w:t>
+              <w:t xml:space="preserve">Servicio que le da a cada PC su IP, máscara, y gateway automáticamente (Droms, 1997).</w:t>
             </w:r>
           </w:p>
         </w:tc>
@@ -1945,7 +1925,7 @@
                 <w:sz w:val="21"/>
                 <w:szCs w:val="21"/>
               </w:rPr>
-              <w:t xml:space="preserve">DNS</w:t>
+              <w:t xml:space="preserve">Ruta por defecto</w:t>
             </w:r>
           </w:p>
         </w:tc>
@@ -1974,7 +1954,7 @@
                 <w:sz w:val="21"/>
                 <w:szCs w:val="21"/>
               </w:rPr>
-              <w:t xml:space="preserve">Traduce nombres (intranet.crg.local) a direcciones IP (10.20.0.194; Mockapetris, 1987).</w:t>
+              <w:t xml:space="preserve">La ruta que se usa cuando ninguna otra coincide (0.0.0.0/0). Suele apuntar a la salida principal.</w:t>
             </w:r>
           </w:p>
         </w:tc>
@@ -1986,7 +1966,7 @@
             <w:tcBorders>
               <w:top w:val="none" w:color="FFFFFF" w:sz="0"/>
               <w:left w:val="none" w:color="FFFFFF" w:sz="0"/>
-              <w:bottom w:val="none" w:color="FFFFFF" w:sz="0"/>
+              <w:bottom w:val="single" w:color="000000" w:sz="6"/>
               <w:right w:val="none" w:color="FFFFFF" w:sz="0"/>
             </w:tcBorders>
             <w:tcMar>
@@ -2015,7 +1995,7 @@
             <w:tcBorders>
               <w:top w:val="none" w:color="FFFFFF" w:sz="0"/>
               <w:left w:val="none" w:color="FFFFFF" w:sz="0"/>
-              <w:bottom w:val="none" w:color="FFFFFF" w:sz="0"/>
+              <w:bottom w:val="single" w:color="000000" w:sz="6"/>
               <w:right w:val="none" w:color="FFFFFF" w:sz="0"/>
             </w:tcBorders>
             <w:tcMar>
@@ -2035,66 +2015,6 @@
                 <w:szCs w:val="21"/>
               </w:rPr>
               <w:t xml:space="preserve">Cambia la IP privada de la PC por la IP pública del router cuando sale hacia afuera (Srisuresh &amp; Egevang, 2001).</w:t>
-            </w:r>
-          </w:p>
-        </w:tc>
-      </w:tr>
-      <w:tr>
-        <w:tc>
-          <w:tcPr>
-            <w:tcW w:type="dxa" w:w="2300"/>
-            <w:tcBorders>
-              <w:top w:val="none" w:color="FFFFFF" w:sz="0"/>
-              <w:left w:val="none" w:color="FFFFFF" w:sz="0"/>
-              <w:bottom w:val="single" w:color="000000" w:sz="6"/>
-              <w:right w:val="none" w:color="FFFFFF" w:sz="0"/>
-            </w:tcBorders>
-            <w:tcMar>
-              <w:top w:type="dxa" w:w="40"/>
-              <w:left w:type="dxa" w:w="80"/>
-              <w:bottom w:type="dxa" w:w="40"/>
-              <w:right w:type="dxa" w:w="80"/>
-            </w:tcMar>
-          </w:tcPr>
-          <w:p>
-            <w:pPr>
-              <w:spacing w:line="240"/>
-            </w:pPr>
-            <w:r>
-              <w:rPr>
-                <w:sz w:val="21"/>
-                <w:szCs w:val="21"/>
-              </w:rPr>
-              <w:t xml:space="preserve">ACL</w:t>
-            </w:r>
-          </w:p>
-        </w:tc>
-        <w:tc>
-          <w:tcPr>
-            <w:tcW w:type="dxa" w:w="7060"/>
-            <w:tcBorders>
-              <w:top w:val="none" w:color="FFFFFF" w:sz="0"/>
-              <w:left w:val="none" w:color="FFFFFF" w:sz="0"/>
-              <w:bottom w:val="single" w:color="000000" w:sz="6"/>
-              <w:right w:val="none" w:color="FFFFFF" w:sz="0"/>
-            </w:tcBorders>
-            <w:tcMar>
-              <w:top w:type="dxa" w:w="40"/>
-              <w:left w:type="dxa" w:w="80"/>
-              <w:bottom w:type="dxa" w:w="40"/>
-              <w:right w:type="dxa" w:w="80"/>
-            </w:tcMar>
-          </w:tcPr>
-          <w:p>
-            <w:pPr>
-              <w:spacing w:line="240"/>
-            </w:pPr>
-            <w:r>
-              <w:rPr>
-                <w:sz w:val="21"/>
-                <w:szCs w:val="21"/>
-              </w:rPr>
-              <w:t xml:space="preserve">Lista de reglas «permitir / bloquear» que aplica el router.</w:t>
             </w:r>
           </w:p>
         </w:tc>
@@ -2309,7 +2229,7 @@
         <w:t xml:space="preserve">primera</w:t>
       </w:r>
       <w:r>
-        <w:t xml:space="preserve"> dirección útil de cada subred es siempre el gateway. El servidor SRV-TI (DNS) vive en la VLAN 40 con la IP fija 10.20.0.194. El cálculo completo, con la dirección de broadcast y la capacidad de cada subred, se presenta en el Anexo A.</w:t>
+        <w:t xml:space="preserve"> dirección útil de cada subred es siempre el gateway. El servidor SRV-TI vive en la VLAN 40 con la IP fija 10.20.0.194. El cálculo completo, con la dirección de broadcast y la capacidad de cada subred, se presenta en el Anexo A.</w:t>
       </w:r>
     </w:p>
     <w:p>
@@ -11441,7 +11361,7 @@
       <w:r>
         <w:drawing>
           <wp:inline distT="0" distB="0" distL="0" distR="0">
-            <wp:extent cx="3362325" cy="1114425"/>
+            <wp:extent cx="3362325" cy="974745"/>
             <wp:effectExtent t="0" r="0" b="0" l="0"/>
             <wp:docPr id="7" name=""/>
             <wp:cNvGraphicFramePr>
@@ -11466,7 +11386,7 @@
                   <pic:spPr bwMode="auto">
                     <a:xfrm>
                       <a:off x="0" y="0"/>
-                      <a:ext cx="3362325" cy="1114425"/>
+                      <a:ext cx="3362325" cy="974745"/>
                     </a:xfrm>
                     <a:prstGeom prst="rect">
                       <a:avLst/>
@@ -11555,7 +11475,7 @@
       </w:pPr>
       <w:bookmarkStart w:name="_Toc16" w:id="16"/>
       <w:r>
-        <w:t xml:space="preserve">Paso 8. Enrutamiento con OSPF</w:t>
+        <w:t xml:space="preserve">Paso 8. Enrutamiento con rutas estáticas</w:t>
       </w:r>
       <w:bookmarkEnd w:id="16"/>
     </w:p>
@@ -11564,7 +11484,7 @@
         <w:ind w:firstLine="720"/>
       </w:pPr>
       <w:r>
-        <w:t xml:space="preserve">OSPF hace que los routers se pasen la lista de redes que conocen. Con </w:t>
+        <w:t xml:space="preserve">Una ruta estática le dice al router, escrita a mano, por dónde mandar los paquetes hacia una red que no tiene conectada: </w:t>
       </w:r>
       <w:r>
         <w:rPr>
@@ -11572,32 +11492,10 @@
           <w:sz w:val="22"/>
           <w:szCs w:val="22"/>
         </w:rPr>
-        <w:t xml:space="preserve">network</w:t>
-      </w:r>
-      <w:r>
-        <w:t xml:space="preserve"> le decimos qué redes anunciar. </w:t>
-      </w:r>
-      <w:r>
-        <w:rPr>
-          <w:rFonts w:ascii="Courier New" w:cs="Courier New" w:eastAsia="Courier New" w:hAnsi="Courier New"/>
-          <w:sz w:val="22"/>
-          <w:szCs w:val="22"/>
-        </w:rPr>
-        <w:t xml:space="preserve">passive-interface</w:t>
-      </w:r>
-      <w:r>
-        <w:t xml:space="preserve"> evita mandar mensajes de OSPF hacia las PC, que no los necesitan. </w:t>
-      </w:r>
-      <w:r>
-        <w:rPr>
-          <w:rFonts w:ascii="Courier New" w:cs="Courier New" w:eastAsia="Courier New" w:hAnsi="Courier New"/>
-          <w:sz w:val="22"/>
-          <w:szCs w:val="22"/>
-        </w:rPr>
-        <w:t xml:space="preserve">router-id</w:t>
-      </w:r>
-      <w:r>
-        <w:t xml:space="preserve"> es solo un número de identificación (no tiene que existir como IP).</w:t>
+        <w:t xml:space="preserve">ip route red máscara siguiente-salto</w:t>
+      </w:r>
+      <w:r>
+        <w:t xml:space="preserve">. Como la red tiene forma de estrella (todas las regionales se conectan solo con R-CRG), alcanzan muy pocas rutas.</w:t>
       </w:r>
     </w:p>
     <w:p>
@@ -11613,18 +11511,7 @@
         <w:ind w:firstLine="720"/>
       </w:pPr>
       <w:r>
-        <w:t xml:space="preserve">R-CRG además tiene la ruta por defecto hacia el ISP y, con </w:t>
-      </w:r>
-      <w:r>
-        <w:rPr>
-          <w:rFonts w:ascii="Courier New" w:cs="Courier New" w:eastAsia="Courier New" w:hAnsi="Courier New"/>
-          <w:sz w:val="22"/>
-          <w:szCs w:val="22"/>
-        </w:rPr>
-        <w:t xml:space="preserve">default-information originate</w:t>
-      </w:r>
-      <w:r>
-        <w:t xml:space="preserve">, se la enseña a los routers regionales.</w:t>
+        <w:t xml:space="preserve">R-CRG necesita una ruta hacia la LAN de cada regional, por el enlace WAN que llega a ella, y una ruta por defecto hacia el ISP para todo lo demás.</w:t>
       </w:r>
     </w:p>
     <w:p>
@@ -11654,7 +11541,7 @@
           <w:sz w:val="19"/>
           <w:szCs w:val="19"/>
         </w:rPr>
-        <w:t xml:space="preserve">router ospf 1</w:t>
+        <w:t xml:space="preserve">ip route 10.20.1.0 255.255.255.224 172.31.255.2</w:t>
       </w:r>
     </w:p>
     <w:p>
@@ -11669,7 +11556,7 @@
           <w:sz w:val="19"/>
           <w:szCs w:val="19"/>
         </w:rPr>
-        <w:t xml:space="preserve"> router-id 1.1.1.1</w:t>
+        <w:t xml:space="preserve">ip route 10.20.1.32 255.255.255.224 172.31.255.6</w:t>
       </w:r>
     </w:p>
     <w:p>
@@ -11684,127 +11571,7 @@
           <w:sz w:val="19"/>
           <w:szCs w:val="19"/>
         </w:rPr>
-        <w:t xml:space="preserve"> network 10.20.0.0 0.0.0.255 area 0</w:t>
-      </w:r>
-    </w:p>
-    <w:p>
-      <w:pPr>
-        <w:shd w:fill="EDEDED" w:color="auto" w:val="clear"/>
-        <w:spacing w:after="0" w:before="0" w:line="240"/>
-        <w:ind w:left="360"/>
-      </w:pPr>
-      <w:r>
-        <w:rPr>
-          <w:rFonts w:ascii="Courier New" w:cs="Courier New" w:eastAsia="Courier New" w:hAnsi="Courier New"/>
-          <w:sz w:val="19"/>
-          <w:szCs w:val="19"/>
-        </w:rPr>
-        <w:t xml:space="preserve"> network 172.31.255.0 0.0.0.15 area 0</w:t>
-      </w:r>
-    </w:p>
-    <w:p>
-      <w:pPr>
-        <w:shd w:fill="EDEDED" w:color="auto" w:val="clear"/>
-        <w:spacing w:after="0" w:before="0" w:line="240"/>
-        <w:ind w:left="360"/>
-      </w:pPr>
-      <w:r>
-        <w:rPr>
-          <w:rFonts w:ascii="Courier New" w:cs="Courier New" w:eastAsia="Courier New" w:hAnsi="Courier New"/>
-          <w:sz w:val="19"/>
-          <w:szCs w:val="19"/>
-        </w:rPr>
-        <w:t xml:space="preserve"> passive-interface GigabitEthernet0/0.10</w:t>
-      </w:r>
-    </w:p>
-    <w:p>
-      <w:pPr>
-        <w:shd w:fill="EDEDED" w:color="auto" w:val="clear"/>
-        <w:spacing w:after="0" w:before="0" w:line="240"/>
-        <w:ind w:left="360"/>
-      </w:pPr>
-      <w:r>
-        <w:rPr>
-          <w:rFonts w:ascii="Courier New" w:cs="Courier New" w:eastAsia="Courier New" w:hAnsi="Courier New"/>
-          <w:sz w:val="19"/>
-          <w:szCs w:val="19"/>
-        </w:rPr>
-        <w:t xml:space="preserve"> passive-interface GigabitEthernet0/0.20</w:t>
-      </w:r>
-    </w:p>
-    <w:p>
-      <w:pPr>
-        <w:shd w:fill="EDEDED" w:color="auto" w:val="clear"/>
-        <w:spacing w:after="0" w:before="0" w:line="240"/>
-        <w:ind w:left="360"/>
-      </w:pPr>
-      <w:r>
-        <w:rPr>
-          <w:rFonts w:ascii="Courier New" w:cs="Courier New" w:eastAsia="Courier New" w:hAnsi="Courier New"/>
-          <w:sz w:val="19"/>
-          <w:szCs w:val="19"/>
-        </w:rPr>
-        <w:t xml:space="preserve"> passive-interface GigabitEthernet0/0.30</w:t>
-      </w:r>
-    </w:p>
-    <w:p>
-      <w:pPr>
-        <w:shd w:fill="EDEDED" w:color="auto" w:val="clear"/>
-        <w:spacing w:after="0" w:before="0" w:line="240"/>
-        <w:ind w:left="360"/>
-      </w:pPr>
-      <w:r>
-        <w:rPr>
-          <w:rFonts w:ascii="Courier New" w:cs="Courier New" w:eastAsia="Courier New" w:hAnsi="Courier New"/>
-          <w:sz w:val="19"/>
-          <w:szCs w:val="19"/>
-        </w:rPr>
-        <w:t xml:space="preserve"> passive-interface GigabitEthernet0/0.40</w:t>
-      </w:r>
-    </w:p>
-    <w:p>
-      <w:pPr>
-        <w:shd w:fill="EDEDED" w:color="auto" w:val="clear"/>
-        <w:spacing w:after="0" w:before="0" w:line="240"/>
-        <w:ind w:left="360"/>
-      </w:pPr>
-      <w:r>
-        <w:rPr>
-          <w:rFonts w:ascii="Courier New" w:cs="Courier New" w:eastAsia="Courier New" w:hAnsi="Courier New"/>
-          <w:sz w:val="19"/>
-          <w:szCs w:val="19"/>
-        </w:rPr>
-        <w:t xml:space="preserve"> passive-interface GigabitEthernet0/0.50</w:t>
-      </w:r>
-    </w:p>
-    <w:p>
-      <w:pPr>
-        <w:shd w:fill="EDEDED" w:color="auto" w:val="clear"/>
-        <w:spacing w:after="0" w:before="0" w:line="240"/>
-        <w:ind w:left="360"/>
-      </w:pPr>
-      <w:r>
-        <w:rPr>
-          <w:rFonts w:ascii="Courier New" w:cs="Courier New" w:eastAsia="Courier New" w:hAnsi="Courier New"/>
-          <w:sz w:val="19"/>
-          <w:szCs w:val="19"/>
-        </w:rPr>
-        <w:t xml:space="preserve"> default-information originate</w:t>
-      </w:r>
-    </w:p>
-    <w:p>
-      <w:pPr>
-        <w:shd w:fill="EDEDED" w:color="auto" w:val="clear"/>
-        <w:spacing w:after="240" w:before="0" w:line="240"/>
-        <w:ind w:left="360"/>
-      </w:pPr>
-      <w:r>
-        <w:rPr>
-          <w:rFonts w:ascii="Courier New" w:cs="Courier New" w:eastAsia="Courier New" w:hAnsi="Courier New"/>
-          <w:sz w:val="19"/>
-          <w:szCs w:val="19"/>
-        </w:rPr>
-        <w:t xml:space="preserve"> exit</w:t>
+        <w:t xml:space="preserve">ip route 10.20.1.64 255.255.255.224 172.31.255.10</w:t>
       </w:r>
     </w:p>
     <w:p>
@@ -11820,7 +11587,7 @@
         <w:ind w:firstLine="720"/>
       </w:pPr>
       <w:r>
-        <w:t xml:space="preserve">Ejemplo de R-NORTE. En R-SUR usa </w:t>
+        <w:t xml:space="preserve">Cada router regional solo conoce su propia LAN y su enlace WAN; todo lo demás está detrás de R-CRG. Por eso basta una ruta por defecto que apunte a la IP de R-CRG en ese enlace. Ejemplo de R-NORTE; en R-SUR el siguiente salto es </w:t>
       </w:r>
       <w:r>
         <w:rPr>
@@ -11828,10 +11595,10 @@
           <w:sz w:val="22"/>
           <w:szCs w:val="22"/>
         </w:rPr>
-        <w:t xml:space="preserve">router-id 3.3.3.3</w:t>
-      </w:r>
-      <w:r>
-        <w:t xml:space="preserve">, </w:t>
+        <w:t xml:space="preserve">172.31.255.5</w:t>
+      </w:r>
+      <w:r>
+        <w:t xml:space="preserve"> y en R-ESTE, </w:t>
       </w:r>
       <w:r>
         <w:rPr>
@@ -11839,54 +11606,10 @@
           <w:sz w:val="22"/>
           <w:szCs w:val="22"/>
         </w:rPr>
-        <w:t xml:space="preserve">network 10.20.1.32 0.0.0.31</w:t>
-      </w:r>
-      <w:r>
-        <w:t xml:space="preserve">, </w:t>
-      </w:r>
-      <w:r>
-        <w:rPr>
-          <w:rFonts w:ascii="Courier New" w:cs="Courier New" w:eastAsia="Courier New" w:hAnsi="Courier New"/>
-          <w:sz w:val="22"/>
-          <w:szCs w:val="22"/>
-        </w:rPr>
-        <w:t xml:space="preserve">network 172.31.255.4 0.0.0.3</w:t>
-      </w:r>
-      <w:r>
-        <w:t xml:space="preserve"> y la subinterfaz .70. En R-ESTE usa </w:t>
-      </w:r>
-      <w:r>
-        <w:rPr>
-          <w:rFonts w:ascii="Courier New" w:cs="Courier New" w:eastAsia="Courier New" w:hAnsi="Courier New"/>
-          <w:sz w:val="22"/>
-          <w:szCs w:val="22"/>
-        </w:rPr>
-        <w:t xml:space="preserve">4.4.4.4</w:t>
-      </w:r>
-      <w:r>
-        <w:t xml:space="preserve">, </w:t>
-      </w:r>
-      <w:r>
-        <w:rPr>
-          <w:rFonts w:ascii="Courier New" w:cs="Courier New" w:eastAsia="Courier New" w:hAnsi="Courier New"/>
-          <w:sz w:val="22"/>
-          <w:szCs w:val="22"/>
-        </w:rPr>
-        <w:t xml:space="preserve">10.20.1.64</w:t>
-      </w:r>
-      <w:r>
-        <w:t xml:space="preserve">, </w:t>
-      </w:r>
-      <w:r>
-        <w:rPr>
-          <w:rFonts w:ascii="Courier New" w:cs="Courier New" w:eastAsia="Courier New" w:hAnsi="Courier New"/>
-          <w:sz w:val="22"/>
-          <w:szCs w:val="22"/>
-        </w:rPr>
-        <w:t xml:space="preserve">172.31.255.8</w:t>
-      </w:r>
-      <w:r>
-        <w:t xml:space="preserve"> y la subinterfaz .80.</w:t>
+        <w:t xml:space="preserve">172.31.255.9</w:t>
+      </w:r>
+      <w:r>
+        <w:t xml:space="preserve">.</w:t>
       </w:r>
     </w:p>
     <w:p>
@@ -11901,82 +11624,7 @@
           <w:sz w:val="19"/>
           <w:szCs w:val="19"/>
         </w:rPr>
-        <w:t xml:space="preserve">router ospf 1</w:t>
-      </w:r>
-    </w:p>
-    <w:p>
-      <w:pPr>
-        <w:shd w:fill="EDEDED" w:color="auto" w:val="clear"/>
-        <w:spacing w:after="0" w:before="0" w:line="240"/>
-        <w:ind w:left="360"/>
-      </w:pPr>
-      <w:r>
-        <w:rPr>
-          <w:rFonts w:ascii="Courier New" w:cs="Courier New" w:eastAsia="Courier New" w:hAnsi="Courier New"/>
-          <w:sz w:val="19"/>
-          <w:szCs w:val="19"/>
-        </w:rPr>
-        <w:t xml:space="preserve"> router-id 2.2.2.2</w:t>
-      </w:r>
-    </w:p>
-    <w:p>
-      <w:pPr>
-        <w:shd w:fill="EDEDED" w:color="auto" w:val="clear"/>
-        <w:spacing w:after="0" w:before="0" w:line="240"/>
-        <w:ind w:left="360"/>
-      </w:pPr>
-      <w:r>
-        <w:rPr>
-          <w:rFonts w:ascii="Courier New" w:cs="Courier New" w:eastAsia="Courier New" w:hAnsi="Courier New"/>
-          <w:sz w:val="19"/>
-          <w:szCs w:val="19"/>
-        </w:rPr>
-        <w:t xml:space="preserve"> network 10.20.1.0 0.0.0.31 area 0</w:t>
-      </w:r>
-    </w:p>
-    <w:p>
-      <w:pPr>
-        <w:shd w:fill="EDEDED" w:color="auto" w:val="clear"/>
-        <w:spacing w:after="0" w:before="0" w:line="240"/>
-        <w:ind w:left="360"/>
-      </w:pPr>
-      <w:r>
-        <w:rPr>
-          <w:rFonts w:ascii="Courier New" w:cs="Courier New" w:eastAsia="Courier New" w:hAnsi="Courier New"/>
-          <w:sz w:val="19"/>
-          <w:szCs w:val="19"/>
-        </w:rPr>
-        <w:t xml:space="preserve"> network 172.31.255.0 0.0.0.3 area 0</w:t>
-      </w:r>
-    </w:p>
-    <w:p>
-      <w:pPr>
-        <w:shd w:fill="EDEDED" w:color="auto" w:val="clear"/>
-        <w:spacing w:after="0" w:before="0" w:line="240"/>
-        <w:ind w:left="360"/>
-      </w:pPr>
-      <w:r>
-        <w:rPr>
-          <w:rFonts w:ascii="Courier New" w:cs="Courier New" w:eastAsia="Courier New" w:hAnsi="Courier New"/>
-          <w:sz w:val="19"/>
-          <w:szCs w:val="19"/>
-        </w:rPr>
-        <w:t xml:space="preserve"> passive-interface GigabitEthernet0/0.60</w:t>
-      </w:r>
-    </w:p>
-    <w:p>
-      <w:pPr>
-        <w:shd w:fill="EDEDED" w:color="auto" w:val="clear"/>
-        <w:spacing w:after="240" w:before="0" w:line="240"/>
-        <w:ind w:left="360"/>
-      </w:pPr>
-      <w:r>
-        <w:rPr>
-          <w:rFonts w:ascii="Courier New" w:cs="Courier New" w:eastAsia="Courier New" w:hAnsi="Courier New"/>
-          <w:sz w:val="19"/>
-          <w:szCs w:val="19"/>
-        </w:rPr>
-        <w:t xml:space="preserve"> exit</w:t>
+        <w:t xml:space="preserve">ip route 0.0.0.0 0.0.0.0 172.31.255.1</w:t>
       </w:r>
     </w:p>
     <w:p>
@@ -11984,7 +11632,7 @@
         <w:pStyle w:val="Heading3"/>
       </w:pPr>
       <w:r>
-        <w:t xml:space="preserve">8.3 Comprobar OSPF</w:t>
+        <w:t xml:space="preserve">8.3 Comprobar las rutas</w:t>
       </w:r>
     </w:p>
     <w:p>
@@ -11992,7 +11640,7 @@
         <w:ind w:firstLine="720"/>
       </w:pPr>
       <w:r>
-        <w:t xml:space="preserve">Espera unos 40 segundos (o presiona el botón de adelantar tiempo, abajo a la izquierda). En R-CRG escribe </w:t>
+        <w:t xml:space="preserve">En R-CRG escribe </w:t>
       </w:r>
       <w:r>
         <w:rPr>
@@ -12000,41 +11648,34 @@
           <w:sz w:val="22"/>
           <w:szCs w:val="22"/>
         </w:rPr>
-        <w:t xml:space="preserve">show ip ospf neighbor</w:t>
-      </w:r>
-      <w:r>
-        <w:t xml:space="preserve">: deben aparecer los tres vecinos en estado </w:t>
+        <w:t xml:space="preserve">show ip route static</w:t>
+      </w:r>
+      <w:r>
+        <w:t xml:space="preserve">: deben aparecer las tres redes regionales con la letra </w:t>
       </w:r>
       <w:r>
         <w:rPr>
           <w:b/>
           <w:bCs/>
         </w:rPr>
-        <w:t xml:space="preserve">FULL</w:t>
-      </w:r>
-      <w:r>
-        <w:t xml:space="preserve"> (Figura 9). Con </w:t>
-      </w:r>
-      <w:r>
-        <w:rPr>
-          <w:rFonts w:ascii="Courier New" w:cs="Courier New" w:eastAsia="Courier New" w:hAnsi="Courier New"/>
-          <w:sz w:val="22"/>
-          <w:szCs w:val="22"/>
-        </w:rPr>
-        <w:t xml:space="preserve">show ip route ospf</w:t>
-      </w:r>
-      <w:r>
-        <w:t xml:space="preserve"> se ven las tres redes regionales aprendidas con la letra </w:t>
+        <w:t xml:space="preserve">S</w:t>
+      </w:r>
+      <w:r>
+        <w:t xml:space="preserve"> y la ruta por defecto con </w:t>
       </w:r>
       <w:r>
         <w:rPr>
           <w:b/>
           <w:bCs/>
         </w:rPr>
-        <w:t xml:space="preserve">O</w:t>
-      </w:r>
-      <w:r>
-        <w:t xml:space="preserve"> (Figura 10).</w:t>
+        <w:t xml:space="preserve">S</w:t>
+      </w:r>
+      <w:r>
+        <w:rPr>
+          <w:i/>
+          <w:iCs/>
+        </w:rPr>
+        <w:t xml:space="preserve"> (Figura 9). En R-NORTE, el mismo comando muestra solo la ruta por defecto hacia R-CRG (Figura 10)</w:t>
       </w:r>
     </w:p>
     <w:p>
@@ -12058,7 +11699,7 @@
           <w:i/>
           <w:iCs/>
         </w:rPr>
-        <w:t xml:space="preserve">Vecinos OSPF de R-CRG</w:t>
+        <w:t xml:space="preserve">Rutas estáticas en R-CRG</w:t>
       </w:r>
     </w:p>
     <w:p>
@@ -12069,7 +11710,7 @@
       <w:r>
         <w:drawing>
           <wp:inline distT="0" distB="0" distL="0" distR="0">
-            <wp:extent cx="5753100" cy="1117745"/>
+            <wp:extent cx="4372356" cy="1117745"/>
             <wp:effectExtent t="0" r="0" b="0" l="0"/>
             <wp:docPr id="9" name=""/>
             <wp:cNvGraphicFramePr>
@@ -12094,7 +11735,7 @@
                   <pic:spPr bwMode="auto">
                     <a:xfrm>
                       <a:off x="0" y="0"/>
-                      <a:ext cx="5753100" cy="1117745"/>
+                      <a:ext cx="4372356" cy="1117745"/>
                     </a:xfrm>
                     <a:prstGeom prst="rect">
                       <a:avLst/>
@@ -12128,7 +11769,7 @@
           <w:i/>
           <w:iCs/>
         </w:rPr>
-        <w:t xml:space="preserve">Rutas aprendidas por OSPF en R-CRG</w:t>
+        <w:t xml:space="preserve">Ruta por defecto en R-NORTE</w:t>
       </w:r>
     </w:p>
     <w:p>
@@ -12139,7 +11780,7 @@
       <w:r>
         <w:drawing>
           <wp:inline distT="0" distB="0" distL="0" distR="0">
-            <wp:extent cx="5105400" cy="975065"/>
+            <wp:extent cx="2859462" cy="547789"/>
             <wp:effectExtent t="0" r="0" b="0" l="0"/>
             <wp:docPr id="10" name=""/>
             <wp:cNvGraphicFramePr>
@@ -12164,7 +11805,7 @@
                   <pic:spPr bwMode="auto">
                     <a:xfrm>
                       <a:off x="0" y="0"/>
-                      <a:ext cx="5105400" cy="975065"/>
+                      <a:ext cx="2859462" cy="547789"/>
                     </a:xfrm>
                     <a:prstGeom prst="rect">
                       <a:avLst/>
@@ -12368,36 +12009,6 @@
           <w:szCs w:val="19"/>
         </w:rPr>
         <w:t xml:space="preserve"> default-router 10.20.0.1</w:t>
-      </w:r>
-    </w:p>
-    <w:p>
-      <w:pPr>
-        <w:shd w:fill="EDEDED" w:color="auto" w:val="clear"/>
-        <w:spacing w:after="0" w:before="0" w:line="240"/>
-        <w:ind w:left="360"/>
-      </w:pPr>
-      <w:r>
-        <w:rPr>
-          <w:rFonts w:ascii="Courier New" w:cs="Courier New" w:eastAsia="Courier New" w:hAnsi="Courier New"/>
-          <w:sz w:val="19"/>
-          <w:szCs w:val="19"/>
-        </w:rPr>
-        <w:t xml:space="preserve"> dns-server 10.20.0.194</w:t>
-      </w:r>
-    </w:p>
-    <w:p>
-      <w:pPr>
-        <w:shd w:fill="EDEDED" w:color="auto" w:val="clear"/>
-        <w:spacing w:after="0" w:before="0" w:line="240"/>
-        <w:ind w:left="360"/>
-      </w:pPr>
-      <w:r>
-        <w:rPr>
-          <w:rFonts w:ascii="Courier New" w:cs="Courier New" w:eastAsia="Courier New" w:hAnsi="Courier New"/>
-          <w:sz w:val="19"/>
-          <w:szCs w:val="19"/>
-        </w:rPr>
-        <w:t xml:space="preserve"> domain-name crg.local</w:t>
       </w:r>
     </w:p>
     <w:p>
@@ -13287,15 +12898,24 @@
       </w:tr>
     </w:tbl>
     <w:p>
+      <w:pPr/>
       <w:r>
         <w:rPr>
           <w:i/>
           <w:iCs/>
         </w:rPr>
-        <w:t xml:space="preserve">Nota. </w:t>
-      </w:r>
-      <w:r>
-        <w:t xml:space="preserve">Todos llevan </w:t>
+        <w:t xml:space="preserve">Nota.</w:t>
+      </w:r>
+      <w:r>
+        <w:t xml:space="preserve"> Todos los pools siguen la misma estructura; solo cambian el nombre, la red y el gateway.</w:t>
+      </w:r>
+    </w:p>
+    <w:p>
+      <w:pPr>
+        <w:ind w:firstLine="720"/>
+      </w:pPr>
+      <w:r>
+        <w:t xml:space="preserve">¿Cómo llega el DHCP a las regionales si está lejos? Gracias al </w:t>
       </w:r>
       <w:r>
         <w:rPr>
@@ -13303,36 +12923,6 @@
           <w:sz w:val="22"/>
           <w:szCs w:val="22"/>
         </w:rPr>
-        <w:t xml:space="preserve">dns-server 10.20.0.194</w:t>
-      </w:r>
-      <w:r>
-        <w:t xml:space="preserve"> y </w:t>
-      </w:r>
-      <w:r>
-        <w:rPr>
-          <w:rFonts w:ascii="Courier New" w:cs="Courier New" w:eastAsia="Courier New" w:hAnsi="Courier New"/>
-          <w:sz w:val="22"/>
-          <w:szCs w:val="22"/>
-        </w:rPr>
-        <w:t xml:space="preserve">domain-name crg.local</w:t>
-      </w:r>
-      <w:r>
-        <w:t xml:space="preserve">.</w:t>
-      </w:r>
-    </w:p>
-    <w:p>
-      <w:pPr>
-        <w:ind w:firstLine="720"/>
-      </w:pPr>
-      <w:r>
-        <w:t xml:space="preserve">¿Cómo llega el DHCP a las regionales si está lejos? Gracias al </w:t>
-      </w:r>
-      <w:r>
-        <w:rPr>
-          <w:rFonts w:ascii="Courier New" w:cs="Courier New" w:eastAsia="Courier New" w:hAnsi="Courier New"/>
-          <w:sz w:val="22"/>
-          <w:szCs w:val="22"/>
-        </w:rPr>
         <w:t xml:space="preserve">ip helper-address</w:t>
       </w:r>
       <w:r>
@@ -13345,7 +12935,7 @@
       </w:pPr>
       <w:bookmarkStart w:name="_Toc18" w:id="18"/>
       <w:r>
-        <w:t xml:space="preserve">Paso 10. Servidor SRV-TI (DNS)</w:t>
+        <w:t xml:space="preserve">Paso 10. IP fija de los servidores</w:t>
       </w:r>
       <w:bookmarkEnd w:id="18"/>
     </w:p>
@@ -13431,268 +13021,25 @@
         <w:t xml:space="preserve">10.20.0.193</w:t>
       </w:r>
       <w:r>
-        <w:t xml:space="preserve">, DNS </w:t>
-      </w:r>
-      <w:r>
-        <w:rPr>
-          <w:rFonts w:ascii="Courier New" w:cs="Courier New" w:eastAsia="Courier New" w:hAnsi="Courier New"/>
-          <w:sz w:val="22"/>
-          <w:szCs w:val="22"/>
-        </w:rPr>
-        <w:t xml:space="preserve">10.20.0.194</w:t>
-      </w:r>
-      <w:r>
         <w:t xml:space="preserve">.</w:t>
       </w:r>
     </w:p>
     <w:p>
       <w:pPr>
-        <w:pStyle w:val="ListParagraph"/>
-        <w:numPr>
-          <w:ilvl w:val="0"/>
-          <w:numId w:val="5"/>
-        </w:numPr>
-      </w:pPr>
-      <w:r>
-        <w:t xml:space="preserve">Ve a la pestaña </w:t>
+        <w:ind w:firstLine="720"/>
+      </w:pPr>
+      <w:r>
+        <w:t xml:space="preserve">Haz lo mismo con </w:t>
       </w:r>
       <w:r>
         <w:rPr>
           <w:b/>
           <w:bCs/>
         </w:rPr>
-        <w:t xml:space="preserve">Services</w:t>
-      </w:r>
-      <w:r>
-        <w:t xml:space="preserve"> &gt; </w:t>
-      </w:r>
-      <w:r>
-        <w:rPr>
-          <w:b/>
-          <w:bCs/>
-        </w:rPr>
-        <w:t xml:space="preserve">DNS</w:t>
-      </w:r>
-      <w:r>
-        <w:t xml:space="preserve">. Marca </w:t>
-      </w:r>
-      <w:r>
-        <w:rPr>
-          <w:b/>
-          <w:bCs/>
-        </w:rPr>
-        <w:t xml:space="preserve">On</w:t>
-      </w:r>
-      <w:r>
-        <w:t xml:space="preserve">.</w:t>
-      </w:r>
-    </w:p>
-    <w:p>
-      <w:pPr>
-        <w:pStyle w:val="ListParagraph"/>
-        <w:numPr>
-          <w:ilvl w:val="0"/>
-          <w:numId w:val="5"/>
-        </w:numPr>
-      </w:pPr>
-      <w:r>
-        <w:t xml:space="preserve">En </w:t>
-      </w:r>
-      <w:r>
-        <w:rPr>
-          <w:b/>
-          <w:bCs/>
-        </w:rPr>
-        <w:t xml:space="preserve">Name</w:t>
-      </w:r>
-      <w:r>
-        <w:t xml:space="preserve"> escribe </w:t>
-      </w:r>
-      <w:r>
-        <w:rPr>
-          <w:rFonts w:ascii="Courier New" w:cs="Courier New" w:eastAsia="Courier New" w:hAnsi="Courier New"/>
-          <w:sz w:val="22"/>
-          <w:szCs w:val="22"/>
-        </w:rPr>
-        <w:t xml:space="preserve">intranet.crg.local</w:t>
-      </w:r>
-      <w:r>
-        <w:t xml:space="preserve">, en </w:t>
-      </w:r>
-      <w:r>
-        <w:rPr>
-          <w:b/>
-          <w:bCs/>
-        </w:rPr>
-        <w:t xml:space="preserve">Address</w:t>
-      </w:r>
-      <w:r>
-        <w:t xml:space="preserve"> </w:t>
-      </w:r>
-      <w:r>
-        <w:rPr>
-          <w:rFonts w:ascii="Courier New" w:cs="Courier New" w:eastAsia="Courier New" w:hAnsi="Courier New"/>
-          <w:sz w:val="22"/>
-          <w:szCs w:val="22"/>
-        </w:rPr>
-        <w:t xml:space="preserve">10.20.0.194</w:t>
-      </w:r>
-      <w:r>
-        <w:t xml:space="preserve"> y presiona </w:t>
-      </w:r>
-      <w:r>
-        <w:rPr>
-          <w:b/>
-          <w:bCs/>
-        </w:rPr>
-        <w:t xml:space="preserve">Add</w:t>
-      </w:r>
-      <w:r>
-        <w:t xml:space="preserve">.</w:t>
-      </w:r>
-    </w:p>
-    <w:p>
-      <w:pPr>
-        <w:pStyle w:val="ListParagraph"/>
-        <w:numPr>
-          <w:ilvl w:val="0"/>
-          <w:numId w:val="5"/>
-        </w:numPr>
-      </w:pPr>
-      <w:r>
-        <w:t xml:space="preserve">Repite con </w:t>
-      </w:r>
-      <w:r>
-        <w:rPr>
-          <w:rFonts w:ascii="Courier New" w:cs="Courier New" w:eastAsia="Courier New" w:hAnsi="Courier New"/>
-          <w:sz w:val="22"/>
-          <w:szCs w:val="22"/>
-        </w:rPr>
-        <w:t xml:space="preserve">archivos.crg.local</w:t>
-      </w:r>
-      <w:r>
-        <w:t xml:space="preserve"> → </w:t>
-      </w:r>
-      <w:r>
-        <w:rPr>
-          <w:rFonts w:ascii="Courier New" w:cs="Courier New" w:eastAsia="Courier New" w:hAnsi="Courier New"/>
-          <w:sz w:val="22"/>
-          <w:szCs w:val="22"/>
-        </w:rPr>
-        <w:t xml:space="preserve">10.20.0.194</w:t>
-      </w:r>
-      <w:r>
-        <w:t xml:space="preserve"> y con </w:t>
-      </w:r>
-      <w:r>
-        <w:rPr>
-          <w:rFonts w:ascii="Courier New" w:cs="Courier New" w:eastAsia="Courier New" w:hAnsi="Courier New"/>
-          <w:sz w:val="22"/>
-          <w:szCs w:val="22"/>
-        </w:rPr>
-        <w:t xml:space="preserve">www.externo.net</w:t>
-      </w:r>
-      <w:r>
-        <w:t xml:space="preserve"> → </w:t>
-      </w:r>
-      <w:r>
-        <w:rPr>
-          <w:rFonts w:ascii="Courier New" w:cs="Courier New" w:eastAsia="Courier New" w:hAnsi="Courier New"/>
-          <w:sz w:val="22"/>
-          <w:szCs w:val="22"/>
-        </w:rPr>
-        <w:t xml:space="preserve">198.51.100.10</w:t>
-      </w:r>
-      <w:r>
-        <w:t xml:space="preserve">.</w:t>
-      </w:r>
-    </w:p>
-    <w:p>
-      <w:pPr>
-        <w:keepNext/>
-      </w:pPr>
-      <w:r>
-        <w:rPr>
-          <w:b/>
-          <w:bCs/>
-        </w:rPr>
-        <w:t xml:space="preserve">Figura 11</w:t>
-      </w:r>
-    </w:p>
-    <w:p>
-      <w:pPr>
-        <w:keepNext/>
-      </w:pPr>
-      <w:r>
-        <w:rPr>
-          <w:i/>
-          <w:iCs/>
-        </w:rPr>
-        <w:t xml:space="preserve">Registros del servicio DNS en SRV-TI</w:t>
-      </w:r>
-    </w:p>
-    <w:p>
-      <w:pPr>
-        <w:keepNext w:val="false"/>
-        <w:spacing w:after="360" w:line="240"/>
-      </w:pPr>
-      <w:r>
-        <w:drawing>
-          <wp:inline distT="0" distB="0" distL="0" distR="0">
-            <wp:extent cx="5810250" cy="2253672"/>
-            <wp:effectExtent t="0" r="0" b="0" l="0"/>
-            <wp:docPr id="11" name=""/>
-            <wp:cNvGraphicFramePr>
-              <a:graphicFrameLocks xmlns:a="http://schemas.openxmlformats.org/drawingml/2006/main" noChangeAspect="1"/>
-            </wp:cNvGraphicFramePr>
-            <a:graphic xmlns:a="http://schemas.openxmlformats.org/drawingml/2006/main">
-              <a:graphicData uri="http://schemas.openxmlformats.org/drawingml/2006/picture">
-                <pic:pic xmlns:pic="http://schemas.openxmlformats.org/drawingml/2006/picture">
-                  <pic:nvPicPr>
-                    <pic:cNvPr id="0" name="" descr=""/>
-                    <pic:cNvPicPr>
-                      <a:picLocks noChangeAspect="1" noChangeArrowheads="1"/>
-                    </pic:cNvPicPr>
-                  </pic:nvPicPr>
-                  <pic:blipFill>
-                    <a:blip r:embed="rId18" cstate="none"/>
-                    <a:srcRect/>
-                    <a:stretch>
-                      <a:fillRect/>
-                    </a:stretch>
-                  </pic:blipFill>
-                  <pic:spPr bwMode="auto">
-                    <a:xfrm>
-                      <a:off x="0" y="0"/>
-                      <a:ext cx="5810250" cy="2253672"/>
-                    </a:xfrm>
-                    <a:prstGeom prst="rect">
-                      <a:avLst/>
-                    </a:prstGeom>
-                  </pic:spPr>
-                </pic:pic>
-              </a:graphicData>
-            </a:graphic>
-          </wp:inline>
-        </w:drawing>
-      </w:r>
-    </w:p>
-    <w:p>
-      <w:pPr>
-        <w:ind w:firstLine="720"/>
-      </w:pPr>
-      <w:r>
-        <w:t xml:space="preserve">Haz lo mismo con </w:t>
-      </w:r>
-      <w:r>
-        <w:rPr>
-          <w:b/>
-          <w:bCs/>
-        </w:rPr>
         <w:t xml:space="preserve">WEB-EXT</w:t>
       </w:r>
       <w:r>
-        <w:t xml:space="preserve"> (solo la IP): </w:t>
+        <w:t xml:space="preserve">: </w:t>
       </w:r>
       <w:r>
         <w:rPr>
@@ -14106,298 +13453,9 @@
       <w:pPr>
         <w:pStyle w:val="Heading2"/>
       </w:pPr>
-      <w:bookmarkStart w:name="_Toc20" w:id="20"/>
-      <w:r>
-        <w:t xml:space="preserve">Paso 12. Seguridad: ACL y acceso remoto</w:t>
-      </w:r>
-      <w:bookmarkEnd w:id="20"/>
-    </w:p>
-    <w:p>
-      <w:pPr>
-        <w:ind w:firstLine="720"/>
-      </w:pPr>
-      <w:r>
-        <w:t xml:space="preserve">Regla del caso: el área de </w:t>
-      </w:r>
-      <w:r>
-        <w:rPr>
-          <w:b/>
-          <w:bCs/>
-        </w:rPr>
-        <w:t xml:space="preserve">Capacitación</w:t>
-      </w:r>
-      <w:r>
-        <w:t xml:space="preserve"> (VLAN 30) no debe llegar a </w:t>
-      </w:r>
-      <w:r>
-        <w:rPr>
-          <w:b/>
-          <w:bCs/>
-        </w:rPr>
-        <w:t xml:space="preserve">Finanzas</w:t>
-      </w:r>
-      <w:r>
-        <w:t xml:space="preserve"> (VLAN 50); todo lo demás sí. La ACL se pone «de salida» en la subinterfaz de Finanzas, que es justo antes de entrar a esa red. Además, solo la VLAN 40 (Administración/TI) puede entrar por Telnet a los routers.</w:t>
-      </w:r>
-    </w:p>
-    <w:p>
-      <w:pPr>
-        <w:shd w:fill="EDEDED" w:color="auto" w:val="clear"/>
-        <w:spacing w:after="0" w:before="120" w:line="240"/>
-        <w:ind w:left="360"/>
-      </w:pPr>
-      <w:r>
-        <w:rPr>
-          <w:rFonts w:ascii="Courier New" w:cs="Courier New" w:eastAsia="Courier New" w:hAnsi="Courier New"/>
-          <w:sz w:val="19"/>
-          <w:szCs w:val="19"/>
-        </w:rPr>
-        <w:t xml:space="preserve">ip access-list extended ACL-FINANZAS</w:t>
-      </w:r>
-    </w:p>
-    <w:p>
-      <w:pPr>
-        <w:shd w:fill="EDEDED" w:color="auto" w:val="clear"/>
-        <w:spacing w:after="0" w:before="0" w:line="240"/>
-        <w:ind w:left="360"/>
-      </w:pPr>
-      <w:r>
-        <w:rPr>
-          <w:rFonts w:ascii="Courier New" w:cs="Courier New" w:eastAsia="Courier New" w:hAnsi="Courier New"/>
-          <w:sz w:val="19"/>
-          <w:szCs w:val="19"/>
-        </w:rPr>
-        <w:t xml:space="preserve"> deny ip 10.20.0.128 0.0.0.63 10.20.0.224 0.0.0.31</w:t>
-      </w:r>
-    </w:p>
-    <w:p>
-      <w:pPr>
-        <w:shd w:fill="EDEDED" w:color="auto" w:val="clear"/>
-        <w:spacing w:after="0" w:before="0" w:line="240"/>
-        <w:ind w:left="360"/>
-      </w:pPr>
-      <w:r>
-        <w:rPr>
-          <w:rFonts w:ascii="Courier New" w:cs="Courier New" w:eastAsia="Courier New" w:hAnsi="Courier New"/>
-          <w:sz w:val="19"/>
-          <w:szCs w:val="19"/>
-        </w:rPr>
-        <w:t xml:space="preserve"> permit ip any any</w:t>
-      </w:r>
-    </w:p>
-    <w:p>
-      <w:pPr>
-        <w:shd w:fill="EDEDED" w:color="auto" w:val="clear"/>
-        <w:spacing w:after="0" w:before="0" w:line="240"/>
-        <w:ind w:left="360"/>
-      </w:pPr>
-      <w:r>
-        <w:rPr>
-          <w:rFonts w:ascii="Courier New" w:cs="Courier New" w:eastAsia="Courier New" w:hAnsi="Courier New"/>
-          <w:sz w:val="19"/>
-          <w:szCs w:val="19"/>
-        </w:rPr>
-        <w:t xml:space="preserve"> exit</w:t>
-      </w:r>
-    </w:p>
-    <w:p>
-      <w:pPr>
-        <w:shd w:fill="EDEDED" w:color="auto" w:val="clear"/>
-        <w:spacing w:after="0" w:before="0" w:line="240"/>
-        <w:ind w:left="360"/>
-      </w:pPr>
-      <w:r>
-        <w:rPr>
-          <w:rFonts w:ascii="Courier New" w:cs="Courier New" w:eastAsia="Courier New" w:hAnsi="Courier New"/>
-          <w:sz w:val="19"/>
-          <w:szCs w:val="19"/>
-        </w:rPr>
-        <w:t xml:space="preserve">interface GigabitEthernet0/0.50</w:t>
-      </w:r>
-    </w:p>
-    <w:p>
-      <w:pPr>
-        <w:shd w:fill="EDEDED" w:color="auto" w:val="clear"/>
-        <w:spacing w:after="0" w:before="0" w:line="240"/>
-        <w:ind w:left="360"/>
-      </w:pPr>
-      <w:r>
-        <w:rPr>
-          <w:rFonts w:ascii="Courier New" w:cs="Courier New" w:eastAsia="Courier New" w:hAnsi="Courier New"/>
-          <w:sz w:val="19"/>
-          <w:szCs w:val="19"/>
-        </w:rPr>
-        <w:t xml:space="preserve"> ip access-group ACL-FINANZAS out</w:t>
-      </w:r>
-    </w:p>
-    <w:p>
-      <w:pPr>
-        <w:shd w:fill="EDEDED" w:color="auto" w:val="clear"/>
-        <w:spacing w:after="0" w:before="0" w:line="240"/>
-        <w:ind w:left="360"/>
-      </w:pPr>
-      <w:r>
-        <w:rPr>
-          <w:rFonts w:ascii="Courier New" w:cs="Courier New" w:eastAsia="Courier New" w:hAnsi="Courier New"/>
-          <w:sz w:val="19"/>
-          <w:szCs w:val="19"/>
-        </w:rPr>
-        <w:t xml:space="preserve"> exit</w:t>
-      </w:r>
-    </w:p>
-    <w:p>
-      <w:pPr>
-        <w:shd w:fill="EDEDED" w:color="auto" w:val="clear"/>
-        <w:spacing w:after="0" w:before="0" w:line="240"/>
-        <w:ind w:left="360"/>
-      </w:pPr>
-      <w:r>
-        <w:rPr>
-          <w:rFonts w:ascii="Courier New" w:cs="Courier New" w:eastAsia="Courier New" w:hAnsi="Courier New"/>
-          <w:sz w:val="19"/>
-          <w:szCs w:val="19"/>
-        </w:rPr>
-        <w:t xml:space="preserve">access-list 10 permit 10.20.0.192 0.0.0.31</w:t>
-      </w:r>
-    </w:p>
-    <w:p>
-      <w:pPr>
-        <w:shd w:fill="EDEDED" w:color="auto" w:val="clear"/>
-        <w:spacing w:after="0" w:before="0" w:line="240"/>
-        <w:ind w:left="360"/>
-      </w:pPr>
-      <w:r>
-        <w:rPr>
-          <w:rFonts w:ascii="Courier New" w:cs="Courier New" w:eastAsia="Courier New" w:hAnsi="Courier New"/>
-          <w:sz w:val="19"/>
-          <w:szCs w:val="19"/>
-        </w:rPr>
-        <w:t xml:space="preserve">line vty 0 4</w:t>
-      </w:r>
-    </w:p>
-    <w:p>
-      <w:pPr>
-        <w:shd w:fill="EDEDED" w:color="auto" w:val="clear"/>
-        <w:spacing w:after="0" w:before="0" w:line="240"/>
-        <w:ind w:left="360"/>
-      </w:pPr>
-      <w:r>
-        <w:rPr>
-          <w:rFonts w:ascii="Courier New" w:cs="Courier New" w:eastAsia="Courier New" w:hAnsi="Courier New"/>
-          <w:sz w:val="19"/>
-          <w:szCs w:val="19"/>
-        </w:rPr>
-        <w:t xml:space="preserve"> access-class 10 in</w:t>
-      </w:r>
-    </w:p>
-    <w:p>
-      <w:pPr>
-        <w:shd w:fill="EDEDED" w:color="auto" w:val="clear"/>
-        <w:spacing w:after="0" w:before="0" w:line="240"/>
-        <w:ind w:left="360"/>
-      </w:pPr>
-      <w:r>
-        <w:rPr>
-          <w:rFonts w:ascii="Courier New" w:cs="Courier New" w:eastAsia="Courier New" w:hAnsi="Courier New"/>
-          <w:sz w:val="19"/>
-          <w:szCs w:val="19"/>
-        </w:rPr>
-        <w:t xml:space="preserve"> login local</w:t>
-      </w:r>
-    </w:p>
-    <w:p>
-      <w:pPr>
-        <w:shd w:fill="EDEDED" w:color="auto" w:val="clear"/>
-        <w:spacing w:after="0" w:before="0" w:line="240"/>
-        <w:ind w:left="360"/>
-      </w:pPr>
-      <w:r>
-        <w:rPr>
-          <w:rFonts w:ascii="Courier New" w:cs="Courier New" w:eastAsia="Courier New" w:hAnsi="Courier New"/>
-          <w:sz w:val="19"/>
-          <w:szCs w:val="19"/>
-        </w:rPr>
-        <w:t xml:space="preserve"> transport input telnet</w:t>
-      </w:r>
-    </w:p>
-    <w:p>
-      <w:pPr>
-        <w:shd w:fill="EDEDED" w:color="auto" w:val="clear"/>
-        <w:spacing w:after="0" w:before="0" w:line="240"/>
-        <w:ind w:left="360"/>
-      </w:pPr>
-      <w:r>
-        <w:rPr>
-          <w:rFonts w:ascii="Courier New" w:cs="Courier New" w:eastAsia="Courier New" w:hAnsi="Courier New"/>
-          <w:sz w:val="19"/>
-          <w:szCs w:val="19"/>
-        </w:rPr>
-        <w:t xml:space="preserve">end</w:t>
-      </w:r>
-    </w:p>
-    <w:p>
-      <w:pPr>
-        <w:shd w:fill="EDEDED" w:color="auto" w:val="clear"/>
-        <w:spacing w:after="240" w:before="0" w:line="240"/>
-        <w:ind w:left="360"/>
-      </w:pPr>
-      <w:r>
-        <w:rPr>
-          <w:rFonts w:ascii="Courier New" w:cs="Courier New" w:eastAsia="Courier New" w:hAnsi="Courier New"/>
-          <w:sz w:val="19"/>
-          <w:szCs w:val="19"/>
-        </w:rPr>
-        <w:t xml:space="preserve">write memory</w:t>
-      </w:r>
-    </w:p>
-    <w:p>
-      <w:pPr>
-        <w:ind w:firstLine="720"/>
-      </w:pPr>
-      <w:r>
-        <w:t xml:space="preserve">El bloque desde </w:t>
-      </w:r>
-      <w:r>
-        <w:rPr>
-          <w:rFonts w:ascii="Courier New" w:cs="Courier New" w:eastAsia="Courier New" w:hAnsi="Courier New"/>
-          <w:sz w:val="22"/>
-          <w:szCs w:val="22"/>
-        </w:rPr>
-        <w:t xml:space="preserve">access-list 10</w:t>
-      </w:r>
-      <w:r>
-        <w:t xml:space="preserve"> hasta </w:t>
-      </w:r>
-      <w:r>
-        <w:rPr>
-          <w:rFonts w:ascii="Courier New" w:cs="Courier New" w:eastAsia="Courier New" w:hAnsi="Courier New"/>
-          <w:sz w:val="22"/>
-          <w:szCs w:val="22"/>
-        </w:rPr>
-        <w:t xml:space="preserve">transport input telnet</w:t>
-      </w:r>
-      <w:r>
-        <w:t xml:space="preserve"> también se pone en R-NORTE, R-SUR y R-ESTE. Al terminar, escribe </w:t>
-      </w:r>
-      <w:r>
-        <w:rPr>
-          <w:rFonts w:ascii="Courier New" w:cs="Courier New" w:eastAsia="Courier New" w:hAnsi="Courier New"/>
-          <w:sz w:val="22"/>
-          <w:szCs w:val="22"/>
-        </w:rPr>
-        <w:t xml:space="preserve">write memory</w:t>
-      </w:r>
-      <w:r>
-        <w:t xml:space="preserve"> en todos los routers.</w:t>
-      </w:r>
-    </w:p>
-    <w:p>
-      <w:pPr>
-        <w:pStyle w:val="Heading2"/>
-      </w:pPr>
       <w:bookmarkStart w:name="_Toc21" w:id="21"/>
       <w:r>
-        <w:t xml:space="preserve">Paso 13. Poner las PC en DHCP</w:t>
+        <w:t xml:space="preserve">Paso 12. Poner las PC en DHCP</w:t>
       </w:r>
       <w:bookmarkEnd w:id="21"/>
     </w:p>
@@ -14452,7 +13510,7 @@
         <w:t xml:space="preserve">DHCP</w:t>
       </w:r>
       <w:r>
-        <w:t xml:space="preserve">. En unos segundos aparecen la IP, la máscara, el gateway y el DNS (Figura 12).</w:t>
+        <w:t xml:space="preserve">. En unos segundos aparecen la IP, la máscara y el gateway (Figura 11).</w:t>
       </w:r>
     </w:p>
     <w:p>
@@ -14464,7 +13522,7 @@
         </w:numPr>
       </w:pPr>
       <w:r>
-        <w:t xml:space="preserve">Si dice «DHCP request failed», espera a que OSPF termine de levantar y vuelve a marcar DHCP, o abre </w:t>
+        <w:t xml:space="preserve">Si dice «DHCP request failed», espera unos segundos y vuelve a marcar DHCP, o abre </w:t>
       </w:r>
       <w:r>
         <w:rPr>
@@ -14497,7 +13555,7 @@
           <w:b/>
           <w:bCs/>
         </w:rPr>
-        <w:t xml:space="preserve">Figura 12</w:t>
+        <w:t xml:space="preserve">Figura 11</w:t>
       </w:r>
     </w:p>
     <w:p>
@@ -14520,7 +13578,7 @@
       <w:r>
         <w:drawing>
           <wp:inline distT="0" distB="0" distL="0" distR="0">
-            <wp:extent cx="5810250" cy="1495425"/>
+            <wp:extent cx="5810250" cy="1497487"/>
             <wp:effectExtent t="0" r="0" b="0" l="0"/>
             <wp:docPr id="12" name=""/>
             <wp:cNvGraphicFramePr>
@@ -14545,7 +13603,7 @@
                   <pic:spPr bwMode="auto">
                     <a:xfrm>
                       <a:off x="0" y="0"/>
-                      <a:ext cx="5810250" cy="1495425"/>
+                      <a:ext cx="5810250" cy="1497487"/>
                     </a:xfrm>
                     <a:prstGeom prst="rect">
                       <a:avLst/>
@@ -14574,7 +13632,7 @@
         <w:t xml:space="preserve">show ip dhcp binding</w:t>
       </w:r>
       <w:r>
-        <w:t xml:space="preserve"> muestra todas las direcciones entregadas. Las 16 PC recibieron una IP dentro de su subred correcta (Figura 13).</w:t>
+        <w:t xml:space="preserve"> muestra todas las direcciones entregadas. Las 16 PC recibieron una IP dentro de su subred correcta (Figura 12).</w:t>
       </w:r>
     </w:p>
     <w:p>
@@ -14586,7 +13644,7 @@
           <w:b/>
           <w:bCs/>
         </w:rPr>
-        <w:t xml:space="preserve">Figura 13</w:t>
+        <w:t xml:space="preserve">Figura 12</w:t>
       </w:r>
     </w:p>
     <w:p>
@@ -14653,7 +13711,7 @@
       </w:pPr>
       <w:bookmarkStart w:name="_Toc22" w:id="22"/>
       <w:r>
-        <w:t xml:space="preserve">Paso 14. Guardar</w:t>
+        <w:t xml:space="preserve">Paso 13. Guardar</w:t>
       </w:r>
       <w:bookmarkEnd w:id="22"/>
     </w:p>
@@ -14741,21 +13799,13 @@
     <w:tbl>
       <w:tblPr>
         <w:tblW w:type="dxa" w:w="9360"/>
-        <w:tblBorders>
-          <w:top w:val="single" w:color="auto" w:sz="4"/>
-          <w:left w:val="single" w:color="auto" w:sz="4"/>
-          <w:bottom w:val="single" w:color="auto" w:sz="4"/>
-          <w:right w:val="single" w:color="auto" w:sz="4"/>
-          <w:insideH w:val="single" w:color="auto" w:sz="4"/>
-          <w:insideV w:val="single" w:color="auto" w:sz="4"/>
-        </w:tblBorders>
       </w:tblPr>
       <w:tblGrid>
-        <w:gridCol w:w="450"/>
-        <w:gridCol w:w="3000"/>
-        <w:gridCol w:w="2100"/>
-        <w:gridCol w:w="2810"/>
-        <w:gridCol w:w="1000"/>
+        <w:gridCol w:w="500"/>
+        <w:gridCol w:w="3060"/>
+        <w:gridCol w:w="2200"/>
+        <w:gridCol w:w="2400"/>
+        <w:gridCol w:w="1200"/>
       </w:tblGrid>
       <w:tr>
         <w:trPr>
@@ -14763,7 +13813,7 @@
         </w:trPr>
         <w:tc>
           <w:tcPr>
-            <w:tcW w:type="dxa" w:w="450"/>
+            <w:tcW w:type="dxa" w:w="500"/>
             <w:tcBorders>
               <w:top w:val="single" w:color="000000" w:sz="6"/>
               <w:left w:val="none" w:color="FFFFFF" w:sz="0"/>
@@ -14794,7 +13844,7 @@
         </w:tc>
         <w:tc>
           <w:tcPr>
-            <w:tcW w:type="dxa" w:w="3000"/>
+            <w:tcW w:type="dxa" w:w="3060"/>
             <w:tcBorders>
               <w:top w:val="single" w:color="000000" w:sz="6"/>
               <w:left w:val="none" w:color="FFFFFF" w:sz="0"/>
@@ -14825,7 +13875,7 @@
         </w:tc>
         <w:tc>
           <w:tcPr>
-            <w:tcW w:type="dxa" w:w="2100"/>
+            <w:tcW w:type="dxa" w:w="2200"/>
             <w:tcBorders>
               <w:top w:val="single" w:color="000000" w:sz="6"/>
               <w:left w:val="none" w:color="FFFFFF" w:sz="0"/>
@@ -14856,7 +13906,7 @@
         </w:tc>
         <w:tc>
           <w:tcPr>
-            <w:tcW w:type="dxa" w:w="2810"/>
+            <w:tcW w:type="dxa" w:w="2400"/>
             <w:tcBorders>
               <w:top w:val="single" w:color="000000" w:sz="6"/>
               <w:left w:val="none" w:color="FFFFFF" w:sz="0"/>
@@ -14887,7 +13937,7 @@
         </w:tc>
         <w:tc>
           <w:tcPr>
-            <w:tcW w:type="dxa" w:w="1000"/>
+            <w:tcW w:type="dxa" w:w="1200"/>
             <w:tcBorders>
               <w:top w:val="single" w:color="000000" w:sz="6"/>
               <w:left w:val="none" w:color="FFFFFF" w:sz="0"/>
@@ -14918,9 +13968,12 @@
         </w:tc>
       </w:tr>
       <w:tr>
-        <w:tc>
-          <w:tcPr>
-            <w:tcW w:type="dxa" w:w="450"/>
+        <w:trPr>
+          <w:cantSplit/>
+        </w:trPr>
+        <w:tc>
+          <w:tcPr>
+            <w:tcW w:type="dxa" w:w="500"/>
             <w:tcBorders>
               <w:top w:val="none" w:color="FFFFFF" w:sz="0"/>
               <w:left w:val="none" w:color="FFFFFF" w:sz="0"/>
@@ -14949,7 +14002,7 @@
         </w:tc>
         <w:tc>
           <w:tcPr>
-            <w:tcW w:type="dxa" w:w="3000"/>
+            <w:tcW w:type="dxa" w:w="3060"/>
             <w:tcBorders>
               <w:top w:val="none" w:color="FFFFFF" w:sz="0"/>
               <w:left w:val="none" w:color="FFFFFF" w:sz="0"/>
@@ -14978,7 +14031,7 @@
         </w:tc>
         <w:tc>
           <w:tcPr>
-            <w:tcW w:type="dxa" w:w="2100"/>
+            <w:tcW w:type="dxa" w:w="2200"/>
             <w:tcBorders>
               <w:top w:val="none" w:color="FFFFFF" w:sz="0"/>
               <w:left w:val="none" w:color="FFFFFF" w:sz="0"/>
@@ -15007,7 +14060,7 @@
         </w:tc>
         <w:tc>
           <w:tcPr>
-            <w:tcW w:type="dxa" w:w="2810"/>
+            <w:tcW w:type="dxa" w:w="2400"/>
             <w:tcBorders>
               <w:top w:val="none" w:color="FFFFFF" w:sz="0"/>
               <w:left w:val="none" w:color="FFFFFF" w:sz="0"/>
@@ -15036,38 +14089,41 @@
         </w:tc>
         <w:tc>
           <w:tcPr>
-            <w:tcW w:type="dxa" w:w="1000"/>
-            <w:tcBorders>
-              <w:top w:val="none" w:color="FFFFFF" w:sz="0"/>
-              <w:left w:val="none" w:color="FFFFFF" w:sz="0"/>
-              <w:bottom w:val="none" w:color="FFFFFF" w:sz="0"/>
-              <w:right w:val="none" w:color="FFFFFF" w:sz="0"/>
-            </w:tcBorders>
-            <w:tcMar>
-              <w:top w:type="dxa" w:w="40"/>
-              <w:left w:type="dxa" w:w="80"/>
-              <w:bottom w:type="dxa" w:w="40"/>
-              <w:right w:type="dxa" w:w="80"/>
-            </w:tcMar>
-          </w:tcPr>
-          <w:p>
-            <w:pPr>
-              <w:spacing w:line="240"/>
-            </w:pPr>
-            <w:r>
-              <w:rPr>
-                <w:sz w:val="21"/>
-                <w:szCs w:val="21"/>
-              </w:rPr>
-              <w:t xml:space="preserve">12, 13</w:t>
+            <w:tcW w:type="dxa" w:w="1200"/>
+            <w:tcBorders>
+              <w:top w:val="none" w:color="FFFFFF" w:sz="0"/>
+              <w:left w:val="none" w:color="FFFFFF" w:sz="0"/>
+              <w:bottom w:val="none" w:color="FFFFFF" w:sz="0"/>
+              <w:right w:val="none" w:color="FFFFFF" w:sz="0"/>
+            </w:tcBorders>
+            <w:tcMar>
+              <w:top w:type="dxa" w:w="40"/>
+              <w:left w:type="dxa" w:w="80"/>
+              <w:bottom w:type="dxa" w:w="40"/>
+              <w:right w:type="dxa" w:w="80"/>
+            </w:tcMar>
+          </w:tcPr>
+          <w:p>
+            <w:pPr>
+              <w:spacing w:line="240"/>
+            </w:pPr>
+            <w:r>
+              <w:rPr>
+                <w:sz w:val="21"/>
+                <w:szCs w:val="21"/>
+              </w:rPr>
+              <w:t xml:space="preserve">11, 12</w:t>
             </w:r>
           </w:p>
         </w:tc>
       </w:tr>
       <w:tr>
-        <w:tc>
-          <w:tcPr>
-            <w:tcW w:type="dxa" w:w="450"/>
+        <w:trPr>
+          <w:cantSplit/>
+        </w:trPr>
+        <w:tc>
+          <w:tcPr>
+            <w:tcW w:type="dxa" w:w="500"/>
             <w:tcBorders>
               <w:top w:val="none" w:color="FFFFFF" w:sz="0"/>
               <w:left w:val="none" w:color="FFFFFF" w:sz="0"/>
@@ -15096,7 +14152,7 @@
         </w:tc>
         <w:tc>
           <w:tcPr>
-            <w:tcW w:type="dxa" w:w="3000"/>
+            <w:tcW w:type="dxa" w:w="3060"/>
             <w:tcBorders>
               <w:top w:val="none" w:color="FFFFFF" w:sz="0"/>
               <w:left w:val="none" w:color="FFFFFF" w:sz="0"/>
@@ -15125,7 +14181,7 @@
         </w:tc>
         <w:tc>
           <w:tcPr>
-            <w:tcW w:type="dxa" w:w="2100"/>
+            <w:tcW w:type="dxa" w:w="2200"/>
             <w:tcBorders>
               <w:top w:val="none" w:color="FFFFFF" w:sz="0"/>
               <w:left w:val="none" w:color="FFFFFF" w:sz="0"/>
@@ -15154,7 +14210,7 @@
         </w:tc>
         <w:tc>
           <w:tcPr>
-            <w:tcW w:type="dxa" w:w="2810"/>
+            <w:tcW w:type="dxa" w:w="2400"/>
             <w:tcBorders>
               <w:top w:val="none" w:color="FFFFFF" w:sz="0"/>
               <w:left w:val="none" w:color="FFFFFF" w:sz="0"/>
@@ -15183,38 +14239,41 @@
         </w:tc>
         <w:tc>
           <w:tcPr>
-            <w:tcW w:type="dxa" w:w="1000"/>
-            <w:tcBorders>
-              <w:top w:val="none" w:color="FFFFFF" w:sz="0"/>
-              <w:left w:val="none" w:color="FFFFFF" w:sz="0"/>
-              <w:bottom w:val="none" w:color="FFFFFF" w:sz="0"/>
-              <w:right w:val="none" w:color="FFFFFF" w:sz="0"/>
-            </w:tcBorders>
-            <w:tcMar>
-              <w:top w:type="dxa" w:w="40"/>
-              <w:left w:type="dxa" w:w="80"/>
-              <w:bottom w:type="dxa" w:w="40"/>
-              <w:right w:type="dxa" w:w="80"/>
-            </w:tcMar>
-          </w:tcPr>
-          <w:p>
-            <w:pPr>
-              <w:spacing w:line="240"/>
-            </w:pPr>
-            <w:r>
-              <w:rPr>
-                <w:sz w:val="21"/>
-                <w:szCs w:val="21"/>
-              </w:rPr>
-              <w:t xml:space="preserve">14</w:t>
+            <w:tcW w:type="dxa" w:w="1200"/>
+            <w:tcBorders>
+              <w:top w:val="none" w:color="FFFFFF" w:sz="0"/>
+              <w:left w:val="none" w:color="FFFFFF" w:sz="0"/>
+              <w:bottom w:val="none" w:color="FFFFFF" w:sz="0"/>
+              <w:right w:val="none" w:color="FFFFFF" w:sz="0"/>
+            </w:tcBorders>
+            <w:tcMar>
+              <w:top w:type="dxa" w:w="40"/>
+              <w:left w:type="dxa" w:w="80"/>
+              <w:bottom w:type="dxa" w:w="40"/>
+              <w:right w:type="dxa" w:w="80"/>
+            </w:tcMar>
+          </w:tcPr>
+          <w:p>
+            <w:pPr>
+              <w:spacing w:line="240"/>
+            </w:pPr>
+            <w:r>
+              <w:rPr>
+                <w:sz w:val="21"/>
+                <w:szCs w:val="21"/>
+              </w:rPr>
+              <w:t xml:space="preserve">13</w:t>
             </w:r>
           </w:p>
         </w:tc>
       </w:tr>
       <w:tr>
-        <w:tc>
-          <w:tcPr>
-            <w:tcW w:type="dxa" w:w="450"/>
+        <w:trPr>
+          <w:cantSplit/>
+        </w:trPr>
+        <w:tc>
+          <w:tcPr>
+            <w:tcW w:type="dxa" w:w="500"/>
             <w:tcBorders>
               <w:top w:val="none" w:color="FFFFFF" w:sz="0"/>
               <w:left w:val="none" w:color="FFFFFF" w:sz="0"/>
@@ -15243,125 +14302,128 @@
         </w:tc>
         <w:tc>
           <w:tcPr>
-            <w:tcW w:type="dxa" w:w="3000"/>
-            <w:tcBorders>
-              <w:top w:val="none" w:color="FFFFFF" w:sz="0"/>
-              <w:left w:val="none" w:color="FFFFFF" w:sz="0"/>
-              <w:bottom w:val="none" w:color="FFFFFF" w:sz="0"/>
-              <w:right w:val="none" w:color="FFFFFF" w:sz="0"/>
-            </w:tcBorders>
-            <w:tcMar>
-              <w:top w:type="dxa" w:w="40"/>
-              <w:left w:type="dxa" w:w="80"/>
-              <w:bottom w:type="dxa" w:w="40"/>
-              <w:right w:type="dxa" w:w="80"/>
-            </w:tcMar>
-          </w:tcPr>
-          <w:p>
-            <w:pPr>
-              <w:spacing w:line="240"/>
-            </w:pPr>
-            <w:r>
-              <w:rPr>
-                <w:sz w:val="21"/>
-                <w:szCs w:val="21"/>
-              </w:rPr>
-              <w:t xml:space="preserve">PC-VEN1 resuelve intranet.crg.local</w:t>
-            </w:r>
-          </w:p>
-        </w:tc>
-        <w:tc>
-          <w:tcPr>
-            <w:tcW w:type="dxa" w:w="2100"/>
-            <w:tcBorders>
-              <w:top w:val="none" w:color="FFFFFF" w:sz="0"/>
-              <w:left w:val="none" w:color="FFFFFF" w:sz="0"/>
-              <w:bottom w:val="none" w:color="FFFFFF" w:sz="0"/>
-              <w:right w:val="none" w:color="FFFFFF" w:sz="0"/>
-            </w:tcBorders>
-            <w:tcMar>
-              <w:top w:type="dxa" w:w="40"/>
-              <w:left w:type="dxa" w:w="80"/>
-              <w:bottom w:type="dxa" w:w="40"/>
-              <w:right w:type="dxa" w:w="80"/>
-            </w:tcMar>
-          </w:tcPr>
-          <w:p>
-            <w:pPr>
-              <w:spacing w:line="240"/>
-            </w:pPr>
-            <w:r>
-              <w:rPr>
-                <w:sz w:val="21"/>
-                <w:szCs w:val="21"/>
-              </w:rPr>
-              <w:t xml:space="preserve">Devuelve 10.20.0.194</w:t>
-            </w:r>
-          </w:p>
-        </w:tc>
-        <w:tc>
-          <w:tcPr>
-            <w:tcW w:type="dxa" w:w="2810"/>
-            <w:tcBorders>
-              <w:top w:val="none" w:color="FFFFFF" w:sz="0"/>
-              <w:left w:val="none" w:color="FFFFFF" w:sz="0"/>
-              <w:bottom w:val="none" w:color="FFFFFF" w:sz="0"/>
-              <w:right w:val="none" w:color="FFFFFF" w:sz="0"/>
-            </w:tcBorders>
-            <w:tcMar>
-              <w:top w:type="dxa" w:w="40"/>
-              <w:left w:type="dxa" w:w="80"/>
-              <w:bottom w:type="dxa" w:w="40"/>
-              <w:right w:type="dxa" w:w="80"/>
-            </w:tcMar>
-          </w:tcPr>
-          <w:p>
-            <w:pPr>
-              <w:spacing w:line="240"/>
-            </w:pPr>
-            <w:r>
-              <w:rPr>
-                <w:sz w:val="21"/>
-                <w:szCs w:val="21"/>
-              </w:rPr>
-              <w:t xml:space="preserve">nslookup correcto</w:t>
-            </w:r>
-          </w:p>
-        </w:tc>
-        <w:tc>
-          <w:tcPr>
-            <w:tcW w:type="dxa" w:w="1000"/>
-            <w:tcBorders>
-              <w:top w:val="none" w:color="FFFFFF" w:sz="0"/>
-              <w:left w:val="none" w:color="FFFFFF" w:sz="0"/>
-              <w:bottom w:val="none" w:color="FFFFFF" w:sz="0"/>
-              <w:right w:val="none" w:color="FFFFFF" w:sz="0"/>
-            </w:tcBorders>
-            <w:tcMar>
-              <w:top w:type="dxa" w:w="40"/>
-              <w:left w:type="dxa" w:w="80"/>
-              <w:bottom w:type="dxa" w:w="40"/>
-              <w:right w:type="dxa" w:w="80"/>
-            </w:tcMar>
-          </w:tcPr>
-          <w:p>
-            <w:pPr>
-              <w:spacing w:line="240"/>
-            </w:pPr>
-            <w:r>
-              <w:rPr>
-                <w:sz w:val="21"/>
-                <w:szCs w:val="21"/>
-              </w:rPr>
-              <w:t xml:space="preserve">15</w:t>
+            <w:tcW w:type="dxa" w:w="3060"/>
+            <w:tcBorders>
+              <w:top w:val="none" w:color="FFFFFF" w:sz="0"/>
+              <w:left w:val="none" w:color="FFFFFF" w:sz="0"/>
+              <w:bottom w:val="none" w:color="FFFFFF" w:sz="0"/>
+              <w:right w:val="none" w:color="FFFFFF" w:sz="0"/>
+            </w:tcBorders>
+            <w:tcMar>
+              <w:top w:type="dxa" w:w="40"/>
+              <w:left w:type="dxa" w:w="80"/>
+              <w:bottom w:type="dxa" w:w="40"/>
+              <w:right w:type="dxa" w:w="80"/>
+            </w:tcMar>
+          </w:tcPr>
+          <w:p>
+            <w:pPr>
+              <w:spacing w:line="240"/>
+            </w:pPr>
+            <w:r>
+              <w:rPr>
+                <w:sz w:val="21"/>
+                <w:szCs w:val="21"/>
+              </w:rPr>
+              <w:t xml:space="preserve">PC-VEN1 hace ping al servidor SRV-TI (10.20.0.194)</w:t>
+            </w:r>
+          </w:p>
+        </w:tc>
+        <w:tc>
+          <w:tcPr>
+            <w:tcW w:type="dxa" w:w="2200"/>
+            <w:tcBorders>
+              <w:top w:val="none" w:color="FFFFFF" w:sz="0"/>
+              <w:left w:val="none" w:color="FFFFFF" w:sz="0"/>
+              <w:bottom w:val="none" w:color="FFFFFF" w:sz="0"/>
+              <w:right w:val="none" w:color="FFFFFF" w:sz="0"/>
+            </w:tcBorders>
+            <w:tcMar>
+              <w:top w:type="dxa" w:w="40"/>
+              <w:left w:type="dxa" w:w="80"/>
+              <w:bottom w:type="dxa" w:w="40"/>
+              <w:right w:type="dxa" w:w="80"/>
+            </w:tcMar>
+          </w:tcPr>
+          <w:p>
+            <w:pPr>
+              <w:spacing w:line="240"/>
+            </w:pPr>
+            <w:r>
+              <w:rPr>
+                <w:sz w:val="21"/>
+                <w:szCs w:val="21"/>
+              </w:rPr>
+              <w:t xml:space="preserve">Responde</w:t>
+            </w:r>
+          </w:p>
+        </w:tc>
+        <w:tc>
+          <w:tcPr>
+            <w:tcW w:type="dxa" w:w="2400"/>
+            <w:tcBorders>
+              <w:top w:val="none" w:color="FFFFFF" w:sz="0"/>
+              <w:left w:val="none" w:color="FFFFFF" w:sz="0"/>
+              <w:bottom w:val="none" w:color="FFFFFF" w:sz="0"/>
+              <w:right w:val="none" w:color="FFFFFF" w:sz="0"/>
+            </w:tcBorders>
+            <w:tcMar>
+              <w:top w:type="dxa" w:w="40"/>
+              <w:left w:type="dxa" w:w="80"/>
+              <w:bottom w:type="dxa" w:w="40"/>
+              <w:right w:type="dxa" w:w="80"/>
+            </w:tcMar>
+          </w:tcPr>
+          <w:p>
+            <w:pPr>
+              <w:spacing w:line="240"/>
+            </w:pPr>
+            <w:r>
+              <w:rPr>
+                <w:sz w:val="21"/>
+                <w:szCs w:val="21"/>
+              </w:rPr>
+              <w:t xml:space="preserve">4 de 4 respuestas</w:t>
+            </w:r>
+          </w:p>
+        </w:tc>
+        <w:tc>
+          <w:tcPr>
+            <w:tcW w:type="dxa" w:w="1200"/>
+            <w:tcBorders>
+              <w:top w:val="none" w:color="FFFFFF" w:sz="0"/>
+              <w:left w:val="none" w:color="FFFFFF" w:sz="0"/>
+              <w:bottom w:val="none" w:color="FFFFFF" w:sz="0"/>
+              <w:right w:val="none" w:color="FFFFFF" w:sz="0"/>
+            </w:tcBorders>
+            <w:tcMar>
+              <w:top w:type="dxa" w:w="40"/>
+              <w:left w:type="dxa" w:w="80"/>
+              <w:bottom w:type="dxa" w:w="40"/>
+              <w:right w:type="dxa" w:w="80"/>
+            </w:tcMar>
+          </w:tcPr>
+          <w:p>
+            <w:pPr>
+              <w:spacing w:line="240"/>
+            </w:pPr>
+            <w:r>
+              <w:rPr>
+                <w:sz w:val="21"/>
+                <w:szCs w:val="21"/>
+              </w:rPr>
+              <w:t xml:space="preserve">14</w:t>
             </w:r>
           </w:p>
         </w:tc>
       </w:tr>
       <w:tr>
-        <w:tc>
-          <w:tcPr>
-            <w:tcW w:type="dxa" w:w="450"/>
+        <w:trPr>
+          <w:cantSplit/>
+        </w:trPr>
+        <w:tc>
+          <w:tcPr>
+            <w:tcW w:type="dxa" w:w="500"/>
             <w:tcBorders>
               <w:top w:val="none" w:color="FFFFFF" w:sz="0"/>
               <w:left w:val="none" w:color="FFFFFF" w:sz="0"/>
@@ -15390,36 +14452,36 @@
         </w:tc>
         <w:tc>
           <w:tcPr>
-            <w:tcW w:type="dxa" w:w="3000"/>
-            <w:tcBorders>
-              <w:top w:val="none" w:color="FFFFFF" w:sz="0"/>
-              <w:left w:val="none" w:color="FFFFFF" w:sz="0"/>
-              <w:bottom w:val="none" w:color="FFFFFF" w:sz="0"/>
-              <w:right w:val="none" w:color="FFFFFF" w:sz="0"/>
-            </w:tcBorders>
-            <w:tcMar>
-              <w:top w:type="dxa" w:w="40"/>
-              <w:left w:type="dxa" w:w="80"/>
-              <w:bottom w:type="dxa" w:w="40"/>
-              <w:right w:type="dxa" w:w="80"/>
-            </w:tcMar>
-          </w:tcPr>
-          <w:p>
-            <w:pPr>
-              <w:spacing w:line="240"/>
-            </w:pPr>
-            <w:r>
-              <w:rPr>
-                <w:sz w:val="21"/>
-                <w:szCs w:val="21"/>
-              </w:rPr>
-              <w:t xml:space="preserve">PC-VEN1 hace ping por nombre al servidor</w:t>
-            </w:r>
-          </w:p>
-        </w:tc>
-        <w:tc>
-          <w:tcPr>
-            <w:tcW w:type="dxa" w:w="2100"/>
+            <w:tcW w:type="dxa" w:w="3060"/>
+            <w:tcBorders>
+              <w:top w:val="none" w:color="FFFFFF" w:sz="0"/>
+              <w:left w:val="none" w:color="FFFFFF" w:sz="0"/>
+              <w:bottom w:val="none" w:color="FFFFFF" w:sz="0"/>
+              <w:right w:val="none" w:color="FFFFFF" w:sz="0"/>
+            </w:tcBorders>
+            <w:tcMar>
+              <w:top w:type="dxa" w:w="40"/>
+              <w:left w:type="dxa" w:w="80"/>
+              <w:bottom w:type="dxa" w:w="40"/>
+              <w:right w:type="dxa" w:w="80"/>
+            </w:tcMar>
+          </w:tcPr>
+          <w:p>
+            <w:pPr>
+              <w:spacing w:line="240"/>
+            </w:pPr>
+            <w:r>
+              <w:rPr>
+                <w:sz w:val="21"/>
+                <w:szCs w:val="21"/>
+              </w:rPr>
+              <w:t xml:space="preserve">PC-NOR1 (regional) llega a la sede central</w:t>
+            </w:r>
+          </w:p>
+        </w:tc>
+        <w:tc>
+          <w:tcPr>
+            <w:tcW w:type="dxa" w:w="2200"/>
             <w:tcBorders>
               <w:top w:val="none" w:color="FFFFFF" w:sz="0"/>
               <w:left w:val="none" w:color="FFFFFF" w:sz="0"/>
@@ -15448,7 +14510,7 @@
         </w:tc>
         <w:tc>
           <w:tcPr>
-            <w:tcW w:type="dxa" w:w="2810"/>
+            <w:tcW w:type="dxa" w:w="2400"/>
             <w:tcBorders>
               <w:top w:val="none" w:color="FFFFFF" w:sz="0"/>
               <w:left w:val="none" w:color="FFFFFF" w:sz="0"/>
@@ -15477,38 +14539,41 @@
         </w:tc>
         <w:tc>
           <w:tcPr>
-            <w:tcW w:type="dxa" w:w="1000"/>
-            <w:tcBorders>
-              <w:top w:val="none" w:color="FFFFFF" w:sz="0"/>
-              <w:left w:val="none" w:color="FFFFFF" w:sz="0"/>
-              <w:bottom w:val="none" w:color="FFFFFF" w:sz="0"/>
-              <w:right w:val="none" w:color="FFFFFF" w:sz="0"/>
-            </w:tcBorders>
-            <w:tcMar>
-              <w:top w:type="dxa" w:w="40"/>
-              <w:left w:type="dxa" w:w="80"/>
-              <w:bottom w:type="dxa" w:w="40"/>
-              <w:right w:type="dxa" w:w="80"/>
-            </w:tcMar>
-          </w:tcPr>
-          <w:p>
-            <w:pPr>
-              <w:spacing w:line="240"/>
-            </w:pPr>
-            <w:r>
-              <w:rPr>
-                <w:sz w:val="21"/>
-                <w:szCs w:val="21"/>
-              </w:rPr>
-              <w:t xml:space="preserve">16</w:t>
+            <w:tcW w:type="dxa" w:w="1200"/>
+            <w:tcBorders>
+              <w:top w:val="none" w:color="FFFFFF" w:sz="0"/>
+              <w:left w:val="none" w:color="FFFFFF" w:sz="0"/>
+              <w:bottom w:val="none" w:color="FFFFFF" w:sz="0"/>
+              <w:right w:val="none" w:color="FFFFFF" w:sz="0"/>
+            </w:tcBorders>
+            <w:tcMar>
+              <w:top w:type="dxa" w:w="40"/>
+              <w:left w:type="dxa" w:w="80"/>
+              <w:bottom w:type="dxa" w:w="40"/>
+              <w:right w:type="dxa" w:w="80"/>
+            </w:tcMar>
+          </w:tcPr>
+          <w:p>
+            <w:pPr>
+              <w:spacing w:line="240"/>
+            </w:pPr>
+            <w:r>
+              <w:rPr>
+                <w:sz w:val="21"/>
+                <w:szCs w:val="21"/>
+              </w:rPr>
+              <w:t xml:space="preserve">15</w:t>
             </w:r>
           </w:p>
         </w:tc>
       </w:tr>
       <w:tr>
-        <w:tc>
-          <w:tcPr>
-            <w:tcW w:type="dxa" w:w="450"/>
+        <w:trPr>
+          <w:cantSplit/>
+        </w:trPr>
+        <w:tc>
+          <w:tcPr>
+            <w:tcW w:type="dxa" w:w="500"/>
             <w:tcBorders>
               <w:top w:val="none" w:color="FFFFFF" w:sz="0"/>
               <w:left w:val="none" w:color="FFFFFF" w:sz="0"/>
@@ -15537,36 +14602,36 @@
         </w:tc>
         <w:tc>
           <w:tcPr>
-            <w:tcW w:type="dxa" w:w="3000"/>
-            <w:tcBorders>
-              <w:top w:val="none" w:color="FFFFFF" w:sz="0"/>
-              <w:left w:val="none" w:color="FFFFFF" w:sz="0"/>
-              <w:bottom w:val="none" w:color="FFFFFF" w:sz="0"/>
-              <w:right w:val="none" w:color="FFFFFF" w:sz="0"/>
-            </w:tcBorders>
-            <w:tcMar>
-              <w:top w:type="dxa" w:w="40"/>
-              <w:left w:type="dxa" w:w="80"/>
-              <w:bottom w:type="dxa" w:w="40"/>
-              <w:right w:type="dxa" w:w="80"/>
-            </w:tcMar>
-          </w:tcPr>
-          <w:p>
-            <w:pPr>
-              <w:spacing w:line="240"/>
-            </w:pPr>
-            <w:r>
-              <w:rPr>
-                <w:sz w:val="21"/>
-                <w:szCs w:val="21"/>
-              </w:rPr>
-              <w:t xml:space="preserve">PC-NOR1 (regional) llega a la sede central</w:t>
-            </w:r>
-          </w:p>
-        </w:tc>
-        <w:tc>
-          <w:tcPr>
-            <w:tcW w:type="dxa" w:w="2100"/>
+            <w:tcW w:type="dxa" w:w="3060"/>
+            <w:tcBorders>
+              <w:top w:val="none" w:color="FFFFFF" w:sz="0"/>
+              <w:left w:val="none" w:color="FFFFFF" w:sz="0"/>
+              <w:bottom w:val="none" w:color="FFFFFF" w:sz="0"/>
+              <w:right w:val="none" w:color="FFFFFF" w:sz="0"/>
+            </w:tcBorders>
+            <w:tcMar>
+              <w:top w:type="dxa" w:w="40"/>
+              <w:left w:type="dxa" w:w="80"/>
+              <w:bottom w:type="dxa" w:w="40"/>
+              <w:right w:type="dxa" w:w="80"/>
+            </w:tcMar>
+          </w:tcPr>
+          <w:p>
+            <w:pPr>
+              <w:spacing w:line="240"/>
+            </w:pPr>
+            <w:r>
+              <w:rPr>
+                <w:sz w:val="21"/>
+                <w:szCs w:val="21"/>
+              </w:rPr>
+              <w:t xml:space="preserve">Regional Norte llega a Regional Este</w:t>
+            </w:r>
+          </w:p>
+        </w:tc>
+        <w:tc>
+          <w:tcPr>
+            <w:tcW w:type="dxa" w:w="2200"/>
             <w:tcBorders>
               <w:top w:val="none" w:color="FFFFFF" w:sz="0"/>
               <w:left w:val="none" w:color="FFFFFF" w:sz="0"/>
@@ -15595,7 +14660,7 @@
         </w:tc>
         <w:tc>
           <w:tcPr>
-            <w:tcW w:type="dxa" w:w="2810"/>
+            <w:tcW w:type="dxa" w:w="2400"/>
             <w:tcBorders>
               <w:top w:val="none" w:color="FFFFFF" w:sz="0"/>
               <w:left w:val="none" w:color="FFFFFF" w:sz="0"/>
@@ -15624,38 +14689,41 @@
         </w:tc>
         <w:tc>
           <w:tcPr>
-            <w:tcW w:type="dxa" w:w="1000"/>
-            <w:tcBorders>
-              <w:top w:val="none" w:color="FFFFFF" w:sz="0"/>
-              <w:left w:val="none" w:color="FFFFFF" w:sz="0"/>
-              <w:bottom w:val="none" w:color="FFFFFF" w:sz="0"/>
-              <w:right w:val="none" w:color="FFFFFF" w:sz="0"/>
-            </w:tcBorders>
-            <w:tcMar>
-              <w:top w:type="dxa" w:w="40"/>
-              <w:left w:type="dxa" w:w="80"/>
-              <w:bottom w:type="dxa" w:w="40"/>
-              <w:right w:type="dxa" w:w="80"/>
-            </w:tcMar>
-          </w:tcPr>
-          <w:p>
-            <w:pPr>
-              <w:spacing w:line="240"/>
-            </w:pPr>
-            <w:r>
-              <w:rPr>
-                <w:sz w:val="21"/>
-                <w:szCs w:val="21"/>
-              </w:rPr>
-              <w:t xml:space="preserve">17</w:t>
+            <w:tcW w:type="dxa" w:w="1200"/>
+            <w:tcBorders>
+              <w:top w:val="none" w:color="FFFFFF" w:sz="0"/>
+              <w:left w:val="none" w:color="FFFFFF" w:sz="0"/>
+              <w:bottom w:val="none" w:color="FFFFFF" w:sz="0"/>
+              <w:right w:val="none" w:color="FFFFFF" w:sz="0"/>
+            </w:tcBorders>
+            <w:tcMar>
+              <w:top w:type="dxa" w:w="40"/>
+              <w:left w:type="dxa" w:w="80"/>
+              <w:bottom w:type="dxa" w:w="40"/>
+              <w:right w:type="dxa" w:w="80"/>
+            </w:tcMar>
+          </w:tcPr>
+          <w:p>
+            <w:pPr>
+              <w:spacing w:line="240"/>
+            </w:pPr>
+            <w:r>
+              <w:rPr>
+                <w:sz w:val="21"/>
+                <w:szCs w:val="21"/>
+              </w:rPr>
+              <w:t xml:space="preserve">16</w:t>
             </w:r>
           </w:p>
         </w:tc>
       </w:tr>
       <w:tr>
-        <w:tc>
-          <w:tcPr>
-            <w:tcW w:type="dxa" w:w="450"/>
+        <w:trPr>
+          <w:cantSplit/>
+        </w:trPr>
+        <w:tc>
+          <w:tcPr>
+            <w:tcW w:type="dxa" w:w="500"/>
             <w:tcBorders>
               <w:top w:val="none" w:color="FFFFFF" w:sz="0"/>
               <w:left w:val="none" w:color="FFFFFF" w:sz="0"/>
@@ -15684,125 +14752,128 @@
         </w:tc>
         <w:tc>
           <w:tcPr>
-            <w:tcW w:type="dxa" w:w="3000"/>
-            <w:tcBorders>
-              <w:top w:val="none" w:color="FFFFFF" w:sz="0"/>
-              <w:left w:val="none" w:color="FFFFFF" w:sz="0"/>
-              <w:bottom w:val="none" w:color="FFFFFF" w:sz="0"/>
-              <w:right w:val="none" w:color="FFFFFF" w:sz="0"/>
-            </w:tcBorders>
-            <w:tcMar>
-              <w:top w:type="dxa" w:w="40"/>
-              <w:left w:type="dxa" w:w="80"/>
-              <w:bottom w:type="dxa" w:w="40"/>
-              <w:right w:type="dxa" w:w="80"/>
-            </w:tcMar>
-          </w:tcPr>
-          <w:p>
-            <w:pPr>
-              <w:spacing w:line="240"/>
-            </w:pPr>
-            <w:r>
-              <w:rPr>
-                <w:sz w:val="21"/>
-                <w:szCs w:val="21"/>
-              </w:rPr>
-              <w:t xml:space="preserve">Regional Norte llega a Regional Este</w:t>
-            </w:r>
-          </w:p>
-        </w:tc>
-        <w:tc>
-          <w:tcPr>
-            <w:tcW w:type="dxa" w:w="2100"/>
-            <w:tcBorders>
-              <w:top w:val="none" w:color="FFFFFF" w:sz="0"/>
-              <w:left w:val="none" w:color="FFFFFF" w:sz="0"/>
-              <w:bottom w:val="none" w:color="FFFFFF" w:sz="0"/>
-              <w:right w:val="none" w:color="FFFFFF" w:sz="0"/>
-            </w:tcBorders>
-            <w:tcMar>
-              <w:top w:type="dxa" w:w="40"/>
-              <w:left w:type="dxa" w:w="80"/>
-              <w:bottom w:type="dxa" w:w="40"/>
-              <w:right w:type="dxa" w:w="80"/>
-            </w:tcMar>
-          </w:tcPr>
-          <w:p>
-            <w:pPr>
-              <w:spacing w:line="240"/>
-            </w:pPr>
-            <w:r>
-              <w:rPr>
-                <w:sz w:val="21"/>
-                <w:szCs w:val="21"/>
-              </w:rPr>
-              <w:t xml:space="preserve">Responde</w:t>
-            </w:r>
-          </w:p>
-        </w:tc>
-        <w:tc>
-          <w:tcPr>
-            <w:tcW w:type="dxa" w:w="2810"/>
-            <w:tcBorders>
-              <w:top w:val="none" w:color="FFFFFF" w:sz="0"/>
-              <w:left w:val="none" w:color="FFFFFF" w:sz="0"/>
-              <w:bottom w:val="none" w:color="FFFFFF" w:sz="0"/>
-              <w:right w:val="none" w:color="FFFFFF" w:sz="0"/>
-            </w:tcBorders>
-            <w:tcMar>
-              <w:top w:type="dxa" w:w="40"/>
-              <w:left w:type="dxa" w:w="80"/>
-              <w:bottom w:type="dxa" w:w="40"/>
-              <w:right w:type="dxa" w:w="80"/>
-            </w:tcMar>
-          </w:tcPr>
-          <w:p>
-            <w:pPr>
-              <w:spacing w:line="240"/>
-            </w:pPr>
-            <w:r>
-              <w:rPr>
-                <w:sz w:val="21"/>
-                <w:szCs w:val="21"/>
-              </w:rPr>
-              <w:t xml:space="preserve">4 de 4 respuestas</w:t>
-            </w:r>
-          </w:p>
-        </w:tc>
-        <w:tc>
-          <w:tcPr>
-            <w:tcW w:type="dxa" w:w="1000"/>
-            <w:tcBorders>
-              <w:top w:val="none" w:color="FFFFFF" w:sz="0"/>
-              <w:left w:val="none" w:color="FFFFFF" w:sz="0"/>
-              <w:bottom w:val="none" w:color="FFFFFF" w:sz="0"/>
-              <w:right w:val="none" w:color="FFFFFF" w:sz="0"/>
-            </w:tcBorders>
-            <w:tcMar>
-              <w:top w:type="dxa" w:w="40"/>
-              <w:left w:type="dxa" w:w="80"/>
-              <w:bottom w:type="dxa" w:w="40"/>
-              <w:right w:type="dxa" w:w="80"/>
-            </w:tcMar>
-          </w:tcPr>
-          <w:p>
-            <w:pPr>
-              <w:spacing w:line="240"/>
-            </w:pPr>
-            <w:r>
-              <w:rPr>
-                <w:sz w:val="21"/>
-                <w:szCs w:val="21"/>
-              </w:rPr>
-              <w:t xml:space="preserve">18</w:t>
+            <w:tcW w:type="dxa" w:w="3060"/>
+            <w:tcBorders>
+              <w:top w:val="none" w:color="FFFFFF" w:sz="0"/>
+              <w:left w:val="none" w:color="FFFFFF" w:sz="0"/>
+              <w:bottom w:val="none" w:color="FFFFFF" w:sz="0"/>
+              <w:right w:val="none" w:color="FFFFFF" w:sz="0"/>
+            </w:tcBorders>
+            <w:tcMar>
+              <w:top w:type="dxa" w:w="40"/>
+              <w:left w:type="dxa" w:w="80"/>
+              <w:bottom w:type="dxa" w:w="40"/>
+              <w:right w:type="dxa" w:w="80"/>
+            </w:tcMar>
+          </w:tcPr>
+          <w:p>
+            <w:pPr>
+              <w:spacing w:line="240"/>
+            </w:pPr>
+            <w:r>
+              <w:rPr>
+                <w:sz w:val="21"/>
+                <w:szCs w:val="21"/>
+              </w:rPr>
+              <w:t xml:space="preserve">Los tres enlaces WAN están activos</w:t>
+            </w:r>
+          </w:p>
+        </w:tc>
+        <w:tc>
+          <w:tcPr>
+            <w:tcW w:type="dxa" w:w="2200"/>
+            <w:tcBorders>
+              <w:top w:val="none" w:color="FFFFFF" w:sz="0"/>
+              <w:left w:val="none" w:color="FFFFFF" w:sz="0"/>
+              <w:bottom w:val="none" w:color="FFFFFF" w:sz="0"/>
+              <w:right w:val="none" w:color="FFFFFF" w:sz="0"/>
+            </w:tcBorders>
+            <w:tcMar>
+              <w:top w:type="dxa" w:w="40"/>
+              <w:left w:type="dxa" w:w="80"/>
+              <w:bottom w:type="dxa" w:w="40"/>
+              <w:right w:type="dxa" w:w="80"/>
+            </w:tcMar>
+          </w:tcPr>
+          <w:p>
+            <w:pPr>
+              <w:spacing w:line="240"/>
+            </w:pPr>
+            <w:r>
+              <w:rPr>
+                <w:sz w:val="21"/>
+                <w:szCs w:val="21"/>
+              </w:rPr>
+              <w:t xml:space="preserve">Serial up/up</w:t>
+            </w:r>
+          </w:p>
+        </w:tc>
+        <w:tc>
+          <w:tcPr>
+            <w:tcW w:type="dxa" w:w="2400"/>
+            <w:tcBorders>
+              <w:top w:val="none" w:color="FFFFFF" w:sz="0"/>
+              <w:left w:val="none" w:color="FFFFFF" w:sz="0"/>
+              <w:bottom w:val="none" w:color="FFFFFF" w:sz="0"/>
+              <w:right w:val="none" w:color="FFFFFF" w:sz="0"/>
+            </w:tcBorders>
+            <w:tcMar>
+              <w:top w:type="dxa" w:w="40"/>
+              <w:left w:type="dxa" w:w="80"/>
+              <w:bottom w:type="dxa" w:w="40"/>
+              <w:right w:type="dxa" w:w="80"/>
+            </w:tcMar>
+          </w:tcPr>
+          <w:p>
+            <w:pPr>
+              <w:spacing w:line="240"/>
+            </w:pPr>
+            <w:r>
+              <w:rPr>
+                <w:sz w:val="21"/>
+                <w:szCs w:val="21"/>
+              </w:rPr>
+              <w:t xml:space="preserve">Correcto</w:t>
+            </w:r>
+          </w:p>
+        </w:tc>
+        <w:tc>
+          <w:tcPr>
+            <w:tcW w:type="dxa" w:w="1200"/>
+            <w:tcBorders>
+              <w:top w:val="none" w:color="FFFFFF" w:sz="0"/>
+              <w:left w:val="none" w:color="FFFFFF" w:sz="0"/>
+              <w:bottom w:val="none" w:color="FFFFFF" w:sz="0"/>
+              <w:right w:val="none" w:color="FFFFFF" w:sz="0"/>
+            </w:tcBorders>
+            <w:tcMar>
+              <w:top w:type="dxa" w:w="40"/>
+              <w:left w:type="dxa" w:w="80"/>
+              <w:bottom w:type="dxa" w:w="40"/>
+              <w:right w:type="dxa" w:w="80"/>
+            </w:tcMar>
+          </w:tcPr>
+          <w:p>
+            <w:pPr>
+              <w:spacing w:line="240"/>
+            </w:pPr>
+            <w:r>
+              <w:rPr>
+                <w:sz w:val="21"/>
+                <w:szCs w:val="21"/>
+              </w:rPr>
+              <w:t xml:space="preserve">6, 8</w:t>
             </w:r>
           </w:p>
         </w:tc>
       </w:tr>
       <w:tr>
-        <w:tc>
-          <w:tcPr>
-            <w:tcW w:type="dxa" w:w="450"/>
+        <w:trPr>
+          <w:cantSplit/>
+        </w:trPr>
+        <w:tc>
+          <w:tcPr>
+            <w:tcW w:type="dxa" w:w="500"/>
             <w:tcBorders>
               <w:top w:val="none" w:color="FFFFFF" w:sz="0"/>
               <w:left w:val="none" w:color="FFFFFF" w:sz="0"/>
@@ -15831,65 +14902,65 @@
         </w:tc>
         <w:tc>
           <w:tcPr>
-            <w:tcW w:type="dxa" w:w="3000"/>
-            <w:tcBorders>
-              <w:top w:val="none" w:color="FFFFFF" w:sz="0"/>
-              <w:left w:val="none" w:color="FFFFFF" w:sz="0"/>
-              <w:bottom w:val="none" w:color="FFFFFF" w:sz="0"/>
-              <w:right w:val="none" w:color="FFFFFF" w:sz="0"/>
-            </w:tcBorders>
-            <w:tcMar>
-              <w:top w:type="dxa" w:w="40"/>
-              <w:left w:type="dxa" w:w="80"/>
-              <w:bottom w:type="dxa" w:w="40"/>
-              <w:right w:type="dxa" w:w="80"/>
-            </w:tcMar>
-          </w:tcPr>
-          <w:p>
-            <w:pPr>
-              <w:spacing w:line="240"/>
-            </w:pPr>
-            <w:r>
-              <w:rPr>
-                <w:sz w:val="21"/>
-                <w:szCs w:val="21"/>
-              </w:rPr>
-              <w:t xml:space="preserve">Los tres enlaces WAN están activos</w:t>
-            </w:r>
-          </w:p>
-        </w:tc>
-        <w:tc>
-          <w:tcPr>
-            <w:tcW w:type="dxa" w:w="2100"/>
-            <w:tcBorders>
-              <w:top w:val="none" w:color="FFFFFF" w:sz="0"/>
-              <w:left w:val="none" w:color="FFFFFF" w:sz="0"/>
-              <w:bottom w:val="none" w:color="FFFFFF" w:sz="0"/>
-              <w:right w:val="none" w:color="FFFFFF" w:sz="0"/>
-            </w:tcBorders>
-            <w:tcMar>
-              <w:top w:type="dxa" w:w="40"/>
-              <w:left w:type="dxa" w:w="80"/>
-              <w:bottom w:type="dxa" w:w="40"/>
-              <w:right w:type="dxa" w:w="80"/>
-            </w:tcMar>
-          </w:tcPr>
-          <w:p>
-            <w:pPr>
-              <w:spacing w:line="240"/>
-            </w:pPr>
-            <w:r>
-              <w:rPr>
-                <w:sz w:val="21"/>
-                <w:szCs w:val="21"/>
-              </w:rPr>
-              <w:t xml:space="preserve">Serial up/up y 3 vecinos OSPF FULL</w:t>
-            </w:r>
-          </w:p>
-        </w:tc>
-        <w:tc>
-          <w:tcPr>
-            <w:tcW w:type="dxa" w:w="2810"/>
+            <w:tcW w:type="dxa" w:w="3060"/>
+            <w:tcBorders>
+              <w:top w:val="none" w:color="FFFFFF" w:sz="0"/>
+              <w:left w:val="none" w:color="FFFFFF" w:sz="0"/>
+              <w:bottom w:val="none" w:color="FFFFFF" w:sz="0"/>
+              <w:right w:val="none" w:color="FFFFFF" w:sz="0"/>
+            </w:tcBorders>
+            <w:tcMar>
+              <w:top w:type="dxa" w:w="40"/>
+              <w:left w:type="dxa" w:w="80"/>
+              <w:bottom w:type="dxa" w:w="40"/>
+              <w:right w:type="dxa" w:w="80"/>
+            </w:tcMar>
+          </w:tcPr>
+          <w:p>
+            <w:pPr>
+              <w:spacing w:line="240"/>
+            </w:pPr>
+            <w:r>
+              <w:rPr>
+                <w:sz w:val="21"/>
+                <w:szCs w:val="21"/>
+              </w:rPr>
+              <w:t xml:space="preserve">Rutas de ida y de vuelta</w:t>
+            </w:r>
+          </w:p>
+        </w:tc>
+        <w:tc>
+          <w:tcPr>
+            <w:tcW w:type="dxa" w:w="2200"/>
+            <w:tcBorders>
+              <w:top w:val="none" w:color="FFFFFF" w:sz="0"/>
+              <w:left w:val="none" w:color="FFFFFF" w:sz="0"/>
+              <w:bottom w:val="none" w:color="FFFFFF" w:sz="0"/>
+              <w:right w:val="none" w:color="FFFFFF" w:sz="0"/>
+            </w:tcBorders>
+            <w:tcMar>
+              <w:top w:type="dxa" w:w="40"/>
+              <w:left w:type="dxa" w:w="80"/>
+              <w:bottom w:type="dxa" w:w="40"/>
+              <w:right w:type="dxa" w:w="80"/>
+            </w:tcMar>
+          </w:tcPr>
+          <w:p>
+            <w:pPr>
+              <w:spacing w:line="240"/>
+            </w:pPr>
+            <w:r>
+              <w:rPr>
+                <w:sz w:val="21"/>
+                <w:szCs w:val="21"/>
+              </w:rPr>
+              <w:t xml:space="preserve">Rutas S en R-CRG y ruta por defecto en las regionales</w:t>
+            </w:r>
+          </w:p>
+        </w:tc>
+        <w:tc>
+          <w:tcPr>
+            <w:tcW w:type="dxa" w:w="2400"/>
             <w:tcBorders>
               <w:top w:val="none" w:color="FFFFFF" w:sz="0"/>
               <w:left w:val="none" w:color="FFFFFF" w:sz="0"/>
@@ -15918,38 +14989,41 @@
         </w:tc>
         <w:tc>
           <w:tcPr>
-            <w:tcW w:type="dxa" w:w="1000"/>
-            <w:tcBorders>
-              <w:top w:val="none" w:color="FFFFFF" w:sz="0"/>
-              <w:left w:val="none" w:color="FFFFFF" w:sz="0"/>
-              <w:bottom w:val="none" w:color="FFFFFF" w:sz="0"/>
-              <w:right w:val="none" w:color="FFFFFF" w:sz="0"/>
-            </w:tcBorders>
-            <w:tcMar>
-              <w:top w:type="dxa" w:w="40"/>
-              <w:left w:type="dxa" w:w="80"/>
-              <w:bottom w:type="dxa" w:w="40"/>
-              <w:right w:type="dxa" w:w="80"/>
-            </w:tcMar>
-          </w:tcPr>
-          <w:p>
-            <w:pPr>
-              <w:spacing w:line="240"/>
-            </w:pPr>
-            <w:r>
-              <w:rPr>
-                <w:sz w:val="21"/>
-                <w:szCs w:val="21"/>
-              </w:rPr>
-              <w:t xml:space="preserve">6, 9</w:t>
+            <w:tcW w:type="dxa" w:w="1200"/>
+            <w:tcBorders>
+              <w:top w:val="none" w:color="FFFFFF" w:sz="0"/>
+              <w:left w:val="none" w:color="FFFFFF" w:sz="0"/>
+              <w:bottom w:val="none" w:color="FFFFFF" w:sz="0"/>
+              <w:right w:val="none" w:color="FFFFFF" w:sz="0"/>
+            </w:tcBorders>
+            <w:tcMar>
+              <w:top w:type="dxa" w:w="40"/>
+              <w:left w:type="dxa" w:w="80"/>
+              <w:bottom w:type="dxa" w:w="40"/>
+              <w:right w:type="dxa" w:w="80"/>
+            </w:tcMar>
+          </w:tcPr>
+          <w:p>
+            <w:pPr>
+              <w:spacing w:line="240"/>
+            </w:pPr>
+            <w:r>
+              <w:rPr>
+                <w:sz w:val="21"/>
+                <w:szCs w:val="21"/>
+              </w:rPr>
+              <w:t xml:space="preserve">9, 10</w:t>
             </w:r>
           </w:p>
         </w:tc>
       </w:tr>
       <w:tr>
-        <w:tc>
-          <w:tcPr>
-            <w:tcW w:type="dxa" w:w="450"/>
+        <w:trPr>
+          <w:cantSplit/>
+        </w:trPr>
+        <w:tc>
+          <w:tcPr>
+            <w:tcW w:type="dxa" w:w="500"/>
             <w:tcBorders>
               <w:top w:val="none" w:color="FFFFFF" w:sz="0"/>
               <w:left w:val="none" w:color="FFFFFF" w:sz="0"/>
@@ -15978,129 +15052,132 @@
         </w:tc>
         <w:tc>
           <w:tcPr>
-            <w:tcW w:type="dxa" w:w="3000"/>
-            <w:tcBorders>
-              <w:top w:val="none" w:color="FFFFFF" w:sz="0"/>
-              <w:left w:val="none" w:color="FFFFFF" w:sz="0"/>
-              <w:bottom w:val="none" w:color="FFFFFF" w:sz="0"/>
-              <w:right w:val="none" w:color="FFFFFF" w:sz="0"/>
-            </w:tcBorders>
-            <w:tcMar>
-              <w:top w:type="dxa" w:w="40"/>
-              <w:left w:type="dxa" w:w="80"/>
-              <w:bottom w:type="dxa" w:w="40"/>
-              <w:right w:type="dxa" w:w="80"/>
-            </w:tcMar>
-          </w:tcPr>
-          <w:p>
-            <w:pPr>
-              <w:spacing w:line="240"/>
-            </w:pPr>
-            <w:r>
-              <w:rPr>
-                <w:sz w:val="21"/>
-                <w:szCs w:val="21"/>
-              </w:rPr>
-              <w:t xml:space="preserve">Rutas de ida y de vuelta</w:t>
-            </w:r>
-          </w:p>
-        </w:tc>
-        <w:tc>
-          <w:tcPr>
-            <w:tcW w:type="dxa" w:w="2100"/>
-            <w:tcBorders>
-              <w:top w:val="none" w:color="FFFFFF" w:sz="0"/>
-              <w:left w:val="none" w:color="FFFFFF" w:sz="0"/>
-              <w:bottom w:val="none" w:color="FFFFFF" w:sz="0"/>
-              <w:right w:val="none" w:color="FFFFFF" w:sz="0"/>
-            </w:tcBorders>
-            <w:tcMar>
-              <w:top w:type="dxa" w:w="40"/>
-              <w:left w:type="dxa" w:w="80"/>
-              <w:bottom w:type="dxa" w:w="40"/>
-              <w:right w:type="dxa" w:w="80"/>
-            </w:tcMar>
-          </w:tcPr>
-          <w:p>
-            <w:pPr>
-              <w:spacing w:line="240"/>
-            </w:pPr>
-            <w:r>
-              <w:rPr>
-                <w:sz w:val="21"/>
-                <w:szCs w:val="21"/>
-              </w:rPr>
-              <w:t xml:space="preserve">Rutas O en R-CRG y ruta por defecto en regionales</w:t>
-            </w:r>
-          </w:p>
-        </w:tc>
-        <w:tc>
-          <w:tcPr>
-            <w:tcW w:type="dxa" w:w="2810"/>
-            <w:tcBorders>
-              <w:top w:val="none" w:color="FFFFFF" w:sz="0"/>
-              <w:left w:val="none" w:color="FFFFFF" w:sz="0"/>
-              <w:bottom w:val="none" w:color="FFFFFF" w:sz="0"/>
-              <w:right w:val="none" w:color="FFFFFF" w:sz="0"/>
-            </w:tcBorders>
-            <w:tcMar>
-              <w:top w:type="dxa" w:w="40"/>
-              <w:left w:type="dxa" w:w="80"/>
-              <w:bottom w:type="dxa" w:w="40"/>
-              <w:right w:type="dxa" w:w="80"/>
-            </w:tcMar>
-          </w:tcPr>
-          <w:p>
-            <w:pPr>
-              <w:spacing w:line="240"/>
-            </w:pPr>
-            <w:r>
-              <w:rPr>
-                <w:sz w:val="21"/>
-                <w:szCs w:val="21"/>
-              </w:rPr>
-              <w:t xml:space="preserve">Correcto</w:t>
-            </w:r>
-          </w:p>
-        </w:tc>
-        <w:tc>
-          <w:tcPr>
-            <w:tcW w:type="dxa" w:w="1000"/>
-            <w:tcBorders>
-              <w:top w:val="none" w:color="FFFFFF" w:sz="0"/>
-              <w:left w:val="none" w:color="FFFFFF" w:sz="0"/>
-              <w:bottom w:val="none" w:color="FFFFFF" w:sz="0"/>
-              <w:right w:val="none" w:color="FFFFFF" w:sz="0"/>
-            </w:tcBorders>
-            <w:tcMar>
-              <w:top w:type="dxa" w:w="40"/>
-              <w:left w:type="dxa" w:w="80"/>
-              <w:bottom w:type="dxa" w:w="40"/>
-              <w:right w:type="dxa" w:w="80"/>
-            </w:tcMar>
-          </w:tcPr>
-          <w:p>
-            <w:pPr>
-              <w:spacing w:line="240"/>
-            </w:pPr>
-            <w:r>
-              <w:rPr>
-                <w:sz w:val="21"/>
-                <w:szCs w:val="21"/>
-              </w:rPr>
-              <w:t xml:space="preserve">10</w:t>
+            <w:tcW w:type="dxa" w:w="3060"/>
+            <w:tcBorders>
+              <w:top w:val="none" w:color="FFFFFF" w:sz="0"/>
+              <w:left w:val="none" w:color="FFFFFF" w:sz="0"/>
+              <w:bottom w:val="none" w:color="FFFFFF" w:sz="0"/>
+              <w:right w:val="none" w:color="FFFFFF" w:sz="0"/>
+            </w:tcBorders>
+            <w:tcMar>
+              <w:top w:type="dxa" w:w="40"/>
+              <w:left w:type="dxa" w:w="80"/>
+              <w:bottom w:type="dxa" w:w="40"/>
+              <w:right w:type="dxa" w:w="80"/>
+            </w:tcMar>
+          </w:tcPr>
+          <w:p>
+            <w:pPr>
+              <w:spacing w:line="240"/>
+            </w:pPr>
+            <w:r>
+              <w:rPr>
+                <w:sz w:val="21"/>
+                <w:szCs w:val="21"/>
+              </w:rPr>
+              <w:t xml:space="preserve">PC-VEN1 llega a la red externa con NAT</w:t>
+            </w:r>
+          </w:p>
+        </w:tc>
+        <w:tc>
+          <w:tcPr>
+            <w:tcW w:type="dxa" w:w="2200"/>
+            <w:tcBorders>
+              <w:top w:val="none" w:color="FFFFFF" w:sz="0"/>
+              <w:left w:val="none" w:color="FFFFFF" w:sz="0"/>
+              <w:bottom w:val="none" w:color="FFFFFF" w:sz="0"/>
+              <w:right w:val="none" w:color="FFFFFF" w:sz="0"/>
+            </w:tcBorders>
+            <w:tcMar>
+              <w:top w:type="dxa" w:w="40"/>
+              <w:left w:type="dxa" w:w="80"/>
+              <w:bottom w:type="dxa" w:w="40"/>
+              <w:right w:type="dxa" w:w="80"/>
+            </w:tcMar>
+          </w:tcPr>
+          <w:p>
+            <w:pPr>
+              <w:spacing w:line="240"/>
+            </w:pPr>
+            <w:r>
+              <w:rPr>
+                <w:sz w:val="21"/>
+                <w:szCs w:val="21"/>
+              </w:rPr>
+              <w:t xml:space="preserve">Responde y aparece en la tabla NAT</w:t>
+            </w:r>
+          </w:p>
+        </w:tc>
+        <w:tc>
+          <w:tcPr>
+            <w:tcW w:type="dxa" w:w="2400"/>
+            <w:tcBorders>
+              <w:top w:val="none" w:color="FFFFFF" w:sz="0"/>
+              <w:left w:val="none" w:color="FFFFFF" w:sz="0"/>
+              <w:bottom w:val="none" w:color="FFFFFF" w:sz="0"/>
+              <w:right w:val="none" w:color="FFFFFF" w:sz="0"/>
+            </w:tcBorders>
+            <w:tcMar>
+              <w:top w:type="dxa" w:w="40"/>
+              <w:left w:type="dxa" w:w="80"/>
+              <w:bottom w:type="dxa" w:w="40"/>
+              <w:right w:type="dxa" w:w="80"/>
+            </w:tcMar>
+          </w:tcPr>
+          <w:p>
+            <w:pPr>
+              <w:spacing w:line="240"/>
+            </w:pPr>
+            <w:r>
+              <w:rPr>
+                <w:sz w:val="21"/>
+                <w:szCs w:val="21"/>
+              </w:rPr>
+              <w:t xml:space="preserve">4 de 4; traducciones a 203.0.113.1</w:t>
+            </w:r>
+          </w:p>
+        </w:tc>
+        <w:tc>
+          <w:tcPr>
+            <w:tcW w:type="dxa" w:w="1200"/>
+            <w:tcBorders>
+              <w:top w:val="none" w:color="FFFFFF" w:sz="0"/>
+              <w:left w:val="none" w:color="FFFFFF" w:sz="0"/>
+              <w:bottom w:val="none" w:color="FFFFFF" w:sz="0"/>
+              <w:right w:val="none" w:color="FFFFFF" w:sz="0"/>
+            </w:tcBorders>
+            <w:tcMar>
+              <w:top w:type="dxa" w:w="40"/>
+              <w:left w:type="dxa" w:w="80"/>
+              <w:bottom w:type="dxa" w:w="40"/>
+              <w:right w:type="dxa" w:w="80"/>
+            </w:tcMar>
+          </w:tcPr>
+          <w:p>
+            <w:pPr>
+              <w:spacing w:line="240"/>
+            </w:pPr>
+            <w:r>
+              <w:rPr>
+                <w:sz w:val="21"/>
+                <w:szCs w:val="21"/>
+              </w:rPr>
+              <w:t xml:space="preserve">17, 18</w:t>
             </w:r>
           </w:p>
         </w:tc>
       </w:tr>
       <w:tr>
-        <w:tc>
-          <w:tcPr>
-            <w:tcW w:type="dxa" w:w="450"/>
-            <w:tcBorders>
-              <w:top w:val="none" w:color="FFFFFF" w:sz="0"/>
-              <w:left w:val="none" w:color="FFFFFF" w:sz="0"/>
-              <w:bottom w:val="none" w:color="FFFFFF" w:sz="0"/>
+        <w:trPr>
+          <w:cantSplit/>
+        </w:trPr>
+        <w:tc>
+          <w:tcPr>
+            <w:tcW w:type="dxa" w:w="500"/>
+            <w:tcBorders>
+              <w:top w:val="none" w:color="FFFFFF" w:sz="0"/>
+              <w:left w:val="none" w:color="FFFFFF" w:sz="0"/>
+              <w:bottom w:val="single" w:color="000000" w:sz="6"/>
               <w:right w:val="none" w:color="FFFFFF" w:sz="0"/>
             </w:tcBorders>
             <w:tcMar>
@@ -16125,187 +15202,40 @@
         </w:tc>
         <w:tc>
           <w:tcPr>
-            <w:tcW w:type="dxa" w:w="3000"/>
-            <w:tcBorders>
-              <w:top w:val="none" w:color="FFFFFF" w:sz="0"/>
-              <w:left w:val="none" w:color="FFFFFF" w:sz="0"/>
-              <w:bottom w:val="none" w:color="FFFFFF" w:sz="0"/>
-              <w:right w:val="none" w:color="FFFFFF" w:sz="0"/>
-            </w:tcBorders>
-            <w:tcMar>
-              <w:top w:type="dxa" w:w="40"/>
-              <w:left w:type="dxa" w:w="80"/>
-              <w:bottom w:type="dxa" w:w="40"/>
-              <w:right w:type="dxa" w:w="80"/>
-            </w:tcMar>
-          </w:tcPr>
-          <w:p>
-            <w:pPr>
-              <w:spacing w:line="240"/>
-            </w:pPr>
-            <w:r>
-              <w:rPr>
-                <w:sz w:val="21"/>
-                <w:szCs w:val="21"/>
-              </w:rPr>
-              <w:t xml:space="preserve">PC-VEN1 llega a la red externa con NAT</w:t>
-            </w:r>
-          </w:p>
-        </w:tc>
-        <w:tc>
-          <w:tcPr>
-            <w:tcW w:type="dxa" w:w="2100"/>
-            <w:tcBorders>
-              <w:top w:val="none" w:color="FFFFFF" w:sz="0"/>
-              <w:left w:val="none" w:color="FFFFFF" w:sz="0"/>
-              <w:bottom w:val="none" w:color="FFFFFF" w:sz="0"/>
-              <w:right w:val="none" w:color="FFFFFF" w:sz="0"/>
-            </w:tcBorders>
-            <w:tcMar>
-              <w:top w:type="dxa" w:w="40"/>
-              <w:left w:type="dxa" w:w="80"/>
-              <w:bottom w:type="dxa" w:w="40"/>
-              <w:right w:type="dxa" w:w="80"/>
-            </w:tcMar>
-          </w:tcPr>
-          <w:p>
-            <w:pPr>
-              <w:spacing w:line="240"/>
-            </w:pPr>
-            <w:r>
-              <w:rPr>
-                <w:sz w:val="21"/>
-                <w:szCs w:val="21"/>
-              </w:rPr>
-              <w:t xml:space="preserve">Responde y aparece en la tabla NAT</w:t>
-            </w:r>
-          </w:p>
-        </w:tc>
-        <w:tc>
-          <w:tcPr>
-            <w:tcW w:type="dxa" w:w="2810"/>
-            <w:tcBorders>
-              <w:top w:val="none" w:color="FFFFFF" w:sz="0"/>
-              <w:left w:val="none" w:color="FFFFFF" w:sz="0"/>
-              <w:bottom w:val="none" w:color="FFFFFF" w:sz="0"/>
-              <w:right w:val="none" w:color="FFFFFF" w:sz="0"/>
-            </w:tcBorders>
-            <w:tcMar>
-              <w:top w:type="dxa" w:w="40"/>
-              <w:left w:type="dxa" w:w="80"/>
-              <w:bottom w:type="dxa" w:w="40"/>
-              <w:right w:type="dxa" w:w="80"/>
-            </w:tcMar>
-          </w:tcPr>
-          <w:p>
-            <w:pPr>
-              <w:spacing w:line="240"/>
-            </w:pPr>
-            <w:r>
-              <w:rPr>
-                <w:sz w:val="21"/>
-                <w:szCs w:val="21"/>
-              </w:rPr>
-              <w:t xml:space="preserve">4 de 4; traducciones a 203.0.113.1</w:t>
-            </w:r>
-          </w:p>
-        </w:tc>
-        <w:tc>
-          <w:tcPr>
-            <w:tcW w:type="dxa" w:w="1000"/>
-            <w:tcBorders>
-              <w:top w:val="none" w:color="FFFFFF" w:sz="0"/>
-              <w:left w:val="none" w:color="FFFFFF" w:sz="0"/>
-              <w:bottom w:val="none" w:color="FFFFFF" w:sz="0"/>
-              <w:right w:val="none" w:color="FFFFFF" w:sz="0"/>
-            </w:tcBorders>
-            <w:tcMar>
-              <w:top w:type="dxa" w:w="40"/>
-              <w:left w:type="dxa" w:w="80"/>
-              <w:bottom w:type="dxa" w:w="40"/>
-              <w:right w:type="dxa" w:w="80"/>
-            </w:tcMar>
-          </w:tcPr>
-          <w:p>
-            <w:pPr>
-              <w:spacing w:line="240"/>
-            </w:pPr>
-            <w:r>
-              <w:rPr>
-                <w:sz w:val="21"/>
-                <w:szCs w:val="21"/>
-              </w:rPr>
-              <w:t xml:space="preserve">19, 20</w:t>
-            </w:r>
-          </w:p>
-        </w:tc>
-      </w:tr>
-      <w:tr>
-        <w:tc>
-          <w:tcPr>
-            <w:tcW w:type="dxa" w:w="450"/>
-            <w:tcBorders>
-              <w:top w:val="none" w:color="FFFFFF" w:sz="0"/>
-              <w:left w:val="none" w:color="FFFFFF" w:sz="0"/>
-              <w:bottom w:val="none" w:color="FFFFFF" w:sz="0"/>
-              <w:right w:val="none" w:color="FFFFFF" w:sz="0"/>
-            </w:tcBorders>
-            <w:tcMar>
-              <w:top w:type="dxa" w:w="40"/>
-              <w:left w:type="dxa" w:w="80"/>
-              <w:bottom w:type="dxa" w:w="40"/>
-              <w:right w:type="dxa" w:w="80"/>
-            </w:tcMar>
-          </w:tcPr>
-          <w:p>
-            <w:pPr>
-              <w:spacing w:line="240"/>
-            </w:pPr>
-            <w:r>
-              <w:rPr>
-                <w:sz w:val="21"/>
-                <w:szCs w:val="21"/>
-              </w:rPr>
-              <w:t xml:space="preserve">10</w:t>
-            </w:r>
-          </w:p>
-        </w:tc>
-        <w:tc>
-          <w:tcPr>
-            <w:tcW w:type="dxa" w:w="3000"/>
-            <w:tcBorders>
-              <w:top w:val="none" w:color="FFFFFF" w:sz="0"/>
-              <w:left w:val="none" w:color="FFFFFF" w:sz="0"/>
-              <w:bottom w:val="none" w:color="FFFFFF" w:sz="0"/>
-              <w:right w:val="none" w:color="FFFFFF" w:sz="0"/>
-            </w:tcBorders>
-            <w:tcMar>
-              <w:top w:type="dxa" w:w="40"/>
-              <w:left w:type="dxa" w:w="80"/>
-              <w:bottom w:type="dxa" w:w="40"/>
-              <w:right w:type="dxa" w:w="80"/>
-            </w:tcMar>
-          </w:tcPr>
-          <w:p>
-            <w:pPr>
-              <w:spacing w:line="240"/>
-            </w:pPr>
-            <w:r>
-              <w:rPr>
-                <w:sz w:val="21"/>
-                <w:szCs w:val="21"/>
-              </w:rPr>
-              <w:t xml:space="preserve">Ventas llega a Finanzas (permitido)</w:t>
-            </w:r>
-          </w:p>
-        </w:tc>
-        <w:tc>
-          <w:tcPr>
-            <w:tcW w:type="dxa" w:w="2100"/>
-            <w:tcBorders>
-              <w:top w:val="none" w:color="FFFFFF" w:sz="0"/>
-              <w:left w:val="none" w:color="FFFFFF" w:sz="0"/>
-              <w:bottom w:val="none" w:color="FFFFFF" w:sz="0"/>
+            <w:tcW w:type="dxa" w:w="3060"/>
+            <w:tcBorders>
+              <w:top w:val="none" w:color="FFFFFF" w:sz="0"/>
+              <w:left w:val="none" w:color="FFFFFF" w:sz="0"/>
+              <w:bottom w:val="single" w:color="000000" w:sz="6"/>
+              <w:right w:val="none" w:color="FFFFFF" w:sz="0"/>
+            </w:tcBorders>
+            <w:tcMar>
+              <w:top w:type="dxa" w:w="40"/>
+              <w:left w:type="dxa" w:w="80"/>
+              <w:bottom w:type="dxa" w:w="40"/>
+              <w:right w:type="dxa" w:w="80"/>
+            </w:tcMar>
+          </w:tcPr>
+          <w:p>
+            <w:pPr>
+              <w:spacing w:line="240"/>
+            </w:pPr>
+            <w:r>
+              <w:rPr>
+                <w:sz w:val="21"/>
+                <w:szCs w:val="21"/>
+              </w:rPr>
+              <w:t xml:space="preserve">Ventas llega a Finanzas (enrutamiento entre VLAN)</w:t>
+            </w:r>
+          </w:p>
+        </w:tc>
+        <w:tc>
+          <w:tcPr>
+            <w:tcW w:type="dxa" w:w="2200"/>
+            <w:tcBorders>
+              <w:top w:val="none" w:color="FFFFFF" w:sz="0"/>
+              <w:left w:val="none" w:color="FFFFFF" w:sz="0"/>
+              <w:bottom w:val="single" w:color="000000" w:sz="6"/>
               <w:right w:val="none" w:color="FFFFFF" w:sz="0"/>
             </w:tcBorders>
             <w:tcMar>
@@ -16330,11 +15260,11 @@
         </w:tc>
         <w:tc>
           <w:tcPr>
-            <w:tcW w:type="dxa" w:w="2810"/>
-            <w:tcBorders>
-              <w:top w:val="none" w:color="FFFFFF" w:sz="0"/>
-              <w:left w:val="none" w:color="FFFFFF" w:sz="0"/>
-              <w:bottom w:val="none" w:color="FFFFFF" w:sz="0"/>
+            <w:tcW w:type="dxa" w:w="2400"/>
+            <w:tcBorders>
+              <w:top w:val="none" w:color="FFFFFF" w:sz="0"/>
+              <w:left w:val="none" w:color="FFFFFF" w:sz="0"/>
+              <w:bottom w:val="single" w:color="000000" w:sz="6"/>
               <w:right w:val="none" w:color="FFFFFF" w:sz="0"/>
             </w:tcBorders>
             <w:tcMar>
@@ -16359,38 +15289,7 @@
         </w:tc>
         <w:tc>
           <w:tcPr>
-            <w:tcW w:type="dxa" w:w="1000"/>
-            <w:tcBorders>
-              <w:top w:val="none" w:color="FFFFFF" w:sz="0"/>
-              <w:left w:val="none" w:color="FFFFFF" w:sz="0"/>
-              <w:bottom w:val="none" w:color="FFFFFF" w:sz="0"/>
-              <w:right w:val="none" w:color="FFFFFF" w:sz="0"/>
-            </w:tcBorders>
-            <w:tcMar>
-              <w:top w:type="dxa" w:w="40"/>
-              <w:left w:type="dxa" w:w="80"/>
-              <w:bottom w:type="dxa" w:w="40"/>
-              <w:right w:type="dxa" w:w="80"/>
-            </w:tcMar>
-          </w:tcPr>
-          <w:p>
-            <w:pPr>
-              <w:spacing w:line="240"/>
-            </w:pPr>
-            <w:r>
-              <w:rPr>
-                <w:sz w:val="21"/>
-                <w:szCs w:val="21"/>
-              </w:rPr>
-              <w:t xml:space="preserve">21</w:t>
-            </w:r>
-          </w:p>
-        </w:tc>
-      </w:tr>
-      <w:tr>
-        <w:tc>
-          <w:tcPr>
-            <w:tcW w:type="dxa" w:w="450"/>
+            <w:tcW w:type="dxa" w:w="1200"/>
             <w:tcBorders>
               <w:top w:val="none" w:color="FFFFFF" w:sz="0"/>
               <w:left w:val="none" w:color="FFFFFF" w:sz="0"/>
@@ -16413,123 +15312,7 @@
                 <w:sz w:val="21"/>
                 <w:szCs w:val="21"/>
               </w:rPr>
-              <w:t xml:space="preserve">11</w:t>
-            </w:r>
-          </w:p>
-        </w:tc>
-        <w:tc>
-          <w:tcPr>
-            <w:tcW w:type="dxa" w:w="3000"/>
-            <w:tcBorders>
-              <w:top w:val="none" w:color="FFFFFF" w:sz="0"/>
-              <w:left w:val="none" w:color="FFFFFF" w:sz="0"/>
-              <w:bottom w:val="single" w:color="000000" w:sz="6"/>
-              <w:right w:val="none" w:color="FFFFFF" w:sz="0"/>
-            </w:tcBorders>
-            <w:tcMar>
-              <w:top w:type="dxa" w:w="40"/>
-              <w:left w:type="dxa" w:w="80"/>
-              <w:bottom w:type="dxa" w:w="40"/>
-              <w:right w:type="dxa" w:w="80"/>
-            </w:tcMar>
-          </w:tcPr>
-          <w:p>
-            <w:pPr>
-              <w:spacing w:line="240"/>
-            </w:pPr>
-            <w:r>
-              <w:rPr>
-                <w:sz w:val="21"/>
-                <w:szCs w:val="21"/>
-              </w:rPr>
-              <w:t xml:space="preserve">Capacitación llega a Finanzas (prohibido)</w:t>
-            </w:r>
-          </w:p>
-        </w:tc>
-        <w:tc>
-          <w:tcPr>
-            <w:tcW w:type="dxa" w:w="2100"/>
-            <w:tcBorders>
-              <w:top w:val="none" w:color="FFFFFF" w:sz="0"/>
-              <w:left w:val="none" w:color="FFFFFF" w:sz="0"/>
-              <w:bottom w:val="single" w:color="000000" w:sz="6"/>
-              <w:right w:val="none" w:color="FFFFFF" w:sz="0"/>
-            </w:tcBorders>
-            <w:tcMar>
-              <w:top w:type="dxa" w:w="40"/>
-              <w:left w:type="dxa" w:w="80"/>
-              <w:bottom w:type="dxa" w:w="40"/>
-              <w:right w:type="dxa" w:w="80"/>
-            </w:tcMar>
-          </w:tcPr>
-          <w:p>
-            <w:pPr>
-              <w:spacing w:line="240"/>
-            </w:pPr>
-            <w:r>
-              <w:rPr>
-                <w:sz w:val="21"/>
-                <w:szCs w:val="21"/>
-              </w:rPr>
-              <w:t xml:space="preserve">Bloqueado</w:t>
-            </w:r>
-          </w:p>
-        </w:tc>
-        <w:tc>
-          <w:tcPr>
-            <w:tcW w:type="dxa" w:w="2810"/>
-            <w:tcBorders>
-              <w:top w:val="none" w:color="FFFFFF" w:sz="0"/>
-              <w:left w:val="none" w:color="FFFFFF" w:sz="0"/>
-              <w:bottom w:val="single" w:color="000000" w:sz="6"/>
-              <w:right w:val="none" w:color="FFFFFF" w:sz="0"/>
-            </w:tcBorders>
-            <w:tcMar>
-              <w:top w:type="dxa" w:w="40"/>
-              <w:left w:type="dxa" w:w="80"/>
-              <w:bottom w:type="dxa" w:w="40"/>
-              <w:right w:type="dxa" w:w="80"/>
-            </w:tcMar>
-          </w:tcPr>
-          <w:p>
-            <w:pPr>
-              <w:spacing w:line="240"/>
-            </w:pPr>
-            <w:r>
-              <w:rPr>
-                <w:sz w:val="21"/>
-                <w:szCs w:val="21"/>
-              </w:rPr>
-              <w:t xml:space="preserve">Destination host unreachable; la ACL cuenta coincidencias</w:t>
-            </w:r>
-          </w:p>
-        </w:tc>
-        <w:tc>
-          <w:tcPr>
-            <w:tcW w:type="dxa" w:w="1000"/>
-            <w:tcBorders>
-              <w:top w:val="none" w:color="FFFFFF" w:sz="0"/>
-              <w:left w:val="none" w:color="FFFFFF" w:sz="0"/>
-              <w:bottom w:val="single" w:color="000000" w:sz="6"/>
-              <w:right w:val="none" w:color="FFFFFF" w:sz="0"/>
-            </w:tcBorders>
-            <w:tcMar>
-              <w:top w:type="dxa" w:w="40"/>
-              <w:left w:type="dxa" w:w="80"/>
-              <w:bottom w:type="dxa" w:w="40"/>
-              <w:right w:type="dxa" w:w="80"/>
-            </w:tcMar>
-          </w:tcPr>
-          <w:p>
-            <w:pPr>
-              <w:spacing w:line="240"/>
-            </w:pPr>
-            <w:r>
-              <w:rPr>
-                <w:sz w:val="21"/>
-                <w:szCs w:val="21"/>
-              </w:rPr>
-              <w:t xml:space="preserve">22, 23</w:t>
+              <w:t xml:space="preserve">19</w:t>
             </w:r>
           </w:p>
         </w:tc>
@@ -16545,7 +15328,7 @@
           <w:b/>
           <w:bCs/>
         </w:rPr>
-        <w:t xml:space="preserve">Figura 14</w:t>
+        <w:t xml:space="preserve">Figura 13</w:t>
       </w:r>
     </w:p>
     <w:p>
@@ -16615,7 +15398,7 @@
           <w:b/>
           <w:bCs/>
         </w:rPr>
-        <w:t xml:space="preserve">Figura 15</w:t>
+        <w:t xml:space="preserve">Figura 14</w:t>
       </w:r>
     </w:p>
     <w:p>
@@ -16627,77 +15410,7 @@
           <w:i/>
           <w:iCs/>
         </w:rPr>
-        <w:t xml:space="preserve">Consulta DNS desde PC-VEN1</w:t>
-      </w:r>
-    </w:p>
-    <w:p>
-      <w:pPr>
-        <w:keepNext w:val="false"/>
-        <w:spacing w:after="360" w:line="240"/>
-      </w:pPr>
-      <w:r>
-        <w:drawing>
-          <wp:inline distT="0" distB="0" distL="0" distR="0">
-            <wp:extent cx="2627348" cy="1466935"/>
-            <wp:effectExtent t="0" r="0" b="0" l="0"/>
-            <wp:docPr id="15" name=""/>
-            <wp:cNvGraphicFramePr>
-              <a:graphicFrameLocks xmlns:a="http://schemas.openxmlformats.org/drawingml/2006/main" noChangeAspect="1"/>
-            </wp:cNvGraphicFramePr>
-            <a:graphic xmlns:a="http://schemas.openxmlformats.org/drawingml/2006/main">
-              <a:graphicData uri="http://schemas.openxmlformats.org/drawingml/2006/picture">
-                <pic:pic xmlns:pic="http://schemas.openxmlformats.org/drawingml/2006/picture">
-                  <pic:nvPicPr>
-                    <pic:cNvPr id="0" name="" descr=""/>
-                    <pic:cNvPicPr>
-                      <a:picLocks noChangeAspect="1" noChangeArrowheads="1"/>
-                    </pic:cNvPicPr>
-                  </pic:nvPicPr>
-                  <pic:blipFill>
-                    <a:blip r:embed="rId22" cstate="none"/>
-                    <a:srcRect/>
-                    <a:stretch>
-                      <a:fillRect/>
-                    </a:stretch>
-                  </pic:blipFill>
-                  <pic:spPr bwMode="auto">
-                    <a:xfrm>
-                      <a:off x="0" y="0"/>
-                      <a:ext cx="2627348" cy="1466935"/>
-                    </a:xfrm>
-                    <a:prstGeom prst="rect">
-                      <a:avLst/>
-                    </a:prstGeom>
-                  </pic:spPr>
-                </pic:pic>
-              </a:graphicData>
-            </a:graphic>
-          </wp:inline>
-        </w:drawing>
-      </w:r>
-    </w:p>
-    <w:p>
-      <w:pPr>
-        <w:keepNext/>
-      </w:pPr>
-      <w:r>
-        <w:rPr>
-          <w:b/>
-          <w:bCs/>
-        </w:rPr>
-        <w:t xml:space="preserve">Figura 16</w:t>
-      </w:r>
-    </w:p>
-    <w:p>
-      <w:pPr>
-        <w:keepNext/>
-      </w:pPr>
-      <w:r>
-        <w:rPr>
-          <w:i/>
-          <w:iCs/>
-        </w:rPr>
-        <w:t xml:space="preserve">Ping por nombre desde PC-VEN1 al servidor de la intranet</w:t>
+        <w:t xml:space="preserve">Ping de PC-VEN1 al servidor SRV-TI</w:t>
       </w:r>
     </w:p>
     <w:p>
@@ -16755,7 +15468,7 @@
           <w:b/>
           <w:bCs/>
         </w:rPr>
-        <w:t xml:space="preserve">Figura 17</w:t>
+        <w:t xml:space="preserve">Figura 15</w:t>
       </w:r>
     </w:p>
     <w:p>
@@ -16767,7 +15480,7 @@
           <w:i/>
           <w:iCs/>
         </w:rPr>
-        <w:t xml:space="preserve">Ping desde PC-NOR1 (Regional Norte) al servidor de la sede central</w:t>
+        <w:t xml:space="preserve">Ping desde PC-NOR1 (Regional Norte) al servidor SRV-TI de la sede central</w:t>
       </w:r>
     </w:p>
     <w:p>
@@ -16825,7 +15538,7 @@
           <w:b/>
           <w:bCs/>
         </w:rPr>
-        <w:t xml:space="preserve">Figura 18</w:t>
+        <w:t xml:space="preserve">Figura 16</w:t>
       </w:r>
     </w:p>
     <w:p>
@@ -16895,7 +15608,7 @@
           <w:b/>
           <w:bCs/>
         </w:rPr>
-        <w:t xml:space="preserve">Figura 19</w:t>
+        <w:t xml:space="preserve">Figura 17</w:t>
       </w:r>
     </w:p>
     <w:p>
@@ -16965,7 +15678,7 @@
           <w:b/>
           <w:bCs/>
         </w:rPr>
-        <w:t xml:space="preserve">Figura 20</w:t>
+        <w:t xml:space="preserve">Figura 18</w:t>
       </w:r>
     </w:p>
     <w:p>
@@ -17050,7 +15763,7 @@
           <w:b/>
           <w:bCs/>
         </w:rPr>
-        <w:t xml:space="preserve">Figura 21</w:t>
+        <w:t xml:space="preserve">Figura 19</w:t>
       </w:r>
     </w:p>
     <w:p>
@@ -17062,7 +15775,7 @@
           <w:i/>
           <w:iCs/>
         </w:rPr>
-        <w:t xml:space="preserve">Ping permitido desde Ventas (PC-VEN1) a Finanzas (PC-FIN1)</w:t>
+        <w:t xml:space="preserve">Ping desde Ventas (PC-VEN1) a Finanzas (PC-FIN1)</w:t>
       </w:r>
     </w:p>
     <w:p>
@@ -17113,176 +15826,6 @@
     </w:p>
     <w:p>
       <w:pPr>
-        <w:keepNext/>
-      </w:pPr>
-      <w:r>
-        <w:rPr>
-          <w:b/>
-          <w:bCs/>
-        </w:rPr>
-        <w:t xml:space="preserve">Figura 22</w:t>
-      </w:r>
-    </w:p>
-    <w:p>
-      <w:pPr>
-        <w:keepNext/>
-      </w:pPr>
-      <w:r>
-        <w:rPr>
-          <w:i/>
-          <w:iCs/>
-        </w:rPr>
-        <w:t xml:space="preserve">Ping bloqueado desde Capacitación (PC-CAP1) a Finanzas (PC-FIN1)</w:t>
-      </w:r>
-    </w:p>
-    <w:p>
-      <w:pPr>
-        <w:keepNext/>
-        <w:spacing w:after="0" w:line="240"/>
-      </w:pPr>
-      <w:r>
-        <w:drawing>
-          <wp:inline distT="0" distB="0" distL="0" distR="0">
-            <wp:extent cx="4333875" cy="1885950"/>
-            <wp:effectExtent t="0" r="0" b="0" l="0"/>
-            <wp:docPr id="22" name=""/>
-            <wp:cNvGraphicFramePr>
-              <a:graphicFrameLocks xmlns:a="http://schemas.openxmlformats.org/drawingml/2006/main" noChangeAspect="1"/>
-            </wp:cNvGraphicFramePr>
-            <a:graphic xmlns:a="http://schemas.openxmlformats.org/drawingml/2006/main">
-              <a:graphicData uri="http://schemas.openxmlformats.org/drawingml/2006/picture">
-                <pic:pic xmlns:pic="http://schemas.openxmlformats.org/drawingml/2006/picture">
-                  <pic:nvPicPr>
-                    <pic:cNvPr id="0" name="" descr=""/>
-                    <pic:cNvPicPr>
-                      <a:picLocks noChangeAspect="1" noChangeArrowheads="1"/>
-                    </pic:cNvPicPr>
-                  </pic:nvPicPr>
-                  <pic:blipFill>
-                    <a:blip r:embed="rId29" cstate="none"/>
-                    <a:srcRect/>
-                    <a:stretch>
-                      <a:fillRect/>
-                    </a:stretch>
-                  </pic:blipFill>
-                  <pic:spPr bwMode="auto">
-                    <a:xfrm>
-                      <a:off x="0" y="0"/>
-                      <a:ext cx="4333875" cy="1885950"/>
-                    </a:xfrm>
-                    <a:prstGeom prst="rect">
-                      <a:avLst/>
-                    </a:prstGeom>
-                  </pic:spPr>
-                </pic:pic>
-              </a:graphicData>
-            </a:graphic>
-          </wp:inline>
-        </w:drawing>
-      </w:r>
-    </w:p>
-    <w:p>
-      <w:pPr>
-        <w:spacing w:after="360"/>
-      </w:pPr>
-      <w:r>
-        <w:rPr>
-          <w:i/>
-          <w:iCs/>
-        </w:rPr>
-        <w:t xml:space="preserve">Nota. </w:t>
-      </w:r>
-      <w:r>
-        <w:t xml:space="preserve">El mensaje lo envía el gateway 10.20.0.129 porque la ACL descarta el paquete.</w:t>
-      </w:r>
-    </w:p>
-    <w:p>
-      <w:pPr>
-        <w:keepNext/>
-      </w:pPr>
-      <w:r>
-        <w:rPr>
-          <w:b/>
-          <w:bCs/>
-        </w:rPr>
-        <w:t xml:space="preserve">Figura 23</w:t>
-      </w:r>
-    </w:p>
-    <w:p>
-      <w:pPr>
-        <w:keepNext/>
-      </w:pPr>
-      <w:r>
-        <w:rPr>
-          <w:i/>
-          <w:iCs/>
-        </w:rPr>
-        <w:t xml:space="preserve">Contadores de las listas de acceso en R-CRG</w:t>
-      </w:r>
-    </w:p>
-    <w:p>
-      <w:pPr>
-        <w:keepNext/>
-        <w:spacing w:after="0" w:line="240"/>
-      </w:pPr>
-      <w:r>
-        <w:drawing>
-          <wp:inline distT="0" distB="0" distL="0" distR="0">
-            <wp:extent cx="5229225" cy="1403230"/>
-            <wp:effectExtent t="0" r="0" b="0" l="0"/>
-            <wp:docPr id="23" name=""/>
-            <wp:cNvGraphicFramePr>
-              <a:graphicFrameLocks xmlns:a="http://schemas.openxmlformats.org/drawingml/2006/main" noChangeAspect="1"/>
-            </wp:cNvGraphicFramePr>
-            <a:graphic xmlns:a="http://schemas.openxmlformats.org/drawingml/2006/main">
-              <a:graphicData uri="http://schemas.openxmlformats.org/drawingml/2006/picture">
-                <pic:pic xmlns:pic="http://schemas.openxmlformats.org/drawingml/2006/picture">
-                  <pic:nvPicPr>
-                    <pic:cNvPr id="0" name="" descr=""/>
-                    <pic:cNvPicPr>
-                      <a:picLocks noChangeAspect="1" noChangeArrowheads="1"/>
-                    </pic:cNvPicPr>
-                  </pic:nvPicPr>
-                  <pic:blipFill>
-                    <a:blip r:embed="rId30" cstate="none"/>
-                    <a:srcRect/>
-                    <a:stretch>
-                      <a:fillRect/>
-                    </a:stretch>
-                  </pic:blipFill>
-                  <pic:spPr bwMode="auto">
-                    <a:xfrm>
-                      <a:off x="0" y="0"/>
-                      <a:ext cx="5229225" cy="1403230"/>
-                    </a:xfrm>
-                    <a:prstGeom prst="rect">
-                      <a:avLst/>
-                    </a:prstGeom>
-                  </pic:spPr>
-                </pic:pic>
-              </a:graphicData>
-            </a:graphic>
-          </wp:inline>
-        </w:drawing>
-      </w:r>
-    </w:p>
-    <w:p>
-      <w:pPr>
-        <w:spacing w:after="360"/>
-      </w:pPr>
-      <w:r>
-        <w:rPr>
-          <w:i/>
-          <w:iCs/>
-        </w:rPr>
-        <w:t xml:space="preserve">Nota. </w:t>
-      </w:r>
-      <w:r>
-        <w:t xml:space="preserve">La regla deny de ACL-FINANZAS tiene coincidencias: la ACL está funcionando.</w:t>
-      </w:r>
-    </w:p>
-    <w:p>
-      <w:pPr>
         <w:pStyle w:val="Heading1"/>
       </w:pPr>
       <w:bookmarkStart w:name="_Toc24" w:id="24"/>
@@ -17851,95 +16394,6 @@
                 <w:sz w:val="21"/>
                 <w:szCs w:val="21"/>
               </w:rPr>
-              <w:t xml:space="preserve">Ping por IP funciona pero por nombre no</w:t>
-            </w:r>
-          </w:p>
-        </w:tc>
-        <w:tc>
-          <w:tcPr>
-            <w:tcW w:type="dxa" w:w="3200"/>
-            <w:tcBorders>
-              <w:top w:val="none" w:color="FFFFFF" w:sz="0"/>
-              <w:left w:val="none" w:color="FFFFFF" w:sz="0"/>
-              <w:bottom w:val="none" w:color="FFFFFF" w:sz="0"/>
-              <w:right w:val="none" w:color="FFFFFF" w:sz="0"/>
-            </w:tcBorders>
-            <w:tcMar>
-              <w:top w:type="dxa" w:w="40"/>
-              <w:left w:type="dxa" w:w="80"/>
-              <w:bottom w:type="dxa" w:w="40"/>
-              <w:right w:type="dxa" w:w="80"/>
-            </w:tcMar>
-          </w:tcPr>
-          <w:p>
-            <w:pPr>
-              <w:spacing w:line="240"/>
-            </w:pPr>
-            <w:r>
-              <w:rPr>
-                <w:sz w:val="21"/>
-                <w:szCs w:val="21"/>
-              </w:rPr>
-              <w:t xml:space="preserve">Problema de DNS, no de red</w:t>
-            </w:r>
-          </w:p>
-        </w:tc>
-        <w:tc>
-          <w:tcPr>
-            <w:tcW w:type="dxa" w:w="3460"/>
-            <w:tcBorders>
-              <w:top w:val="none" w:color="FFFFFF" w:sz="0"/>
-              <w:left w:val="none" w:color="FFFFFF" w:sz="0"/>
-              <w:bottom w:val="none" w:color="FFFFFF" w:sz="0"/>
-              <w:right w:val="none" w:color="FFFFFF" w:sz="0"/>
-            </w:tcBorders>
-            <w:tcMar>
-              <w:top w:type="dxa" w:w="40"/>
-              <w:left w:type="dxa" w:w="80"/>
-              <w:bottom w:type="dxa" w:w="40"/>
-              <w:right w:type="dxa" w:w="80"/>
-            </w:tcMar>
-          </w:tcPr>
-          <w:p>
-            <w:pPr>
-              <w:spacing w:line="240"/>
-            </w:pPr>
-            <w:r>
-              <w:rPr>
-                <w:sz w:val="21"/>
-                <w:szCs w:val="21"/>
-              </w:rPr>
-              <w:t xml:space="preserve">Revisa que el servicio DNS esté en On y que la PC tenga DNS 10.20.0.194.</w:t>
-            </w:r>
-          </w:p>
-        </w:tc>
-      </w:tr>
-      <w:tr>
-        <w:tc>
-          <w:tcPr>
-            <w:tcW w:type="dxa" w:w="2700"/>
-            <w:tcBorders>
-              <w:top w:val="none" w:color="FFFFFF" w:sz="0"/>
-              <w:left w:val="none" w:color="FFFFFF" w:sz="0"/>
-              <w:bottom w:val="none" w:color="FFFFFF" w:sz="0"/>
-              <w:right w:val="none" w:color="FFFFFF" w:sz="0"/>
-            </w:tcBorders>
-            <w:tcMar>
-              <w:top w:type="dxa" w:w="40"/>
-              <w:left w:type="dxa" w:w="80"/>
-              <w:bottom w:type="dxa" w:w="40"/>
-              <w:right w:type="dxa" w:w="80"/>
-            </w:tcMar>
-          </w:tcPr>
-          <w:p>
-            <w:pPr>
-              <w:spacing w:line="240"/>
-            </w:pPr>
-            <w:r>
-              <w:rPr>
-                <w:sz w:val="21"/>
-                <w:szCs w:val="21"/>
-              </w:rPr>
               <w:t xml:space="preserve">Se pierde el primer ping</w:t>
             </w:r>
           </w:p>
@@ -18606,7 +17060,7 @@
                 <w:sz w:val="21"/>
                 <w:szCs w:val="21"/>
               </w:rPr>
-              <w:t xml:space="preserve">DNS interno y servicios de intranet (SRV-TI).</w:t>
+              <w:t xml:space="preserve">Servicios de intranet y archivos (SRV-TI).</w:t>
             </w:r>
           </w:p>
         </w:tc>
@@ -19194,7 +17648,7 @@
         <w:ind w:firstLine="720"/>
       </w:pPr>
       <w:r>
-        <w:t xml:space="preserve">Se construyó en Packet Tracer la red completa del CRG según el diseño: ocho VLAN con sus ocho subredes VLSM, tres enlaces WAN seriales /30, enrutamiento OSPF de área única, DHCP centralizado con reenvío desde las regionales, DNS interno, NAT hacia una red externa simulada y una ACL que protege a Finanzas. Las once pruebas de la matriz de aceptación dieron el resultado esperado y quedaron registradas con capturas.</w:t>
+        <w:t xml:space="preserve">Se construyó en Packet Tracer la red completa del CRG según el diseño: ocho VLAN con sus ocho subredes VLSM, tres enlaces WAN seriales /30, rutas estáticas entre las sedes, DHCP centralizado con reenvío desde las regionales y NAT hacia una red externa simulada. Las nueve pruebas de la matriz de aceptación dieron el resultado esperado y quedaron registradas con capturas.</w:t>
       </w:r>
     </w:p>
     <w:p>
@@ -19202,7 +17656,7 @@
         <w:ind w:firstLine="720"/>
       </w:pPr>
       <w:r>
-        <w:t xml:space="preserve">En relación con los objetivos, se cumplieron el objetivo general y los siete específicos: el análisis del contexto definió los requisitos de la red; el plan VLSM de la Tabla 2 cubre la demanda de 300 equipos; las VLAN, las troncales y las subinterfaces funcionan según las Figuras 3 a 6; OSPF formó adyacencia con las tres regionales (Figura 9); DHCP, DNS, NAT y la ACL respondieron como se esperaba en la matriz de la Tabla 8; y la Tabla 10 estima los equipos para una instalación real.</w:t>
+        <w:t xml:space="preserve">En relación con los objetivos, se cumplieron el objetivo general y los siete específicos: el análisis del contexto definió los requisitos de la red; el plan VLSM de la Tabla 2 cubre la demanda de 300 equipos; las VLAN, las troncales y las subinterfaces funcionan según las Figuras 3 a 6; las rutas estáticas conectan las cuatro sedes (Figuras 9 y 10); DHCP y NAT respondieron como se esperaba en la matriz de la Tabla 8; y la Tabla 10 estima los equipos para una instalación real.</w:t>
       </w:r>
     </w:p>
     <w:p>
@@ -19210,7 +17664,7 @@
         <w:ind w:firstLine="720"/>
       </w:pPr>
       <w:r>
-        <w:t xml:space="preserve">La separación en VLAN limita el tamaño de cada dominio de difusión, el DHCP evita las direcciones duplicadas y OSPF permite agregar nuevas sedes sin escribir rutas a mano. Como limitación, el simulador usa dos PC por grupo en lugar de 300 equipos y no mide rendimiento real; para una instalación real haría falta un estudio del sitio, cotizaciones formales y pruebas de carga.</w:t>
+        <w:t xml:space="preserve">La separación en VLAN limita el tamaño de cada dominio de difusión, el DHCP evita las direcciones duplicadas y las rutas estáticas mantienen el enrutamiento simple, porque todas las regionales dependen de la sede central. Como limitación, el simulador usa dos PC por grupo en lugar de 300 equipos y no mide rendimiento real; para una instalación real haría falta un estudio del sitio, cotizaciones formales y pruebas de carga.</w:t>
       </w:r>
     </w:p>
     <w:p>
@@ -19247,10 +17701,25 @@
           <w:b/>
           <w:bCs/>
         </w:rPr>
-        <w:t xml:space="preserve">Usar SSH en lugar de Telnet.</w:t>
-      </w:r>
-      <w:r>
-        <w:t xml:space="preserve"> Telnet envía el usuario y la contraseña sin cifrar. En equipos reales se debe generar una clave RSA y cambiar la línea </w:t>
+        <w:t xml:space="preserve">Agregar seguridad en una segunda etapa.</w:t>
+      </w:r>
+      <w:r>
+        <w:t xml:space="preserve"> Este trabajo no incluye controles de seguridad. En una red real conviene usar listas de control de acceso (ACL) para aislar áreas sensibles como Finanzas y SSH en lugar de Telnet para administrar los equipos.</w:t>
+      </w:r>
+    </w:p>
+    <w:p>
+      <w:pPr>
+        <w:ind w:firstLine="720"/>
+      </w:pPr>
+      <w:r>
+        <w:rPr>
+          <w:b/>
+          <w:bCs/>
+        </w:rPr>
+        <w:t xml:space="preserve">Agregar un servidor DNS.</w:t>
+      </w:r>
+      <w:r>
+        <w:t xml:space="preserve"> Permitiría usar nombres como </w:t>
       </w:r>
       <w:r>
         <w:rPr>
@@ -19258,21 +17727,25 @@
           <w:sz w:val="22"/>
           <w:szCs w:val="22"/>
         </w:rPr>
-        <w:t xml:space="preserve">transport input telnet</w:t>
-      </w:r>
-      <w:r>
-        <w:t xml:space="preserve"> por </w:t>
-      </w:r>
-      <w:r>
-        <w:rPr>
-          <w:rFonts w:ascii="Courier New" w:cs="Courier New" w:eastAsia="Courier New" w:hAnsi="Courier New"/>
-          <w:sz w:val="22"/>
-          <w:szCs w:val="22"/>
-        </w:rPr>
-        <w:t xml:space="preserve">transport input ssh</w:t>
-      </w:r>
-      <w:r>
-        <w:t xml:space="preserve">.</w:t>
+        <w:t xml:space="preserve">intranet.crg.local</w:t>
+      </w:r>
+      <w:r>
+        <w:t xml:space="preserve"> en lugar de direcciones IP (Mockapetris, 1987).</w:t>
+      </w:r>
+    </w:p>
+    <w:p>
+      <w:pPr>
+        <w:ind w:firstLine="720"/>
+      </w:pPr>
+      <w:r>
+        <w:rPr>
+          <w:b/>
+          <w:bCs/>
+        </w:rPr>
+        <w:t xml:space="preserve">Pasar a enrutamiento dinámico si la red crece.</w:t>
+      </w:r>
+      <w:r>
+        <w:t xml:space="preserve"> Con más sedes o enlaces de respaldo, mantener rutas estáticas a mano se vuelve difícil; un protocolo como OSPF actualiza las rutas automáticamente (Moy, 1998).</w:t>
       </w:r>
     </w:p>
     <w:p>

</xml_diff>

<commit_message>
Eliminar el párrafo introductorio sobre repetir el trabajo
Co-Authored-By: Claude Sonnet 5.5 <noreply@anthropic.com>
</commit_message>
<xml_diff>
--- a/ProyectoFinal-Redes-ACT6-APA7.docx
+++ b/ProyectoFinal-Redes-ACT6-APA7.docx
@@ -208,7 +208,7 @@
               <w:tab/>
             </w:r>
             <w:r>
-              <w:t>6</w:t>
+              <w:t>5</w:t>
             </w:r>
           </w:hyperlink>
         </w:p>
@@ -268,7 +268,7 @@
               <w:tab/>
             </w:r>
             <w:r>
-              <w:t>8</w:t>
+              <w:t>7</w:t>
             </w:r>
           </w:hyperlink>
         </w:p>
@@ -408,7 +408,7 @@
               <w:tab/>
             </w:r>
             <w:r>
-              <w:t>12</w:t>
+              <w:t>11</w:t>
             </w:r>
           </w:hyperlink>
         </w:p>
@@ -428,7 +428,7 @@
               <w:tab/>
             </w:r>
             <w:r>
-              <w:t>13</w:t>
+              <w:t>12</w:t>
             </w:r>
           </w:hyperlink>
         </w:p>
@@ -448,7 +448,7 @@
               <w:tab/>
             </w:r>
             <w:r>
-              <w:t>14</w:t>
+              <w:t>13</w:t>
             </w:r>
           </w:hyperlink>
         </w:p>
@@ -468,7 +468,7 @@
               <w:tab/>
             </w:r>
             <w:r>
-              <w:t>15</w:t>
+              <w:t>14</w:t>
             </w:r>
           </w:hyperlink>
         </w:p>
@@ -488,7 +488,7 @@
               <w:tab/>
             </w:r>
             <w:r>
-              <w:t>15</w:t>
+              <w:t>14</w:t>
             </w:r>
           </w:hyperlink>
         </w:p>
@@ -528,7 +528,7 @@
               <w:tab/>
             </w:r>
             <w:r>
-              <w:t>20</w:t>
+              <w:t>19</w:t>
             </w:r>
           </w:hyperlink>
         </w:p>
@@ -568,7 +568,7 @@
               <w:tab/>
             </w:r>
             <w:r>
-              <w:t>24</w:t>
+              <w:t>23</w:t>
             </w:r>
           </w:hyperlink>
         </w:p>
@@ -588,7 +588,7 @@
               <w:tab/>
             </w:r>
             <w:r>
-              <w:t>25</w:t>
+              <w:t>24</w:t>
             </w:r>
           </w:hyperlink>
         </w:p>
@@ -608,7 +608,7 @@
               <w:tab/>
             </w:r>
             <w:r>
-              <w:t>25</w:t>
+              <w:t>24</w:t>
             </w:r>
           </w:hyperlink>
         </w:p>
@@ -628,7 +628,7 @@
               <w:tab/>
             </w:r>
             <w:r>
-              <w:t>26</w:t>
+              <w:t>25</w:t>
             </w:r>
           </w:hyperlink>
         </w:p>
@@ -648,7 +648,7 @@
               <w:tab/>
             </w:r>
             <w:r>
-              <w:t>27</w:t>
+              <w:t>26</w:t>
             </w:r>
           </w:hyperlink>
         </w:p>
@@ -860,24 +860,6 @@
       </w:pPr>
       <w:r>
         <w:t xml:space="preserve">Crestline Group (CRG) es una empresa ficticia de servicios corporativos que llega del extranjero a abrir sus oficinas en Bolivia. Como sus cuatro sedes son nuevas, la red se construye desde cero y se aprovecha para hacerla bien desde el inicio: separar a los usuarios en grupos (VLAN), darle a cada grupo su propio rango de direcciones (subred), unir las sedes con enlaces WAN y automatizar la entrega de direcciones.</w:t>
-      </w:r>
-    </w:p>
-    <w:p>
-      <w:pPr>
-        <w:ind w:firstLine="720"/>
-      </w:pPr>
-      <w:r>
-        <w:t xml:space="preserve">Este documento está pensado para que </w:t>
-      </w:r>
-      <w:r>
-        <w:rPr>
-          <w:b/>
-          <w:bCs/>
-        </w:rPr>
-        <w:t xml:space="preserve">cualquier persona</w:t>
-      </w:r>
-      <w:r>
-        <w:t xml:space="preserve"> pueda repetir el trabajo, aunque nunca haya usado Cisco Packet Tracer, el simulador de redes de Cisco Networking Academy (s. f.). Si sigues los pasos en orden y copias los comandos tal como están, vas a obtener exactamente la misma red. El diseño sigue el modelo jerárquico de capas (acceso y distribución) que recomienda Cisco (2024).</w:t>
       </w:r>
     </w:p>
     <w:p>

</xml_diff>

<commit_message>
Unir el párrafo introductorio con el contexto de la empresa
Co-Authored-By: Claude Sonnet 5.5 <noreply@anthropic.com>
</commit_message>
<xml_diff>
--- a/ProyectoFinal-Redes-ACT6-APA7.docx
+++ b/ProyectoFinal-Redes-ACT6-APA7.docx
@@ -856,28 +856,62 @@
     </w:p>
     <w:p>
       <w:pPr>
+        <w:pStyle w:val="Heading2"/>
+      </w:pPr>
+      <w:bookmarkStart w:name="_Toc202" w:id="202"/>
+      <w:r>
+        <w:t xml:space="preserve">Contexto de la empresa</w:t>
+      </w:r>
+      <w:bookmarkEnd w:id="202"/>
+    </w:p>
+    <w:p>
+      <w:pPr>
         <w:ind w:firstLine="720"/>
       </w:pPr>
       <w:r>
-        <w:t xml:space="preserve">Crestline Group (CRG) es una empresa ficticia de servicios corporativos que llega del extranjero a abrir sus oficinas en Bolivia. Como sus cuatro sedes son nuevas, la red se construye desde cero y se aprovecha para hacerla bien desde el inicio: separar a los usuarios en grupos (VLAN), darle a cada grupo su propio rango de direcciones (subred), unir las sedes con enlaces WAN y automatizar la entrega de direcciones.</w:t>
+        <w:t xml:space="preserve">Crestline Group (CRG) es una empresa ficticia de servicios corporativos con casa matriz en el extranjero que decidió abrir operaciones en Bolivia. Su sede central se instala en Cochabamba y se organiza en cinco áreas: Ventas, Operaciones, Capacitación, Administración y TI, y Finanzas. Para atender a clientes de todo el país abre, además, tres oficinas regionales: Norte, Sur y Este.</w:t>
+      </w:r>
+    </w:p>
+    <w:p>
+      <w:pPr>
+        <w:ind w:firstLine="720"/>
+      </w:pPr>
+      <w:r>
+        <w:t xml:space="preserve">Las cuatro sedes son nuevas: los locales se acaban de habilitar y ninguna cuenta con infraestructura de red. La empresa no quiere crecer de a poco, sino iniciar operaciones con todo el personal ya instalado: 300 computadoras repartidas en tres áreas de 60 equipos (Ventas, Operaciones y Capacitación) y cinco grupos de 24 (Administración y TI, Finanzas y las tres regionales).</w:t>
+      </w:r>
+    </w:p>
+    <w:p>
+      <w:pPr>
+        <w:ind w:firstLine="720"/>
+      </w:pPr>
+      <w:r>
+        <w:t xml:space="preserve">La casa matriz exige además condiciones que la red debe cumplir desde el primer día: que cada área tenga su propia red, que las direcciones se asignen de forma automática y que las oficinas regionales se comuniquen con la sede central y puedan salir a una red externa.</w:t>
+      </w:r>
+    </w:p>
+    <w:p>
+      <w:pPr>
+        <w:ind w:firstLine="720"/>
+      </w:pPr>
+      <w:r>
+        <w:t xml:space="preserve">Por eso la red se construye desde cero y se aprovecha para hacerla bien desde el inicio: separar a los usuarios en grupos (VLAN), darle a cada grupo su propio rango de direcciones (subred), unir las sedes con enlaces WAN y automatizar la entrega de direcciones.</w:t>
       </w:r>
     </w:p>
     <w:p>
       <w:pPr>
         <w:pStyle w:val="Heading2"/>
       </w:pPr>
-      <w:bookmarkStart w:name="_Toc202" w:id="202"/>
-      <w:r>
-        <w:t xml:space="preserve">Contexto de la empresa</w:t>
-      </w:r>
-      <w:bookmarkEnd w:id="202"/>
+      <w:bookmarkStart w:name="_Toc203" w:id="203"/>
+      <w:r>
+        <w:t xml:space="preserve">Planteamiento del problema</w:t>
+      </w:r>
+      <w:bookmarkEnd w:id="203"/>
     </w:p>
     <w:p>
       <w:pPr>
         <w:ind w:firstLine="720"/>
       </w:pPr>
       <w:r>
-        <w:t xml:space="preserve">Crestline Group es una empresa ficticia de servicios corporativos con casa matriz en el extranjero que decidió abrir operaciones en Bolivia. Su sede central se instala en Cochabamba y se organiza en cinco áreas: Ventas, Operaciones, Capacitación, Administración y TI, y Finanzas. Para atender a clientes de todo el país abre, además, tres oficinas regionales: Norte, Sur y Este.</w:t>
+        <w:t xml:space="preserve">Como se trata de una empresa nueva, no hay una red que corregir; el reto es construirla bien desde el inicio. Si las 300 computadoras se conectaran sin planificación a una sola red plana, todos los mensajes de difusión, como las consultas ARP, llegarían a todos los equipos y consumirían ancho de banda. Las direcciones IP tendrían que configurarse una por una, con el riesgo de repetirlas, y no habría separación entre áreas, por lo que un problema en una de ellas afectaría a todas.</w:t>
       </w:r>
     </w:p>
     <w:p>
@@ -885,69 +919,35 @@
         <w:ind w:firstLine="720"/>
       </w:pPr>
       <w:r>
-        <w:t xml:space="preserve">Las cuatro sedes son nuevas: los locales se acaban de habilitar y ninguna cuenta con infraestructura de red. La empresa no quiere crecer de a poco, sino iniciar operaciones con todo el personal ya instalado: 300 computadoras repartidas en tres áreas de 60 equipos (Ventas, Operaciones y Capacitación) y cinco grupos de 24 (Administración y TI, Finanzas y las tres regionales).</w:t>
-      </w:r>
+        <w:t xml:space="preserve">Las oficinas regionales, por su parte, necesitan un esquema de direccionamiento y enrutamiento documentado para comunicarse con la sede central. A partir del contexto se definieron los requisitos de la nueva red: atender a 300 computadoras repartidas en ocho grupos, dar a cada grupo una subred propia, entregar las direcciones de forma automática, conectar las tres regionales con la sede central y permitir la salida hacia una red externa.</w:t>
+      </w:r>
+    </w:p>
+    <w:p>
+      <w:pPr>
+        <w:pStyle w:val="Heading2"/>
+      </w:pPr>
+      <w:bookmarkStart w:name="_Toc204" w:id="204"/>
+      <w:r>
+        <w:t xml:space="preserve">Objetivos</w:t>
+      </w:r>
+      <w:bookmarkEnd w:id="204"/>
+    </w:p>
+    <w:p>
+      <w:pPr>
+        <w:pStyle w:val="Heading3"/>
+      </w:pPr>
+      <w:bookmarkStart w:name="_Toc205" w:id="205"/>
+      <w:r>
+        <w:t xml:space="preserve">Objetivo general</w:t>
+      </w:r>
+      <w:bookmarkEnd w:id="205"/>
     </w:p>
     <w:p>
       <w:pPr>
         <w:ind w:firstLine="720"/>
       </w:pPr>
       <w:r>
-        <w:t xml:space="preserve">La casa matriz exige además condiciones que la red debe cumplir desde el primer día: que cada área tenga su propia red, que las direcciones se asignen de forma automática y que las oficinas regionales se comuniquen con la sede central y puedan salir a una red externa.</w:t>
-      </w:r>
-    </w:p>
-    <w:p>
-      <w:pPr>
-        <w:pStyle w:val="Heading2"/>
-      </w:pPr>
-      <w:bookmarkStart w:name="_Toc203" w:id="203"/>
-      <w:r>
-        <w:t xml:space="preserve">Planteamiento del problema</w:t>
-      </w:r>
-      <w:bookmarkEnd w:id="203"/>
-    </w:p>
-    <w:p>
-      <w:pPr>
-        <w:ind w:firstLine="720"/>
-      </w:pPr>
-      <w:r>
-        <w:t xml:space="preserve">Como se trata de una empresa nueva, no hay una red que corregir; el reto es construirla bien desde el inicio. Si las 300 computadoras se conectaran sin planificación a una sola red plana, todos los mensajes de difusión, como las consultas ARP, llegarían a todos los equipos y consumirían ancho de banda. Las direcciones IP tendrían que configurarse una por una, con el riesgo de repetirlas, y no habría separación entre áreas, por lo que un problema en una de ellas afectaría a todas.</w:t>
-      </w:r>
-    </w:p>
-    <w:p>
-      <w:pPr>
-        <w:ind w:firstLine="720"/>
-      </w:pPr>
-      <w:r>
-        <w:t xml:space="preserve">Las oficinas regionales, por su parte, necesitan un esquema de direccionamiento y enrutamiento documentado para comunicarse con la sede central. A partir del contexto se definieron los requisitos de la nueva red: atender a 300 computadoras repartidas en ocho grupos, dar a cada grupo una subred propia, entregar las direcciones de forma automática, conectar las tres regionales con la sede central y permitir la salida hacia una red externa.</w:t>
-      </w:r>
-    </w:p>
-    <w:p>
-      <w:pPr>
-        <w:pStyle w:val="Heading2"/>
-      </w:pPr>
-      <w:bookmarkStart w:name="_Toc204" w:id="204"/>
-      <w:r>
-        <w:t xml:space="preserve">Objetivos</w:t>
-      </w:r>
-      <w:bookmarkEnd w:id="204"/>
-    </w:p>
-    <w:p>
-      <w:pPr>
-        <w:pStyle w:val="Heading3"/>
-      </w:pPr>
-      <w:bookmarkStart w:name="_Toc205" w:id="205"/>
-      <w:r>
-        <w:t xml:space="preserve">Objetivo general</w:t>
-      </w:r>
-      <w:bookmarkEnd w:id="205"/>
-    </w:p>
-    <w:p>
-      <w:pPr>
-        <w:ind w:firstLine="720"/>
-      </w:pPr>
-      <w:r>
-        <w:t xml:space="preserve">Diseñar, implementar y validar en Cisco Packet Tracer una red LAN empresarial segmentada mediante VLAN y VLSM, con interconexión WAN entre la sede central y tres oficinas regionales, que mejore la organización, la administración y la seguridad de la red del CRG.</w:t>
+        <w:t xml:space="preserve">Diseñar, implementar y validar en Cisco Packet Tracer una red LAN empresarial segmentada mediante VLAN y VLSM, con interconexión WAN entre la sede central y tres oficinas regionales, que mejore la organización, la administración y el funcionamiento de la red del CRG.</w:t>
       </w:r>
     </w:p>
     <w:p>

</xml_diff>

<commit_message>
Agregar cuadro de sedes, áreas y computadoras al contexto de la empresa
Las tablas siguientes se renumeran (la del glosario pasa a ser la Tabla 2).

Co-Authored-By: Claude Sonnet 5.5 <noreply@anthropic.com>
</commit_message>
<xml_diff>
--- a/ProyectoFinal-Redes-ACT6-APA7.docx
+++ b/ProyectoFinal-Redes-ACT6-APA7.docx
@@ -208,7 +208,7 @@
               <w:tab/>
             </w:r>
             <w:r>
-              <w:t>5</w:t>
+              <w:t>6</w:t>
             </w:r>
           </w:hyperlink>
         </w:p>
@@ -268,7 +268,7 @@
               <w:tab/>
             </w:r>
             <w:r>
-              <w:t>7</w:t>
+              <w:t>8</w:t>
             </w:r>
           </w:hyperlink>
         </w:p>
@@ -368,7 +368,7 @@
               <w:tab/>
             </w:r>
             <w:r>
-              <w:t>11</w:t>
+              <w:t>12</w:t>
             </w:r>
           </w:hyperlink>
         </w:p>
@@ -388,7 +388,7 @@
               <w:tab/>
             </w:r>
             <w:r>
-              <w:t>11</w:t>
+              <w:t>12</w:t>
             </w:r>
           </w:hyperlink>
         </w:p>
@@ -408,7 +408,7 @@
               <w:tab/>
             </w:r>
             <w:r>
-              <w:t>11</w:t>
+              <w:t>12</w:t>
             </w:r>
           </w:hyperlink>
         </w:p>
@@ -428,7 +428,7 @@
               <w:tab/>
             </w:r>
             <w:r>
-              <w:t>12</w:t>
+              <w:t>13</w:t>
             </w:r>
           </w:hyperlink>
         </w:p>
@@ -448,7 +448,7 @@
               <w:tab/>
             </w:r>
             <w:r>
-              <w:t>13</w:t>
+              <w:t>14</w:t>
             </w:r>
           </w:hyperlink>
         </w:p>
@@ -468,7 +468,7 @@
               <w:tab/>
             </w:r>
             <w:r>
-              <w:t>14</w:t>
+              <w:t>15</w:t>
             </w:r>
           </w:hyperlink>
         </w:p>
@@ -488,7 +488,7 @@
               <w:tab/>
             </w:r>
             <w:r>
-              <w:t>14</w:t>
+              <w:t>15</w:t>
             </w:r>
           </w:hyperlink>
         </w:p>
@@ -528,7 +528,7 @@
               <w:tab/>
             </w:r>
             <w:r>
-              <w:t>19</w:t>
+              <w:t>20</w:t>
             </w:r>
           </w:hyperlink>
         </w:p>
@@ -568,7 +568,7 @@
               <w:tab/>
             </w:r>
             <w:r>
-              <w:t>23</w:t>
+              <w:t>24</w:t>
             </w:r>
           </w:hyperlink>
         </w:p>
@@ -588,7 +588,7 @@
               <w:tab/>
             </w:r>
             <w:r>
-              <w:t>24</w:t>
+              <w:t>25</w:t>
             </w:r>
           </w:hyperlink>
         </w:p>
@@ -608,7 +608,7 @@
               <w:tab/>
             </w:r>
             <w:r>
-              <w:t>24</w:t>
+              <w:t>25</w:t>
             </w:r>
           </w:hyperlink>
         </w:p>
@@ -628,7 +628,7 @@
               <w:tab/>
             </w:r>
             <w:r>
-              <w:t>25</w:t>
+              <w:t>26</w:t>
             </w:r>
           </w:hyperlink>
         </w:p>
@@ -648,7 +648,7 @@
               <w:tab/>
             </w:r>
             <w:r>
-              <w:t>26</w:t>
+              <w:t>27</w:t>
             </w:r>
           </w:hyperlink>
         </w:p>
@@ -877,7 +877,1218 @@
         <w:ind w:firstLine="720"/>
       </w:pPr>
       <w:r>
-        <w:t xml:space="preserve">Las cuatro sedes son nuevas: los locales se acaban de habilitar y ninguna cuenta con infraestructura de red. La empresa no quiere crecer de a poco, sino iniciar operaciones con todo el personal ya instalado: 300 computadoras repartidas en tres áreas de 60 equipos (Ventas, Operaciones y Capacitación) y cinco grupos de 24 (Administración y TI, Finanzas y las tres regionales).</w:t>
+        <w:t xml:space="preserve">Las cuatro sedes son nuevas: los locales se acaban de habilitar y ninguna cuenta con infraestructura de red. La empresa no quiere crecer de a poco, sino iniciar operaciones con todo el personal ya instalado: 300 computadoras repartidas en tres áreas de 60 equipos (Ventas, Operaciones y Capacitación) y cinco grupos de 24 (Administración y TI, Finanzas y las tres regionales). La Tabla 1 resume cómo se reparten las sedes, las áreas y los equipos.</w:t>
+      </w:r>
+    </w:p>
+    <w:p>
+      <w:pPr>
+        <w:keepNext/>
+      </w:pPr>
+      <w:r>
+        <w:rPr>
+          <w:b/>
+          <w:bCs/>
+        </w:rPr>
+        <w:t xml:space="preserve">Tabla 1</w:t>
+      </w:r>
+    </w:p>
+    <w:p>
+      <w:pPr>
+        <w:keepNext/>
+      </w:pPr>
+      <w:r>
+        <w:rPr>
+          <w:i/>
+          <w:iCs/>
+        </w:rPr>
+        <w:t xml:space="preserve">Sedes, áreas y computadoras de Crestline Group</w:t>
+      </w:r>
+    </w:p>
+    <w:tbl>
+      <w:tblPr>
+        <w:tblW w:type="dxa" w:w="9360"/>
+      </w:tblPr>
+      <w:tblGrid>
+        <w:gridCol w:w="2700"/>
+        <w:gridCol w:w="3300"/>
+        <w:gridCol w:w="1900"/>
+        <w:gridCol w:w="1460"/>
+      </w:tblGrid>
+      <w:tr>
+        <w:trPr>
+          <w:tblHeader/>
+        </w:trPr>
+        <w:tc>
+          <w:tcPr>
+            <w:tcW w:type="dxa" w:w="2700"/>
+            <w:tcBorders>
+              <w:top w:val="single" w:color="000000" w:sz="6"/>
+              <w:left w:val="none" w:color="FFFFFF" w:sz="0"/>
+              <w:bottom w:val="single" w:color="000000" w:sz="6"/>
+              <w:right w:val="none" w:color="FFFFFF" w:sz="0"/>
+            </w:tcBorders>
+            <w:tcMar>
+              <w:top w:type="dxa" w:w="40"/>
+              <w:left w:type="dxa" w:w="80"/>
+              <w:bottom w:type="dxa" w:w="40"/>
+              <w:right w:type="dxa" w:w="80"/>
+            </w:tcMar>
+          </w:tcPr>
+          <w:p>
+            <w:pPr>
+              <w:spacing w:line="240"/>
+            </w:pPr>
+            <w:r>
+              <w:rPr>
+                <w:b/>
+                <w:bCs/>
+                <w:sz w:val="21"/>
+                <w:szCs w:val="21"/>
+              </w:rPr>
+              <w:t xml:space="preserve">Sede</w:t>
+            </w:r>
+          </w:p>
+        </w:tc>
+        <w:tc>
+          <w:tcPr>
+            <w:tcW w:type="dxa" w:w="3300"/>
+            <w:tcBorders>
+              <w:top w:val="single" w:color="000000" w:sz="6"/>
+              <w:left w:val="none" w:color="FFFFFF" w:sz="0"/>
+              <w:bottom w:val="single" w:color="000000" w:sz="6"/>
+              <w:right w:val="none" w:color="FFFFFF" w:sz="0"/>
+            </w:tcBorders>
+            <w:tcMar>
+              <w:top w:type="dxa" w:w="40"/>
+              <w:left w:type="dxa" w:w="80"/>
+              <w:bottom w:type="dxa" w:w="40"/>
+              <w:right w:type="dxa" w:w="80"/>
+            </w:tcMar>
+          </w:tcPr>
+          <w:p>
+            <w:pPr>
+              <w:spacing w:line="240"/>
+            </w:pPr>
+            <w:r>
+              <w:rPr>
+                <w:b/>
+                <w:bCs/>
+                <w:sz w:val="21"/>
+                <w:szCs w:val="21"/>
+              </w:rPr>
+              <w:t xml:space="preserve">Área o grupo</w:t>
+            </w:r>
+          </w:p>
+        </w:tc>
+        <w:tc>
+          <w:tcPr>
+            <w:tcW w:type="dxa" w:w="1900"/>
+            <w:tcBorders>
+              <w:top w:val="single" w:color="000000" w:sz="6"/>
+              <w:left w:val="none" w:color="FFFFFF" w:sz="0"/>
+              <w:bottom w:val="single" w:color="000000" w:sz="6"/>
+              <w:right w:val="none" w:color="FFFFFF" w:sz="0"/>
+            </w:tcBorders>
+            <w:tcMar>
+              <w:top w:type="dxa" w:w="40"/>
+              <w:left w:type="dxa" w:w="80"/>
+              <w:bottom w:type="dxa" w:w="40"/>
+              <w:right w:type="dxa" w:w="80"/>
+            </w:tcMar>
+          </w:tcPr>
+          <w:p>
+            <w:pPr>
+              <w:spacing w:line="240"/>
+            </w:pPr>
+            <w:r>
+              <w:rPr>
+                <w:b/>
+                <w:bCs/>
+                <w:sz w:val="21"/>
+                <w:szCs w:val="21"/>
+              </w:rPr>
+              <w:t xml:space="preserve">Computadoras</w:t>
+            </w:r>
+          </w:p>
+        </w:tc>
+        <w:tc>
+          <w:tcPr>
+            <w:tcW w:type="dxa" w:w="1460"/>
+            <w:tcBorders>
+              <w:top w:val="single" w:color="000000" w:sz="6"/>
+              <w:left w:val="none" w:color="FFFFFF" w:sz="0"/>
+              <w:bottom w:val="single" w:color="000000" w:sz="6"/>
+              <w:right w:val="none" w:color="FFFFFF" w:sz="0"/>
+            </w:tcBorders>
+            <w:tcMar>
+              <w:top w:type="dxa" w:w="40"/>
+              <w:left w:type="dxa" w:w="80"/>
+              <w:bottom w:type="dxa" w:w="40"/>
+              <w:right w:type="dxa" w:w="80"/>
+            </w:tcMar>
+          </w:tcPr>
+          <w:p>
+            <w:pPr>
+              <w:spacing w:line="240"/>
+            </w:pPr>
+            <w:r>
+              <w:rPr>
+                <w:b/>
+                <w:bCs/>
+                <w:sz w:val="21"/>
+                <w:szCs w:val="21"/>
+              </w:rPr>
+              <w:t xml:space="preserve">Subtotal</w:t>
+            </w:r>
+          </w:p>
+        </w:tc>
+      </w:tr>
+      <w:tr>
+        <w:trPr>
+          <w:cantSplit/>
+        </w:trPr>
+        <w:tc>
+          <w:tcPr>
+            <w:tcW w:type="dxa" w:w="2700"/>
+            <w:tcBorders>
+              <w:top w:val="none" w:color="FFFFFF" w:sz="0"/>
+              <w:left w:val="none" w:color="FFFFFF" w:sz="0"/>
+              <w:bottom w:val="none" w:color="FFFFFF" w:sz="0"/>
+              <w:right w:val="none" w:color="FFFFFF" w:sz="0"/>
+            </w:tcBorders>
+            <w:tcMar>
+              <w:top w:type="dxa" w:w="40"/>
+              <w:left w:type="dxa" w:w="80"/>
+              <w:bottom w:type="dxa" w:w="40"/>
+              <w:right w:type="dxa" w:w="80"/>
+            </w:tcMar>
+          </w:tcPr>
+          <w:p>
+            <w:pPr>
+              <w:spacing w:line="240"/>
+            </w:pPr>
+            <w:r>
+              <w:rPr>
+                <w:sz w:val="21"/>
+                <w:szCs w:val="21"/>
+              </w:rPr>
+              <w:t xml:space="preserve">Sede central (Cochabamba)</w:t>
+            </w:r>
+          </w:p>
+        </w:tc>
+        <w:tc>
+          <w:tcPr>
+            <w:tcW w:type="dxa" w:w="3300"/>
+            <w:tcBorders>
+              <w:top w:val="none" w:color="FFFFFF" w:sz="0"/>
+              <w:left w:val="none" w:color="FFFFFF" w:sz="0"/>
+              <w:bottom w:val="none" w:color="FFFFFF" w:sz="0"/>
+              <w:right w:val="none" w:color="FFFFFF" w:sz="0"/>
+            </w:tcBorders>
+            <w:tcMar>
+              <w:top w:type="dxa" w:w="40"/>
+              <w:left w:type="dxa" w:w="80"/>
+              <w:bottom w:type="dxa" w:w="40"/>
+              <w:right w:type="dxa" w:w="80"/>
+            </w:tcMar>
+          </w:tcPr>
+          <w:p>
+            <w:pPr>
+              <w:spacing w:line="240"/>
+            </w:pPr>
+            <w:r>
+              <w:rPr>
+                <w:sz w:val="21"/>
+                <w:szCs w:val="21"/>
+              </w:rPr>
+              <w:t xml:space="preserve">Ventas</w:t>
+            </w:r>
+          </w:p>
+        </w:tc>
+        <w:tc>
+          <w:tcPr>
+            <w:tcW w:type="dxa" w:w="1900"/>
+            <w:tcBorders>
+              <w:top w:val="none" w:color="FFFFFF" w:sz="0"/>
+              <w:left w:val="none" w:color="FFFFFF" w:sz="0"/>
+              <w:bottom w:val="none" w:color="FFFFFF" w:sz="0"/>
+              <w:right w:val="none" w:color="FFFFFF" w:sz="0"/>
+            </w:tcBorders>
+            <w:tcMar>
+              <w:top w:type="dxa" w:w="40"/>
+              <w:left w:type="dxa" w:w="80"/>
+              <w:bottom w:type="dxa" w:w="40"/>
+              <w:right w:type="dxa" w:w="80"/>
+            </w:tcMar>
+          </w:tcPr>
+          <w:p>
+            <w:pPr>
+              <w:spacing w:line="240"/>
+            </w:pPr>
+            <w:r>
+              <w:rPr>
+                <w:sz w:val="21"/>
+                <w:szCs w:val="21"/>
+              </w:rPr>
+              <w:t xml:space="preserve">60</w:t>
+            </w:r>
+          </w:p>
+        </w:tc>
+        <w:tc>
+          <w:tcPr>
+            <w:tcW w:type="dxa" w:w="1460"/>
+            <w:tcBorders>
+              <w:top w:val="none" w:color="FFFFFF" w:sz="0"/>
+              <w:left w:val="none" w:color="FFFFFF" w:sz="0"/>
+              <w:bottom w:val="none" w:color="FFFFFF" w:sz="0"/>
+              <w:right w:val="none" w:color="FFFFFF" w:sz="0"/>
+            </w:tcBorders>
+            <w:tcMar>
+              <w:top w:type="dxa" w:w="40"/>
+              <w:left w:type="dxa" w:w="80"/>
+              <w:bottom w:type="dxa" w:w="40"/>
+              <w:right w:type="dxa" w:w="80"/>
+            </w:tcMar>
+          </w:tcPr>
+          <w:p>
+            <w:pPr>
+              <w:spacing w:line="240"/>
+            </w:pPr>
+          </w:p>
+        </w:tc>
+      </w:tr>
+      <w:tr>
+        <w:trPr>
+          <w:cantSplit/>
+        </w:trPr>
+        <w:tc>
+          <w:tcPr>
+            <w:tcW w:type="dxa" w:w="2700"/>
+            <w:tcBorders>
+              <w:top w:val="none" w:color="FFFFFF" w:sz="0"/>
+              <w:left w:val="none" w:color="FFFFFF" w:sz="0"/>
+              <w:bottom w:val="none" w:color="FFFFFF" w:sz="0"/>
+              <w:right w:val="none" w:color="FFFFFF" w:sz="0"/>
+            </w:tcBorders>
+            <w:tcMar>
+              <w:top w:type="dxa" w:w="40"/>
+              <w:left w:type="dxa" w:w="80"/>
+              <w:bottom w:type="dxa" w:w="40"/>
+              <w:right w:type="dxa" w:w="80"/>
+            </w:tcMar>
+          </w:tcPr>
+          <w:p>
+            <w:pPr>
+              <w:spacing w:line="240"/>
+            </w:pPr>
+          </w:p>
+        </w:tc>
+        <w:tc>
+          <w:tcPr>
+            <w:tcW w:type="dxa" w:w="3300"/>
+            <w:tcBorders>
+              <w:top w:val="none" w:color="FFFFFF" w:sz="0"/>
+              <w:left w:val="none" w:color="FFFFFF" w:sz="0"/>
+              <w:bottom w:val="none" w:color="FFFFFF" w:sz="0"/>
+              <w:right w:val="none" w:color="FFFFFF" w:sz="0"/>
+            </w:tcBorders>
+            <w:tcMar>
+              <w:top w:type="dxa" w:w="40"/>
+              <w:left w:type="dxa" w:w="80"/>
+              <w:bottom w:type="dxa" w:w="40"/>
+              <w:right w:type="dxa" w:w="80"/>
+            </w:tcMar>
+          </w:tcPr>
+          <w:p>
+            <w:pPr>
+              <w:spacing w:line="240"/>
+            </w:pPr>
+            <w:r>
+              <w:rPr>
+                <w:sz w:val="21"/>
+                <w:szCs w:val="21"/>
+              </w:rPr>
+              <w:t xml:space="preserve">Operaciones</w:t>
+            </w:r>
+          </w:p>
+        </w:tc>
+        <w:tc>
+          <w:tcPr>
+            <w:tcW w:type="dxa" w:w="1900"/>
+            <w:tcBorders>
+              <w:top w:val="none" w:color="FFFFFF" w:sz="0"/>
+              <w:left w:val="none" w:color="FFFFFF" w:sz="0"/>
+              <w:bottom w:val="none" w:color="FFFFFF" w:sz="0"/>
+              <w:right w:val="none" w:color="FFFFFF" w:sz="0"/>
+            </w:tcBorders>
+            <w:tcMar>
+              <w:top w:type="dxa" w:w="40"/>
+              <w:left w:type="dxa" w:w="80"/>
+              <w:bottom w:type="dxa" w:w="40"/>
+              <w:right w:type="dxa" w:w="80"/>
+            </w:tcMar>
+          </w:tcPr>
+          <w:p>
+            <w:pPr>
+              <w:spacing w:line="240"/>
+            </w:pPr>
+            <w:r>
+              <w:rPr>
+                <w:sz w:val="21"/>
+                <w:szCs w:val="21"/>
+              </w:rPr>
+              <w:t xml:space="preserve">60</w:t>
+            </w:r>
+          </w:p>
+        </w:tc>
+        <w:tc>
+          <w:tcPr>
+            <w:tcW w:type="dxa" w:w="1460"/>
+            <w:tcBorders>
+              <w:top w:val="none" w:color="FFFFFF" w:sz="0"/>
+              <w:left w:val="none" w:color="FFFFFF" w:sz="0"/>
+              <w:bottom w:val="none" w:color="FFFFFF" w:sz="0"/>
+              <w:right w:val="none" w:color="FFFFFF" w:sz="0"/>
+            </w:tcBorders>
+            <w:tcMar>
+              <w:top w:type="dxa" w:w="40"/>
+              <w:left w:type="dxa" w:w="80"/>
+              <w:bottom w:type="dxa" w:w="40"/>
+              <w:right w:type="dxa" w:w="80"/>
+            </w:tcMar>
+          </w:tcPr>
+          <w:p>
+            <w:pPr>
+              <w:spacing w:line="240"/>
+            </w:pPr>
+          </w:p>
+        </w:tc>
+      </w:tr>
+      <w:tr>
+        <w:trPr>
+          <w:cantSplit/>
+        </w:trPr>
+        <w:tc>
+          <w:tcPr>
+            <w:tcW w:type="dxa" w:w="2700"/>
+            <w:tcBorders>
+              <w:top w:val="none" w:color="FFFFFF" w:sz="0"/>
+              <w:left w:val="none" w:color="FFFFFF" w:sz="0"/>
+              <w:bottom w:val="none" w:color="FFFFFF" w:sz="0"/>
+              <w:right w:val="none" w:color="FFFFFF" w:sz="0"/>
+            </w:tcBorders>
+            <w:tcMar>
+              <w:top w:type="dxa" w:w="40"/>
+              <w:left w:type="dxa" w:w="80"/>
+              <w:bottom w:type="dxa" w:w="40"/>
+              <w:right w:type="dxa" w:w="80"/>
+            </w:tcMar>
+          </w:tcPr>
+          <w:p>
+            <w:pPr>
+              <w:spacing w:line="240"/>
+            </w:pPr>
+          </w:p>
+        </w:tc>
+        <w:tc>
+          <w:tcPr>
+            <w:tcW w:type="dxa" w:w="3300"/>
+            <w:tcBorders>
+              <w:top w:val="none" w:color="FFFFFF" w:sz="0"/>
+              <w:left w:val="none" w:color="FFFFFF" w:sz="0"/>
+              <w:bottom w:val="none" w:color="FFFFFF" w:sz="0"/>
+              <w:right w:val="none" w:color="FFFFFF" w:sz="0"/>
+            </w:tcBorders>
+            <w:tcMar>
+              <w:top w:type="dxa" w:w="40"/>
+              <w:left w:type="dxa" w:w="80"/>
+              <w:bottom w:type="dxa" w:w="40"/>
+              <w:right w:type="dxa" w:w="80"/>
+            </w:tcMar>
+          </w:tcPr>
+          <w:p>
+            <w:pPr>
+              <w:spacing w:line="240"/>
+            </w:pPr>
+            <w:r>
+              <w:rPr>
+                <w:sz w:val="21"/>
+                <w:szCs w:val="21"/>
+              </w:rPr>
+              <w:t xml:space="preserve">Capacitación</w:t>
+            </w:r>
+          </w:p>
+        </w:tc>
+        <w:tc>
+          <w:tcPr>
+            <w:tcW w:type="dxa" w:w="1900"/>
+            <w:tcBorders>
+              <w:top w:val="none" w:color="FFFFFF" w:sz="0"/>
+              <w:left w:val="none" w:color="FFFFFF" w:sz="0"/>
+              <w:bottom w:val="none" w:color="FFFFFF" w:sz="0"/>
+              <w:right w:val="none" w:color="FFFFFF" w:sz="0"/>
+            </w:tcBorders>
+            <w:tcMar>
+              <w:top w:type="dxa" w:w="40"/>
+              <w:left w:type="dxa" w:w="80"/>
+              <w:bottom w:type="dxa" w:w="40"/>
+              <w:right w:type="dxa" w:w="80"/>
+            </w:tcMar>
+          </w:tcPr>
+          <w:p>
+            <w:pPr>
+              <w:spacing w:line="240"/>
+            </w:pPr>
+            <w:r>
+              <w:rPr>
+                <w:sz w:val="21"/>
+                <w:szCs w:val="21"/>
+              </w:rPr>
+              <w:t xml:space="preserve">60</w:t>
+            </w:r>
+          </w:p>
+        </w:tc>
+        <w:tc>
+          <w:tcPr>
+            <w:tcW w:type="dxa" w:w="1460"/>
+            <w:tcBorders>
+              <w:top w:val="none" w:color="FFFFFF" w:sz="0"/>
+              <w:left w:val="none" w:color="FFFFFF" w:sz="0"/>
+              <w:bottom w:val="none" w:color="FFFFFF" w:sz="0"/>
+              <w:right w:val="none" w:color="FFFFFF" w:sz="0"/>
+            </w:tcBorders>
+            <w:tcMar>
+              <w:top w:type="dxa" w:w="40"/>
+              <w:left w:type="dxa" w:w="80"/>
+              <w:bottom w:type="dxa" w:w="40"/>
+              <w:right w:type="dxa" w:w="80"/>
+            </w:tcMar>
+          </w:tcPr>
+          <w:p>
+            <w:pPr>
+              <w:spacing w:line="240"/>
+            </w:pPr>
+          </w:p>
+        </w:tc>
+      </w:tr>
+      <w:tr>
+        <w:trPr>
+          <w:cantSplit/>
+        </w:trPr>
+        <w:tc>
+          <w:tcPr>
+            <w:tcW w:type="dxa" w:w="2700"/>
+            <w:tcBorders>
+              <w:top w:val="none" w:color="FFFFFF" w:sz="0"/>
+              <w:left w:val="none" w:color="FFFFFF" w:sz="0"/>
+              <w:bottom w:val="none" w:color="FFFFFF" w:sz="0"/>
+              <w:right w:val="none" w:color="FFFFFF" w:sz="0"/>
+            </w:tcBorders>
+            <w:tcMar>
+              <w:top w:type="dxa" w:w="40"/>
+              <w:left w:type="dxa" w:w="80"/>
+              <w:bottom w:type="dxa" w:w="40"/>
+              <w:right w:type="dxa" w:w="80"/>
+            </w:tcMar>
+          </w:tcPr>
+          <w:p>
+            <w:pPr>
+              <w:spacing w:line="240"/>
+            </w:pPr>
+          </w:p>
+        </w:tc>
+        <w:tc>
+          <w:tcPr>
+            <w:tcW w:type="dxa" w:w="3300"/>
+            <w:tcBorders>
+              <w:top w:val="none" w:color="FFFFFF" w:sz="0"/>
+              <w:left w:val="none" w:color="FFFFFF" w:sz="0"/>
+              <w:bottom w:val="none" w:color="FFFFFF" w:sz="0"/>
+              <w:right w:val="none" w:color="FFFFFF" w:sz="0"/>
+            </w:tcBorders>
+            <w:tcMar>
+              <w:top w:type="dxa" w:w="40"/>
+              <w:left w:type="dxa" w:w="80"/>
+              <w:bottom w:type="dxa" w:w="40"/>
+              <w:right w:type="dxa" w:w="80"/>
+            </w:tcMar>
+          </w:tcPr>
+          <w:p>
+            <w:pPr>
+              <w:spacing w:line="240"/>
+            </w:pPr>
+            <w:r>
+              <w:rPr>
+                <w:sz w:val="21"/>
+                <w:szCs w:val="21"/>
+              </w:rPr>
+              <w:t xml:space="preserve">Administración y TI</w:t>
+            </w:r>
+          </w:p>
+        </w:tc>
+        <w:tc>
+          <w:tcPr>
+            <w:tcW w:type="dxa" w:w="1900"/>
+            <w:tcBorders>
+              <w:top w:val="none" w:color="FFFFFF" w:sz="0"/>
+              <w:left w:val="none" w:color="FFFFFF" w:sz="0"/>
+              <w:bottom w:val="none" w:color="FFFFFF" w:sz="0"/>
+              <w:right w:val="none" w:color="FFFFFF" w:sz="0"/>
+            </w:tcBorders>
+            <w:tcMar>
+              <w:top w:type="dxa" w:w="40"/>
+              <w:left w:type="dxa" w:w="80"/>
+              <w:bottom w:type="dxa" w:w="40"/>
+              <w:right w:type="dxa" w:w="80"/>
+            </w:tcMar>
+          </w:tcPr>
+          <w:p>
+            <w:pPr>
+              <w:spacing w:line="240"/>
+            </w:pPr>
+            <w:r>
+              <w:rPr>
+                <w:sz w:val="21"/>
+                <w:szCs w:val="21"/>
+              </w:rPr>
+              <w:t xml:space="preserve">24</w:t>
+            </w:r>
+          </w:p>
+        </w:tc>
+        <w:tc>
+          <w:tcPr>
+            <w:tcW w:type="dxa" w:w="1460"/>
+            <w:tcBorders>
+              <w:top w:val="none" w:color="FFFFFF" w:sz="0"/>
+              <w:left w:val="none" w:color="FFFFFF" w:sz="0"/>
+              <w:bottom w:val="none" w:color="FFFFFF" w:sz="0"/>
+              <w:right w:val="none" w:color="FFFFFF" w:sz="0"/>
+            </w:tcBorders>
+            <w:tcMar>
+              <w:top w:type="dxa" w:w="40"/>
+              <w:left w:type="dxa" w:w="80"/>
+              <w:bottom w:type="dxa" w:w="40"/>
+              <w:right w:type="dxa" w:w="80"/>
+            </w:tcMar>
+          </w:tcPr>
+          <w:p>
+            <w:pPr>
+              <w:spacing w:line="240"/>
+            </w:pPr>
+          </w:p>
+        </w:tc>
+      </w:tr>
+      <w:tr>
+        <w:trPr>
+          <w:cantSplit/>
+        </w:trPr>
+        <w:tc>
+          <w:tcPr>
+            <w:tcW w:type="dxa" w:w="2700"/>
+            <w:tcBorders>
+              <w:top w:val="none" w:color="FFFFFF" w:sz="0"/>
+              <w:left w:val="none" w:color="FFFFFF" w:sz="0"/>
+              <w:bottom w:val="none" w:color="FFFFFF" w:sz="0"/>
+              <w:right w:val="none" w:color="FFFFFF" w:sz="0"/>
+            </w:tcBorders>
+            <w:tcMar>
+              <w:top w:type="dxa" w:w="40"/>
+              <w:left w:type="dxa" w:w="80"/>
+              <w:bottom w:type="dxa" w:w="40"/>
+              <w:right w:type="dxa" w:w="80"/>
+            </w:tcMar>
+          </w:tcPr>
+          <w:p>
+            <w:pPr>
+              <w:spacing w:line="240"/>
+            </w:pPr>
+          </w:p>
+        </w:tc>
+        <w:tc>
+          <w:tcPr>
+            <w:tcW w:type="dxa" w:w="3300"/>
+            <w:tcBorders>
+              <w:top w:val="none" w:color="FFFFFF" w:sz="0"/>
+              <w:left w:val="none" w:color="FFFFFF" w:sz="0"/>
+              <w:bottom w:val="none" w:color="FFFFFF" w:sz="0"/>
+              <w:right w:val="none" w:color="FFFFFF" w:sz="0"/>
+            </w:tcBorders>
+            <w:tcMar>
+              <w:top w:type="dxa" w:w="40"/>
+              <w:left w:type="dxa" w:w="80"/>
+              <w:bottom w:type="dxa" w:w="40"/>
+              <w:right w:type="dxa" w:w="80"/>
+            </w:tcMar>
+          </w:tcPr>
+          <w:p>
+            <w:pPr>
+              <w:spacing w:line="240"/>
+            </w:pPr>
+            <w:r>
+              <w:rPr>
+                <w:sz w:val="21"/>
+                <w:szCs w:val="21"/>
+              </w:rPr>
+              <w:t xml:space="preserve">Finanzas</w:t>
+            </w:r>
+          </w:p>
+        </w:tc>
+        <w:tc>
+          <w:tcPr>
+            <w:tcW w:type="dxa" w:w="1900"/>
+            <w:tcBorders>
+              <w:top w:val="none" w:color="FFFFFF" w:sz="0"/>
+              <w:left w:val="none" w:color="FFFFFF" w:sz="0"/>
+              <w:bottom w:val="none" w:color="FFFFFF" w:sz="0"/>
+              <w:right w:val="none" w:color="FFFFFF" w:sz="0"/>
+            </w:tcBorders>
+            <w:tcMar>
+              <w:top w:type="dxa" w:w="40"/>
+              <w:left w:type="dxa" w:w="80"/>
+              <w:bottom w:type="dxa" w:w="40"/>
+              <w:right w:type="dxa" w:w="80"/>
+            </w:tcMar>
+          </w:tcPr>
+          <w:p>
+            <w:pPr>
+              <w:spacing w:line="240"/>
+            </w:pPr>
+            <w:r>
+              <w:rPr>
+                <w:sz w:val="21"/>
+                <w:szCs w:val="21"/>
+              </w:rPr>
+              <w:t xml:space="preserve">24</w:t>
+            </w:r>
+          </w:p>
+        </w:tc>
+        <w:tc>
+          <w:tcPr>
+            <w:tcW w:type="dxa" w:w="1460"/>
+            <w:tcBorders>
+              <w:top w:val="none" w:color="FFFFFF" w:sz="0"/>
+              <w:left w:val="none" w:color="FFFFFF" w:sz="0"/>
+              <w:bottom w:val="none" w:color="FFFFFF" w:sz="0"/>
+              <w:right w:val="none" w:color="FFFFFF" w:sz="0"/>
+            </w:tcBorders>
+            <w:tcMar>
+              <w:top w:type="dxa" w:w="40"/>
+              <w:left w:type="dxa" w:w="80"/>
+              <w:bottom w:type="dxa" w:w="40"/>
+              <w:right w:type="dxa" w:w="80"/>
+            </w:tcMar>
+          </w:tcPr>
+          <w:p>
+            <w:pPr>
+              <w:spacing w:line="240"/>
+            </w:pPr>
+            <w:r>
+              <w:rPr>
+                <w:sz w:val="21"/>
+                <w:szCs w:val="21"/>
+              </w:rPr>
+              <w:t xml:space="preserve">228</w:t>
+            </w:r>
+          </w:p>
+        </w:tc>
+      </w:tr>
+      <w:tr>
+        <w:trPr>
+          <w:cantSplit/>
+        </w:trPr>
+        <w:tc>
+          <w:tcPr>
+            <w:tcW w:type="dxa" w:w="2700"/>
+            <w:tcBorders>
+              <w:top w:val="none" w:color="FFFFFF" w:sz="0"/>
+              <w:left w:val="none" w:color="FFFFFF" w:sz="0"/>
+              <w:bottom w:val="none" w:color="FFFFFF" w:sz="0"/>
+              <w:right w:val="none" w:color="FFFFFF" w:sz="0"/>
+            </w:tcBorders>
+            <w:tcMar>
+              <w:top w:type="dxa" w:w="40"/>
+              <w:left w:type="dxa" w:w="80"/>
+              <w:bottom w:type="dxa" w:w="40"/>
+              <w:right w:type="dxa" w:w="80"/>
+            </w:tcMar>
+          </w:tcPr>
+          <w:p>
+            <w:pPr>
+              <w:spacing w:line="240"/>
+            </w:pPr>
+            <w:r>
+              <w:rPr>
+                <w:sz w:val="21"/>
+                <w:szCs w:val="21"/>
+              </w:rPr>
+              <w:t xml:space="preserve">Oficina regional Norte</w:t>
+            </w:r>
+          </w:p>
+        </w:tc>
+        <w:tc>
+          <w:tcPr>
+            <w:tcW w:type="dxa" w:w="3300"/>
+            <w:tcBorders>
+              <w:top w:val="none" w:color="FFFFFF" w:sz="0"/>
+              <w:left w:val="none" w:color="FFFFFF" w:sz="0"/>
+              <w:bottom w:val="none" w:color="FFFFFF" w:sz="0"/>
+              <w:right w:val="none" w:color="FFFFFF" w:sz="0"/>
+            </w:tcBorders>
+            <w:tcMar>
+              <w:top w:type="dxa" w:w="40"/>
+              <w:left w:type="dxa" w:w="80"/>
+              <w:bottom w:type="dxa" w:w="40"/>
+              <w:right w:type="dxa" w:w="80"/>
+            </w:tcMar>
+          </w:tcPr>
+          <w:p>
+            <w:pPr>
+              <w:spacing w:line="240"/>
+            </w:pPr>
+            <w:r>
+              <w:rPr>
+                <w:sz w:val="21"/>
+                <w:szCs w:val="21"/>
+              </w:rPr>
+              <w:t xml:space="preserve">Regional Norte</w:t>
+            </w:r>
+          </w:p>
+        </w:tc>
+        <w:tc>
+          <w:tcPr>
+            <w:tcW w:type="dxa" w:w="1900"/>
+            <w:tcBorders>
+              <w:top w:val="none" w:color="FFFFFF" w:sz="0"/>
+              <w:left w:val="none" w:color="FFFFFF" w:sz="0"/>
+              <w:bottom w:val="none" w:color="FFFFFF" w:sz="0"/>
+              <w:right w:val="none" w:color="FFFFFF" w:sz="0"/>
+            </w:tcBorders>
+            <w:tcMar>
+              <w:top w:type="dxa" w:w="40"/>
+              <w:left w:type="dxa" w:w="80"/>
+              <w:bottom w:type="dxa" w:w="40"/>
+              <w:right w:type="dxa" w:w="80"/>
+            </w:tcMar>
+          </w:tcPr>
+          <w:p>
+            <w:pPr>
+              <w:spacing w:line="240"/>
+            </w:pPr>
+            <w:r>
+              <w:rPr>
+                <w:sz w:val="21"/>
+                <w:szCs w:val="21"/>
+              </w:rPr>
+              <w:t xml:space="preserve">24</w:t>
+            </w:r>
+          </w:p>
+        </w:tc>
+        <w:tc>
+          <w:tcPr>
+            <w:tcW w:type="dxa" w:w="1460"/>
+            <w:tcBorders>
+              <w:top w:val="none" w:color="FFFFFF" w:sz="0"/>
+              <w:left w:val="none" w:color="FFFFFF" w:sz="0"/>
+              <w:bottom w:val="none" w:color="FFFFFF" w:sz="0"/>
+              <w:right w:val="none" w:color="FFFFFF" w:sz="0"/>
+            </w:tcBorders>
+            <w:tcMar>
+              <w:top w:type="dxa" w:w="40"/>
+              <w:left w:type="dxa" w:w="80"/>
+              <w:bottom w:type="dxa" w:w="40"/>
+              <w:right w:type="dxa" w:w="80"/>
+            </w:tcMar>
+          </w:tcPr>
+          <w:p>
+            <w:pPr>
+              <w:spacing w:line="240"/>
+            </w:pPr>
+            <w:r>
+              <w:rPr>
+                <w:sz w:val="21"/>
+                <w:szCs w:val="21"/>
+              </w:rPr>
+              <w:t xml:space="preserve">24</w:t>
+            </w:r>
+          </w:p>
+        </w:tc>
+      </w:tr>
+      <w:tr>
+        <w:trPr>
+          <w:cantSplit/>
+        </w:trPr>
+        <w:tc>
+          <w:tcPr>
+            <w:tcW w:type="dxa" w:w="2700"/>
+            <w:tcBorders>
+              <w:top w:val="none" w:color="FFFFFF" w:sz="0"/>
+              <w:left w:val="none" w:color="FFFFFF" w:sz="0"/>
+              <w:bottom w:val="none" w:color="FFFFFF" w:sz="0"/>
+              <w:right w:val="none" w:color="FFFFFF" w:sz="0"/>
+            </w:tcBorders>
+            <w:tcMar>
+              <w:top w:type="dxa" w:w="40"/>
+              <w:left w:type="dxa" w:w="80"/>
+              <w:bottom w:type="dxa" w:w="40"/>
+              <w:right w:type="dxa" w:w="80"/>
+            </w:tcMar>
+          </w:tcPr>
+          <w:p>
+            <w:pPr>
+              <w:spacing w:line="240"/>
+            </w:pPr>
+            <w:r>
+              <w:rPr>
+                <w:sz w:val="21"/>
+                <w:szCs w:val="21"/>
+              </w:rPr>
+              <w:t xml:space="preserve">Oficina regional Sur</w:t>
+            </w:r>
+          </w:p>
+        </w:tc>
+        <w:tc>
+          <w:tcPr>
+            <w:tcW w:type="dxa" w:w="3300"/>
+            <w:tcBorders>
+              <w:top w:val="none" w:color="FFFFFF" w:sz="0"/>
+              <w:left w:val="none" w:color="FFFFFF" w:sz="0"/>
+              <w:bottom w:val="none" w:color="FFFFFF" w:sz="0"/>
+              <w:right w:val="none" w:color="FFFFFF" w:sz="0"/>
+            </w:tcBorders>
+            <w:tcMar>
+              <w:top w:type="dxa" w:w="40"/>
+              <w:left w:type="dxa" w:w="80"/>
+              <w:bottom w:type="dxa" w:w="40"/>
+              <w:right w:type="dxa" w:w="80"/>
+            </w:tcMar>
+          </w:tcPr>
+          <w:p>
+            <w:pPr>
+              <w:spacing w:line="240"/>
+            </w:pPr>
+            <w:r>
+              <w:rPr>
+                <w:sz w:val="21"/>
+                <w:szCs w:val="21"/>
+              </w:rPr>
+              <w:t xml:space="preserve">Regional Sur</w:t>
+            </w:r>
+          </w:p>
+        </w:tc>
+        <w:tc>
+          <w:tcPr>
+            <w:tcW w:type="dxa" w:w="1900"/>
+            <w:tcBorders>
+              <w:top w:val="none" w:color="FFFFFF" w:sz="0"/>
+              <w:left w:val="none" w:color="FFFFFF" w:sz="0"/>
+              <w:bottom w:val="none" w:color="FFFFFF" w:sz="0"/>
+              <w:right w:val="none" w:color="FFFFFF" w:sz="0"/>
+            </w:tcBorders>
+            <w:tcMar>
+              <w:top w:type="dxa" w:w="40"/>
+              <w:left w:type="dxa" w:w="80"/>
+              <w:bottom w:type="dxa" w:w="40"/>
+              <w:right w:type="dxa" w:w="80"/>
+            </w:tcMar>
+          </w:tcPr>
+          <w:p>
+            <w:pPr>
+              <w:spacing w:line="240"/>
+            </w:pPr>
+            <w:r>
+              <w:rPr>
+                <w:sz w:val="21"/>
+                <w:szCs w:val="21"/>
+              </w:rPr>
+              <w:t xml:space="preserve">24</w:t>
+            </w:r>
+          </w:p>
+        </w:tc>
+        <w:tc>
+          <w:tcPr>
+            <w:tcW w:type="dxa" w:w="1460"/>
+            <w:tcBorders>
+              <w:top w:val="none" w:color="FFFFFF" w:sz="0"/>
+              <w:left w:val="none" w:color="FFFFFF" w:sz="0"/>
+              <w:bottom w:val="none" w:color="FFFFFF" w:sz="0"/>
+              <w:right w:val="none" w:color="FFFFFF" w:sz="0"/>
+            </w:tcBorders>
+            <w:tcMar>
+              <w:top w:type="dxa" w:w="40"/>
+              <w:left w:type="dxa" w:w="80"/>
+              <w:bottom w:type="dxa" w:w="40"/>
+              <w:right w:type="dxa" w:w="80"/>
+            </w:tcMar>
+          </w:tcPr>
+          <w:p>
+            <w:pPr>
+              <w:spacing w:line="240"/>
+            </w:pPr>
+            <w:r>
+              <w:rPr>
+                <w:sz w:val="21"/>
+                <w:szCs w:val="21"/>
+              </w:rPr>
+              <w:t xml:space="preserve">24</w:t>
+            </w:r>
+          </w:p>
+        </w:tc>
+      </w:tr>
+      <w:tr>
+        <w:trPr>
+          <w:cantSplit/>
+        </w:trPr>
+        <w:tc>
+          <w:tcPr>
+            <w:tcW w:type="dxa" w:w="2700"/>
+            <w:tcBorders>
+              <w:top w:val="none" w:color="FFFFFF" w:sz="0"/>
+              <w:left w:val="none" w:color="FFFFFF" w:sz="0"/>
+              <w:bottom w:val="none" w:color="FFFFFF" w:sz="0"/>
+              <w:right w:val="none" w:color="FFFFFF" w:sz="0"/>
+            </w:tcBorders>
+            <w:tcMar>
+              <w:top w:type="dxa" w:w="40"/>
+              <w:left w:type="dxa" w:w="80"/>
+              <w:bottom w:type="dxa" w:w="40"/>
+              <w:right w:type="dxa" w:w="80"/>
+            </w:tcMar>
+          </w:tcPr>
+          <w:p>
+            <w:pPr>
+              <w:spacing w:line="240"/>
+            </w:pPr>
+            <w:r>
+              <w:rPr>
+                <w:sz w:val="21"/>
+                <w:szCs w:val="21"/>
+              </w:rPr>
+              <w:t xml:space="preserve">Oficina regional Este</w:t>
+            </w:r>
+          </w:p>
+        </w:tc>
+        <w:tc>
+          <w:tcPr>
+            <w:tcW w:type="dxa" w:w="3300"/>
+            <w:tcBorders>
+              <w:top w:val="none" w:color="FFFFFF" w:sz="0"/>
+              <w:left w:val="none" w:color="FFFFFF" w:sz="0"/>
+              <w:bottom w:val="none" w:color="FFFFFF" w:sz="0"/>
+              <w:right w:val="none" w:color="FFFFFF" w:sz="0"/>
+            </w:tcBorders>
+            <w:tcMar>
+              <w:top w:type="dxa" w:w="40"/>
+              <w:left w:type="dxa" w:w="80"/>
+              <w:bottom w:type="dxa" w:w="40"/>
+              <w:right w:type="dxa" w:w="80"/>
+            </w:tcMar>
+          </w:tcPr>
+          <w:p>
+            <w:pPr>
+              <w:spacing w:line="240"/>
+            </w:pPr>
+            <w:r>
+              <w:rPr>
+                <w:sz w:val="21"/>
+                <w:szCs w:val="21"/>
+              </w:rPr>
+              <w:t xml:space="preserve">Regional Este</w:t>
+            </w:r>
+          </w:p>
+        </w:tc>
+        <w:tc>
+          <w:tcPr>
+            <w:tcW w:type="dxa" w:w="1900"/>
+            <w:tcBorders>
+              <w:top w:val="none" w:color="FFFFFF" w:sz="0"/>
+              <w:left w:val="none" w:color="FFFFFF" w:sz="0"/>
+              <w:bottom w:val="none" w:color="FFFFFF" w:sz="0"/>
+              <w:right w:val="none" w:color="FFFFFF" w:sz="0"/>
+            </w:tcBorders>
+            <w:tcMar>
+              <w:top w:type="dxa" w:w="40"/>
+              <w:left w:type="dxa" w:w="80"/>
+              <w:bottom w:type="dxa" w:w="40"/>
+              <w:right w:type="dxa" w:w="80"/>
+            </w:tcMar>
+          </w:tcPr>
+          <w:p>
+            <w:pPr>
+              <w:spacing w:line="240"/>
+            </w:pPr>
+            <w:r>
+              <w:rPr>
+                <w:sz w:val="21"/>
+                <w:szCs w:val="21"/>
+              </w:rPr>
+              <w:t xml:space="preserve">24</w:t>
+            </w:r>
+          </w:p>
+        </w:tc>
+        <w:tc>
+          <w:tcPr>
+            <w:tcW w:type="dxa" w:w="1460"/>
+            <w:tcBorders>
+              <w:top w:val="none" w:color="FFFFFF" w:sz="0"/>
+              <w:left w:val="none" w:color="FFFFFF" w:sz="0"/>
+              <w:bottom w:val="none" w:color="FFFFFF" w:sz="0"/>
+              <w:right w:val="none" w:color="FFFFFF" w:sz="0"/>
+            </w:tcBorders>
+            <w:tcMar>
+              <w:top w:type="dxa" w:w="40"/>
+              <w:left w:type="dxa" w:w="80"/>
+              <w:bottom w:type="dxa" w:w="40"/>
+              <w:right w:type="dxa" w:w="80"/>
+            </w:tcMar>
+          </w:tcPr>
+          <w:p>
+            <w:pPr>
+              <w:spacing w:line="240"/>
+            </w:pPr>
+            <w:r>
+              <w:rPr>
+                <w:sz w:val="21"/>
+                <w:szCs w:val="21"/>
+              </w:rPr>
+              <w:t xml:space="preserve">24</w:t>
+            </w:r>
+          </w:p>
+        </w:tc>
+      </w:tr>
+      <w:tr>
+        <w:trPr>
+          <w:cantSplit/>
+        </w:trPr>
+        <w:tc>
+          <w:tcPr>
+            <w:tcW w:type="dxa" w:w="2700"/>
+            <w:tcBorders>
+              <w:top w:val="none" w:color="FFFFFF" w:sz="0"/>
+              <w:left w:val="none" w:color="FFFFFF" w:sz="0"/>
+              <w:bottom w:val="single" w:color="000000" w:sz="6"/>
+              <w:right w:val="none" w:color="FFFFFF" w:sz="0"/>
+            </w:tcBorders>
+            <w:tcMar>
+              <w:top w:type="dxa" w:w="40"/>
+              <w:left w:type="dxa" w:w="80"/>
+              <w:bottom w:type="dxa" w:w="40"/>
+              <w:right w:type="dxa" w:w="80"/>
+            </w:tcMar>
+          </w:tcPr>
+          <w:p>
+            <w:pPr>
+              <w:spacing w:line="240"/>
+            </w:pPr>
+            <w:r>
+              <w:rPr>
+                <w:b/>
+                <w:bCs/>
+                <w:sz w:val="21"/>
+                <w:szCs w:val="21"/>
+              </w:rPr>
+              <w:t xml:space="preserve">Total</w:t>
+            </w:r>
+          </w:p>
+        </w:tc>
+        <w:tc>
+          <w:tcPr>
+            <w:tcW w:type="dxa" w:w="3300"/>
+            <w:tcBorders>
+              <w:top w:val="none" w:color="FFFFFF" w:sz="0"/>
+              <w:left w:val="none" w:color="FFFFFF" w:sz="0"/>
+              <w:bottom w:val="single" w:color="000000" w:sz="6"/>
+              <w:right w:val="none" w:color="FFFFFF" w:sz="0"/>
+            </w:tcBorders>
+            <w:tcMar>
+              <w:top w:type="dxa" w:w="40"/>
+              <w:left w:type="dxa" w:w="80"/>
+              <w:bottom w:type="dxa" w:w="40"/>
+              <w:right w:type="dxa" w:w="80"/>
+            </w:tcMar>
+          </w:tcPr>
+          <w:p>
+            <w:pPr>
+              <w:spacing w:line="240"/>
+            </w:pPr>
+            <w:r>
+              <w:rPr>
+                <w:b/>
+                <w:bCs/>
+                <w:sz w:val="21"/>
+                <w:szCs w:val="21"/>
+              </w:rPr>
+              <w:t xml:space="preserve">8 grupos</w:t>
+            </w:r>
+          </w:p>
+        </w:tc>
+        <w:tc>
+          <w:tcPr>
+            <w:tcW w:type="dxa" w:w="1900"/>
+            <w:tcBorders>
+              <w:top w:val="none" w:color="FFFFFF" w:sz="0"/>
+              <w:left w:val="none" w:color="FFFFFF" w:sz="0"/>
+              <w:bottom w:val="single" w:color="000000" w:sz="6"/>
+              <w:right w:val="none" w:color="FFFFFF" w:sz="0"/>
+            </w:tcBorders>
+            <w:tcMar>
+              <w:top w:type="dxa" w:w="40"/>
+              <w:left w:type="dxa" w:w="80"/>
+              <w:bottom w:type="dxa" w:w="40"/>
+              <w:right w:type="dxa" w:w="80"/>
+            </w:tcMar>
+          </w:tcPr>
+          <w:p>
+            <w:pPr>
+              <w:spacing w:line="240"/>
+            </w:pPr>
+            <w:r>
+              <w:rPr>
+                <w:b/>
+                <w:bCs/>
+                <w:sz w:val="21"/>
+                <w:szCs w:val="21"/>
+              </w:rPr>
+              <w:t xml:space="preserve">300</w:t>
+            </w:r>
+          </w:p>
+        </w:tc>
+        <w:tc>
+          <w:tcPr>
+            <w:tcW w:type="dxa" w:w="1460"/>
+            <w:tcBorders>
+              <w:top w:val="none" w:color="FFFFFF" w:sz="0"/>
+              <w:left w:val="none" w:color="FFFFFF" w:sz="0"/>
+              <w:bottom w:val="single" w:color="000000" w:sz="6"/>
+              <w:right w:val="none" w:color="FFFFFF" w:sz="0"/>
+            </w:tcBorders>
+            <w:tcMar>
+              <w:top w:type="dxa" w:w="40"/>
+              <w:left w:type="dxa" w:w="80"/>
+              <w:bottom w:type="dxa" w:w="40"/>
+              <w:right w:type="dxa" w:w="80"/>
+            </w:tcMar>
+          </w:tcPr>
+          <w:p>
+            <w:pPr>
+              <w:spacing w:line="240"/>
+            </w:pPr>
+          </w:p>
+        </w:tc>
+      </w:tr>
+    </w:tbl>
+    <w:p>
+      <w:pPr>
+        <w:spacing w:after="360"/>
+      </w:pPr>
+      <w:r>
+        <w:rPr>
+          <w:i/>
+          <w:iCs/>
+        </w:rPr>
+        <w:t xml:space="preserve">Nota.</w:t>
+      </w:r>
+      <w:r>
+        <w:t xml:space="preserve"> La sede central concentra 228 de las 300 computadoras (76 %); cada oficina regional tiene 24.</w:t>
       </w:r>
     </w:p>
     <w:p>
@@ -1111,7 +2322,7 @@
         <w:ind w:firstLine="720"/>
       </w:pPr>
       <w:r>
-        <w:t xml:space="preserve">Para seguir el documento conviene conocer algunos términos básicos de redes. La Tabla 1 los resume en lenguaje sencillo; cada uno se amplía en el paso donde se aplica.</w:t>
+        <w:t xml:space="preserve">Para seguir el documento conviene conocer algunos términos básicos de redes. La Tabla 2 los resume en lenguaje sencillo; cada uno se amplía en el paso donde se aplica.</w:t>
       </w:r>
     </w:p>
     <w:p>
@@ -1123,7 +2334,7 @@
           <w:b/>
           <w:bCs/>
         </w:rPr>
-        <w:t xml:space="preserve">Tabla 1</w:t>
+        <w:t xml:space="preserve">Tabla 2</w:t>
       </w:r>
     </w:p>
     <w:p>
@@ -2223,7 +3434,7 @@
           <w:b/>
           <w:bCs/>
         </w:rPr>
-        <w:t xml:space="preserve">Tabla 2</w:t>
+        <w:t xml:space="preserve">Tabla 3</w:t>
       </w:r>
     </w:p>
     <w:p>
@@ -3879,7 +5090,7 @@
           <w:b/>
           <w:bCs/>
         </w:rPr>
-        <w:t xml:space="preserve">Tabla 3</w:t>
+        <w:t xml:space="preserve">Tabla 4</w:t>
       </w:r>
     </w:p>
     <w:p>
@@ -4866,7 +6077,7 @@
           <w:b/>
           <w:bCs/>
         </w:rPr>
-        <w:t xml:space="preserve">Tabla 4</w:t>
+        <w:t xml:space="preserve">Tabla 5</w:t>
       </w:r>
     </w:p>
     <w:p>
@@ -5750,7 +6961,7 @@
         <w:t xml:space="preserve">rayo</w:t>
       </w:r>
       <w:r>
-        <w:t xml:space="preserve"> (Connections) abajo a la izquierda. Elige el tipo de cable, haz clic en el primer equipo, elige el puerto, y luego haz clic en el segundo equipo y elige su puerto. Las conexiones se indican en la Tabla 5.</w:t>
+        <w:t xml:space="preserve"> (Connections) abajo a la izquierda. Elige el tipo de cable, haz clic en el primer equipo, elige el puerto, y luego haz clic en el segundo equipo y elige su puerto. Las conexiones se indican en la Tabla 6.</w:t>
       </w:r>
     </w:p>
     <w:p>
@@ -5762,7 +6973,7 @@
           <w:b/>
           <w:bCs/>
         </w:rPr>
-        <w:t xml:space="preserve">Tabla 5</w:t>
+        <w:t xml:space="preserve">Tabla 6</w:t>
       </w:r>
     </w:p>
     <w:p>
@@ -10257,7 +11468,7 @@
         <w:ind w:firstLine="720"/>
       </w:pPr>
       <w:r>
-        <w:t xml:space="preserve">Los tres routers regionales llevan lo mismo, cambiando los números según la Tabla 6. Este es el ejemplo de </w:t>
+        <w:t xml:space="preserve">Los tres routers regionales llevan lo mismo, cambiando los números según la Tabla 7. Este es el ejemplo de </w:t>
       </w:r>
       <w:r>
         <w:rPr>
@@ -10545,7 +11756,7 @@
           <w:b/>
           <w:bCs/>
         </w:rPr>
-        <w:t xml:space="preserve">Tabla 6</w:t>
+        <w:t xml:space="preserve">Tabla 7</w:t>
       </w:r>
     </w:p>
     <w:p>
@@ -12036,7 +13247,7 @@
           <w:b/>
           <w:bCs/>
         </w:rPr>
-        <w:t xml:space="preserve">Tabla 7</w:t>
+        <w:t xml:space="preserve">Tabla 8</w:t>
       </w:r>
     </w:p>
     <w:p>
@@ -13763,7 +14974,7 @@
           <w:b/>
           <w:bCs/>
         </w:rPr>
-        <w:t xml:space="preserve">Tabla 8</w:t>
+        <w:t xml:space="preserve">Tabla 9</w:t>
       </w:r>
     </w:p>
     <w:p>
@@ -15825,7 +17036,7 @@
           <w:b/>
           <w:bCs/>
         </w:rPr>
-        <w:t xml:space="preserve">Tabla 9</w:t>
+        <w:t xml:space="preserve">Tabla 10</w:t>
       </w:r>
     </w:p>
     <w:p>
@@ -16545,7 +17756,7 @@
         <w:ind w:firstLine="720"/>
       </w:pPr>
       <w:r>
-        <w:t xml:space="preserve">La maqueta de Packet Tracer usa dos computadoras por grupo, pero la red real debe atender a 300 equipos. La Tabla 10 estima los equipos necesarios para una instalación física. Se consideraron switches de acceso de 48 puertos, un punto de red por computadora y una reserva del 15 % de puertos para impresoras y crecimiento. Con esa reserva, Ventas y Operaciones (120 equipos) necesitan tres switches; Capacitación (60), dos; Administración/TI y Finanzas (48 equipos más el servidor), dos; y cada regional (24), uno.</w:t>
+        <w:t xml:space="preserve">La maqueta de Packet Tracer usa dos computadoras por grupo, pero la red real debe atender a 300 equipos. La Tabla 11 estima los equipos necesarios para una instalación física. Se consideraron switches de acceso de 48 puertos, un punto de red por computadora y una reserva del 15 % de puertos para impresoras y crecimiento. Con esa reserva, Ventas y Operaciones (120 equipos) necesitan tres switches; Capacitación (60), dos; Administración/TI y Finanzas (48 equipos más el servidor), dos; y cada regional (24), uno.</w:t>
       </w:r>
     </w:p>
     <w:p>
@@ -16557,7 +17768,7 @@
           <w:b/>
           <w:bCs/>
         </w:rPr>
-        <w:t xml:space="preserve">Tabla 10</w:t>
+        <w:t xml:space="preserve">Tabla 11</w:t>
       </w:r>
     </w:p>
     <w:p>
@@ -17638,7 +18849,7 @@
         <w:ind w:firstLine="720"/>
       </w:pPr>
       <w:r>
-        <w:t xml:space="preserve">En relación con los objetivos, se cumplieron el objetivo general y los siete específicos: el análisis del contexto definió los requisitos de la red; el plan VLSM de la Tabla 2 cubre la demanda de 300 equipos; las VLAN, las troncales y las subinterfaces funcionan según las Figuras 3 a 6; las rutas estáticas conectan las cuatro sedes (Figuras 9 y 10); DHCP y NAT respondieron como se esperaba en la matriz de la Tabla 8; y la Tabla 10 estima los equipos para una instalación real.</w:t>
+        <w:t xml:space="preserve">En relación con los objetivos, se cumplieron el objetivo general y los siete específicos: el análisis del contexto definió los requisitos de la red; el plan VLSM de la Tabla 3 cubre la demanda de 300 equipos; las VLAN, las troncales y las subinterfaces funcionan según las Figuras 3 a 6; las rutas estáticas conectan las cuatro sedes (Figuras 9 y 10); DHCP y NAT respondieron como se esperaba en la matriz de la Tabla 9; y la Tabla 11 estima los equipos para una instalación real.</w:t>
       </w:r>
     </w:p>
     <w:p>
@@ -17798,7 +19009,7 @@
         <w:t xml:space="preserve">Planificar la instalación física.</w:t>
       </w:r>
       <w:r>
-        <w:t xml:space="preserve"> Antes de comprar los equipos de la Tabla 10 se recomienda un estudio del sitio, medir los recorridos de cableado (máximo 100 m por segmento UTP) y realizar pruebas de carga.</w:t>
+        <w:t xml:space="preserve"> Antes de comprar los equipos de la Tabla 11 se recomienda un estudio del sitio, medir los recorridos de cableado (máximo 100 m por segmento UTP) y realizar pruebas de carga.</w:t>
       </w:r>
     </w:p>
     <w:p>

</xml_diff>

<commit_message>
Quitar el párrafo de lo que no forma parte del alcance
Co-Authored-By: Claude Sonnet 5.5 <noreply@anthropic.com>
</commit_message>
<xml_diff>
--- a/ProyectoFinal-Redes-ACT6-APA7.docx
+++ b/ProyectoFinal-Redes-ACT6-APA7.docx
@@ -348,7 +348,7 @@
               <w:tab/>
             </w:r>
             <w:r>
-              <w:t>10</w:t>
+              <w:t>9</w:t>
             </w:r>
           </w:hyperlink>
         </w:p>
@@ -448,7 +448,7 @@
               <w:tab/>
             </w:r>
             <w:r>
-              <w:t>13</w:t>
+              <w:t>12</w:t>
             </w:r>
           </w:hyperlink>
         </w:p>
@@ -468,7 +468,7 @@
               <w:tab/>
             </w:r>
             <w:r>
-              <w:t>14</w:t>
+              <w:t>13</w:t>
             </w:r>
           </w:hyperlink>
         </w:p>
@@ -528,7 +528,7 @@
               <w:tab/>
             </w:r>
             <w:r>
-              <w:t>15</w:t>
+              <w:t>14</w:t>
             </w:r>
           </w:hyperlink>
         </w:p>
@@ -548,7 +548,7 @@
               <w:tab/>
             </w:r>
             <w:r>
-              <w:t>16</w:t>
+              <w:t>15</w:t>
             </w:r>
           </w:hyperlink>
         </w:p>
@@ -608,7 +608,7 @@
               <w:tab/>
             </w:r>
             <w:r>
-              <w:t>18</w:t>
+              <w:t>17</w:t>
             </w:r>
           </w:hyperlink>
         </w:p>
@@ -648,7 +648,7 @@
               <w:tab/>
             </w:r>
             <w:r>
-              <w:t>19</w:t>
+              <w:t>18</w:t>
             </w:r>
           </w:hyperlink>
         </w:p>
@@ -1862,14 +1862,6 @@
       </w:pPr>
       <w:r>
         <w:t xml:space="preserve">El proyecto abarca el diseño lógico, la configuración y las pruebas de la red en Cisco Packet Tracer 9.0.1 (Cisco Networking Academy, s. f.). Comprende IPv4, VLSM, rutas estáticas, DHCP y NAT. Para mantener la simulación manejable se colocan dos computadoras por área en lugar de las 25 a 75 reales; el plan de direccionamiento, en cambio, está calculado para la cantidad total de equipos.</w:t>
-      </w:r>
-    </w:p>
-    <w:p>
-      <w:pPr>
-        <w:ind w:firstLine="720"/>
-      </w:pPr>
-      <w:r>
-        <w:t xml:space="preserve">No forman parte del alcance las VLAN, la resolución de nombres (DNS), los controles de seguridad como las listas de control de acceso, la instalación física del cableado, la red inalámbrica, IPv6, la redundancia de enlaces ni la contratación de servicios reales de Internet. Packet Tracer reproduce el comportamiento lógico de los equipos Cisco, pero no mide el rendimiento real, por lo que los tiempos de respuesta de las pruebas solo sirven como referencia.</w:t>
       </w:r>
     </w:p>
     <w:p>

</xml_diff>

<commit_message>
Aclarar el significado de los nombres R-CRG y R-P1 a R-P3 en La topología
Co-Authored-By: Claude Sonnet 5.5 <noreply@anthropic.com>
</commit_message>
<xml_diff>
--- a/ProyectoFinal-Redes-ACT6-APA7.docx
+++ b/ProyectoFinal-Redes-ACT6-APA7.docx
@@ -348,7 +348,7 @@
               <w:tab/>
             </w:r>
             <w:r>
-              <w:t>9</w:t>
+              <w:t>10</w:t>
             </w:r>
           </w:hyperlink>
         </w:p>
@@ -448,7 +448,7 @@
               <w:tab/>
             </w:r>
             <w:r>
-              <w:t>12</w:t>
+              <w:t>13</w:t>
             </w:r>
           </w:hyperlink>
         </w:p>
@@ -468,7 +468,7 @@
               <w:tab/>
             </w:r>
             <w:r>
-              <w:t>13</w:t>
+              <w:t>14</w:t>
             </w:r>
           </w:hyperlink>
         </w:p>
@@ -528,7 +528,7 @@
               <w:tab/>
             </w:r>
             <w:r>
-              <w:t>14</w:t>
+              <w:t>15</w:t>
             </w:r>
           </w:hyperlink>
         </w:p>
@@ -548,7 +548,7 @@
               <w:tab/>
             </w:r>
             <w:r>
-              <w:t>15</w:t>
+              <w:t>16</w:t>
             </w:r>
           </w:hyperlink>
         </w:p>
@@ -608,7 +608,7 @@
               <w:tab/>
             </w:r>
             <w:r>
-              <w:t>17</w:t>
+              <w:t>18</w:t>
             </w:r>
           </w:hyperlink>
         </w:p>
@@ -648,7 +648,7 @@
               <w:tab/>
             </w:r>
             <w:r>
-              <w:t>18</w:t>
+              <w:t>19</w:t>
             </w:r>
           </w:hyperlink>
         </w:p>
@@ -2616,7 +2616,7 @@
         <w:ind w:firstLine="720"/>
       </w:pPr>
       <w:r>
-        <w:t xml:space="preserve">La red tiene un router central (R-CRG) y tres routers de piso (R-P1, R-P2 y R-P3). Cada router de piso atiende a dos áreas, y cada área tiene su propio switch con sus computadoras. Además, hay un router ISP con un servidor WEB-EXT que hacen de «Internet de mentira» para probar el NAT. En el simulador se colocan dos PC por área como muestra; en la realidad cada área tendría entre 25 y 75 computadoras. La Figura 1 muestra el diseño.</w:t>
+        <w:t xml:space="preserve">La red tiene un router central (R-CRG, por Crestline Group) y tres routers de piso (R-P1, R-P2 y R-P3, por «router de piso» 1, 2 y 3). Cada router de piso atiende a dos áreas, y cada área tiene su propio switch con sus computadoras. Además, hay un router ISP con un servidor WEB-EXT que hacen de «Internet de mentira» para probar el NAT. En el simulador se colocan dos PC por área como muestra; en la realidad cada área tendría entre 25 y 75 computadoras. La Figura 1 muestra el diseño.</w:t>
       </w:r>
     </w:p>
     <w:p>

</xml_diff>

<commit_message>
Agregar tabla de equipos por área y subred necesaria en el plan de direcciones
Co-Authored-By: Claude Sonnet 5.5 <noreply@anthropic.com>
</commit_message>
<xml_diff>
--- a/ProyectoFinal-Redes-ACT6-APA7.docx
+++ b/ProyectoFinal-Redes-ACT6-APA7.docx
@@ -408,7 +408,7 @@
               <w:tab/>
             </w:r>
             <w:r>
-              <w:t>11</w:t>
+              <w:t>12</w:t>
             </w:r>
           </w:hyperlink>
         </w:p>
@@ -568,7 +568,7 @@
               <w:tab/>
             </w:r>
             <w:r>
-              <w:t>16</w:t>
+              <w:t>17</w:t>
             </w:r>
           </w:hyperlink>
         </w:p>
@@ -588,7 +588,7 @@
               <w:tab/>
             </w:r>
             <w:r>
-              <w:t>17</w:t>
+              <w:t>18</w:t>
             </w:r>
           </w:hyperlink>
         </w:p>
@@ -628,7 +628,7 @@
               <w:tab/>
             </w:r>
             <w:r>
-              <w:t>18</w:t>
+              <w:t>19</w:t>
             </w:r>
           </w:hyperlink>
         </w:p>
@@ -708,7 +708,7 @@
               <w:tab/>
             </w:r>
             <w:r>
-              <w:t>20</w:t>
+              <w:t>21</w:t>
             </w:r>
           </w:hyperlink>
         </w:p>
@@ -728,7 +728,7 @@
               <w:tab/>
             </w:r>
             <w:r>
-              <w:t>21</w:t>
+              <w:t>22</w:t>
             </w:r>
           </w:hyperlink>
         </w:p>
@@ -2719,7 +2719,7 @@
         <w:ind w:firstLine="720"/>
       </w:pPr>
       <w:r>
-        <w:t xml:space="preserve">Se usa el bloque privado 10.20.0.0/23 (512 direcciones), que es apto para redes internas (Rekhter et al., 1996). Las áreas de 70 y 75 PC reciben una /25 (126 direcciones útiles), las de 40 y 50 PC una /26 (62 útiles) y la de 25 PC una /27 (30 útiles). Se asigna de la subred más grande a la más chica. La primera dirección útil de cada subred es siempre el gateway. Los tres enlaces entre routers usan /30 y salen del final del bloque. El servidor SRV-TI vive en la subred de Soporte TI con la IP fija 10.20.1.194. El cálculo completo, con la dirección de broadcast y la capacidad de cada subred, se presenta en el Anexo A.</w:t>
+        <w:t xml:space="preserve">Se usa el bloque privado 10.20.0.0/23 (512 direcciones), que es apto para redes internas (Rekhter et al., 1996). Las áreas de 70 y 75 PC reciben una /25 (126 direcciones útiles), las de 40 y 50 PC una /26 (62 útiles) y la de 25 PC una /27 (30 útiles). Se asigna de la subred más grande a la más chica. La primera dirección útil de cada subred es siempre el gateway. Los tres enlaces entre routers usan /30 y salen del final del bloque. El servidor SRV-TI vive en la subred de Soporte TI con la IP fija 10.20.1.194. El cálculo completo, con la dirección de broadcast y la capacidad de cada subred, se presenta en el Anexo A. La Tabla 3 muestra cuántos equipos tiene cada área y qué subred necesita.</w:t>
       </w:r>
     </w:p>
     <w:p>
@@ -2732,6 +2732,1417 @@
           <w:bCs/>
         </w:rPr>
         <w:t xml:space="preserve">Tabla 3</w:t>
+      </w:r>
+    </w:p>
+    <w:p>
+      <w:pPr>
+        <w:keepNext/>
+      </w:pPr>
+      <w:r>
+        <w:rPr>
+          <w:i/>
+          <w:iCs/>
+        </w:rPr>
+        <w:t xml:space="preserve">Equipos por área y subred necesaria</w:t>
+      </w:r>
+    </w:p>
+    <w:tbl>
+      <w:tblPr>
+        <w:tblW w:type="dxa" w:w="9360"/>
+      </w:tblPr>
+      <w:tblGrid>
+        <w:gridCol w:w="3000"/>
+        <w:gridCol w:w="1700"/>
+        <w:gridCol w:w="2100"/>
+        <w:gridCol w:w="1000"/>
+        <w:gridCol w:w="1560"/>
+      </w:tblGrid>
+      <w:tr>
+        <w:trPr>
+          <w:tblHeader/>
+        </w:trPr>
+        <w:tc>
+          <w:tcPr>
+            <w:tcW w:type="dxa" w:w="3000"/>
+            <w:tcBorders>
+              <w:top w:val="single" w:color="000000" w:sz="6"/>
+              <w:left w:val="none" w:color="FFFFFF" w:sz="0"/>
+              <w:bottom w:val="single" w:color="000000" w:sz="6"/>
+              <w:right w:val="none" w:color="FFFFFF" w:sz="0"/>
+            </w:tcBorders>
+            <w:tcMar>
+              <w:top w:type="dxa" w:w="40"/>
+              <w:left w:type="dxa" w:w="80"/>
+              <w:bottom w:type="dxa" w:w="40"/>
+              <w:right w:type="dxa" w:w="80"/>
+            </w:tcMar>
+          </w:tcPr>
+          <w:p>
+            <w:pPr>
+              <w:spacing w:line="240"/>
+            </w:pPr>
+            <w:r>
+              <w:rPr>
+                <w:b/>
+                <w:bCs/>
+                <w:sz w:val="21"/>
+                <w:szCs w:val="21"/>
+              </w:rPr>
+              <w:t xml:space="preserve">Subred</w:t>
+            </w:r>
+          </w:p>
+        </w:tc>
+        <w:tc>
+          <w:tcPr>
+            <w:tcW w:type="dxa" w:w="1700"/>
+            <w:tcBorders>
+              <w:top w:val="single" w:color="000000" w:sz="6"/>
+              <w:left w:val="none" w:color="FFFFFF" w:sz="0"/>
+              <w:bottom w:val="single" w:color="000000" w:sz="6"/>
+              <w:right w:val="none" w:color="FFFFFF" w:sz="0"/>
+            </w:tcBorders>
+            <w:tcMar>
+              <w:top w:type="dxa" w:w="40"/>
+              <w:left w:type="dxa" w:w="80"/>
+              <w:bottom w:type="dxa" w:w="40"/>
+              <w:right w:type="dxa" w:w="80"/>
+            </w:tcMar>
+          </w:tcPr>
+          <w:p>
+            <w:pPr>
+              <w:spacing w:line="240"/>
+            </w:pPr>
+            <w:r>
+              <w:rPr>
+                <w:b/>
+                <w:bCs/>
+                <w:sz w:val="21"/>
+                <w:szCs w:val="21"/>
+              </w:rPr>
+              <w:t xml:space="preserve">Equipos</w:t>
+            </w:r>
+          </w:p>
+        </w:tc>
+        <w:tc>
+          <w:tcPr>
+            <w:tcW w:type="dxa" w:w="2100"/>
+            <w:tcBorders>
+              <w:top w:val="single" w:color="000000" w:sz="6"/>
+              <w:left w:val="none" w:color="FFFFFF" w:sz="0"/>
+              <w:bottom w:val="single" w:color="000000" w:sz="6"/>
+              <w:right w:val="none" w:color="FFFFFF" w:sz="0"/>
+            </w:tcBorders>
+            <w:tcMar>
+              <w:top w:type="dxa" w:w="40"/>
+              <w:left w:type="dxa" w:w="80"/>
+              <w:bottom w:type="dxa" w:w="40"/>
+              <w:right w:type="dxa" w:w="80"/>
+            </w:tcMar>
+          </w:tcPr>
+          <w:p>
+            <w:pPr>
+              <w:spacing w:line="240"/>
+            </w:pPr>
+            <w:r>
+              <w:rPr>
+                <w:b/>
+                <w:bCs/>
+                <w:sz w:val="21"/>
+                <w:szCs w:val="21"/>
+              </w:rPr>
+              <w:t xml:space="preserve">Direcciones necesarias</w:t>
+            </w:r>
+          </w:p>
+        </w:tc>
+        <w:tc>
+          <w:tcPr>
+            <w:tcW w:type="dxa" w:w="1000"/>
+            <w:tcBorders>
+              <w:top w:val="single" w:color="000000" w:sz="6"/>
+              <w:left w:val="none" w:color="FFFFFF" w:sz="0"/>
+              <w:bottom w:val="single" w:color="000000" w:sz="6"/>
+              <w:right w:val="none" w:color="FFFFFF" w:sz="0"/>
+            </w:tcBorders>
+            <w:tcMar>
+              <w:top w:type="dxa" w:w="40"/>
+              <w:left w:type="dxa" w:w="80"/>
+              <w:bottom w:type="dxa" w:w="40"/>
+              <w:right w:type="dxa" w:w="80"/>
+            </w:tcMar>
+          </w:tcPr>
+          <w:p>
+            <w:pPr>
+              <w:spacing w:line="240"/>
+            </w:pPr>
+            <w:r>
+              <w:rPr>
+                <w:b/>
+                <w:bCs/>
+                <w:sz w:val="21"/>
+                <w:szCs w:val="21"/>
+              </w:rPr>
+              <w:t xml:space="preserve">Prefijo</w:t>
+            </w:r>
+          </w:p>
+        </w:tc>
+        <w:tc>
+          <w:tcPr>
+            <w:tcW w:type="dxa" w:w="1560"/>
+            <w:tcBorders>
+              <w:top w:val="single" w:color="000000" w:sz="6"/>
+              <w:left w:val="none" w:color="FFFFFF" w:sz="0"/>
+              <w:bottom w:val="single" w:color="000000" w:sz="6"/>
+              <w:right w:val="none" w:color="FFFFFF" w:sz="0"/>
+            </w:tcBorders>
+            <w:tcMar>
+              <w:top w:type="dxa" w:w="40"/>
+              <w:left w:type="dxa" w:w="80"/>
+              <w:bottom w:type="dxa" w:w="40"/>
+              <w:right w:type="dxa" w:w="80"/>
+            </w:tcMar>
+          </w:tcPr>
+          <w:p>
+            <w:pPr>
+              <w:spacing w:line="240"/>
+            </w:pPr>
+            <w:r>
+              <w:rPr>
+                <w:b/>
+                <w:bCs/>
+                <w:sz w:val="21"/>
+                <w:szCs w:val="21"/>
+              </w:rPr>
+              <w:t xml:space="preserve">Direcciones útiles</w:t>
+            </w:r>
+          </w:p>
+        </w:tc>
+      </w:tr>
+      <w:tr>
+        <w:trPr>
+          <w:cantSplit/>
+        </w:trPr>
+        <w:tc>
+          <w:tcPr>
+            <w:tcW w:type="dxa" w:w="3000"/>
+            <w:tcBorders>
+              <w:top w:val="none" w:color="FFFFFF" w:sz="0"/>
+              <w:left w:val="none" w:color="FFFFFF" w:sz="0"/>
+              <w:bottom w:val="none" w:color="FFFFFF" w:sz="0"/>
+              <w:right w:val="none" w:color="FFFFFF" w:sz="0"/>
+            </w:tcBorders>
+            <w:tcMar>
+              <w:top w:type="dxa" w:w="40"/>
+              <w:left w:type="dxa" w:w="80"/>
+              <w:bottom w:type="dxa" w:w="40"/>
+              <w:right w:type="dxa" w:w="80"/>
+            </w:tcMar>
+          </w:tcPr>
+          <w:p>
+            <w:pPr>
+              <w:spacing w:line="240"/>
+            </w:pPr>
+            <w:r>
+              <w:rPr>
+                <w:sz w:val="21"/>
+                <w:szCs w:val="21"/>
+              </w:rPr>
+              <w:t xml:space="preserve">Ventas</w:t>
+            </w:r>
+          </w:p>
+        </w:tc>
+        <w:tc>
+          <w:tcPr>
+            <w:tcW w:type="dxa" w:w="1700"/>
+            <w:tcBorders>
+              <w:top w:val="none" w:color="FFFFFF" w:sz="0"/>
+              <w:left w:val="none" w:color="FFFFFF" w:sz="0"/>
+              <w:bottom w:val="none" w:color="FFFFFF" w:sz="0"/>
+              <w:right w:val="none" w:color="FFFFFF" w:sz="0"/>
+            </w:tcBorders>
+            <w:tcMar>
+              <w:top w:type="dxa" w:w="40"/>
+              <w:left w:type="dxa" w:w="80"/>
+              <w:bottom w:type="dxa" w:w="40"/>
+              <w:right w:type="dxa" w:w="80"/>
+            </w:tcMar>
+          </w:tcPr>
+          <w:p>
+            <w:pPr>
+              <w:spacing w:line="240"/>
+            </w:pPr>
+            <w:r>
+              <w:rPr>
+                <w:sz w:val="21"/>
+                <w:szCs w:val="21"/>
+              </w:rPr>
+              <w:t xml:space="preserve">75 PC</w:t>
+            </w:r>
+          </w:p>
+        </w:tc>
+        <w:tc>
+          <w:tcPr>
+            <w:tcW w:type="dxa" w:w="2100"/>
+            <w:tcBorders>
+              <w:top w:val="none" w:color="FFFFFF" w:sz="0"/>
+              <w:left w:val="none" w:color="FFFFFF" w:sz="0"/>
+              <w:bottom w:val="none" w:color="FFFFFF" w:sz="0"/>
+              <w:right w:val="none" w:color="FFFFFF" w:sz="0"/>
+            </w:tcBorders>
+            <w:tcMar>
+              <w:top w:type="dxa" w:w="40"/>
+              <w:left w:type="dxa" w:w="80"/>
+              <w:bottom w:type="dxa" w:w="40"/>
+              <w:right w:type="dxa" w:w="80"/>
+            </w:tcMar>
+          </w:tcPr>
+          <w:p>
+            <w:pPr>
+              <w:spacing w:line="240"/>
+            </w:pPr>
+            <w:r>
+              <w:rPr>
+                <w:sz w:val="21"/>
+                <w:szCs w:val="21"/>
+              </w:rPr>
+              <w:t xml:space="preserve">76</w:t>
+            </w:r>
+          </w:p>
+        </w:tc>
+        <w:tc>
+          <w:tcPr>
+            <w:tcW w:type="dxa" w:w="1000"/>
+            <w:tcBorders>
+              <w:top w:val="none" w:color="FFFFFF" w:sz="0"/>
+              <w:left w:val="none" w:color="FFFFFF" w:sz="0"/>
+              <w:bottom w:val="none" w:color="FFFFFF" w:sz="0"/>
+              <w:right w:val="none" w:color="FFFFFF" w:sz="0"/>
+            </w:tcBorders>
+            <w:tcMar>
+              <w:top w:type="dxa" w:w="40"/>
+              <w:left w:type="dxa" w:w="80"/>
+              <w:bottom w:type="dxa" w:w="40"/>
+              <w:right w:type="dxa" w:w="80"/>
+            </w:tcMar>
+          </w:tcPr>
+          <w:p>
+            <w:pPr>
+              <w:spacing w:line="240"/>
+            </w:pPr>
+            <w:r>
+              <w:rPr>
+                <w:sz w:val="21"/>
+                <w:szCs w:val="21"/>
+              </w:rPr>
+              <w:t xml:space="preserve">/25</w:t>
+            </w:r>
+          </w:p>
+        </w:tc>
+        <w:tc>
+          <w:tcPr>
+            <w:tcW w:type="dxa" w:w="1560"/>
+            <w:tcBorders>
+              <w:top w:val="none" w:color="FFFFFF" w:sz="0"/>
+              <w:left w:val="none" w:color="FFFFFF" w:sz="0"/>
+              <w:bottom w:val="none" w:color="FFFFFF" w:sz="0"/>
+              <w:right w:val="none" w:color="FFFFFF" w:sz="0"/>
+            </w:tcBorders>
+            <w:tcMar>
+              <w:top w:type="dxa" w:w="40"/>
+              <w:left w:type="dxa" w:w="80"/>
+              <w:bottom w:type="dxa" w:w="40"/>
+              <w:right w:type="dxa" w:w="80"/>
+            </w:tcMar>
+          </w:tcPr>
+          <w:p>
+            <w:pPr>
+              <w:spacing w:line="240"/>
+            </w:pPr>
+            <w:r>
+              <w:rPr>
+                <w:sz w:val="21"/>
+                <w:szCs w:val="21"/>
+              </w:rPr>
+              <w:t xml:space="preserve">126</w:t>
+            </w:r>
+          </w:p>
+        </w:tc>
+      </w:tr>
+      <w:tr>
+        <w:trPr>
+          <w:cantSplit/>
+        </w:trPr>
+        <w:tc>
+          <w:tcPr>
+            <w:tcW w:type="dxa" w:w="3000"/>
+            <w:tcBorders>
+              <w:top w:val="none" w:color="FFFFFF" w:sz="0"/>
+              <w:left w:val="none" w:color="FFFFFF" w:sz="0"/>
+              <w:bottom w:val="none" w:color="FFFFFF" w:sz="0"/>
+              <w:right w:val="none" w:color="FFFFFF" w:sz="0"/>
+            </w:tcBorders>
+            <w:tcMar>
+              <w:top w:type="dxa" w:w="40"/>
+              <w:left w:type="dxa" w:w="80"/>
+              <w:bottom w:type="dxa" w:w="40"/>
+              <w:right w:type="dxa" w:w="80"/>
+            </w:tcMar>
+          </w:tcPr>
+          <w:p>
+            <w:pPr>
+              <w:spacing w:line="240"/>
+            </w:pPr>
+            <w:r>
+              <w:rPr>
+                <w:sz w:val="21"/>
+                <w:szCs w:val="21"/>
+              </w:rPr>
+              <w:t xml:space="preserve">Operaciones</w:t>
+            </w:r>
+          </w:p>
+        </w:tc>
+        <w:tc>
+          <w:tcPr>
+            <w:tcW w:type="dxa" w:w="1700"/>
+            <w:tcBorders>
+              <w:top w:val="none" w:color="FFFFFF" w:sz="0"/>
+              <w:left w:val="none" w:color="FFFFFF" w:sz="0"/>
+              <w:bottom w:val="none" w:color="FFFFFF" w:sz="0"/>
+              <w:right w:val="none" w:color="FFFFFF" w:sz="0"/>
+            </w:tcBorders>
+            <w:tcMar>
+              <w:top w:type="dxa" w:w="40"/>
+              <w:left w:type="dxa" w:w="80"/>
+              <w:bottom w:type="dxa" w:w="40"/>
+              <w:right w:type="dxa" w:w="80"/>
+            </w:tcMar>
+          </w:tcPr>
+          <w:p>
+            <w:pPr>
+              <w:spacing w:line="240"/>
+            </w:pPr>
+            <w:r>
+              <w:rPr>
+                <w:sz w:val="21"/>
+                <w:szCs w:val="21"/>
+              </w:rPr>
+              <w:t xml:space="preserve">70 PC</w:t>
+            </w:r>
+          </w:p>
+        </w:tc>
+        <w:tc>
+          <w:tcPr>
+            <w:tcW w:type="dxa" w:w="2100"/>
+            <w:tcBorders>
+              <w:top w:val="none" w:color="FFFFFF" w:sz="0"/>
+              <w:left w:val="none" w:color="FFFFFF" w:sz="0"/>
+              <w:bottom w:val="none" w:color="FFFFFF" w:sz="0"/>
+              <w:right w:val="none" w:color="FFFFFF" w:sz="0"/>
+            </w:tcBorders>
+            <w:tcMar>
+              <w:top w:type="dxa" w:w="40"/>
+              <w:left w:type="dxa" w:w="80"/>
+              <w:bottom w:type="dxa" w:w="40"/>
+              <w:right w:type="dxa" w:w="80"/>
+            </w:tcMar>
+          </w:tcPr>
+          <w:p>
+            <w:pPr>
+              <w:spacing w:line="240"/>
+            </w:pPr>
+            <w:r>
+              <w:rPr>
+                <w:sz w:val="21"/>
+                <w:szCs w:val="21"/>
+              </w:rPr>
+              <w:t xml:space="preserve">71</w:t>
+            </w:r>
+          </w:p>
+        </w:tc>
+        <w:tc>
+          <w:tcPr>
+            <w:tcW w:type="dxa" w:w="1000"/>
+            <w:tcBorders>
+              <w:top w:val="none" w:color="FFFFFF" w:sz="0"/>
+              <w:left w:val="none" w:color="FFFFFF" w:sz="0"/>
+              <w:bottom w:val="none" w:color="FFFFFF" w:sz="0"/>
+              <w:right w:val="none" w:color="FFFFFF" w:sz="0"/>
+            </w:tcBorders>
+            <w:tcMar>
+              <w:top w:type="dxa" w:w="40"/>
+              <w:left w:type="dxa" w:w="80"/>
+              <w:bottom w:type="dxa" w:w="40"/>
+              <w:right w:type="dxa" w:w="80"/>
+            </w:tcMar>
+          </w:tcPr>
+          <w:p>
+            <w:pPr>
+              <w:spacing w:line="240"/>
+            </w:pPr>
+            <w:r>
+              <w:rPr>
+                <w:sz w:val="21"/>
+                <w:szCs w:val="21"/>
+              </w:rPr>
+              <w:t xml:space="preserve">/25</w:t>
+            </w:r>
+          </w:p>
+        </w:tc>
+        <w:tc>
+          <w:tcPr>
+            <w:tcW w:type="dxa" w:w="1560"/>
+            <w:tcBorders>
+              <w:top w:val="none" w:color="FFFFFF" w:sz="0"/>
+              <w:left w:val="none" w:color="FFFFFF" w:sz="0"/>
+              <w:bottom w:val="none" w:color="FFFFFF" w:sz="0"/>
+              <w:right w:val="none" w:color="FFFFFF" w:sz="0"/>
+            </w:tcBorders>
+            <w:tcMar>
+              <w:top w:type="dxa" w:w="40"/>
+              <w:left w:type="dxa" w:w="80"/>
+              <w:bottom w:type="dxa" w:w="40"/>
+              <w:right w:type="dxa" w:w="80"/>
+            </w:tcMar>
+          </w:tcPr>
+          <w:p>
+            <w:pPr>
+              <w:spacing w:line="240"/>
+            </w:pPr>
+            <w:r>
+              <w:rPr>
+                <w:sz w:val="21"/>
+                <w:szCs w:val="21"/>
+              </w:rPr>
+              <w:t xml:space="preserve">126</w:t>
+            </w:r>
+          </w:p>
+        </w:tc>
+      </w:tr>
+      <w:tr>
+        <w:trPr>
+          <w:cantSplit/>
+        </w:trPr>
+        <w:tc>
+          <w:tcPr>
+            <w:tcW w:type="dxa" w:w="3000"/>
+            <w:tcBorders>
+              <w:top w:val="none" w:color="FFFFFF" w:sz="0"/>
+              <w:left w:val="none" w:color="FFFFFF" w:sz="0"/>
+              <w:bottom w:val="none" w:color="FFFFFF" w:sz="0"/>
+              <w:right w:val="none" w:color="FFFFFF" w:sz="0"/>
+            </w:tcBorders>
+            <w:tcMar>
+              <w:top w:type="dxa" w:w="40"/>
+              <w:left w:type="dxa" w:w="80"/>
+              <w:bottom w:type="dxa" w:w="40"/>
+              <w:right w:type="dxa" w:w="80"/>
+            </w:tcMar>
+          </w:tcPr>
+          <w:p>
+            <w:pPr>
+              <w:spacing w:line="240"/>
+            </w:pPr>
+            <w:r>
+              <w:rPr>
+                <w:sz w:val="21"/>
+                <w:szCs w:val="21"/>
+              </w:rPr>
+              <w:t xml:space="preserve">Capacitación</w:t>
+            </w:r>
+          </w:p>
+        </w:tc>
+        <w:tc>
+          <w:tcPr>
+            <w:tcW w:type="dxa" w:w="1700"/>
+            <w:tcBorders>
+              <w:top w:val="none" w:color="FFFFFF" w:sz="0"/>
+              <w:left w:val="none" w:color="FFFFFF" w:sz="0"/>
+              <w:bottom w:val="none" w:color="FFFFFF" w:sz="0"/>
+              <w:right w:val="none" w:color="FFFFFF" w:sz="0"/>
+            </w:tcBorders>
+            <w:tcMar>
+              <w:top w:type="dxa" w:w="40"/>
+              <w:left w:type="dxa" w:w="80"/>
+              <w:bottom w:type="dxa" w:w="40"/>
+              <w:right w:type="dxa" w:w="80"/>
+            </w:tcMar>
+          </w:tcPr>
+          <w:p>
+            <w:pPr>
+              <w:spacing w:line="240"/>
+            </w:pPr>
+            <w:r>
+              <w:rPr>
+                <w:sz w:val="21"/>
+                <w:szCs w:val="21"/>
+              </w:rPr>
+              <w:t xml:space="preserve">50 PC</w:t>
+            </w:r>
+          </w:p>
+        </w:tc>
+        <w:tc>
+          <w:tcPr>
+            <w:tcW w:type="dxa" w:w="2100"/>
+            <w:tcBorders>
+              <w:top w:val="none" w:color="FFFFFF" w:sz="0"/>
+              <w:left w:val="none" w:color="FFFFFF" w:sz="0"/>
+              <w:bottom w:val="none" w:color="FFFFFF" w:sz="0"/>
+              <w:right w:val="none" w:color="FFFFFF" w:sz="0"/>
+            </w:tcBorders>
+            <w:tcMar>
+              <w:top w:type="dxa" w:w="40"/>
+              <w:left w:type="dxa" w:w="80"/>
+              <w:bottom w:type="dxa" w:w="40"/>
+              <w:right w:type="dxa" w:w="80"/>
+            </w:tcMar>
+          </w:tcPr>
+          <w:p>
+            <w:pPr>
+              <w:spacing w:line="240"/>
+            </w:pPr>
+            <w:r>
+              <w:rPr>
+                <w:sz w:val="21"/>
+                <w:szCs w:val="21"/>
+              </w:rPr>
+              <w:t xml:space="preserve">51</w:t>
+            </w:r>
+          </w:p>
+        </w:tc>
+        <w:tc>
+          <w:tcPr>
+            <w:tcW w:type="dxa" w:w="1000"/>
+            <w:tcBorders>
+              <w:top w:val="none" w:color="FFFFFF" w:sz="0"/>
+              <w:left w:val="none" w:color="FFFFFF" w:sz="0"/>
+              <w:bottom w:val="none" w:color="FFFFFF" w:sz="0"/>
+              <w:right w:val="none" w:color="FFFFFF" w:sz="0"/>
+            </w:tcBorders>
+            <w:tcMar>
+              <w:top w:type="dxa" w:w="40"/>
+              <w:left w:type="dxa" w:w="80"/>
+              <w:bottom w:type="dxa" w:w="40"/>
+              <w:right w:type="dxa" w:w="80"/>
+            </w:tcMar>
+          </w:tcPr>
+          <w:p>
+            <w:pPr>
+              <w:spacing w:line="240"/>
+            </w:pPr>
+            <w:r>
+              <w:rPr>
+                <w:sz w:val="21"/>
+                <w:szCs w:val="21"/>
+              </w:rPr>
+              <w:t xml:space="preserve">/26</w:t>
+            </w:r>
+          </w:p>
+        </w:tc>
+        <w:tc>
+          <w:tcPr>
+            <w:tcW w:type="dxa" w:w="1560"/>
+            <w:tcBorders>
+              <w:top w:val="none" w:color="FFFFFF" w:sz="0"/>
+              <w:left w:val="none" w:color="FFFFFF" w:sz="0"/>
+              <w:bottom w:val="none" w:color="FFFFFF" w:sz="0"/>
+              <w:right w:val="none" w:color="FFFFFF" w:sz="0"/>
+            </w:tcBorders>
+            <w:tcMar>
+              <w:top w:type="dxa" w:w="40"/>
+              <w:left w:type="dxa" w:w="80"/>
+              <w:bottom w:type="dxa" w:w="40"/>
+              <w:right w:type="dxa" w:w="80"/>
+            </w:tcMar>
+          </w:tcPr>
+          <w:p>
+            <w:pPr>
+              <w:spacing w:line="240"/>
+            </w:pPr>
+            <w:r>
+              <w:rPr>
+                <w:sz w:val="21"/>
+                <w:szCs w:val="21"/>
+              </w:rPr>
+              <w:t xml:space="preserve">62</w:t>
+            </w:r>
+          </w:p>
+        </w:tc>
+      </w:tr>
+      <w:tr>
+        <w:trPr>
+          <w:cantSplit/>
+        </w:trPr>
+        <w:tc>
+          <w:tcPr>
+            <w:tcW w:type="dxa" w:w="3000"/>
+            <w:tcBorders>
+              <w:top w:val="none" w:color="FFFFFF" w:sz="0"/>
+              <w:left w:val="none" w:color="FFFFFF" w:sz="0"/>
+              <w:bottom w:val="none" w:color="FFFFFF" w:sz="0"/>
+              <w:right w:val="none" w:color="FFFFFF" w:sz="0"/>
+            </w:tcBorders>
+            <w:tcMar>
+              <w:top w:type="dxa" w:w="40"/>
+              <w:left w:type="dxa" w:w="80"/>
+              <w:bottom w:type="dxa" w:w="40"/>
+              <w:right w:type="dxa" w:w="80"/>
+            </w:tcMar>
+          </w:tcPr>
+          <w:p>
+            <w:pPr>
+              <w:spacing w:line="240"/>
+            </w:pPr>
+            <w:r>
+              <w:rPr>
+                <w:sz w:val="21"/>
+                <w:szCs w:val="21"/>
+              </w:rPr>
+              <w:t xml:space="preserve">Administración</w:t>
+            </w:r>
+          </w:p>
+        </w:tc>
+        <w:tc>
+          <w:tcPr>
+            <w:tcW w:type="dxa" w:w="1700"/>
+            <w:tcBorders>
+              <w:top w:val="none" w:color="FFFFFF" w:sz="0"/>
+              <w:left w:val="none" w:color="FFFFFF" w:sz="0"/>
+              <w:bottom w:val="none" w:color="FFFFFF" w:sz="0"/>
+              <w:right w:val="none" w:color="FFFFFF" w:sz="0"/>
+            </w:tcBorders>
+            <w:tcMar>
+              <w:top w:type="dxa" w:w="40"/>
+              <w:left w:type="dxa" w:w="80"/>
+              <w:bottom w:type="dxa" w:w="40"/>
+              <w:right w:type="dxa" w:w="80"/>
+            </w:tcMar>
+          </w:tcPr>
+          <w:p>
+            <w:pPr>
+              <w:spacing w:line="240"/>
+            </w:pPr>
+            <w:r>
+              <w:rPr>
+                <w:sz w:val="21"/>
+                <w:szCs w:val="21"/>
+              </w:rPr>
+              <w:t xml:space="preserve">40 PC</w:t>
+            </w:r>
+          </w:p>
+        </w:tc>
+        <w:tc>
+          <w:tcPr>
+            <w:tcW w:type="dxa" w:w="2100"/>
+            <w:tcBorders>
+              <w:top w:val="none" w:color="FFFFFF" w:sz="0"/>
+              <w:left w:val="none" w:color="FFFFFF" w:sz="0"/>
+              <w:bottom w:val="none" w:color="FFFFFF" w:sz="0"/>
+              <w:right w:val="none" w:color="FFFFFF" w:sz="0"/>
+            </w:tcBorders>
+            <w:tcMar>
+              <w:top w:type="dxa" w:w="40"/>
+              <w:left w:type="dxa" w:w="80"/>
+              <w:bottom w:type="dxa" w:w="40"/>
+              <w:right w:type="dxa" w:w="80"/>
+            </w:tcMar>
+          </w:tcPr>
+          <w:p>
+            <w:pPr>
+              <w:spacing w:line="240"/>
+            </w:pPr>
+            <w:r>
+              <w:rPr>
+                <w:sz w:val="21"/>
+                <w:szCs w:val="21"/>
+              </w:rPr>
+              <w:t xml:space="preserve">41</w:t>
+            </w:r>
+          </w:p>
+        </w:tc>
+        <w:tc>
+          <w:tcPr>
+            <w:tcW w:type="dxa" w:w="1000"/>
+            <w:tcBorders>
+              <w:top w:val="none" w:color="FFFFFF" w:sz="0"/>
+              <w:left w:val="none" w:color="FFFFFF" w:sz="0"/>
+              <w:bottom w:val="none" w:color="FFFFFF" w:sz="0"/>
+              <w:right w:val="none" w:color="FFFFFF" w:sz="0"/>
+            </w:tcBorders>
+            <w:tcMar>
+              <w:top w:type="dxa" w:w="40"/>
+              <w:left w:type="dxa" w:w="80"/>
+              <w:bottom w:type="dxa" w:w="40"/>
+              <w:right w:type="dxa" w:w="80"/>
+            </w:tcMar>
+          </w:tcPr>
+          <w:p>
+            <w:pPr>
+              <w:spacing w:line="240"/>
+            </w:pPr>
+            <w:r>
+              <w:rPr>
+                <w:sz w:val="21"/>
+                <w:szCs w:val="21"/>
+              </w:rPr>
+              <w:t xml:space="preserve">/26</w:t>
+            </w:r>
+          </w:p>
+        </w:tc>
+        <w:tc>
+          <w:tcPr>
+            <w:tcW w:type="dxa" w:w="1560"/>
+            <w:tcBorders>
+              <w:top w:val="none" w:color="FFFFFF" w:sz="0"/>
+              <w:left w:val="none" w:color="FFFFFF" w:sz="0"/>
+              <w:bottom w:val="none" w:color="FFFFFF" w:sz="0"/>
+              <w:right w:val="none" w:color="FFFFFF" w:sz="0"/>
+            </w:tcBorders>
+            <w:tcMar>
+              <w:top w:type="dxa" w:w="40"/>
+              <w:left w:type="dxa" w:w="80"/>
+              <w:bottom w:type="dxa" w:w="40"/>
+              <w:right w:type="dxa" w:w="80"/>
+            </w:tcMar>
+          </w:tcPr>
+          <w:p>
+            <w:pPr>
+              <w:spacing w:line="240"/>
+            </w:pPr>
+            <w:r>
+              <w:rPr>
+                <w:sz w:val="21"/>
+                <w:szCs w:val="21"/>
+              </w:rPr>
+              <w:t xml:space="preserve">62</w:t>
+            </w:r>
+          </w:p>
+        </w:tc>
+      </w:tr>
+      <w:tr>
+        <w:trPr>
+          <w:cantSplit/>
+        </w:trPr>
+        <w:tc>
+          <w:tcPr>
+            <w:tcW w:type="dxa" w:w="3000"/>
+            <w:tcBorders>
+              <w:top w:val="none" w:color="FFFFFF" w:sz="0"/>
+              <w:left w:val="none" w:color="FFFFFF" w:sz="0"/>
+              <w:bottom w:val="none" w:color="FFFFFF" w:sz="0"/>
+              <w:right w:val="none" w:color="FFFFFF" w:sz="0"/>
+            </w:tcBorders>
+            <w:tcMar>
+              <w:top w:type="dxa" w:w="40"/>
+              <w:left w:type="dxa" w:w="80"/>
+              <w:bottom w:type="dxa" w:w="40"/>
+              <w:right w:type="dxa" w:w="80"/>
+            </w:tcMar>
+          </w:tcPr>
+          <w:p>
+            <w:pPr>
+              <w:spacing w:line="240"/>
+            </w:pPr>
+            <w:r>
+              <w:rPr>
+                <w:sz w:val="21"/>
+                <w:szCs w:val="21"/>
+              </w:rPr>
+              <w:t xml:space="preserve">Finanzas</w:t>
+            </w:r>
+          </w:p>
+        </w:tc>
+        <w:tc>
+          <w:tcPr>
+            <w:tcW w:type="dxa" w:w="1700"/>
+            <w:tcBorders>
+              <w:top w:val="none" w:color="FFFFFF" w:sz="0"/>
+              <w:left w:val="none" w:color="FFFFFF" w:sz="0"/>
+              <w:bottom w:val="none" w:color="FFFFFF" w:sz="0"/>
+              <w:right w:val="none" w:color="FFFFFF" w:sz="0"/>
+            </w:tcBorders>
+            <w:tcMar>
+              <w:top w:type="dxa" w:w="40"/>
+              <w:left w:type="dxa" w:w="80"/>
+              <w:bottom w:type="dxa" w:w="40"/>
+              <w:right w:type="dxa" w:w="80"/>
+            </w:tcMar>
+          </w:tcPr>
+          <w:p>
+            <w:pPr>
+              <w:spacing w:line="240"/>
+            </w:pPr>
+            <w:r>
+              <w:rPr>
+                <w:sz w:val="21"/>
+                <w:szCs w:val="21"/>
+              </w:rPr>
+              <w:t xml:space="preserve">40 PC</w:t>
+            </w:r>
+          </w:p>
+        </w:tc>
+        <w:tc>
+          <w:tcPr>
+            <w:tcW w:type="dxa" w:w="2100"/>
+            <w:tcBorders>
+              <w:top w:val="none" w:color="FFFFFF" w:sz="0"/>
+              <w:left w:val="none" w:color="FFFFFF" w:sz="0"/>
+              <w:bottom w:val="none" w:color="FFFFFF" w:sz="0"/>
+              <w:right w:val="none" w:color="FFFFFF" w:sz="0"/>
+            </w:tcBorders>
+            <w:tcMar>
+              <w:top w:type="dxa" w:w="40"/>
+              <w:left w:type="dxa" w:w="80"/>
+              <w:bottom w:type="dxa" w:w="40"/>
+              <w:right w:type="dxa" w:w="80"/>
+            </w:tcMar>
+          </w:tcPr>
+          <w:p>
+            <w:pPr>
+              <w:spacing w:line="240"/>
+            </w:pPr>
+            <w:r>
+              <w:rPr>
+                <w:sz w:val="21"/>
+                <w:szCs w:val="21"/>
+              </w:rPr>
+              <w:t xml:space="preserve">41</w:t>
+            </w:r>
+          </w:p>
+        </w:tc>
+        <w:tc>
+          <w:tcPr>
+            <w:tcW w:type="dxa" w:w="1000"/>
+            <w:tcBorders>
+              <w:top w:val="none" w:color="FFFFFF" w:sz="0"/>
+              <w:left w:val="none" w:color="FFFFFF" w:sz="0"/>
+              <w:bottom w:val="none" w:color="FFFFFF" w:sz="0"/>
+              <w:right w:val="none" w:color="FFFFFF" w:sz="0"/>
+            </w:tcBorders>
+            <w:tcMar>
+              <w:top w:type="dxa" w:w="40"/>
+              <w:left w:type="dxa" w:w="80"/>
+              <w:bottom w:type="dxa" w:w="40"/>
+              <w:right w:type="dxa" w:w="80"/>
+            </w:tcMar>
+          </w:tcPr>
+          <w:p>
+            <w:pPr>
+              <w:spacing w:line="240"/>
+            </w:pPr>
+            <w:r>
+              <w:rPr>
+                <w:sz w:val="21"/>
+                <w:szCs w:val="21"/>
+              </w:rPr>
+              <w:t xml:space="preserve">/26</w:t>
+            </w:r>
+          </w:p>
+        </w:tc>
+        <w:tc>
+          <w:tcPr>
+            <w:tcW w:type="dxa" w:w="1560"/>
+            <w:tcBorders>
+              <w:top w:val="none" w:color="FFFFFF" w:sz="0"/>
+              <w:left w:val="none" w:color="FFFFFF" w:sz="0"/>
+              <w:bottom w:val="none" w:color="FFFFFF" w:sz="0"/>
+              <w:right w:val="none" w:color="FFFFFF" w:sz="0"/>
+            </w:tcBorders>
+            <w:tcMar>
+              <w:top w:type="dxa" w:w="40"/>
+              <w:left w:type="dxa" w:w="80"/>
+              <w:bottom w:type="dxa" w:w="40"/>
+              <w:right w:type="dxa" w:w="80"/>
+            </w:tcMar>
+          </w:tcPr>
+          <w:p>
+            <w:pPr>
+              <w:spacing w:line="240"/>
+            </w:pPr>
+            <w:r>
+              <w:rPr>
+                <w:sz w:val="21"/>
+                <w:szCs w:val="21"/>
+              </w:rPr>
+              <w:t xml:space="preserve">62</w:t>
+            </w:r>
+          </w:p>
+        </w:tc>
+      </w:tr>
+      <w:tr>
+        <w:trPr>
+          <w:cantSplit/>
+        </w:trPr>
+        <w:tc>
+          <w:tcPr>
+            <w:tcW w:type="dxa" w:w="3000"/>
+            <w:tcBorders>
+              <w:top w:val="none" w:color="FFFFFF" w:sz="0"/>
+              <w:left w:val="none" w:color="FFFFFF" w:sz="0"/>
+              <w:bottom w:val="none" w:color="FFFFFF" w:sz="0"/>
+              <w:right w:val="none" w:color="FFFFFF" w:sz="0"/>
+            </w:tcBorders>
+            <w:tcMar>
+              <w:top w:type="dxa" w:w="40"/>
+              <w:left w:type="dxa" w:w="80"/>
+              <w:bottom w:type="dxa" w:w="40"/>
+              <w:right w:type="dxa" w:w="80"/>
+            </w:tcMar>
+          </w:tcPr>
+          <w:p>
+            <w:pPr>
+              <w:spacing w:line="240"/>
+            </w:pPr>
+            <w:r>
+              <w:rPr>
+                <w:sz w:val="21"/>
+                <w:szCs w:val="21"/>
+              </w:rPr>
+              <w:t xml:space="preserve">Soporte TI</w:t>
+            </w:r>
+          </w:p>
+        </w:tc>
+        <w:tc>
+          <w:tcPr>
+            <w:tcW w:type="dxa" w:w="1700"/>
+            <w:tcBorders>
+              <w:top w:val="none" w:color="FFFFFF" w:sz="0"/>
+              <w:left w:val="none" w:color="FFFFFF" w:sz="0"/>
+              <w:bottom w:val="none" w:color="FFFFFF" w:sz="0"/>
+              <w:right w:val="none" w:color="FFFFFF" w:sz="0"/>
+            </w:tcBorders>
+            <w:tcMar>
+              <w:top w:type="dxa" w:w="40"/>
+              <w:left w:type="dxa" w:w="80"/>
+              <w:bottom w:type="dxa" w:w="40"/>
+              <w:right w:type="dxa" w:w="80"/>
+            </w:tcMar>
+          </w:tcPr>
+          <w:p>
+            <w:pPr>
+              <w:spacing w:line="240"/>
+            </w:pPr>
+            <w:r>
+              <w:rPr>
+                <w:sz w:val="21"/>
+                <w:szCs w:val="21"/>
+              </w:rPr>
+              <w:t xml:space="preserve">25 PC y 1 servidor</w:t>
+            </w:r>
+          </w:p>
+        </w:tc>
+        <w:tc>
+          <w:tcPr>
+            <w:tcW w:type="dxa" w:w="2100"/>
+            <w:tcBorders>
+              <w:top w:val="none" w:color="FFFFFF" w:sz="0"/>
+              <w:left w:val="none" w:color="FFFFFF" w:sz="0"/>
+              <w:bottom w:val="none" w:color="FFFFFF" w:sz="0"/>
+              <w:right w:val="none" w:color="FFFFFF" w:sz="0"/>
+            </w:tcBorders>
+            <w:tcMar>
+              <w:top w:type="dxa" w:w="40"/>
+              <w:left w:type="dxa" w:w="80"/>
+              <w:bottom w:type="dxa" w:w="40"/>
+              <w:right w:type="dxa" w:w="80"/>
+            </w:tcMar>
+          </w:tcPr>
+          <w:p>
+            <w:pPr>
+              <w:spacing w:line="240"/>
+            </w:pPr>
+            <w:r>
+              <w:rPr>
+                <w:sz w:val="21"/>
+                <w:szCs w:val="21"/>
+              </w:rPr>
+              <w:t xml:space="preserve">27</w:t>
+            </w:r>
+          </w:p>
+        </w:tc>
+        <w:tc>
+          <w:tcPr>
+            <w:tcW w:type="dxa" w:w="1000"/>
+            <w:tcBorders>
+              <w:top w:val="none" w:color="FFFFFF" w:sz="0"/>
+              <w:left w:val="none" w:color="FFFFFF" w:sz="0"/>
+              <w:bottom w:val="none" w:color="FFFFFF" w:sz="0"/>
+              <w:right w:val="none" w:color="FFFFFF" w:sz="0"/>
+            </w:tcBorders>
+            <w:tcMar>
+              <w:top w:type="dxa" w:w="40"/>
+              <w:left w:type="dxa" w:w="80"/>
+              <w:bottom w:type="dxa" w:w="40"/>
+              <w:right w:type="dxa" w:w="80"/>
+            </w:tcMar>
+          </w:tcPr>
+          <w:p>
+            <w:pPr>
+              <w:spacing w:line="240"/>
+            </w:pPr>
+            <w:r>
+              <w:rPr>
+                <w:sz w:val="21"/>
+                <w:szCs w:val="21"/>
+              </w:rPr>
+              <w:t xml:space="preserve">/27</w:t>
+            </w:r>
+          </w:p>
+        </w:tc>
+        <w:tc>
+          <w:tcPr>
+            <w:tcW w:type="dxa" w:w="1560"/>
+            <w:tcBorders>
+              <w:top w:val="none" w:color="FFFFFF" w:sz="0"/>
+              <w:left w:val="none" w:color="FFFFFF" w:sz="0"/>
+              <w:bottom w:val="none" w:color="FFFFFF" w:sz="0"/>
+              <w:right w:val="none" w:color="FFFFFF" w:sz="0"/>
+            </w:tcBorders>
+            <w:tcMar>
+              <w:top w:type="dxa" w:w="40"/>
+              <w:left w:type="dxa" w:w="80"/>
+              <w:bottom w:type="dxa" w:w="40"/>
+              <w:right w:type="dxa" w:w="80"/>
+            </w:tcMar>
+          </w:tcPr>
+          <w:p>
+            <w:pPr>
+              <w:spacing w:line="240"/>
+            </w:pPr>
+            <w:r>
+              <w:rPr>
+                <w:sz w:val="21"/>
+                <w:szCs w:val="21"/>
+              </w:rPr>
+              <w:t xml:space="preserve">30</w:t>
+            </w:r>
+          </w:p>
+        </w:tc>
+      </w:tr>
+      <w:tr>
+        <w:trPr>
+          <w:cantSplit/>
+        </w:trPr>
+        <w:tc>
+          <w:tcPr>
+            <w:tcW w:type="dxa" w:w="3000"/>
+            <w:tcBorders>
+              <w:top w:val="none" w:color="FFFFFF" w:sz="0"/>
+              <w:left w:val="none" w:color="FFFFFF" w:sz="0"/>
+              <w:bottom w:val="none" w:color="FFFFFF" w:sz="0"/>
+              <w:right w:val="none" w:color="FFFFFF" w:sz="0"/>
+            </w:tcBorders>
+            <w:tcMar>
+              <w:top w:type="dxa" w:w="40"/>
+              <w:left w:type="dxa" w:w="80"/>
+              <w:bottom w:type="dxa" w:w="40"/>
+              <w:right w:type="dxa" w:w="80"/>
+            </w:tcMar>
+          </w:tcPr>
+          <w:p>
+            <w:pPr>
+              <w:spacing w:line="240"/>
+            </w:pPr>
+            <w:r>
+              <w:rPr>
+                <w:sz w:val="21"/>
+                <w:szCs w:val="21"/>
+              </w:rPr>
+              <w:t xml:space="preserve">Cada enlace entre routers (3)</w:t>
+            </w:r>
+          </w:p>
+        </w:tc>
+        <w:tc>
+          <w:tcPr>
+            <w:tcW w:type="dxa" w:w="1700"/>
+            <w:tcBorders>
+              <w:top w:val="none" w:color="FFFFFF" w:sz="0"/>
+              <w:left w:val="none" w:color="FFFFFF" w:sz="0"/>
+              <w:bottom w:val="none" w:color="FFFFFF" w:sz="0"/>
+              <w:right w:val="none" w:color="FFFFFF" w:sz="0"/>
+            </w:tcBorders>
+            <w:tcMar>
+              <w:top w:type="dxa" w:w="40"/>
+              <w:left w:type="dxa" w:w="80"/>
+              <w:bottom w:type="dxa" w:w="40"/>
+              <w:right w:type="dxa" w:w="80"/>
+            </w:tcMar>
+          </w:tcPr>
+          <w:p>
+            <w:pPr>
+              <w:spacing w:line="240"/>
+            </w:pPr>
+            <w:r>
+              <w:rPr>
+                <w:sz w:val="21"/>
+                <w:szCs w:val="21"/>
+              </w:rPr>
+              <w:t xml:space="preserve">2 routers</w:t>
+            </w:r>
+          </w:p>
+        </w:tc>
+        <w:tc>
+          <w:tcPr>
+            <w:tcW w:type="dxa" w:w="2100"/>
+            <w:tcBorders>
+              <w:top w:val="none" w:color="FFFFFF" w:sz="0"/>
+              <w:left w:val="none" w:color="FFFFFF" w:sz="0"/>
+              <w:bottom w:val="none" w:color="FFFFFF" w:sz="0"/>
+              <w:right w:val="none" w:color="FFFFFF" w:sz="0"/>
+            </w:tcBorders>
+            <w:tcMar>
+              <w:top w:type="dxa" w:w="40"/>
+              <w:left w:type="dxa" w:w="80"/>
+              <w:bottom w:type="dxa" w:w="40"/>
+              <w:right w:type="dxa" w:w="80"/>
+            </w:tcMar>
+          </w:tcPr>
+          <w:p>
+            <w:pPr>
+              <w:spacing w:line="240"/>
+            </w:pPr>
+            <w:r>
+              <w:rPr>
+                <w:sz w:val="21"/>
+                <w:szCs w:val="21"/>
+              </w:rPr>
+              <w:t xml:space="preserve">2</w:t>
+            </w:r>
+          </w:p>
+        </w:tc>
+        <w:tc>
+          <w:tcPr>
+            <w:tcW w:type="dxa" w:w="1000"/>
+            <w:tcBorders>
+              <w:top w:val="none" w:color="FFFFFF" w:sz="0"/>
+              <w:left w:val="none" w:color="FFFFFF" w:sz="0"/>
+              <w:bottom w:val="none" w:color="FFFFFF" w:sz="0"/>
+              <w:right w:val="none" w:color="FFFFFF" w:sz="0"/>
+            </w:tcBorders>
+            <w:tcMar>
+              <w:top w:type="dxa" w:w="40"/>
+              <w:left w:type="dxa" w:w="80"/>
+              <w:bottom w:type="dxa" w:w="40"/>
+              <w:right w:type="dxa" w:w="80"/>
+            </w:tcMar>
+          </w:tcPr>
+          <w:p>
+            <w:pPr>
+              <w:spacing w:line="240"/>
+            </w:pPr>
+            <w:r>
+              <w:rPr>
+                <w:sz w:val="21"/>
+                <w:szCs w:val="21"/>
+              </w:rPr>
+              <w:t xml:space="preserve">/30</w:t>
+            </w:r>
+          </w:p>
+        </w:tc>
+        <w:tc>
+          <w:tcPr>
+            <w:tcW w:type="dxa" w:w="1560"/>
+            <w:tcBorders>
+              <w:top w:val="none" w:color="FFFFFF" w:sz="0"/>
+              <w:left w:val="none" w:color="FFFFFF" w:sz="0"/>
+              <w:bottom w:val="none" w:color="FFFFFF" w:sz="0"/>
+              <w:right w:val="none" w:color="FFFFFF" w:sz="0"/>
+            </w:tcBorders>
+            <w:tcMar>
+              <w:top w:type="dxa" w:w="40"/>
+              <w:left w:type="dxa" w:w="80"/>
+              <w:bottom w:type="dxa" w:w="40"/>
+              <w:right w:type="dxa" w:w="80"/>
+            </w:tcMar>
+          </w:tcPr>
+          <w:p>
+            <w:pPr>
+              <w:spacing w:line="240"/>
+            </w:pPr>
+            <w:r>
+              <w:rPr>
+                <w:sz w:val="21"/>
+                <w:szCs w:val="21"/>
+              </w:rPr>
+              <w:t xml:space="preserve">2</w:t>
+            </w:r>
+          </w:p>
+        </w:tc>
+      </w:tr>
+      <w:tr>
+        <w:trPr>
+          <w:cantSplit/>
+        </w:trPr>
+        <w:tc>
+          <w:tcPr>
+            <w:tcW w:type="dxa" w:w="3000"/>
+            <w:tcBorders>
+              <w:top w:val="none" w:color="FFFFFF" w:sz="0"/>
+              <w:left w:val="none" w:color="FFFFFF" w:sz="0"/>
+              <w:bottom w:val="single" w:color="000000" w:sz="6"/>
+              <w:right w:val="none" w:color="FFFFFF" w:sz="0"/>
+            </w:tcBorders>
+            <w:tcMar>
+              <w:top w:type="dxa" w:w="40"/>
+              <w:left w:type="dxa" w:w="80"/>
+              <w:bottom w:type="dxa" w:w="40"/>
+              <w:right w:type="dxa" w:w="80"/>
+            </w:tcMar>
+          </w:tcPr>
+          <w:p>
+            <w:pPr>
+              <w:spacing w:line="240"/>
+            </w:pPr>
+            <w:r>
+              <w:rPr>
+                <w:sz w:val="21"/>
+                <w:szCs w:val="21"/>
+              </w:rPr>
+              <w:t xml:space="preserve">Enlace con el ISP</w:t>
+            </w:r>
+          </w:p>
+        </w:tc>
+        <w:tc>
+          <w:tcPr>
+            <w:tcW w:type="dxa" w:w="1700"/>
+            <w:tcBorders>
+              <w:top w:val="none" w:color="FFFFFF" w:sz="0"/>
+              <w:left w:val="none" w:color="FFFFFF" w:sz="0"/>
+              <w:bottom w:val="single" w:color="000000" w:sz="6"/>
+              <w:right w:val="none" w:color="FFFFFF" w:sz="0"/>
+            </w:tcBorders>
+            <w:tcMar>
+              <w:top w:type="dxa" w:w="40"/>
+              <w:left w:type="dxa" w:w="80"/>
+              <w:bottom w:type="dxa" w:w="40"/>
+              <w:right w:type="dxa" w:w="80"/>
+            </w:tcMar>
+          </w:tcPr>
+          <w:p>
+            <w:pPr>
+              <w:spacing w:line="240"/>
+            </w:pPr>
+            <w:r>
+              <w:rPr>
+                <w:sz w:val="21"/>
+                <w:szCs w:val="21"/>
+              </w:rPr>
+              <w:t xml:space="preserve">2 routers</w:t>
+            </w:r>
+          </w:p>
+        </w:tc>
+        <w:tc>
+          <w:tcPr>
+            <w:tcW w:type="dxa" w:w="2100"/>
+            <w:tcBorders>
+              <w:top w:val="none" w:color="FFFFFF" w:sz="0"/>
+              <w:left w:val="none" w:color="FFFFFF" w:sz="0"/>
+              <w:bottom w:val="single" w:color="000000" w:sz="6"/>
+              <w:right w:val="none" w:color="FFFFFF" w:sz="0"/>
+            </w:tcBorders>
+            <w:tcMar>
+              <w:top w:type="dxa" w:w="40"/>
+              <w:left w:type="dxa" w:w="80"/>
+              <w:bottom w:type="dxa" w:w="40"/>
+              <w:right w:type="dxa" w:w="80"/>
+            </w:tcMar>
+          </w:tcPr>
+          <w:p>
+            <w:pPr>
+              <w:spacing w:line="240"/>
+            </w:pPr>
+            <w:r>
+              <w:rPr>
+                <w:sz w:val="21"/>
+                <w:szCs w:val="21"/>
+              </w:rPr>
+              <w:t xml:space="preserve">2</w:t>
+            </w:r>
+          </w:p>
+        </w:tc>
+        <w:tc>
+          <w:tcPr>
+            <w:tcW w:type="dxa" w:w="1000"/>
+            <w:tcBorders>
+              <w:top w:val="none" w:color="FFFFFF" w:sz="0"/>
+              <w:left w:val="none" w:color="FFFFFF" w:sz="0"/>
+              <w:bottom w:val="single" w:color="000000" w:sz="6"/>
+              <w:right w:val="none" w:color="FFFFFF" w:sz="0"/>
+            </w:tcBorders>
+            <w:tcMar>
+              <w:top w:type="dxa" w:w="40"/>
+              <w:left w:type="dxa" w:w="80"/>
+              <w:bottom w:type="dxa" w:w="40"/>
+              <w:right w:type="dxa" w:w="80"/>
+            </w:tcMar>
+          </w:tcPr>
+          <w:p>
+            <w:pPr>
+              <w:spacing w:line="240"/>
+            </w:pPr>
+            <w:r>
+              <w:rPr>
+                <w:sz w:val="21"/>
+                <w:szCs w:val="21"/>
+              </w:rPr>
+              <w:t xml:space="preserve">/30</w:t>
+            </w:r>
+          </w:p>
+        </w:tc>
+        <w:tc>
+          <w:tcPr>
+            <w:tcW w:type="dxa" w:w="1560"/>
+            <w:tcBorders>
+              <w:top w:val="none" w:color="FFFFFF" w:sz="0"/>
+              <w:left w:val="none" w:color="FFFFFF" w:sz="0"/>
+              <w:bottom w:val="single" w:color="000000" w:sz="6"/>
+              <w:right w:val="none" w:color="FFFFFF" w:sz="0"/>
+            </w:tcBorders>
+            <w:tcMar>
+              <w:top w:type="dxa" w:w="40"/>
+              <w:left w:type="dxa" w:w="80"/>
+              <w:bottom w:type="dxa" w:w="40"/>
+              <w:right w:type="dxa" w:w="80"/>
+            </w:tcMar>
+          </w:tcPr>
+          <w:p>
+            <w:pPr>
+              <w:spacing w:line="240"/>
+            </w:pPr>
+            <w:r>
+              <w:rPr>
+                <w:sz w:val="21"/>
+                <w:szCs w:val="21"/>
+              </w:rPr>
+              <w:t xml:space="preserve">2</w:t>
+            </w:r>
+          </w:p>
+        </w:tc>
+      </w:tr>
+    </w:tbl>
+    <w:p>
+      <w:pPr>
+        <w:spacing w:after="360"/>
+      </w:pPr>
+      <w:r>
+        <w:rPr>
+          <w:i/>
+          <w:iCs/>
+        </w:rPr>
+        <w:t xml:space="preserve">Nota.</w:t>
+      </w:r>
+      <w:r>
+        <w:t xml:space="preserve"> Las direcciones necesarias suman los equipos y el gateway de cada área.</w:t>
+      </w:r>
+    </w:p>
+    <w:p>
+      <w:pPr>
+        <w:keepNext/>
+      </w:pPr>
+      <w:r>
+        <w:rPr>
+          <w:b/>
+          <w:bCs/>
+        </w:rPr>
+        <w:t xml:space="preserve">Tabla 4</w:t>
       </w:r>
     </w:p>
     <w:p>
@@ -3840,7 +5251,7 @@
           <w:b/>
           <w:bCs/>
         </w:rPr>
-        <w:t xml:space="preserve">Tabla 4</w:t>
+        <w:t xml:space="preserve">Tabla 5</w:t>
       </w:r>
     </w:p>
     <w:p>
@@ -4835,7 +6246,7 @@
           <w:b/>
           <w:bCs/>
         </w:rPr>
-        <w:t xml:space="preserve">Tabla 5</w:t>
+        <w:t xml:space="preserve">Tabla 6</w:t>
       </w:r>
     </w:p>
     <w:p>
@@ -5619,7 +7030,7 @@
         <w:t xml:space="preserve">rayo</w:t>
       </w:r>
       <w:r>
-        <w:t xml:space="preserve"> (Connections) abajo a la izquierda. Elige el tipo de cable, haz clic en el primer equipo, elige el puerto, y luego haz clic en el segundo equipo y elige su puerto. Las conexiones se indican en la Tabla 6.</w:t>
+        <w:t xml:space="preserve"> (Connections) abajo a la izquierda. Elige el tipo de cable, haz clic en el primer equipo, elige el puerto, y luego haz clic en el segundo equipo y elige su puerto. Las conexiones se indican en la Tabla 7.</w:t>
       </w:r>
     </w:p>
     <w:p>
@@ -5631,7 +7042,7 @@
           <w:b/>
           <w:bCs/>
         </w:rPr>
-        <w:t xml:space="preserve">Tabla 6</w:t>
+        <w:t xml:space="preserve">Tabla 7</w:t>
       </w:r>
     </w:p>
     <w:p>
@@ -7382,7 +8793,7 @@
         <w:ind w:firstLine="720"/>
       </w:pPr>
       <w:r>
-        <w:t xml:space="preserve">R-CRG usa un puerto Gigabit por cada router de piso, y cada enlace es una subred /30 (Tabla 4). La línea </w:t>
+        <w:t xml:space="preserve">R-CRG usa un puerto Gigabit por cada router de piso, y cada enlace es una subred /30 (Tabla 5). La línea </w:t>
       </w:r>
       <w:r>
         <w:rPr>
@@ -7656,7 +9067,7 @@
         <w:ind w:firstLine="720"/>
       </w:pPr>
       <w:r>
-        <w:t xml:space="preserve">Los tres routers de piso llevan lo mismo, cambiando los números según la Tabla 7. Este es el ejemplo de R-P1. Las interfaces G0/1 y G0/2 son los gateways de sus dos áreas. La línea </w:t>
+        <w:t xml:space="preserve">Los tres routers de piso llevan lo mismo, cambiando los números según la Tabla 8. Este es el ejemplo de R-P1. Las interfaces G0/1 y G0/2 son los gateways de sus dos áreas. La línea </w:t>
       </w:r>
       <w:r>
         <w:rPr>
@@ -7909,7 +9320,7 @@
           <w:b/>
           <w:bCs/>
         </w:rPr>
-        <w:t xml:space="preserve">Tabla 7</w:t>
+        <w:t xml:space="preserve">Tabla 8</w:t>
       </w:r>
     </w:p>
     <w:p>
@@ -8556,7 +9967,7 @@
         <w:t xml:space="preserve">Nota.</w:t>
       </w:r>
       <w:r>
-        <w:t xml:space="preserve"> Los enlaces con R-CRG llevan máscara 255.255.255.252; las demás máscaras son las de la Tabla 3.</w:t>
+        <w:t xml:space="preserve"> Los enlaces con R-CRG llevan máscara 255.255.255.252; las demás máscaras son las de la Tabla 4.</w:t>
       </w:r>
     </w:p>
     <w:p>
@@ -9037,7 +10448,7 @@
           <w:b/>
           <w:bCs/>
         </w:rPr>
-        <w:t xml:space="preserve">Tabla 8</w:t>
+        <w:t xml:space="preserve">Tabla 9</w:t>
       </w:r>
     </w:p>
     <w:p>
@@ -10251,7 +11662,7 @@
         <w:ind w:firstLine="720"/>
       </w:pPr>
       <w:r>
-        <w:t xml:space="preserve">Las pruebas se hacen desde Desktop &gt; Command Prompt de cada PC y desde la CLI de R-CRG. Nota importante: en el primer ping a un destino nuevo es normal que se pierda el primer paquete; es el tiempo que tarda el equipo en averiguar la dirección física (ARP). No es una falla. La Tabla 9 enumera las pruebas; la columna «Observado» se completa al ejecutarlas en el simulador.</w:t>
+        <w:t xml:space="preserve">Las pruebas se hacen desde Desktop &gt; Command Prompt de cada PC y desde la CLI de R-CRG. Nota importante: en el primer ping a un destino nuevo es normal que se pierda el primer paquete; es el tiempo que tarda el equipo en averiguar la dirección física (ARP). No es una falla. La Tabla 10 enumera las pruebas; la columna «Observado» se completa al ejecutarlas en el simulador.</w:t>
       </w:r>
     </w:p>
     <w:p>
@@ -10263,7 +11674,7 @@
           <w:b/>
           <w:bCs/>
         </w:rPr>
-        <w:t xml:space="preserve">Tabla 9</w:t>
+        <w:t xml:space="preserve">Tabla 10</w:t>
       </w:r>
     </w:p>
     <w:p>
@@ -11541,7 +12952,7 @@
           <w:b/>
           <w:bCs/>
         </w:rPr>
-        <w:t xml:space="preserve">Tabla 10</w:t>
+        <w:t xml:space="preserve">Tabla 11</w:t>
       </w:r>
     </w:p>
     <w:p>
@@ -12232,7 +13643,7 @@
         <w:ind w:firstLine="720"/>
       </w:pPr>
       <w:r>
-        <w:t xml:space="preserve">La maqueta de Packet Tracer usa dos computadoras por área, pero la red real debe atender a 300 equipos. La Tabla 11 estima los equipos necesarios para una instalación física. Se consideraron switches de acceso de 48 puertos, un punto de red por computadora y una reserva del 15 % de puertos para impresoras y crecimiento. Con esa reserva, Ventas (75), Operaciones (70) y Capacitación (50) necesitan dos switches cada una; Administración (40), Finanzas (40) y Soporte TI (25, más el servidor), uno cada una.</w:t>
+        <w:t xml:space="preserve">La maqueta de Packet Tracer usa dos computadoras por área, pero la red real debe atender a 300 equipos. La Tabla 12 estima los equipos necesarios para una instalación física. Se consideraron switches de acceso de 48 puertos, un punto de red por computadora y una reserva del 15 % de puertos para impresoras y crecimiento. Con esa reserva, Ventas (75), Operaciones (70) y Capacitación (50) necesitan dos switches cada una; Administración (40), Finanzas (40) y Soporte TI (25, más el servidor), uno cada una.</w:t>
       </w:r>
     </w:p>
     <w:p>
@@ -12244,7 +13655,7 @@
           <w:b/>
           <w:bCs/>
         </w:rPr>
-        <w:t xml:space="preserve">Tabla 11</w:t>
+        <w:t xml:space="preserve">Tabla 12</w:t>
       </w:r>
     </w:p>
     <w:p>
@@ -13233,7 +14644,7 @@
         <w:ind w:firstLine="720"/>
       </w:pPr>
       <w:r>
-        <w:t xml:space="preserve">En relación con los objetivos, el análisis del contexto definió los requisitos de la red; el plan VLSM de la Tabla 3 cubre la demanda de 300 equipos y deja libres 20 direcciones al final del bloque; y la Tabla 11 estima los equipos para una instalación real. El modelo de un router central y routers de piso limita el tamaño de cada dominio de difusión, el DHCP evita las direcciones duplicadas y las rutas estáticas mantienen el enrutamiento simple, porque todos los routers de piso dependen del router central. Como limitación, el simulador usa dos PC por área en lugar de 300 equipos y no mide rendimiento real; para una instalación real haría falta un estudio del sitio, cotizaciones formales y pruebas de carga.</w:t>
+        <w:t xml:space="preserve">En relación con los objetivos, el análisis del contexto definió los requisitos de la red; el plan VLSM de la Tabla 4 cubre la demanda de 300 equipos y deja libres 20 direcciones al final del bloque; y la Tabla 12 estima los equipos para una instalación real. El modelo de un router central y routers de piso limita el tamaño de cada dominio de difusión, el DHCP evita las direcciones duplicadas y las rutas estáticas mantienen el enrutamiento simple, porque todos los routers de piso dependen del router central. Como limitación, el simulador usa dos PC por área en lugar de 300 equipos y no mide rendimiento real; para una instalación real haría falta un estudio del sitio, cotizaciones formales y pruebas de carga.</w:t>
       </w:r>
     </w:p>
     <w:p>
@@ -13385,7 +14796,7 @@
         <w:t xml:space="preserve">Planificar la instalación física.</w:t>
       </w:r>
       <w:r>
-        <w:t xml:space="preserve"> Antes de comprar los equipos de la Tabla 11 se recomienda un estudio del sitio, medir los recorridos de cableado (máximo 100 m por segmento UTP) y realizar pruebas de carga.</w:t>
+        <w:t xml:space="preserve"> Antes de comprar los equipos de la Tabla 12 se recomienda un estudio del sitio, medir los recorridos de cableado (máximo 100 m por segmento UTP) y realizar pruebas de carga.</w:t>
       </w:r>
     </w:p>
     <w:p>

</xml_diff>

<commit_message>
Quitar la columna de direcciones necesarias de la tabla de equipos por área
Co-Authored-By: Claude Sonnet 5.5 <noreply@anthropic.com>
</commit_message>
<xml_diff>
--- a/ProyectoFinal-Redes-ACT6-APA7.docx
+++ b/ProyectoFinal-Redes-ACT6-APA7.docx
@@ -2751,11 +2751,10 @@
         <w:tblW w:type="dxa" w:w="9360"/>
       </w:tblPr>
       <w:tblGrid>
-        <w:gridCol w:w="3000"/>
+        <w:gridCol w:w="3300"/>
+        <w:gridCol w:w="2300"/>
         <w:gridCol w:w="1700"/>
-        <w:gridCol w:w="2100"/>
-        <w:gridCol w:w="1000"/>
-        <w:gridCol w:w="1560"/>
+        <w:gridCol w:w="2060"/>
       </w:tblGrid>
       <w:tr>
         <w:trPr>
@@ -2763,7 +2762,7 @@
         </w:trPr>
         <w:tc>
           <w:tcPr>
-            <w:tcW w:type="dxa" w:w="3000"/>
+            <w:tcW w:type="dxa" w:w="3300"/>
             <w:tcBorders>
               <w:top w:val="single" w:color="000000" w:sz="6"/>
               <w:left w:val="none" w:color="FFFFFF" w:sz="0"/>
@@ -2794,7 +2793,7 @@
         </w:tc>
         <w:tc>
           <w:tcPr>
-            <w:tcW w:type="dxa" w:w="1700"/>
+            <w:tcW w:type="dxa" w:w="2300"/>
             <w:tcBorders>
               <w:top w:val="single" w:color="000000" w:sz="6"/>
               <w:left w:val="none" w:color="FFFFFF" w:sz="0"/>
@@ -2825,7 +2824,7 @@
         </w:tc>
         <w:tc>
           <w:tcPr>
-            <w:tcW w:type="dxa" w:w="2100"/>
+            <w:tcW w:type="dxa" w:w="1700"/>
             <w:tcBorders>
               <w:top w:val="single" w:color="000000" w:sz="6"/>
               <w:left w:val="none" w:color="FFFFFF" w:sz="0"/>
@@ -2850,44 +2849,13 @@
                 <w:sz w:val="21"/>
                 <w:szCs w:val="21"/>
               </w:rPr>
-              <w:t xml:space="preserve">Direcciones necesarias</w:t>
-            </w:r>
-          </w:p>
-        </w:tc>
-        <w:tc>
-          <w:tcPr>
-            <w:tcW w:type="dxa" w:w="1000"/>
-            <w:tcBorders>
-              <w:top w:val="single" w:color="000000" w:sz="6"/>
-              <w:left w:val="none" w:color="FFFFFF" w:sz="0"/>
-              <w:bottom w:val="single" w:color="000000" w:sz="6"/>
-              <w:right w:val="none" w:color="FFFFFF" w:sz="0"/>
-            </w:tcBorders>
-            <w:tcMar>
-              <w:top w:type="dxa" w:w="40"/>
-              <w:left w:type="dxa" w:w="80"/>
-              <w:bottom w:type="dxa" w:w="40"/>
-              <w:right w:type="dxa" w:w="80"/>
-            </w:tcMar>
-          </w:tcPr>
-          <w:p>
-            <w:pPr>
-              <w:spacing w:line="240"/>
-            </w:pPr>
-            <w:r>
-              <w:rPr>
-                <w:b/>
-                <w:bCs/>
-                <w:sz w:val="21"/>
-                <w:szCs w:val="21"/>
-              </w:rPr>
               <w:t xml:space="preserve">Prefijo</w:t>
             </w:r>
           </w:p>
         </w:tc>
         <w:tc>
           <w:tcPr>
-            <w:tcW w:type="dxa" w:w="1560"/>
+            <w:tcW w:type="dxa" w:w="2060"/>
             <w:tcBorders>
               <w:top w:val="single" w:color="000000" w:sz="6"/>
               <w:left w:val="none" w:color="FFFFFF" w:sz="0"/>
@@ -2923,7 +2891,7 @@
         </w:trPr>
         <w:tc>
           <w:tcPr>
-            <w:tcW w:type="dxa" w:w="3000"/>
+            <w:tcW w:type="dxa" w:w="3300"/>
             <w:tcBorders>
               <w:top w:val="none" w:color="FFFFFF" w:sz="0"/>
               <w:left w:val="none" w:color="FFFFFF" w:sz="0"/>
@@ -2952,6 +2920,35 @@
         </w:tc>
         <w:tc>
           <w:tcPr>
+            <w:tcW w:type="dxa" w:w="2300"/>
+            <w:tcBorders>
+              <w:top w:val="none" w:color="FFFFFF" w:sz="0"/>
+              <w:left w:val="none" w:color="FFFFFF" w:sz="0"/>
+              <w:bottom w:val="none" w:color="FFFFFF" w:sz="0"/>
+              <w:right w:val="none" w:color="FFFFFF" w:sz="0"/>
+            </w:tcBorders>
+            <w:tcMar>
+              <w:top w:type="dxa" w:w="40"/>
+              <w:left w:type="dxa" w:w="80"/>
+              <w:bottom w:type="dxa" w:w="40"/>
+              <w:right w:type="dxa" w:w="80"/>
+            </w:tcMar>
+          </w:tcPr>
+          <w:p>
+            <w:pPr>
+              <w:spacing w:line="240"/>
+            </w:pPr>
+            <w:r>
+              <w:rPr>
+                <w:sz w:val="21"/>
+                <w:szCs w:val="21"/>
+              </w:rPr>
+              <w:t xml:space="preserve">75 PC</w:t>
+            </w:r>
+          </w:p>
+        </w:tc>
+        <w:tc>
+          <w:tcPr>
             <w:tcW w:type="dxa" w:w="1700"/>
             <w:tcBorders>
               <w:top w:val="none" w:color="FFFFFF" w:sz="0"/>
@@ -2975,71 +2972,13 @@
                 <w:sz w:val="21"/>
                 <w:szCs w:val="21"/>
               </w:rPr>
-              <w:t xml:space="preserve">75 PC</w:t>
-            </w:r>
-          </w:p>
-        </w:tc>
-        <w:tc>
-          <w:tcPr>
-            <w:tcW w:type="dxa" w:w="2100"/>
-            <w:tcBorders>
-              <w:top w:val="none" w:color="FFFFFF" w:sz="0"/>
-              <w:left w:val="none" w:color="FFFFFF" w:sz="0"/>
-              <w:bottom w:val="none" w:color="FFFFFF" w:sz="0"/>
-              <w:right w:val="none" w:color="FFFFFF" w:sz="0"/>
-            </w:tcBorders>
-            <w:tcMar>
-              <w:top w:type="dxa" w:w="40"/>
-              <w:left w:type="dxa" w:w="80"/>
-              <w:bottom w:type="dxa" w:w="40"/>
-              <w:right w:type="dxa" w:w="80"/>
-            </w:tcMar>
-          </w:tcPr>
-          <w:p>
-            <w:pPr>
-              <w:spacing w:line="240"/>
-            </w:pPr>
-            <w:r>
-              <w:rPr>
-                <w:sz w:val="21"/>
-                <w:szCs w:val="21"/>
-              </w:rPr>
-              <w:t xml:space="preserve">76</w:t>
-            </w:r>
-          </w:p>
-        </w:tc>
-        <w:tc>
-          <w:tcPr>
-            <w:tcW w:type="dxa" w:w="1000"/>
-            <w:tcBorders>
-              <w:top w:val="none" w:color="FFFFFF" w:sz="0"/>
-              <w:left w:val="none" w:color="FFFFFF" w:sz="0"/>
-              <w:bottom w:val="none" w:color="FFFFFF" w:sz="0"/>
-              <w:right w:val="none" w:color="FFFFFF" w:sz="0"/>
-            </w:tcBorders>
-            <w:tcMar>
-              <w:top w:type="dxa" w:w="40"/>
-              <w:left w:type="dxa" w:w="80"/>
-              <w:bottom w:type="dxa" w:w="40"/>
-              <w:right w:type="dxa" w:w="80"/>
-            </w:tcMar>
-          </w:tcPr>
-          <w:p>
-            <w:pPr>
-              <w:spacing w:line="240"/>
-            </w:pPr>
-            <w:r>
-              <w:rPr>
-                <w:sz w:val="21"/>
-                <w:szCs w:val="21"/>
-              </w:rPr>
               <w:t xml:space="preserve">/25</w:t>
             </w:r>
           </w:p>
         </w:tc>
         <w:tc>
           <w:tcPr>
-            <w:tcW w:type="dxa" w:w="1560"/>
+            <w:tcW w:type="dxa" w:w="2060"/>
             <w:tcBorders>
               <w:top w:val="none" w:color="FFFFFF" w:sz="0"/>
               <w:left w:val="none" w:color="FFFFFF" w:sz="0"/>
@@ -3073,7 +3012,7 @@
         </w:trPr>
         <w:tc>
           <w:tcPr>
-            <w:tcW w:type="dxa" w:w="3000"/>
+            <w:tcW w:type="dxa" w:w="3300"/>
             <w:tcBorders>
               <w:top w:val="none" w:color="FFFFFF" w:sz="0"/>
               <w:left w:val="none" w:color="FFFFFF" w:sz="0"/>
@@ -3102,6 +3041,35 @@
         </w:tc>
         <w:tc>
           <w:tcPr>
+            <w:tcW w:type="dxa" w:w="2300"/>
+            <w:tcBorders>
+              <w:top w:val="none" w:color="FFFFFF" w:sz="0"/>
+              <w:left w:val="none" w:color="FFFFFF" w:sz="0"/>
+              <w:bottom w:val="none" w:color="FFFFFF" w:sz="0"/>
+              <w:right w:val="none" w:color="FFFFFF" w:sz="0"/>
+            </w:tcBorders>
+            <w:tcMar>
+              <w:top w:type="dxa" w:w="40"/>
+              <w:left w:type="dxa" w:w="80"/>
+              <w:bottom w:type="dxa" w:w="40"/>
+              <w:right w:type="dxa" w:w="80"/>
+            </w:tcMar>
+          </w:tcPr>
+          <w:p>
+            <w:pPr>
+              <w:spacing w:line="240"/>
+            </w:pPr>
+            <w:r>
+              <w:rPr>
+                <w:sz w:val="21"/>
+                <w:szCs w:val="21"/>
+              </w:rPr>
+              <w:t xml:space="preserve">70 PC</w:t>
+            </w:r>
+          </w:p>
+        </w:tc>
+        <w:tc>
+          <w:tcPr>
             <w:tcW w:type="dxa" w:w="1700"/>
             <w:tcBorders>
               <w:top w:val="none" w:color="FFFFFF" w:sz="0"/>
@@ -3125,71 +3093,13 @@
                 <w:sz w:val="21"/>
                 <w:szCs w:val="21"/>
               </w:rPr>
-              <w:t xml:space="preserve">70 PC</w:t>
-            </w:r>
-          </w:p>
-        </w:tc>
-        <w:tc>
-          <w:tcPr>
-            <w:tcW w:type="dxa" w:w="2100"/>
-            <w:tcBorders>
-              <w:top w:val="none" w:color="FFFFFF" w:sz="0"/>
-              <w:left w:val="none" w:color="FFFFFF" w:sz="0"/>
-              <w:bottom w:val="none" w:color="FFFFFF" w:sz="0"/>
-              <w:right w:val="none" w:color="FFFFFF" w:sz="0"/>
-            </w:tcBorders>
-            <w:tcMar>
-              <w:top w:type="dxa" w:w="40"/>
-              <w:left w:type="dxa" w:w="80"/>
-              <w:bottom w:type="dxa" w:w="40"/>
-              <w:right w:type="dxa" w:w="80"/>
-            </w:tcMar>
-          </w:tcPr>
-          <w:p>
-            <w:pPr>
-              <w:spacing w:line="240"/>
-            </w:pPr>
-            <w:r>
-              <w:rPr>
-                <w:sz w:val="21"/>
-                <w:szCs w:val="21"/>
-              </w:rPr>
-              <w:t xml:space="preserve">71</w:t>
-            </w:r>
-          </w:p>
-        </w:tc>
-        <w:tc>
-          <w:tcPr>
-            <w:tcW w:type="dxa" w:w="1000"/>
-            <w:tcBorders>
-              <w:top w:val="none" w:color="FFFFFF" w:sz="0"/>
-              <w:left w:val="none" w:color="FFFFFF" w:sz="0"/>
-              <w:bottom w:val="none" w:color="FFFFFF" w:sz="0"/>
-              <w:right w:val="none" w:color="FFFFFF" w:sz="0"/>
-            </w:tcBorders>
-            <w:tcMar>
-              <w:top w:type="dxa" w:w="40"/>
-              <w:left w:type="dxa" w:w="80"/>
-              <w:bottom w:type="dxa" w:w="40"/>
-              <w:right w:type="dxa" w:w="80"/>
-            </w:tcMar>
-          </w:tcPr>
-          <w:p>
-            <w:pPr>
-              <w:spacing w:line="240"/>
-            </w:pPr>
-            <w:r>
-              <w:rPr>
-                <w:sz w:val="21"/>
-                <w:szCs w:val="21"/>
-              </w:rPr>
               <w:t xml:space="preserve">/25</w:t>
             </w:r>
           </w:p>
         </w:tc>
         <w:tc>
           <w:tcPr>
-            <w:tcW w:type="dxa" w:w="1560"/>
+            <w:tcW w:type="dxa" w:w="2060"/>
             <w:tcBorders>
               <w:top w:val="none" w:color="FFFFFF" w:sz="0"/>
               <w:left w:val="none" w:color="FFFFFF" w:sz="0"/>
@@ -3223,7 +3133,7 @@
         </w:trPr>
         <w:tc>
           <w:tcPr>
-            <w:tcW w:type="dxa" w:w="3000"/>
+            <w:tcW w:type="dxa" w:w="3300"/>
             <w:tcBorders>
               <w:top w:val="none" w:color="FFFFFF" w:sz="0"/>
               <w:left w:val="none" w:color="FFFFFF" w:sz="0"/>
@@ -3252,6 +3162,35 @@
         </w:tc>
         <w:tc>
           <w:tcPr>
+            <w:tcW w:type="dxa" w:w="2300"/>
+            <w:tcBorders>
+              <w:top w:val="none" w:color="FFFFFF" w:sz="0"/>
+              <w:left w:val="none" w:color="FFFFFF" w:sz="0"/>
+              <w:bottom w:val="none" w:color="FFFFFF" w:sz="0"/>
+              <w:right w:val="none" w:color="FFFFFF" w:sz="0"/>
+            </w:tcBorders>
+            <w:tcMar>
+              <w:top w:type="dxa" w:w="40"/>
+              <w:left w:type="dxa" w:w="80"/>
+              <w:bottom w:type="dxa" w:w="40"/>
+              <w:right w:type="dxa" w:w="80"/>
+            </w:tcMar>
+          </w:tcPr>
+          <w:p>
+            <w:pPr>
+              <w:spacing w:line="240"/>
+            </w:pPr>
+            <w:r>
+              <w:rPr>
+                <w:sz w:val="21"/>
+                <w:szCs w:val="21"/>
+              </w:rPr>
+              <w:t xml:space="preserve">50 PC</w:t>
+            </w:r>
+          </w:p>
+        </w:tc>
+        <w:tc>
+          <w:tcPr>
             <w:tcW w:type="dxa" w:w="1700"/>
             <w:tcBorders>
               <w:top w:val="none" w:color="FFFFFF" w:sz="0"/>
@@ -3275,71 +3214,13 @@
                 <w:sz w:val="21"/>
                 <w:szCs w:val="21"/>
               </w:rPr>
-              <w:t xml:space="preserve">50 PC</w:t>
-            </w:r>
-          </w:p>
-        </w:tc>
-        <w:tc>
-          <w:tcPr>
-            <w:tcW w:type="dxa" w:w="2100"/>
-            <w:tcBorders>
-              <w:top w:val="none" w:color="FFFFFF" w:sz="0"/>
-              <w:left w:val="none" w:color="FFFFFF" w:sz="0"/>
-              <w:bottom w:val="none" w:color="FFFFFF" w:sz="0"/>
-              <w:right w:val="none" w:color="FFFFFF" w:sz="0"/>
-            </w:tcBorders>
-            <w:tcMar>
-              <w:top w:type="dxa" w:w="40"/>
-              <w:left w:type="dxa" w:w="80"/>
-              <w:bottom w:type="dxa" w:w="40"/>
-              <w:right w:type="dxa" w:w="80"/>
-            </w:tcMar>
-          </w:tcPr>
-          <w:p>
-            <w:pPr>
-              <w:spacing w:line="240"/>
-            </w:pPr>
-            <w:r>
-              <w:rPr>
-                <w:sz w:val="21"/>
-                <w:szCs w:val="21"/>
-              </w:rPr>
-              <w:t xml:space="preserve">51</w:t>
-            </w:r>
-          </w:p>
-        </w:tc>
-        <w:tc>
-          <w:tcPr>
-            <w:tcW w:type="dxa" w:w="1000"/>
-            <w:tcBorders>
-              <w:top w:val="none" w:color="FFFFFF" w:sz="0"/>
-              <w:left w:val="none" w:color="FFFFFF" w:sz="0"/>
-              <w:bottom w:val="none" w:color="FFFFFF" w:sz="0"/>
-              <w:right w:val="none" w:color="FFFFFF" w:sz="0"/>
-            </w:tcBorders>
-            <w:tcMar>
-              <w:top w:type="dxa" w:w="40"/>
-              <w:left w:type="dxa" w:w="80"/>
-              <w:bottom w:type="dxa" w:w="40"/>
-              <w:right w:type="dxa" w:w="80"/>
-            </w:tcMar>
-          </w:tcPr>
-          <w:p>
-            <w:pPr>
-              <w:spacing w:line="240"/>
-            </w:pPr>
-            <w:r>
-              <w:rPr>
-                <w:sz w:val="21"/>
-                <w:szCs w:val="21"/>
-              </w:rPr>
               <w:t xml:space="preserve">/26</w:t>
             </w:r>
           </w:p>
         </w:tc>
         <w:tc>
           <w:tcPr>
-            <w:tcW w:type="dxa" w:w="1560"/>
+            <w:tcW w:type="dxa" w:w="2060"/>
             <w:tcBorders>
               <w:top w:val="none" w:color="FFFFFF" w:sz="0"/>
               <w:left w:val="none" w:color="FFFFFF" w:sz="0"/>
@@ -3373,7 +3254,7 @@
         </w:trPr>
         <w:tc>
           <w:tcPr>
-            <w:tcW w:type="dxa" w:w="3000"/>
+            <w:tcW w:type="dxa" w:w="3300"/>
             <w:tcBorders>
               <w:top w:val="none" w:color="FFFFFF" w:sz="0"/>
               <w:left w:val="none" w:color="FFFFFF" w:sz="0"/>
@@ -3402,6 +3283,35 @@
         </w:tc>
         <w:tc>
           <w:tcPr>
+            <w:tcW w:type="dxa" w:w="2300"/>
+            <w:tcBorders>
+              <w:top w:val="none" w:color="FFFFFF" w:sz="0"/>
+              <w:left w:val="none" w:color="FFFFFF" w:sz="0"/>
+              <w:bottom w:val="none" w:color="FFFFFF" w:sz="0"/>
+              <w:right w:val="none" w:color="FFFFFF" w:sz="0"/>
+            </w:tcBorders>
+            <w:tcMar>
+              <w:top w:type="dxa" w:w="40"/>
+              <w:left w:type="dxa" w:w="80"/>
+              <w:bottom w:type="dxa" w:w="40"/>
+              <w:right w:type="dxa" w:w="80"/>
+            </w:tcMar>
+          </w:tcPr>
+          <w:p>
+            <w:pPr>
+              <w:spacing w:line="240"/>
+            </w:pPr>
+            <w:r>
+              <w:rPr>
+                <w:sz w:val="21"/>
+                <w:szCs w:val="21"/>
+              </w:rPr>
+              <w:t xml:space="preserve">40 PC</w:t>
+            </w:r>
+          </w:p>
+        </w:tc>
+        <w:tc>
+          <w:tcPr>
             <w:tcW w:type="dxa" w:w="1700"/>
             <w:tcBorders>
               <w:top w:val="none" w:color="FFFFFF" w:sz="0"/>
@@ -3425,71 +3335,13 @@
                 <w:sz w:val="21"/>
                 <w:szCs w:val="21"/>
               </w:rPr>
-              <w:t xml:space="preserve">40 PC</w:t>
-            </w:r>
-          </w:p>
-        </w:tc>
-        <w:tc>
-          <w:tcPr>
-            <w:tcW w:type="dxa" w:w="2100"/>
-            <w:tcBorders>
-              <w:top w:val="none" w:color="FFFFFF" w:sz="0"/>
-              <w:left w:val="none" w:color="FFFFFF" w:sz="0"/>
-              <w:bottom w:val="none" w:color="FFFFFF" w:sz="0"/>
-              <w:right w:val="none" w:color="FFFFFF" w:sz="0"/>
-            </w:tcBorders>
-            <w:tcMar>
-              <w:top w:type="dxa" w:w="40"/>
-              <w:left w:type="dxa" w:w="80"/>
-              <w:bottom w:type="dxa" w:w="40"/>
-              <w:right w:type="dxa" w:w="80"/>
-            </w:tcMar>
-          </w:tcPr>
-          <w:p>
-            <w:pPr>
-              <w:spacing w:line="240"/>
-            </w:pPr>
-            <w:r>
-              <w:rPr>
-                <w:sz w:val="21"/>
-                <w:szCs w:val="21"/>
-              </w:rPr>
-              <w:t xml:space="preserve">41</w:t>
-            </w:r>
-          </w:p>
-        </w:tc>
-        <w:tc>
-          <w:tcPr>
-            <w:tcW w:type="dxa" w:w="1000"/>
-            <w:tcBorders>
-              <w:top w:val="none" w:color="FFFFFF" w:sz="0"/>
-              <w:left w:val="none" w:color="FFFFFF" w:sz="0"/>
-              <w:bottom w:val="none" w:color="FFFFFF" w:sz="0"/>
-              <w:right w:val="none" w:color="FFFFFF" w:sz="0"/>
-            </w:tcBorders>
-            <w:tcMar>
-              <w:top w:type="dxa" w:w="40"/>
-              <w:left w:type="dxa" w:w="80"/>
-              <w:bottom w:type="dxa" w:w="40"/>
-              <w:right w:type="dxa" w:w="80"/>
-            </w:tcMar>
-          </w:tcPr>
-          <w:p>
-            <w:pPr>
-              <w:spacing w:line="240"/>
-            </w:pPr>
-            <w:r>
-              <w:rPr>
-                <w:sz w:val="21"/>
-                <w:szCs w:val="21"/>
-              </w:rPr>
               <w:t xml:space="preserve">/26</w:t>
             </w:r>
           </w:p>
         </w:tc>
         <w:tc>
           <w:tcPr>
-            <w:tcW w:type="dxa" w:w="1560"/>
+            <w:tcW w:type="dxa" w:w="2060"/>
             <w:tcBorders>
               <w:top w:val="none" w:color="FFFFFF" w:sz="0"/>
               <w:left w:val="none" w:color="FFFFFF" w:sz="0"/>
@@ -3523,7 +3375,7 @@
         </w:trPr>
         <w:tc>
           <w:tcPr>
-            <w:tcW w:type="dxa" w:w="3000"/>
+            <w:tcW w:type="dxa" w:w="3300"/>
             <w:tcBorders>
               <w:top w:val="none" w:color="FFFFFF" w:sz="0"/>
               <w:left w:val="none" w:color="FFFFFF" w:sz="0"/>
@@ -3552,6 +3404,35 @@
         </w:tc>
         <w:tc>
           <w:tcPr>
+            <w:tcW w:type="dxa" w:w="2300"/>
+            <w:tcBorders>
+              <w:top w:val="none" w:color="FFFFFF" w:sz="0"/>
+              <w:left w:val="none" w:color="FFFFFF" w:sz="0"/>
+              <w:bottom w:val="none" w:color="FFFFFF" w:sz="0"/>
+              <w:right w:val="none" w:color="FFFFFF" w:sz="0"/>
+            </w:tcBorders>
+            <w:tcMar>
+              <w:top w:type="dxa" w:w="40"/>
+              <w:left w:type="dxa" w:w="80"/>
+              <w:bottom w:type="dxa" w:w="40"/>
+              <w:right w:type="dxa" w:w="80"/>
+            </w:tcMar>
+          </w:tcPr>
+          <w:p>
+            <w:pPr>
+              <w:spacing w:line="240"/>
+            </w:pPr>
+            <w:r>
+              <w:rPr>
+                <w:sz w:val="21"/>
+                <w:szCs w:val="21"/>
+              </w:rPr>
+              <w:t xml:space="preserve">40 PC</w:t>
+            </w:r>
+          </w:p>
+        </w:tc>
+        <w:tc>
+          <w:tcPr>
             <w:tcW w:type="dxa" w:w="1700"/>
             <w:tcBorders>
               <w:top w:val="none" w:color="FFFFFF" w:sz="0"/>
@@ -3575,71 +3456,13 @@
                 <w:sz w:val="21"/>
                 <w:szCs w:val="21"/>
               </w:rPr>
-              <w:t xml:space="preserve">40 PC</w:t>
-            </w:r>
-          </w:p>
-        </w:tc>
-        <w:tc>
-          <w:tcPr>
-            <w:tcW w:type="dxa" w:w="2100"/>
-            <w:tcBorders>
-              <w:top w:val="none" w:color="FFFFFF" w:sz="0"/>
-              <w:left w:val="none" w:color="FFFFFF" w:sz="0"/>
-              <w:bottom w:val="none" w:color="FFFFFF" w:sz="0"/>
-              <w:right w:val="none" w:color="FFFFFF" w:sz="0"/>
-            </w:tcBorders>
-            <w:tcMar>
-              <w:top w:type="dxa" w:w="40"/>
-              <w:left w:type="dxa" w:w="80"/>
-              <w:bottom w:type="dxa" w:w="40"/>
-              <w:right w:type="dxa" w:w="80"/>
-            </w:tcMar>
-          </w:tcPr>
-          <w:p>
-            <w:pPr>
-              <w:spacing w:line="240"/>
-            </w:pPr>
-            <w:r>
-              <w:rPr>
-                <w:sz w:val="21"/>
-                <w:szCs w:val="21"/>
-              </w:rPr>
-              <w:t xml:space="preserve">41</w:t>
-            </w:r>
-          </w:p>
-        </w:tc>
-        <w:tc>
-          <w:tcPr>
-            <w:tcW w:type="dxa" w:w="1000"/>
-            <w:tcBorders>
-              <w:top w:val="none" w:color="FFFFFF" w:sz="0"/>
-              <w:left w:val="none" w:color="FFFFFF" w:sz="0"/>
-              <w:bottom w:val="none" w:color="FFFFFF" w:sz="0"/>
-              <w:right w:val="none" w:color="FFFFFF" w:sz="0"/>
-            </w:tcBorders>
-            <w:tcMar>
-              <w:top w:type="dxa" w:w="40"/>
-              <w:left w:type="dxa" w:w="80"/>
-              <w:bottom w:type="dxa" w:w="40"/>
-              <w:right w:type="dxa" w:w="80"/>
-            </w:tcMar>
-          </w:tcPr>
-          <w:p>
-            <w:pPr>
-              <w:spacing w:line="240"/>
-            </w:pPr>
-            <w:r>
-              <w:rPr>
-                <w:sz w:val="21"/>
-                <w:szCs w:val="21"/>
-              </w:rPr>
               <w:t xml:space="preserve">/26</w:t>
             </w:r>
           </w:p>
         </w:tc>
         <w:tc>
           <w:tcPr>
-            <w:tcW w:type="dxa" w:w="1560"/>
+            <w:tcW w:type="dxa" w:w="2060"/>
             <w:tcBorders>
               <w:top w:val="none" w:color="FFFFFF" w:sz="0"/>
               <w:left w:val="none" w:color="FFFFFF" w:sz="0"/>
@@ -3673,7 +3496,7 @@
         </w:trPr>
         <w:tc>
           <w:tcPr>
-            <w:tcW w:type="dxa" w:w="3000"/>
+            <w:tcW w:type="dxa" w:w="3300"/>
             <w:tcBorders>
               <w:top w:val="none" w:color="FFFFFF" w:sz="0"/>
               <w:left w:val="none" w:color="FFFFFF" w:sz="0"/>
@@ -3702,6 +3525,35 @@
         </w:tc>
         <w:tc>
           <w:tcPr>
+            <w:tcW w:type="dxa" w:w="2300"/>
+            <w:tcBorders>
+              <w:top w:val="none" w:color="FFFFFF" w:sz="0"/>
+              <w:left w:val="none" w:color="FFFFFF" w:sz="0"/>
+              <w:bottom w:val="none" w:color="FFFFFF" w:sz="0"/>
+              <w:right w:val="none" w:color="FFFFFF" w:sz="0"/>
+            </w:tcBorders>
+            <w:tcMar>
+              <w:top w:type="dxa" w:w="40"/>
+              <w:left w:type="dxa" w:w="80"/>
+              <w:bottom w:type="dxa" w:w="40"/>
+              <w:right w:type="dxa" w:w="80"/>
+            </w:tcMar>
+          </w:tcPr>
+          <w:p>
+            <w:pPr>
+              <w:spacing w:line="240"/>
+            </w:pPr>
+            <w:r>
+              <w:rPr>
+                <w:sz w:val="21"/>
+                <w:szCs w:val="21"/>
+              </w:rPr>
+              <w:t xml:space="preserve">25 PC y 1 servidor</w:t>
+            </w:r>
+          </w:p>
+        </w:tc>
+        <w:tc>
+          <w:tcPr>
             <w:tcW w:type="dxa" w:w="1700"/>
             <w:tcBorders>
               <w:top w:val="none" w:color="FFFFFF" w:sz="0"/>
@@ -3725,71 +3577,13 @@
                 <w:sz w:val="21"/>
                 <w:szCs w:val="21"/>
               </w:rPr>
-              <w:t xml:space="preserve">25 PC y 1 servidor</w:t>
-            </w:r>
-          </w:p>
-        </w:tc>
-        <w:tc>
-          <w:tcPr>
-            <w:tcW w:type="dxa" w:w="2100"/>
-            <w:tcBorders>
-              <w:top w:val="none" w:color="FFFFFF" w:sz="0"/>
-              <w:left w:val="none" w:color="FFFFFF" w:sz="0"/>
-              <w:bottom w:val="none" w:color="FFFFFF" w:sz="0"/>
-              <w:right w:val="none" w:color="FFFFFF" w:sz="0"/>
-            </w:tcBorders>
-            <w:tcMar>
-              <w:top w:type="dxa" w:w="40"/>
-              <w:left w:type="dxa" w:w="80"/>
-              <w:bottom w:type="dxa" w:w="40"/>
-              <w:right w:type="dxa" w:w="80"/>
-            </w:tcMar>
-          </w:tcPr>
-          <w:p>
-            <w:pPr>
-              <w:spacing w:line="240"/>
-            </w:pPr>
-            <w:r>
-              <w:rPr>
-                <w:sz w:val="21"/>
-                <w:szCs w:val="21"/>
-              </w:rPr>
-              <w:t xml:space="preserve">27</w:t>
-            </w:r>
-          </w:p>
-        </w:tc>
-        <w:tc>
-          <w:tcPr>
-            <w:tcW w:type="dxa" w:w="1000"/>
-            <w:tcBorders>
-              <w:top w:val="none" w:color="FFFFFF" w:sz="0"/>
-              <w:left w:val="none" w:color="FFFFFF" w:sz="0"/>
-              <w:bottom w:val="none" w:color="FFFFFF" w:sz="0"/>
-              <w:right w:val="none" w:color="FFFFFF" w:sz="0"/>
-            </w:tcBorders>
-            <w:tcMar>
-              <w:top w:type="dxa" w:w="40"/>
-              <w:left w:type="dxa" w:w="80"/>
-              <w:bottom w:type="dxa" w:w="40"/>
-              <w:right w:type="dxa" w:w="80"/>
-            </w:tcMar>
-          </w:tcPr>
-          <w:p>
-            <w:pPr>
-              <w:spacing w:line="240"/>
-            </w:pPr>
-            <w:r>
-              <w:rPr>
-                <w:sz w:val="21"/>
-                <w:szCs w:val="21"/>
-              </w:rPr>
               <w:t xml:space="preserve">/27</w:t>
             </w:r>
           </w:p>
         </w:tc>
         <w:tc>
           <w:tcPr>
-            <w:tcW w:type="dxa" w:w="1560"/>
+            <w:tcW w:type="dxa" w:w="2060"/>
             <w:tcBorders>
               <w:top w:val="none" w:color="FFFFFF" w:sz="0"/>
               <w:left w:val="none" w:color="FFFFFF" w:sz="0"/>
@@ -3823,7 +3617,7 @@
         </w:trPr>
         <w:tc>
           <w:tcPr>
-            <w:tcW w:type="dxa" w:w="3000"/>
+            <w:tcW w:type="dxa" w:w="3300"/>
             <w:tcBorders>
               <w:top w:val="none" w:color="FFFFFF" w:sz="0"/>
               <w:left w:val="none" w:color="FFFFFF" w:sz="0"/>
@@ -3852,6 +3646,35 @@
         </w:tc>
         <w:tc>
           <w:tcPr>
+            <w:tcW w:type="dxa" w:w="2300"/>
+            <w:tcBorders>
+              <w:top w:val="none" w:color="FFFFFF" w:sz="0"/>
+              <w:left w:val="none" w:color="FFFFFF" w:sz="0"/>
+              <w:bottom w:val="none" w:color="FFFFFF" w:sz="0"/>
+              <w:right w:val="none" w:color="FFFFFF" w:sz="0"/>
+            </w:tcBorders>
+            <w:tcMar>
+              <w:top w:type="dxa" w:w="40"/>
+              <w:left w:type="dxa" w:w="80"/>
+              <w:bottom w:type="dxa" w:w="40"/>
+              <w:right w:type="dxa" w:w="80"/>
+            </w:tcMar>
+          </w:tcPr>
+          <w:p>
+            <w:pPr>
+              <w:spacing w:line="240"/>
+            </w:pPr>
+            <w:r>
+              <w:rPr>
+                <w:sz w:val="21"/>
+                <w:szCs w:val="21"/>
+              </w:rPr>
+              <w:t xml:space="preserve">2 routers</w:t>
+            </w:r>
+          </w:p>
+        </w:tc>
+        <w:tc>
+          <w:tcPr>
             <w:tcW w:type="dxa" w:w="1700"/>
             <w:tcBorders>
               <w:top w:val="none" w:color="FFFFFF" w:sz="0"/>
@@ -3875,71 +3698,13 @@
                 <w:sz w:val="21"/>
                 <w:szCs w:val="21"/>
               </w:rPr>
-              <w:t xml:space="preserve">2 routers</w:t>
-            </w:r>
-          </w:p>
-        </w:tc>
-        <w:tc>
-          <w:tcPr>
-            <w:tcW w:type="dxa" w:w="2100"/>
-            <w:tcBorders>
-              <w:top w:val="none" w:color="FFFFFF" w:sz="0"/>
-              <w:left w:val="none" w:color="FFFFFF" w:sz="0"/>
-              <w:bottom w:val="none" w:color="FFFFFF" w:sz="0"/>
-              <w:right w:val="none" w:color="FFFFFF" w:sz="0"/>
-            </w:tcBorders>
-            <w:tcMar>
-              <w:top w:type="dxa" w:w="40"/>
-              <w:left w:type="dxa" w:w="80"/>
-              <w:bottom w:type="dxa" w:w="40"/>
-              <w:right w:type="dxa" w:w="80"/>
-            </w:tcMar>
-          </w:tcPr>
-          <w:p>
-            <w:pPr>
-              <w:spacing w:line="240"/>
-            </w:pPr>
-            <w:r>
-              <w:rPr>
-                <w:sz w:val="21"/>
-                <w:szCs w:val="21"/>
-              </w:rPr>
-              <w:t xml:space="preserve">2</w:t>
-            </w:r>
-          </w:p>
-        </w:tc>
-        <w:tc>
-          <w:tcPr>
-            <w:tcW w:type="dxa" w:w="1000"/>
-            <w:tcBorders>
-              <w:top w:val="none" w:color="FFFFFF" w:sz="0"/>
-              <w:left w:val="none" w:color="FFFFFF" w:sz="0"/>
-              <w:bottom w:val="none" w:color="FFFFFF" w:sz="0"/>
-              <w:right w:val="none" w:color="FFFFFF" w:sz="0"/>
-            </w:tcBorders>
-            <w:tcMar>
-              <w:top w:type="dxa" w:w="40"/>
-              <w:left w:type="dxa" w:w="80"/>
-              <w:bottom w:type="dxa" w:w="40"/>
-              <w:right w:type="dxa" w:w="80"/>
-            </w:tcMar>
-          </w:tcPr>
-          <w:p>
-            <w:pPr>
-              <w:spacing w:line="240"/>
-            </w:pPr>
-            <w:r>
-              <w:rPr>
-                <w:sz w:val="21"/>
-                <w:szCs w:val="21"/>
-              </w:rPr>
               <w:t xml:space="preserve">/30</w:t>
             </w:r>
           </w:p>
         </w:tc>
         <w:tc>
           <w:tcPr>
-            <w:tcW w:type="dxa" w:w="1560"/>
+            <w:tcW w:type="dxa" w:w="2060"/>
             <w:tcBorders>
               <w:top w:val="none" w:color="FFFFFF" w:sz="0"/>
               <w:left w:val="none" w:color="FFFFFF" w:sz="0"/>
@@ -3973,7 +3738,7 @@
         </w:trPr>
         <w:tc>
           <w:tcPr>
-            <w:tcW w:type="dxa" w:w="3000"/>
+            <w:tcW w:type="dxa" w:w="3300"/>
             <w:tcBorders>
               <w:top w:val="none" w:color="FFFFFF" w:sz="0"/>
               <w:left w:val="none" w:color="FFFFFF" w:sz="0"/>
@@ -4002,6 +3767,35 @@
         </w:tc>
         <w:tc>
           <w:tcPr>
+            <w:tcW w:type="dxa" w:w="2300"/>
+            <w:tcBorders>
+              <w:top w:val="none" w:color="FFFFFF" w:sz="0"/>
+              <w:left w:val="none" w:color="FFFFFF" w:sz="0"/>
+              <w:bottom w:val="single" w:color="000000" w:sz="6"/>
+              <w:right w:val="none" w:color="FFFFFF" w:sz="0"/>
+            </w:tcBorders>
+            <w:tcMar>
+              <w:top w:type="dxa" w:w="40"/>
+              <w:left w:type="dxa" w:w="80"/>
+              <w:bottom w:type="dxa" w:w="40"/>
+              <w:right w:type="dxa" w:w="80"/>
+            </w:tcMar>
+          </w:tcPr>
+          <w:p>
+            <w:pPr>
+              <w:spacing w:line="240"/>
+            </w:pPr>
+            <w:r>
+              <w:rPr>
+                <w:sz w:val="21"/>
+                <w:szCs w:val="21"/>
+              </w:rPr>
+              <w:t xml:space="preserve">2 routers</w:t>
+            </w:r>
+          </w:p>
+        </w:tc>
+        <w:tc>
+          <w:tcPr>
             <w:tcW w:type="dxa" w:w="1700"/>
             <w:tcBorders>
               <w:top w:val="none" w:color="FFFFFF" w:sz="0"/>
@@ -4025,71 +3819,13 @@
                 <w:sz w:val="21"/>
                 <w:szCs w:val="21"/>
               </w:rPr>
-              <w:t xml:space="preserve">2 routers</w:t>
-            </w:r>
-          </w:p>
-        </w:tc>
-        <w:tc>
-          <w:tcPr>
-            <w:tcW w:type="dxa" w:w="2100"/>
-            <w:tcBorders>
-              <w:top w:val="none" w:color="FFFFFF" w:sz="0"/>
-              <w:left w:val="none" w:color="FFFFFF" w:sz="0"/>
-              <w:bottom w:val="single" w:color="000000" w:sz="6"/>
-              <w:right w:val="none" w:color="FFFFFF" w:sz="0"/>
-            </w:tcBorders>
-            <w:tcMar>
-              <w:top w:type="dxa" w:w="40"/>
-              <w:left w:type="dxa" w:w="80"/>
-              <w:bottom w:type="dxa" w:w="40"/>
-              <w:right w:type="dxa" w:w="80"/>
-            </w:tcMar>
-          </w:tcPr>
-          <w:p>
-            <w:pPr>
-              <w:spacing w:line="240"/>
-            </w:pPr>
-            <w:r>
-              <w:rPr>
-                <w:sz w:val="21"/>
-                <w:szCs w:val="21"/>
-              </w:rPr>
-              <w:t xml:space="preserve">2</w:t>
-            </w:r>
-          </w:p>
-        </w:tc>
-        <w:tc>
-          <w:tcPr>
-            <w:tcW w:type="dxa" w:w="1000"/>
-            <w:tcBorders>
-              <w:top w:val="none" w:color="FFFFFF" w:sz="0"/>
-              <w:left w:val="none" w:color="FFFFFF" w:sz="0"/>
-              <w:bottom w:val="single" w:color="000000" w:sz="6"/>
-              <w:right w:val="none" w:color="FFFFFF" w:sz="0"/>
-            </w:tcBorders>
-            <w:tcMar>
-              <w:top w:type="dxa" w:w="40"/>
-              <w:left w:type="dxa" w:w="80"/>
-              <w:bottom w:type="dxa" w:w="40"/>
-              <w:right w:type="dxa" w:w="80"/>
-            </w:tcMar>
-          </w:tcPr>
-          <w:p>
-            <w:pPr>
-              <w:spacing w:line="240"/>
-            </w:pPr>
-            <w:r>
-              <w:rPr>
-                <w:sz w:val="21"/>
-                <w:szCs w:val="21"/>
-              </w:rPr>
               <w:t xml:space="preserve">/30</w:t>
             </w:r>
           </w:p>
         </w:tc>
         <w:tc>
           <w:tcPr>
-            <w:tcW w:type="dxa" w:w="1560"/>
+            <w:tcW w:type="dxa" w:w="2060"/>
             <w:tcBorders>
               <w:top w:val="none" w:color="FFFFFF" w:sz="0"/>
               <w:left w:val="none" w:color="FFFFFF" w:sz="0"/>
@@ -4130,7 +3866,7 @@
         <w:t xml:space="preserve">Nota.</w:t>
       </w:r>
       <w:r>
-        <w:t xml:space="preserve"> Las direcciones necesarias suman los equipos y el gateway de cada área.</w:t>
+        <w:t xml:space="preserve"> Cada prefijo se eligió para que alcancen los equipos más el gateway de cada área.</w:t>
       </w:r>
     </w:p>
     <w:p>

</xml_diff>

<commit_message>
Construir la red en Packet Tracer y agregar capturas y resultados de las pruebas
Se agrega CRG_Red_Empresarial.pkt con la red de 4 routers y 10 subredes, y 13
capturas al paso a paso y a las pruebas. Las nueve pruebas dieron el resultado
esperado.

Co-Authored-By: Claude Opus 5.5 <noreply@anthropic.com>
</commit_message>
<xml_diff>
--- a/ProyectoFinal-Redes-ACT6-APA7.docx
+++ b/ProyectoFinal-Redes-ACT6-APA7.docx
@@ -468,7 +468,7 @@
               <w:tab/>
             </w:r>
             <w:r>
-              <w:t>14</w:t>
+              <w:t>15</w:t>
             </w:r>
           </w:hyperlink>
         </w:p>
@@ -488,7 +488,7 @@
               <w:tab/>
             </w:r>
             <w:r>
-              <w:t>14</w:t>
+              <w:t>16</w:t>
             </w:r>
           </w:hyperlink>
         </w:p>
@@ -508,7 +508,7 @@
               <w:tab/>
             </w:r>
             <w:r>
-              <w:t>14</w:t>
+              <w:t>16</w:t>
             </w:r>
           </w:hyperlink>
         </w:p>
@@ -528,7 +528,7 @@
               <w:tab/>
             </w:r>
             <w:r>
-              <w:t>15</w:t>
+              <w:t>16</w:t>
             </w:r>
           </w:hyperlink>
         </w:p>
@@ -548,7 +548,7 @@
               <w:tab/>
             </w:r>
             <w:r>
-              <w:t>16</w:t>
+              <w:t>18</w:t>
             </w:r>
           </w:hyperlink>
         </w:p>
@@ -568,7 +568,7 @@
               <w:tab/>
             </w:r>
             <w:r>
-              <w:t>17</w:t>
+              <w:t>19</w:t>
             </w:r>
           </w:hyperlink>
         </w:p>
@@ -588,7 +588,7 @@
               <w:tab/>
             </w:r>
             <w:r>
-              <w:t>18</w:t>
+              <w:t>20</w:t>
             </w:r>
           </w:hyperlink>
         </w:p>
@@ -608,7 +608,7 @@
               <w:tab/>
             </w:r>
             <w:r>
-              <w:t>18</w:t>
+              <w:t>20</w:t>
             </w:r>
           </w:hyperlink>
         </w:p>
@@ -628,7 +628,7 @@
               <w:tab/>
             </w:r>
             <w:r>
-              <w:t>19</w:t>
+              <w:t>21</w:t>
             </w:r>
           </w:hyperlink>
         </w:p>
@@ -648,7 +648,7 @@
               <w:tab/>
             </w:r>
             <w:r>
-              <w:t>19</w:t>
+              <w:t>22</w:t>
             </w:r>
           </w:hyperlink>
         </w:p>
@@ -668,7 +668,7 @@
               <w:tab/>
             </w:r>
             <w:r>
-              <w:t>19</w:t>
+              <w:t>22</w:t>
             </w:r>
           </w:hyperlink>
         </w:p>
@@ -688,7 +688,7 @@
               <w:tab/>
             </w:r>
             <w:r>
-              <w:t>20</w:t>
+              <w:t>26</w:t>
             </w:r>
           </w:hyperlink>
         </w:p>
@@ -708,7 +708,7 @@
               <w:tab/>
             </w:r>
             <w:r>
-              <w:t>21</w:t>
+              <w:t>26</w:t>
             </w:r>
           </w:hyperlink>
         </w:p>
@@ -728,7 +728,7 @@
               <w:tab/>
             </w:r>
             <w:r>
-              <w:t>22</w:t>
+              <w:t>27</w:t>
             </w:r>
           </w:hyperlink>
         </w:p>
@@ -748,7 +748,7 @@
               <w:tab/>
             </w:r>
             <w:r>
-              <w:t>22</w:t>
+              <w:t>28</w:t>
             </w:r>
           </w:hyperlink>
         </w:p>
@@ -768,7 +768,7 @@
               <w:tab/>
             </w:r>
             <w:r>
-              <w:t>24</w:t>
+              <w:t>30</w:t>
             </w:r>
           </w:hyperlink>
         </w:p>
@@ -788,7 +788,7 @@
               <w:tab/>
             </w:r>
             <w:r>
-              <w:t>26</w:t>
+              <w:t>32</w:t>
             </w:r>
           </w:hyperlink>
           <w:r>
@@ -815,7 +815,7 @@
     <w:p>
       <w:pPr/>
       <w:r>
-        <w:t xml:space="preserve">El presente trabajo documenta el diseño de la red de Crestline Group, una empresa ficticia de servicios corporativos que llega del extranjero para abrir su oficina en Bolivia con 300 computadoras repartidas en seis áreas. Como el local es nuevo y no existe una red previa, el diseño parte de cero y busca evitar desde el inicio los problemas de una red plana: exceso de tráfico de difusión, direcciones IP repetidas y falta de separación entre áreas. La solución divide la red en diez subredes calculadas con VLSM a partir del bloque 10.20.0.0/23: seis redes de área y cuatro enlaces punto a punto. Un router central y tres routers de piso se comunican mediante rutas estáticas, el DHCP es centralizado con reenvío desde los routers de piso y la salida a una red externa simulada se hace con NAT. El documento describe la construcción paso a paso en Cisco Packet Tracer con los comandos utilizados, define nueve pruebas de aceptación y estima los equipos necesarios para una instalación física. Se concluye que el diseño cubre la demanda de 300 equipos con direcciones sobrantes para crecer; también se señalan las limitaciones de la simulación y las mejoras recomendadas para un despliegue real.</w:t>
+        <w:t xml:space="preserve">El presente trabajo documenta el diseño de la red de Crestline Group, una empresa ficticia de servicios corporativos que llega del extranjero para abrir su oficina en Bolivia con 300 computadoras repartidas en seis áreas. Como el local es nuevo y no existe una red previa, el diseño parte de cero y busca evitar desde el inicio los problemas de una red plana: exceso de tráfico de difusión, direcciones IP repetidas y falta de separación entre áreas. La solución divide la red en diez subredes calculadas con VLSM a partir del bloque 10.20.0.0/23: seis redes de área y cuatro enlaces punto a punto. Un router central y tres routers de piso se comunican mediante rutas estáticas, el DHCP es centralizado con reenvío desde los routers de piso y la salida a una red externa simulada se hace con NAT. El documento describe la construcción paso a paso en Cisco Packet Tracer con los comandos utilizados y capturas del archivo terminado, registra nueve pruebas de aceptación, todas con el resultado esperado, y estima los equipos necesarios para una instalación física. Se concluye que el diseño cubre la demanda de 300 equipos con direcciones sobrantes para crecer; también se señalan las limitaciones de la simulación y las mejoras recomendadas para un despliegue real.</w:t>
       </w:r>
     </w:p>
     <w:p>
@@ -6728,17 +6728,95 @@
     </w:p>
     <w:p>
       <w:pPr>
-        <w:spacing w:after="360"/>
+        <w:ind w:firstLine="720"/>
+      </w:pPr>
+      <w:r>
+        <w:t xml:space="preserve">El puerto queda con el nombre Serial0/0/0. La Figura 2 muestra la tarjeta instalada en la ranura 0 de R-CRG.</w:t>
+      </w:r>
+    </w:p>
+    <w:p>
+      <w:pPr>
+        <w:keepNext/>
+      </w:pPr>
+      <w:r>
+        <w:rPr>
+          <w:b/>
+          <w:bCs/>
+        </w:rPr>
+        <w:t xml:space="preserve">Figura 2</w:t>
+      </w:r>
+    </w:p>
+    <w:p>
+      <w:pPr>
+        <w:keepNext/>
       </w:pPr>
       <w:r>
         <w:rPr>
           <w:i/>
           <w:iCs/>
         </w:rPr>
+        <w:t xml:space="preserve">Router R-CRG con la tarjeta HWIC-2T instalada</w:t>
+      </w:r>
+    </w:p>
+    <w:p>
+      <w:pPr>
+        <w:keepNext/>
+        <w:spacing w:after="0" w:line="240"/>
+      </w:pPr>
+      <w:r>
+        <w:drawing>
+          <wp:inline distT="0" distB="0" distL="0" distR="0">
+            <wp:extent cx="5810250" cy="2727260"/>
+            <wp:effectExtent t="0" r="0" b="0" l="0"/>
+            <wp:docPr id="1002" name=""/>
+            <wp:cNvGraphicFramePr>
+              <a:graphicFrameLocks xmlns:a="http://schemas.openxmlformats.org/drawingml/2006/main" noChangeAspect="1"/>
+            </wp:cNvGraphicFramePr>
+            <a:graphic xmlns:a="http://schemas.openxmlformats.org/drawingml/2006/main">
+              <a:graphicData uri="http://schemas.openxmlformats.org/drawingml/2006/picture">
+                <pic:pic xmlns:pic="http://schemas.openxmlformats.org/drawingml/2006/picture">
+                  <pic:nvPicPr>
+                    <pic:cNvPr id="0" name="" descr=""/>
+                    <pic:cNvPicPr>
+                      <a:picLocks noChangeAspect="1" noChangeArrowheads="1"/>
+                    </pic:cNvPicPr>
+                  </pic:nvPicPr>
+                  <pic:blipFill>
+                    <a:blip r:embed="rIdFig2" cstate="none"/>
+                    <a:srcRect/>
+                    <a:stretch>
+                      <a:fillRect/>
+                    </a:stretch>
+                  </pic:blipFill>
+                  <pic:spPr bwMode="auto">
+                    <a:xfrm>
+                      <a:off x="0" y="0"/>
+                      <a:ext cx="5810250" cy="2727260"/>
+                    </a:xfrm>
+                    <a:prstGeom prst="rect">
+                      <a:avLst/>
+                    </a:prstGeom>
+                  </pic:spPr>
+                </pic:pic>
+              </a:graphicData>
+            </a:graphic>
+          </wp:inline>
+        </w:drawing>
+      </w:r>
+    </w:p>
+    <w:p>
+      <w:pPr>
+        <w:spacing w:after="360"/>
+      </w:pPr>
+      <w:r>
+        <w:rPr>
+          <w:i/>
+          <w:iCs/>
+        </w:rPr>
         <w:t xml:space="preserve">Nota.</w:t>
       </w:r>
       <w:r>
-        <w:t xml:space="preserve"> El puerto queda con el nombre Serial0/0/0.</w:t>
+        <w:t xml:space="preserve"> La tarjeta aparece en la ranura eHWIC 0, a la derecha de la vista trasera del router.</w:t>
       </w:r>
     </w:p>
     <w:p>
@@ -8311,6 +8389,99 @@
       </w:r>
       <w:r>
         <w:t xml:space="preserve"> (switch–switch, router–router) van con cable cruzado (Cross-Over). En el cable serial, el extremo donde haces clic primero es el DCE, el que marca el «reloj» del enlace.</w:t>
+      </w:r>
+    </w:p>
+    <w:p>
+      <w:pPr>
+        <w:ind w:firstLine="720"/>
+      </w:pPr>
+      <w:r>
+        <w:t xml:space="preserve">Al terminar de conectar, la red queda como en la Figura 3. Los triángulos se ponen verdes cuando cada interfaz se configura en los pasos siguientes.</w:t>
+      </w:r>
+    </w:p>
+    <w:p>
+      <w:pPr>
+        <w:keepNext/>
+      </w:pPr>
+      <w:r>
+        <w:rPr>
+          <w:b/>
+          <w:bCs/>
+        </w:rPr>
+        <w:t xml:space="preserve">Figura 3</w:t>
+      </w:r>
+    </w:p>
+    <w:p>
+      <w:pPr>
+        <w:keepNext/>
+      </w:pPr>
+      <w:r>
+        <w:rPr>
+          <w:i/>
+          <w:iCs/>
+        </w:rPr>
+        <w:t xml:space="preserve">Red de Crestline Group terminada en Packet Tracer</w:t>
+      </w:r>
+    </w:p>
+    <w:p>
+      <w:pPr>
+        <w:keepNext/>
+        <w:spacing w:after="0" w:line="240"/>
+      </w:pPr>
+      <w:r>
+        <w:drawing>
+          <wp:inline distT="0" distB="0" distL="0" distR="0">
+            <wp:extent cx="5810250" cy="2257787"/>
+            <wp:effectExtent t="0" r="0" b="0" l="0"/>
+            <wp:docPr id="1003" name=""/>
+            <wp:cNvGraphicFramePr>
+              <a:graphicFrameLocks xmlns:a="http://schemas.openxmlformats.org/drawingml/2006/main" noChangeAspect="1"/>
+            </wp:cNvGraphicFramePr>
+            <a:graphic xmlns:a="http://schemas.openxmlformats.org/drawingml/2006/main">
+              <a:graphicData uri="http://schemas.openxmlformats.org/drawingml/2006/picture">
+                <pic:pic xmlns:pic="http://schemas.openxmlformats.org/drawingml/2006/picture">
+                  <pic:nvPicPr>
+                    <pic:cNvPr id="0" name="" descr=""/>
+                    <pic:cNvPicPr>
+                      <a:picLocks noChangeAspect="1" noChangeArrowheads="1"/>
+                    </pic:cNvPicPr>
+                  </pic:nvPicPr>
+                  <pic:blipFill>
+                    <a:blip r:embed="rIdFig3" cstate="none"/>
+                    <a:srcRect/>
+                    <a:stretch>
+                      <a:fillRect/>
+                    </a:stretch>
+                  </pic:blipFill>
+                  <pic:spPr bwMode="auto">
+                    <a:xfrm>
+                      <a:off x="0" y="0"/>
+                      <a:ext cx="5810250" cy="2257787"/>
+                    </a:xfrm>
+                    <a:prstGeom prst="rect">
+                      <a:avLst/>
+                    </a:prstGeom>
+                  </pic:spPr>
+                </pic:pic>
+              </a:graphicData>
+            </a:graphic>
+          </wp:inline>
+        </w:drawing>
+      </w:r>
+    </w:p>
+    <w:p>
+      <w:pPr>
+        <w:spacing w:after="360"/>
+      </w:pPr>
+      <w:r>
+        <w:rPr>
+          <w:i/>
+          <w:iCs/>
+        </w:rPr>
+        <w:t xml:space="preserve">Nota.</w:t>
+      </w:r>
+      <w:r>
+        <w:t xml:space="preserve"> Las líneas punteadas son cables cruzados entre routers; la línea roja en zigzag es el enlace serial con el ISP. Las etiquetas indican la subred de cada área y de cada enlace.</w:t>
       </w:r>
     </w:p>
     <w:p>
@@ -9732,8 +9903,158 @@
         <w:t xml:space="preserve">show ip interface brief</w:t>
       </w:r>
       <w:r>
-        <w:t xml:space="preserve">. Todas las interfaces que usamos deben decir up / up.</w:t>
-      </w:r>
+        <w:t xml:space="preserve">. Todas las interfaces que usamos deben decir up / up. La Figura 4 muestra R-CRG (con el enlace serial que se configura en el Paso 11) y la Figura 5, R-P1.</w:t>
+      </w:r>
+    </w:p>
+    <w:p>
+      <w:pPr>
+        <w:keepNext/>
+      </w:pPr>
+      <w:r>
+        <w:rPr>
+          <w:b/>
+          <w:bCs/>
+        </w:rPr>
+        <w:t xml:space="preserve">Figura 4</w:t>
+      </w:r>
+    </w:p>
+    <w:p>
+      <w:pPr>
+        <w:keepNext/>
+      </w:pPr>
+      <w:r>
+        <w:rPr>
+          <w:i/>
+          <w:iCs/>
+        </w:rPr>
+        <w:t xml:space="preserve">Resultado de show ip interface brief en R-CRG</w:t>
+      </w:r>
+    </w:p>
+    <w:p>
+      <w:pPr>
+        <w:keepNext/>
+        <w:spacing w:after="0" w:line="240"/>
+      </w:pPr>
+      <w:r>
+        <w:drawing>
+          <wp:inline distT="0" distB="0" distL="0" distR="0">
+            <wp:extent cx="5480000" cy="1150000"/>
+            <wp:effectExtent t="0" r="0" b="0" l="0"/>
+            <wp:docPr id="1004" name=""/>
+            <wp:cNvGraphicFramePr>
+              <a:graphicFrameLocks xmlns:a="http://schemas.openxmlformats.org/drawingml/2006/main" noChangeAspect="1"/>
+            </wp:cNvGraphicFramePr>
+            <a:graphic xmlns:a="http://schemas.openxmlformats.org/drawingml/2006/main">
+              <a:graphicData uri="http://schemas.openxmlformats.org/drawingml/2006/picture">
+                <pic:pic xmlns:pic="http://schemas.openxmlformats.org/drawingml/2006/picture">
+                  <pic:nvPicPr>
+                    <pic:cNvPr id="0" name="" descr=""/>
+                    <pic:cNvPicPr>
+                      <a:picLocks noChangeAspect="1" noChangeArrowheads="1"/>
+                    </pic:cNvPicPr>
+                  </pic:nvPicPr>
+                  <pic:blipFill>
+                    <a:blip r:embed="rIdFig4" cstate="none"/>
+                    <a:srcRect/>
+                    <a:stretch>
+                      <a:fillRect/>
+                    </a:stretch>
+                  </pic:blipFill>
+                  <pic:spPr bwMode="auto">
+                    <a:xfrm>
+                      <a:off x="0" y="0"/>
+                      <a:ext cx="5480000" cy="1150000"/>
+                    </a:xfrm>
+                    <a:prstGeom prst="rect">
+                      <a:avLst/>
+                    </a:prstGeom>
+                  </pic:spPr>
+                </pic:pic>
+              </a:graphicData>
+            </a:graphic>
+          </wp:inline>
+        </w:drawing>
+      </w:r>
+    </w:p>
+    <w:p>
+      <w:pPr>
+        <w:spacing w:after="240"/>
+      </w:pPr>
+    </w:p>
+    <w:p>
+      <w:pPr>
+        <w:keepNext/>
+      </w:pPr>
+      <w:r>
+        <w:rPr>
+          <w:b/>
+          <w:bCs/>
+        </w:rPr>
+        <w:t xml:space="preserve">Figura 5</w:t>
+      </w:r>
+    </w:p>
+    <w:p>
+      <w:pPr>
+        <w:keepNext/>
+      </w:pPr>
+      <w:r>
+        <w:rPr>
+          <w:i/>
+          <w:iCs/>
+        </w:rPr>
+        <w:t xml:space="preserve">Interfaces y ruta por defecto de R-P1</w:t>
+      </w:r>
+    </w:p>
+    <w:p>
+      <w:pPr>
+        <w:keepNext/>
+        <w:spacing w:after="0" w:line="240"/>
+      </w:pPr>
+      <w:r>
+        <w:drawing>
+          <wp:inline distT="0" distB="0" distL="0" distR="0">
+            <wp:extent cx="5480000" cy="1410000"/>
+            <wp:effectExtent t="0" r="0" b="0" l="0"/>
+            <wp:docPr id="1005" name=""/>
+            <wp:cNvGraphicFramePr>
+              <a:graphicFrameLocks xmlns:a="http://schemas.openxmlformats.org/drawingml/2006/main" noChangeAspect="1"/>
+            </wp:cNvGraphicFramePr>
+            <a:graphic xmlns:a="http://schemas.openxmlformats.org/drawingml/2006/main">
+              <a:graphicData uri="http://schemas.openxmlformats.org/drawingml/2006/picture">
+                <pic:pic xmlns:pic="http://schemas.openxmlformats.org/drawingml/2006/picture">
+                  <pic:nvPicPr>
+                    <pic:cNvPr id="0" name="" descr=""/>
+                    <pic:cNvPicPr>
+                      <a:picLocks noChangeAspect="1" noChangeArrowheads="1"/>
+                    </pic:cNvPicPr>
+                  </pic:nvPicPr>
+                  <pic:blipFill>
+                    <a:blip r:embed="rIdFig5" cstate="none"/>
+                    <a:srcRect/>
+                    <a:stretch>
+                      <a:fillRect/>
+                    </a:stretch>
+                  </pic:blipFill>
+                  <pic:spPr bwMode="auto">
+                    <a:xfrm>
+                      <a:off x="0" y="0"/>
+                      <a:ext cx="5480000" cy="1410000"/>
+                    </a:xfrm>
+                    <a:prstGeom prst="rect">
+                      <a:avLst/>
+                    </a:prstGeom>
+                  </pic:spPr>
+                </pic:pic>
+              </a:graphicData>
+            </a:graphic>
+          </wp:inline>
+        </w:drawing>
+      </w:r>
+    </w:p>
+    <w:p>
+      <w:pPr>
+        <w:spacing w:after="240"/>
+      </w:pPr>
     </w:p>
     <w:p>
       <w:pPr>
@@ -9991,8 +10312,83 @@
         <w:t xml:space="preserve">S*</w:t>
       </w:r>
       <w:r>
-        <w:t xml:space="preserve">. En cada router de piso, el mismo comando muestra solo la ruta por defecto hacia R-CRG.</w:t>
-      </w:r>
+        <w:t xml:space="preserve"> (Figura 6). En cada router de piso, el mismo comando muestra solo la ruta por defecto hacia R-CRG (Figura 5).</w:t>
+      </w:r>
+    </w:p>
+    <w:p>
+      <w:pPr>
+        <w:keepNext/>
+      </w:pPr>
+      <w:r>
+        <w:rPr>
+          <w:b/>
+          <w:bCs/>
+        </w:rPr>
+        <w:t xml:space="preserve">Figura 6</w:t>
+      </w:r>
+    </w:p>
+    <w:p>
+      <w:pPr>
+        <w:keepNext/>
+      </w:pPr>
+      <w:r>
+        <w:rPr>
+          <w:i/>
+          <w:iCs/>
+        </w:rPr>
+        <w:t xml:space="preserve">Rutas estáticas en R-CRG</w:t>
+      </w:r>
+    </w:p>
+    <w:p>
+      <w:pPr>
+        <w:keepNext/>
+        <w:spacing w:after="0" w:line="240"/>
+      </w:pPr>
+      <w:r>
+        <w:drawing>
+          <wp:inline distT="0" distB="0" distL="0" distR="0">
+            <wp:extent cx="4030000" cy="1410000"/>
+            <wp:effectExtent t="0" r="0" b="0" l="0"/>
+            <wp:docPr id="1006" name=""/>
+            <wp:cNvGraphicFramePr>
+              <a:graphicFrameLocks xmlns:a="http://schemas.openxmlformats.org/drawingml/2006/main" noChangeAspect="1"/>
+            </wp:cNvGraphicFramePr>
+            <a:graphic xmlns:a="http://schemas.openxmlformats.org/drawingml/2006/main">
+              <a:graphicData uri="http://schemas.openxmlformats.org/drawingml/2006/picture">
+                <pic:pic xmlns:pic="http://schemas.openxmlformats.org/drawingml/2006/picture">
+                  <pic:nvPicPr>
+                    <pic:cNvPr id="0" name="" descr=""/>
+                    <pic:cNvPicPr>
+                      <a:picLocks noChangeAspect="1" noChangeArrowheads="1"/>
+                    </pic:cNvPicPr>
+                  </pic:nvPicPr>
+                  <pic:blipFill>
+                    <a:blip r:embed="rIdFig6" cstate="none"/>
+                    <a:srcRect/>
+                    <a:stretch>
+                      <a:fillRect/>
+                    </a:stretch>
+                  </pic:blipFill>
+                  <pic:spPr bwMode="auto">
+                    <a:xfrm>
+                      <a:off x="0" y="0"/>
+                      <a:ext cx="4030000" cy="1410000"/>
+                    </a:xfrm>
+                    <a:prstGeom prst="rect">
+                      <a:avLst/>
+                    </a:prstGeom>
+                  </pic:spPr>
+                </pic:pic>
+              </a:graphicData>
+            </a:graphic>
+          </wp:inline>
+        </w:drawing>
+      </w:r>
+    </w:p>
+    <w:p>
+      <w:pPr>
+        <w:spacing w:after="240"/>
+      </w:pPr>
     </w:p>
     <w:p>
       <w:pPr>
@@ -11346,8 +11742,83 @@
         <w:ind w:firstLine="720"/>
       </w:pPr>
       <w:r>
-        <w:t xml:space="preserve">Marca DHCP. En unos segundos aparecen la IP, la máscara y el gateway.</w:t>
-      </w:r>
+        <w:t xml:space="preserve">Marca DHCP. En unos segundos aparecen la IP, la máscara y el gateway (Figura 7).</w:t>
+      </w:r>
+    </w:p>
+    <w:p>
+      <w:pPr>
+        <w:keepNext/>
+      </w:pPr>
+      <w:r>
+        <w:rPr>
+          <w:b/>
+          <w:bCs/>
+        </w:rPr>
+        <w:t xml:space="preserve">Figura 7</w:t>
+      </w:r>
+    </w:p>
+    <w:p>
+      <w:pPr>
+        <w:keepNext/>
+      </w:pPr>
+      <w:r>
+        <w:rPr>
+          <w:i/>
+          <w:iCs/>
+        </w:rPr>
+        <w:t xml:space="preserve">PC-VEN1 recibió su configuración por DHCP</w:t>
+      </w:r>
+    </w:p>
+    <w:p>
+      <w:pPr>
+        <w:keepNext/>
+        <w:spacing w:after="0" w:line="240"/>
+      </w:pPr>
+      <w:r>
+        <w:drawing>
+          <wp:inline distT="0" distB="0" distL="0" distR="0">
+            <wp:extent cx="5810250" cy="1452562"/>
+            <wp:effectExtent t="0" r="0" b="0" l="0"/>
+            <wp:docPr id="1007" name=""/>
+            <wp:cNvGraphicFramePr>
+              <a:graphicFrameLocks xmlns:a="http://schemas.openxmlformats.org/drawingml/2006/main" noChangeAspect="1"/>
+            </wp:cNvGraphicFramePr>
+            <a:graphic xmlns:a="http://schemas.openxmlformats.org/drawingml/2006/main">
+              <a:graphicData uri="http://schemas.openxmlformats.org/drawingml/2006/picture">
+                <pic:pic xmlns:pic="http://schemas.openxmlformats.org/drawingml/2006/picture">
+                  <pic:nvPicPr>
+                    <pic:cNvPr id="0" name="" descr=""/>
+                    <pic:cNvPicPr>
+                      <a:picLocks noChangeAspect="1" noChangeArrowheads="1"/>
+                    </pic:cNvPicPr>
+                  </pic:nvPicPr>
+                  <pic:blipFill>
+                    <a:blip r:embed="rIdFig7" cstate="none"/>
+                    <a:srcRect/>
+                    <a:stretch>
+                      <a:fillRect/>
+                    </a:stretch>
+                  </pic:blipFill>
+                  <pic:spPr bwMode="auto">
+                    <a:xfrm>
+                      <a:off x="0" y="0"/>
+                      <a:ext cx="5810250" cy="1452562"/>
+                    </a:xfrm>
+                    <a:prstGeom prst="rect">
+                      <a:avLst/>
+                    </a:prstGeom>
+                  </pic:spPr>
+                </pic:pic>
+              </a:graphicData>
+            </a:graphic>
+          </wp:inline>
+        </w:drawing>
+      </w:r>
+    </w:p>
+    <w:p>
+      <w:pPr>
+        <w:spacing w:after="240"/>
+      </w:pPr>
     </w:p>
     <w:p>
       <w:pPr>
@@ -11362,8 +11833,83 @@
         <w:ind w:firstLine="720"/>
       </w:pPr>
       <w:r>
-        <w:t xml:space="preserve">En R-CRG, show ip dhcp binding muestra todas las direcciones entregadas. Las 12 PC deben recibir una IP dentro de la subred de su área.</w:t>
-      </w:r>
+        <w:t xml:space="preserve">En R-CRG, show ip dhcp binding muestra todas las direcciones entregadas. Las 12 PC recibieron una IP dentro de la subred de su área (Figura 8).</w:t>
+      </w:r>
+    </w:p>
+    <w:p>
+      <w:pPr>
+        <w:keepNext/>
+      </w:pPr>
+      <w:r>
+        <w:rPr>
+          <w:b/>
+          <w:bCs/>
+        </w:rPr>
+        <w:t xml:space="preserve">Figura 8</w:t>
+      </w:r>
+    </w:p>
+    <w:p>
+      <w:pPr>
+        <w:keepNext/>
+      </w:pPr>
+      <w:r>
+        <w:rPr>
+          <w:i/>
+          <w:iCs/>
+        </w:rPr>
+        <w:t xml:space="preserve">Direcciones entregadas por el DHCP de R-CRG</w:t>
+      </w:r>
+    </w:p>
+    <w:p>
+      <w:pPr>
+        <w:keepNext/>
+        <w:spacing w:after="0" w:line="240"/>
+      </w:pPr>
+      <w:r>
+        <w:drawing>
+          <wp:inline distT="0" distB="0" distL="0" distR="0">
+            <wp:extent cx="5080000" cy="2190000"/>
+            <wp:effectExtent t="0" r="0" b="0" l="0"/>
+            <wp:docPr id="1008" name=""/>
+            <wp:cNvGraphicFramePr>
+              <a:graphicFrameLocks xmlns:a="http://schemas.openxmlformats.org/drawingml/2006/main" noChangeAspect="1"/>
+            </wp:cNvGraphicFramePr>
+            <a:graphic xmlns:a="http://schemas.openxmlformats.org/drawingml/2006/main">
+              <a:graphicData uri="http://schemas.openxmlformats.org/drawingml/2006/picture">
+                <pic:pic xmlns:pic="http://schemas.openxmlformats.org/drawingml/2006/picture">
+                  <pic:nvPicPr>
+                    <pic:cNvPr id="0" name="" descr=""/>
+                    <pic:cNvPicPr>
+                      <a:picLocks noChangeAspect="1" noChangeArrowheads="1"/>
+                    </pic:cNvPicPr>
+                  </pic:nvPicPr>
+                  <pic:blipFill>
+                    <a:blip r:embed="rIdFig8" cstate="none"/>
+                    <a:srcRect/>
+                    <a:stretch>
+                      <a:fillRect/>
+                    </a:stretch>
+                  </pic:blipFill>
+                  <pic:spPr bwMode="auto">
+                    <a:xfrm>
+                      <a:off x="0" y="0"/>
+                      <a:ext cx="5080000" cy="2190000"/>
+                    </a:xfrm>
+                    <a:prstGeom prst="rect">
+                      <a:avLst/>
+                    </a:prstGeom>
+                  </pic:spPr>
+                </pic:pic>
+              </a:graphicData>
+            </a:graphic>
+          </wp:inline>
+        </w:drawing>
+      </w:r>
+    </w:p>
+    <w:p>
+      <w:pPr>
+        <w:spacing w:after="240"/>
+      </w:pPr>
     </w:p>
     <w:p>
       <w:pPr>
@@ -11398,7 +11944,7 @@
         <w:ind w:firstLine="720"/>
       </w:pPr>
       <w:r>
-        <w:t xml:space="preserve">Las pruebas se hacen desde Desktop &gt; Command Prompt de cada PC y desde la CLI de R-CRG. Nota importante: en el primer ping a un destino nuevo es normal que se pierda el primer paquete; es el tiempo que tarda el equipo en averiguar la dirección física (ARP). No es una falla. La Tabla 10 enumera las pruebas; la columna «Observado» se completa al ejecutarlas en el simulador.</w:t>
+        <w:t xml:space="preserve">Las pruebas se hacen desde Desktop &gt; Command Prompt de cada PC y desde la CLI de R-CRG. Nota importante: en el primer ping a un destino nuevo es normal que se pierda el primer paquete; es el tiempo que tarda el equipo en averiguar la dirección física (ARP). No es una falla. La Tabla 10 resume las pruebas y sus resultados.</w:t>
       </w:r>
     </w:p>
     <w:p>
@@ -11431,9 +11977,10 @@
       </w:tblPr>
       <w:tblGrid>
         <w:gridCol w:w="500"/>
-        <w:gridCol w:w="4300"/>
-        <w:gridCol w:w="3000"/>
-        <w:gridCol w:w="1560"/>
+        <w:gridCol w:w="3300"/>
+        <w:gridCol w:w="2500"/>
+        <w:gridCol w:w="2060"/>
+        <w:gridCol w:w="1000"/>
       </w:tblGrid>
       <w:tr>
         <w:trPr>
@@ -11472,7 +12019,7 @@
         </w:tc>
         <w:tc>
           <w:tcPr>
-            <w:tcW w:type="dxa" w:w="4300"/>
+            <w:tcW w:type="dxa" w:w="3300"/>
             <w:tcBorders>
               <w:top w:val="single" w:color="000000" w:sz="6"/>
               <w:left w:val="none" w:color="FFFFFF" w:sz="0"/>
@@ -11503,7 +12050,7 @@
         </w:tc>
         <w:tc>
           <w:tcPr>
-            <w:tcW w:type="dxa" w:w="3000"/>
+            <w:tcW w:type="dxa" w:w="2500"/>
             <w:tcBorders>
               <w:top w:val="single" w:color="000000" w:sz="6"/>
               <w:left w:val="none" w:color="FFFFFF" w:sz="0"/>
@@ -11534,7 +12081,7 @@
         </w:tc>
         <w:tc>
           <w:tcPr>
-            <w:tcW w:type="dxa" w:w="1560"/>
+            <w:tcW w:type="dxa" w:w="2060"/>
             <w:tcBorders>
               <w:top w:val="single" w:color="000000" w:sz="6"/>
               <w:left w:val="none" w:color="FFFFFF" w:sz="0"/>
@@ -11560,6 +12107,37 @@
                 <w:szCs w:val="21"/>
               </w:rPr>
               <w:t xml:space="preserve">Observado</w:t>
+            </w:r>
+          </w:p>
+        </w:tc>
+        <w:tc>
+          <w:tcPr>
+            <w:tcW w:type="dxa" w:w="1000"/>
+            <w:tcBorders>
+              <w:top w:val="single" w:color="000000" w:sz="6"/>
+              <w:left w:val="none" w:color="FFFFFF" w:sz="0"/>
+              <w:bottom w:val="single" w:color="000000" w:sz="6"/>
+              <w:right w:val="none" w:color="FFFFFF" w:sz="0"/>
+            </w:tcBorders>
+            <w:tcMar>
+              <w:top w:type="dxa" w:w="40"/>
+              <w:left w:type="dxa" w:w="80"/>
+              <w:bottom w:type="dxa" w:w="40"/>
+              <w:right w:type="dxa" w:w="80"/>
+            </w:tcMar>
+          </w:tcPr>
+          <w:p>
+            <w:pPr>
+              <w:spacing w:line="240"/>
+            </w:pPr>
+            <w:r>
+              <w:rPr>
+                <w:b/>
+                <w:bCs/>
+                <w:sz w:val="21"/>
+                <w:szCs w:val="21"/>
+              </w:rPr>
+              <w:t xml:space="preserve">Figura</w:t>
             </w:r>
           </w:p>
         </w:tc>
@@ -11599,7 +12177,7 @@
         </w:tc>
         <w:tc>
           <w:tcPr>
-            <w:tcW w:type="dxa" w:w="4300"/>
+            <w:tcW w:type="dxa" w:w="3300"/>
             <w:tcBorders>
               <w:top w:val="none" w:color="FFFFFF" w:sz="0"/>
               <w:left w:val="none" w:color="FFFFFF" w:sz="0"/>
@@ -11628,7 +12206,7 @@
         </w:tc>
         <w:tc>
           <w:tcPr>
-            <w:tcW w:type="dxa" w:w="3000"/>
+            <w:tcW w:type="dxa" w:w="2500"/>
             <w:tcBorders>
               <w:top w:val="none" w:color="FFFFFF" w:sz="0"/>
               <w:left w:val="none" w:color="FFFFFF" w:sz="0"/>
@@ -11657,30 +12235,59 @@
         </w:tc>
         <w:tc>
           <w:tcPr>
-            <w:tcW w:type="dxa" w:w="1560"/>
-            <w:tcBorders>
-              <w:top w:val="none" w:color="FFFFFF" w:sz="0"/>
-              <w:left w:val="none" w:color="FFFFFF" w:sz="0"/>
-              <w:bottom w:val="none" w:color="FFFFFF" w:sz="0"/>
-              <w:right w:val="none" w:color="FFFFFF" w:sz="0"/>
-            </w:tcBorders>
-            <w:tcMar>
-              <w:top w:type="dxa" w:w="40"/>
-              <w:left w:type="dxa" w:w="80"/>
-              <w:bottom w:type="dxa" w:w="40"/>
-              <w:right w:type="dxa" w:w="80"/>
-            </w:tcMar>
-          </w:tcPr>
-          <w:p>
-            <w:pPr>
-              <w:spacing w:line="240"/>
-            </w:pPr>
-            <w:r>
-              <w:rPr>
-                <w:sz w:val="21"/>
-                <w:szCs w:val="21"/>
-              </w:rPr>
-              <w:t xml:space="preserve">Pendiente</w:t>
+            <w:tcW w:type="dxa" w:w="2060"/>
+            <w:tcBorders>
+              <w:top w:val="none" w:color="FFFFFF" w:sz="0"/>
+              <w:left w:val="none" w:color="FFFFFF" w:sz="0"/>
+              <w:bottom w:val="none" w:color="FFFFFF" w:sz="0"/>
+              <w:right w:val="none" w:color="FFFFFF" w:sz="0"/>
+            </w:tcBorders>
+            <w:tcMar>
+              <w:top w:type="dxa" w:w="40"/>
+              <w:left w:type="dxa" w:w="80"/>
+              <w:bottom w:type="dxa" w:w="40"/>
+              <w:right w:type="dxa" w:w="80"/>
+            </w:tcMar>
+          </w:tcPr>
+          <w:p>
+            <w:pPr>
+              <w:spacing w:line="240"/>
+            </w:pPr>
+            <w:r>
+              <w:rPr>
+                <w:sz w:val="21"/>
+                <w:szCs w:val="21"/>
+              </w:rPr>
+              <w:t xml:space="preserve">12 de 12 PC con IP correcta</w:t>
+            </w:r>
+          </w:p>
+        </w:tc>
+        <w:tc>
+          <w:tcPr>
+            <w:tcW w:type="dxa" w:w="1000"/>
+            <w:tcBorders>
+              <w:top w:val="none" w:color="FFFFFF" w:sz="0"/>
+              <w:left w:val="none" w:color="FFFFFF" w:sz="0"/>
+              <w:bottom w:val="none" w:color="FFFFFF" w:sz="0"/>
+              <w:right w:val="none" w:color="FFFFFF" w:sz="0"/>
+            </w:tcBorders>
+            <w:tcMar>
+              <w:top w:type="dxa" w:w="40"/>
+              <w:left w:type="dxa" w:w="80"/>
+              <w:bottom w:type="dxa" w:w="40"/>
+              <w:right w:type="dxa" w:w="80"/>
+            </w:tcMar>
+          </w:tcPr>
+          <w:p>
+            <w:pPr>
+              <w:spacing w:line="240"/>
+            </w:pPr>
+            <w:r>
+              <w:rPr>
+                <w:sz w:val="21"/>
+                <w:szCs w:val="21"/>
+              </w:rPr>
+              <w:t xml:space="preserve">7, 8</w:t>
             </w:r>
           </w:p>
         </w:tc>
@@ -11720,7 +12327,7 @@
         </w:tc>
         <w:tc>
           <w:tcPr>
-            <w:tcW w:type="dxa" w:w="4300"/>
+            <w:tcW w:type="dxa" w:w="3300"/>
             <w:tcBorders>
               <w:top w:val="none" w:color="FFFFFF" w:sz="0"/>
               <w:left w:val="none" w:color="FFFFFF" w:sz="0"/>
@@ -11749,7 +12356,7 @@
         </w:tc>
         <w:tc>
           <w:tcPr>
-            <w:tcW w:type="dxa" w:w="3000"/>
+            <w:tcW w:type="dxa" w:w="2500"/>
             <w:tcBorders>
               <w:top w:val="none" w:color="FFFFFF" w:sz="0"/>
               <w:left w:val="none" w:color="FFFFFF" w:sz="0"/>
@@ -11778,30 +12385,59 @@
         </w:tc>
         <w:tc>
           <w:tcPr>
-            <w:tcW w:type="dxa" w:w="1560"/>
-            <w:tcBorders>
-              <w:top w:val="none" w:color="FFFFFF" w:sz="0"/>
-              <w:left w:val="none" w:color="FFFFFF" w:sz="0"/>
-              <w:bottom w:val="none" w:color="FFFFFF" w:sz="0"/>
-              <w:right w:val="none" w:color="FFFFFF" w:sz="0"/>
-            </w:tcBorders>
-            <w:tcMar>
-              <w:top w:type="dxa" w:w="40"/>
-              <w:left w:type="dxa" w:w="80"/>
-              <w:bottom w:type="dxa" w:w="40"/>
-              <w:right w:type="dxa" w:w="80"/>
-            </w:tcMar>
-          </w:tcPr>
-          <w:p>
-            <w:pPr>
-              <w:spacing w:line="240"/>
-            </w:pPr>
-            <w:r>
-              <w:rPr>
-                <w:sz w:val="21"/>
-                <w:szCs w:val="21"/>
-              </w:rPr>
-              <w:t xml:space="preserve">Pendiente</w:t>
+            <w:tcW w:type="dxa" w:w="2060"/>
+            <w:tcBorders>
+              <w:top w:val="none" w:color="FFFFFF" w:sz="0"/>
+              <w:left w:val="none" w:color="FFFFFF" w:sz="0"/>
+              <w:bottom w:val="none" w:color="FFFFFF" w:sz="0"/>
+              <w:right w:val="none" w:color="FFFFFF" w:sz="0"/>
+            </w:tcBorders>
+            <w:tcMar>
+              <w:top w:type="dxa" w:w="40"/>
+              <w:left w:type="dxa" w:w="80"/>
+              <w:bottom w:type="dxa" w:w="40"/>
+              <w:right w:type="dxa" w:w="80"/>
+            </w:tcMar>
+          </w:tcPr>
+          <w:p>
+            <w:pPr>
+              <w:spacing w:line="240"/>
+            </w:pPr>
+            <w:r>
+              <w:rPr>
+                <w:sz w:val="21"/>
+                <w:szCs w:val="21"/>
+              </w:rPr>
+              <w:t xml:space="preserve">4 de 4 respuestas</w:t>
+            </w:r>
+          </w:p>
+        </w:tc>
+        <w:tc>
+          <w:tcPr>
+            <w:tcW w:type="dxa" w:w="1000"/>
+            <w:tcBorders>
+              <w:top w:val="none" w:color="FFFFFF" w:sz="0"/>
+              <w:left w:val="none" w:color="FFFFFF" w:sz="0"/>
+              <w:bottom w:val="none" w:color="FFFFFF" w:sz="0"/>
+              <w:right w:val="none" w:color="FFFFFF" w:sz="0"/>
+            </w:tcBorders>
+            <w:tcMar>
+              <w:top w:type="dxa" w:w="40"/>
+              <w:left w:type="dxa" w:w="80"/>
+              <w:bottom w:type="dxa" w:w="40"/>
+              <w:right w:type="dxa" w:w="80"/>
+            </w:tcMar>
+          </w:tcPr>
+          <w:p>
+            <w:pPr>
+              <w:spacing w:line="240"/>
+            </w:pPr>
+            <w:r>
+              <w:rPr>
+                <w:sz w:val="21"/>
+                <w:szCs w:val="21"/>
+              </w:rPr>
+              <w:t xml:space="preserve">9</w:t>
             </w:r>
           </w:p>
         </w:tc>
@@ -11841,7 +12477,7 @@
         </w:tc>
         <w:tc>
           <w:tcPr>
-            <w:tcW w:type="dxa" w:w="4300"/>
+            <w:tcW w:type="dxa" w:w="3300"/>
             <w:tcBorders>
               <w:top w:val="none" w:color="FFFFFF" w:sz="0"/>
               <w:left w:val="none" w:color="FFFFFF" w:sz="0"/>
@@ -11870,7 +12506,7 @@
         </w:tc>
         <w:tc>
           <w:tcPr>
-            <w:tcW w:type="dxa" w:w="3000"/>
+            <w:tcW w:type="dxa" w:w="2500"/>
             <w:tcBorders>
               <w:top w:val="none" w:color="FFFFFF" w:sz="0"/>
               <w:left w:val="none" w:color="FFFFFF" w:sz="0"/>
@@ -11899,30 +12535,59 @@
         </w:tc>
         <w:tc>
           <w:tcPr>
-            <w:tcW w:type="dxa" w:w="1560"/>
-            <w:tcBorders>
-              <w:top w:val="none" w:color="FFFFFF" w:sz="0"/>
-              <w:left w:val="none" w:color="FFFFFF" w:sz="0"/>
-              <w:bottom w:val="none" w:color="FFFFFF" w:sz="0"/>
-              <w:right w:val="none" w:color="FFFFFF" w:sz="0"/>
-            </w:tcBorders>
-            <w:tcMar>
-              <w:top w:type="dxa" w:w="40"/>
-              <w:left w:type="dxa" w:w="80"/>
-              <w:bottom w:type="dxa" w:w="40"/>
-              <w:right w:type="dxa" w:w="80"/>
-            </w:tcMar>
-          </w:tcPr>
-          <w:p>
-            <w:pPr>
-              <w:spacing w:line="240"/>
-            </w:pPr>
-            <w:r>
-              <w:rPr>
-                <w:sz w:val="21"/>
-                <w:szCs w:val="21"/>
-              </w:rPr>
-              <w:t xml:space="preserve">Pendiente</w:t>
+            <w:tcW w:type="dxa" w:w="2060"/>
+            <w:tcBorders>
+              <w:top w:val="none" w:color="FFFFFF" w:sz="0"/>
+              <w:left w:val="none" w:color="FFFFFF" w:sz="0"/>
+              <w:bottom w:val="none" w:color="FFFFFF" w:sz="0"/>
+              <w:right w:val="none" w:color="FFFFFF" w:sz="0"/>
+            </w:tcBorders>
+            <w:tcMar>
+              <w:top w:type="dxa" w:w="40"/>
+              <w:left w:type="dxa" w:w="80"/>
+              <w:bottom w:type="dxa" w:w="40"/>
+              <w:right w:type="dxa" w:w="80"/>
+            </w:tcMar>
+          </w:tcPr>
+          <w:p>
+            <w:pPr>
+              <w:spacing w:line="240"/>
+            </w:pPr>
+            <w:r>
+              <w:rPr>
+                <w:sz w:val="21"/>
+                <w:szCs w:val="21"/>
+              </w:rPr>
+              <w:t xml:space="preserve">4 de 4 respuestas</w:t>
+            </w:r>
+          </w:p>
+        </w:tc>
+        <w:tc>
+          <w:tcPr>
+            <w:tcW w:type="dxa" w:w="1000"/>
+            <w:tcBorders>
+              <w:top w:val="none" w:color="FFFFFF" w:sz="0"/>
+              <w:left w:val="none" w:color="FFFFFF" w:sz="0"/>
+              <w:bottom w:val="none" w:color="FFFFFF" w:sz="0"/>
+              <w:right w:val="none" w:color="FFFFFF" w:sz="0"/>
+            </w:tcBorders>
+            <w:tcMar>
+              <w:top w:type="dxa" w:w="40"/>
+              <w:left w:type="dxa" w:w="80"/>
+              <w:bottom w:type="dxa" w:w="40"/>
+              <w:right w:type="dxa" w:w="80"/>
+            </w:tcMar>
+          </w:tcPr>
+          <w:p>
+            <w:pPr>
+              <w:spacing w:line="240"/>
+            </w:pPr>
+            <w:r>
+              <w:rPr>
+                <w:sz w:val="21"/>
+                <w:szCs w:val="21"/>
+              </w:rPr>
+              <w:t xml:space="preserve">10</w:t>
             </w:r>
           </w:p>
         </w:tc>
@@ -11962,7 +12627,7 @@
         </w:tc>
         <w:tc>
           <w:tcPr>
-            <w:tcW w:type="dxa" w:w="4300"/>
+            <w:tcW w:type="dxa" w:w="3300"/>
             <w:tcBorders>
               <w:top w:val="none" w:color="FFFFFF" w:sz="0"/>
               <w:left w:val="none" w:color="FFFFFF" w:sz="0"/>
@@ -11991,7 +12656,7 @@
         </w:tc>
         <w:tc>
           <w:tcPr>
-            <w:tcW w:type="dxa" w:w="3000"/>
+            <w:tcW w:type="dxa" w:w="2500"/>
             <w:tcBorders>
               <w:top w:val="none" w:color="FFFFFF" w:sz="0"/>
               <w:left w:val="none" w:color="FFFFFF" w:sz="0"/>
@@ -12020,30 +12685,59 @@
         </w:tc>
         <w:tc>
           <w:tcPr>
-            <w:tcW w:type="dxa" w:w="1560"/>
-            <w:tcBorders>
-              <w:top w:val="none" w:color="FFFFFF" w:sz="0"/>
-              <w:left w:val="none" w:color="FFFFFF" w:sz="0"/>
-              <w:bottom w:val="none" w:color="FFFFFF" w:sz="0"/>
-              <w:right w:val="none" w:color="FFFFFF" w:sz="0"/>
-            </w:tcBorders>
-            <w:tcMar>
-              <w:top w:type="dxa" w:w="40"/>
-              <w:left w:type="dxa" w:w="80"/>
-              <w:bottom w:type="dxa" w:w="40"/>
-              <w:right w:type="dxa" w:w="80"/>
-            </w:tcMar>
-          </w:tcPr>
-          <w:p>
-            <w:pPr>
-              <w:spacing w:line="240"/>
-            </w:pPr>
-            <w:r>
-              <w:rPr>
-                <w:sz w:val="21"/>
-                <w:szCs w:val="21"/>
-              </w:rPr>
-              <w:t xml:space="preserve">Pendiente</w:t>
+            <w:tcW w:type="dxa" w:w="2060"/>
+            <w:tcBorders>
+              <w:top w:val="none" w:color="FFFFFF" w:sz="0"/>
+              <w:left w:val="none" w:color="FFFFFF" w:sz="0"/>
+              <w:bottom w:val="none" w:color="FFFFFF" w:sz="0"/>
+              <w:right w:val="none" w:color="FFFFFF" w:sz="0"/>
+            </w:tcBorders>
+            <w:tcMar>
+              <w:top w:type="dxa" w:w="40"/>
+              <w:left w:type="dxa" w:w="80"/>
+              <w:bottom w:type="dxa" w:w="40"/>
+              <w:right w:type="dxa" w:w="80"/>
+            </w:tcMar>
+          </w:tcPr>
+          <w:p>
+            <w:pPr>
+              <w:spacing w:line="240"/>
+            </w:pPr>
+            <w:r>
+              <w:rPr>
+                <w:sz w:val="21"/>
+                <w:szCs w:val="21"/>
+              </w:rPr>
+              <w:t xml:space="preserve">4 de 4 respuestas</w:t>
+            </w:r>
+          </w:p>
+        </w:tc>
+        <w:tc>
+          <w:tcPr>
+            <w:tcW w:type="dxa" w:w="1000"/>
+            <w:tcBorders>
+              <w:top w:val="none" w:color="FFFFFF" w:sz="0"/>
+              <w:left w:val="none" w:color="FFFFFF" w:sz="0"/>
+              <w:bottom w:val="none" w:color="FFFFFF" w:sz="0"/>
+              <w:right w:val="none" w:color="FFFFFF" w:sz="0"/>
+            </w:tcBorders>
+            <w:tcMar>
+              <w:top w:type="dxa" w:w="40"/>
+              <w:left w:type="dxa" w:w="80"/>
+              <w:bottom w:type="dxa" w:w="40"/>
+              <w:right w:type="dxa" w:w="80"/>
+            </w:tcMar>
+          </w:tcPr>
+          <w:p>
+            <w:pPr>
+              <w:spacing w:line="240"/>
+            </w:pPr>
+            <w:r>
+              <w:rPr>
+                <w:sz w:val="21"/>
+                <w:szCs w:val="21"/>
+              </w:rPr>
+              <w:t xml:space="preserve">11</w:t>
             </w:r>
           </w:p>
         </w:tc>
@@ -12083,7 +12777,7 @@
         </w:tc>
         <w:tc>
           <w:tcPr>
-            <w:tcW w:type="dxa" w:w="4300"/>
+            <w:tcW w:type="dxa" w:w="3300"/>
             <w:tcBorders>
               <w:top w:val="none" w:color="FFFFFF" w:sz="0"/>
               <w:left w:val="none" w:color="FFFFFF" w:sz="0"/>
@@ -12112,7 +12806,7 @@
         </w:tc>
         <w:tc>
           <w:tcPr>
-            <w:tcW w:type="dxa" w:w="3000"/>
+            <w:tcW w:type="dxa" w:w="2500"/>
             <w:tcBorders>
               <w:top w:val="none" w:color="FFFFFF" w:sz="0"/>
               <w:left w:val="none" w:color="FFFFFF" w:sz="0"/>
@@ -12141,30 +12835,59 @@
         </w:tc>
         <w:tc>
           <w:tcPr>
-            <w:tcW w:type="dxa" w:w="1560"/>
-            <w:tcBorders>
-              <w:top w:val="none" w:color="FFFFFF" w:sz="0"/>
-              <w:left w:val="none" w:color="FFFFFF" w:sz="0"/>
-              <w:bottom w:val="none" w:color="FFFFFF" w:sz="0"/>
-              <w:right w:val="none" w:color="FFFFFF" w:sz="0"/>
-            </w:tcBorders>
-            <w:tcMar>
-              <w:top w:type="dxa" w:w="40"/>
-              <w:left w:type="dxa" w:w="80"/>
-              <w:bottom w:type="dxa" w:w="40"/>
-              <w:right w:type="dxa" w:w="80"/>
-            </w:tcMar>
-          </w:tcPr>
-          <w:p>
-            <w:pPr>
-              <w:spacing w:line="240"/>
-            </w:pPr>
-            <w:r>
-              <w:rPr>
-                <w:sz w:val="21"/>
-                <w:szCs w:val="21"/>
-              </w:rPr>
-              <w:t xml:space="preserve">Pendiente</w:t>
+            <w:tcW w:type="dxa" w:w="2060"/>
+            <w:tcBorders>
+              <w:top w:val="none" w:color="FFFFFF" w:sz="0"/>
+              <w:left w:val="none" w:color="FFFFFF" w:sz="0"/>
+              <w:bottom w:val="none" w:color="FFFFFF" w:sz="0"/>
+              <w:right w:val="none" w:color="FFFFFF" w:sz="0"/>
+            </w:tcBorders>
+            <w:tcMar>
+              <w:top w:type="dxa" w:w="40"/>
+              <w:left w:type="dxa" w:w="80"/>
+              <w:bottom w:type="dxa" w:w="40"/>
+              <w:right w:type="dxa" w:w="80"/>
+            </w:tcMar>
+          </w:tcPr>
+          <w:p>
+            <w:pPr>
+              <w:spacing w:line="240"/>
+            </w:pPr>
+            <w:r>
+              <w:rPr>
+                <w:sz w:val="21"/>
+                <w:szCs w:val="21"/>
+              </w:rPr>
+              <w:t xml:space="preserve">4 de 4 respuestas</w:t>
+            </w:r>
+          </w:p>
+        </w:tc>
+        <w:tc>
+          <w:tcPr>
+            <w:tcW w:type="dxa" w:w="1000"/>
+            <w:tcBorders>
+              <w:top w:val="none" w:color="FFFFFF" w:sz="0"/>
+              <w:left w:val="none" w:color="FFFFFF" w:sz="0"/>
+              <w:bottom w:val="none" w:color="FFFFFF" w:sz="0"/>
+              <w:right w:val="none" w:color="FFFFFF" w:sz="0"/>
+            </w:tcBorders>
+            <w:tcMar>
+              <w:top w:type="dxa" w:w="40"/>
+              <w:left w:type="dxa" w:w="80"/>
+              <w:bottom w:type="dxa" w:w="40"/>
+              <w:right w:type="dxa" w:w="80"/>
+            </w:tcMar>
+          </w:tcPr>
+          <w:p>
+            <w:pPr>
+              <w:spacing w:line="240"/>
+            </w:pPr>
+            <w:r>
+              <w:rPr>
+                <w:sz w:val="21"/>
+                <w:szCs w:val="21"/>
+              </w:rPr>
+              <w:t xml:space="preserve">12</w:t>
             </w:r>
           </w:p>
         </w:tc>
@@ -12204,7 +12927,7 @@
         </w:tc>
         <w:tc>
           <w:tcPr>
-            <w:tcW w:type="dxa" w:w="4300"/>
+            <w:tcW w:type="dxa" w:w="3300"/>
             <w:tcBorders>
               <w:top w:val="none" w:color="FFFFFF" w:sz="0"/>
               <w:left w:val="none" w:color="FFFFFF" w:sz="0"/>
@@ -12233,7 +12956,7 @@
         </w:tc>
         <w:tc>
           <w:tcPr>
-            <w:tcW w:type="dxa" w:w="3000"/>
+            <w:tcW w:type="dxa" w:w="2500"/>
             <w:tcBorders>
               <w:top w:val="none" w:color="FFFFFF" w:sz="0"/>
               <w:left w:val="none" w:color="FFFFFF" w:sz="0"/>
@@ -12262,30 +12985,59 @@
         </w:tc>
         <w:tc>
           <w:tcPr>
-            <w:tcW w:type="dxa" w:w="1560"/>
-            <w:tcBorders>
-              <w:top w:val="none" w:color="FFFFFF" w:sz="0"/>
-              <w:left w:val="none" w:color="FFFFFF" w:sz="0"/>
-              <w:bottom w:val="none" w:color="FFFFFF" w:sz="0"/>
-              <w:right w:val="none" w:color="FFFFFF" w:sz="0"/>
-            </w:tcBorders>
-            <w:tcMar>
-              <w:top w:type="dxa" w:w="40"/>
-              <w:left w:type="dxa" w:w="80"/>
-              <w:bottom w:type="dxa" w:w="40"/>
-              <w:right w:type="dxa" w:w="80"/>
-            </w:tcMar>
-          </w:tcPr>
-          <w:p>
-            <w:pPr>
-              <w:spacing w:line="240"/>
-            </w:pPr>
-            <w:r>
-              <w:rPr>
-                <w:sz w:val="21"/>
-                <w:szCs w:val="21"/>
-              </w:rPr>
-              <w:t xml:space="preserve">Pendiente</w:t>
+            <w:tcW w:type="dxa" w:w="2060"/>
+            <w:tcBorders>
+              <w:top w:val="none" w:color="FFFFFF" w:sz="0"/>
+              <w:left w:val="none" w:color="FFFFFF" w:sz="0"/>
+              <w:bottom w:val="none" w:color="FFFFFF" w:sz="0"/>
+              <w:right w:val="none" w:color="FFFFFF" w:sz="0"/>
+            </w:tcBorders>
+            <w:tcMar>
+              <w:top w:type="dxa" w:w="40"/>
+              <w:left w:type="dxa" w:w="80"/>
+              <w:bottom w:type="dxa" w:w="40"/>
+              <w:right w:type="dxa" w:w="80"/>
+            </w:tcMar>
+          </w:tcPr>
+          <w:p>
+            <w:pPr>
+              <w:spacing w:line="240"/>
+            </w:pPr>
+            <w:r>
+              <w:rPr>
+                <w:sz w:val="21"/>
+                <w:szCs w:val="21"/>
+              </w:rPr>
+              <w:t xml:space="preserve">Correcto</w:t>
+            </w:r>
+          </w:p>
+        </w:tc>
+        <w:tc>
+          <w:tcPr>
+            <w:tcW w:type="dxa" w:w="1000"/>
+            <w:tcBorders>
+              <w:top w:val="none" w:color="FFFFFF" w:sz="0"/>
+              <w:left w:val="none" w:color="FFFFFF" w:sz="0"/>
+              <w:bottom w:val="none" w:color="FFFFFF" w:sz="0"/>
+              <w:right w:val="none" w:color="FFFFFF" w:sz="0"/>
+            </w:tcBorders>
+            <w:tcMar>
+              <w:top w:type="dxa" w:w="40"/>
+              <w:left w:type="dxa" w:w="80"/>
+              <w:bottom w:type="dxa" w:w="40"/>
+              <w:right w:type="dxa" w:w="80"/>
+            </w:tcMar>
+          </w:tcPr>
+          <w:p>
+            <w:pPr>
+              <w:spacing w:line="240"/>
+            </w:pPr>
+            <w:r>
+              <w:rPr>
+                <w:sz w:val="21"/>
+                <w:szCs w:val="21"/>
+              </w:rPr>
+              <w:t xml:space="preserve">4, 5</w:t>
             </w:r>
           </w:p>
         </w:tc>
@@ -12325,7 +13077,7 @@
         </w:tc>
         <w:tc>
           <w:tcPr>
-            <w:tcW w:type="dxa" w:w="4300"/>
+            <w:tcW w:type="dxa" w:w="3300"/>
             <w:tcBorders>
               <w:top w:val="none" w:color="FFFFFF" w:sz="0"/>
               <w:left w:val="none" w:color="FFFFFF" w:sz="0"/>
@@ -12354,7 +13106,7 @@
         </w:tc>
         <w:tc>
           <w:tcPr>
-            <w:tcW w:type="dxa" w:w="3000"/>
+            <w:tcW w:type="dxa" w:w="2500"/>
             <w:tcBorders>
               <w:top w:val="none" w:color="FFFFFF" w:sz="0"/>
               <w:left w:val="none" w:color="FFFFFF" w:sz="0"/>
@@ -12383,30 +13135,59 @@
         </w:tc>
         <w:tc>
           <w:tcPr>
-            <w:tcW w:type="dxa" w:w="1560"/>
-            <w:tcBorders>
-              <w:top w:val="none" w:color="FFFFFF" w:sz="0"/>
-              <w:left w:val="none" w:color="FFFFFF" w:sz="0"/>
-              <w:bottom w:val="none" w:color="FFFFFF" w:sz="0"/>
-              <w:right w:val="none" w:color="FFFFFF" w:sz="0"/>
-            </w:tcBorders>
-            <w:tcMar>
-              <w:top w:type="dxa" w:w="40"/>
-              <w:left w:type="dxa" w:w="80"/>
-              <w:bottom w:type="dxa" w:w="40"/>
-              <w:right w:type="dxa" w:w="80"/>
-            </w:tcMar>
-          </w:tcPr>
-          <w:p>
-            <w:pPr>
-              <w:spacing w:line="240"/>
-            </w:pPr>
-            <w:r>
-              <w:rPr>
-                <w:sz w:val="21"/>
-                <w:szCs w:val="21"/>
-              </w:rPr>
-              <w:t xml:space="preserve">Pendiente</w:t>
+            <w:tcW w:type="dxa" w:w="2060"/>
+            <w:tcBorders>
+              <w:top w:val="none" w:color="FFFFFF" w:sz="0"/>
+              <w:left w:val="none" w:color="FFFFFF" w:sz="0"/>
+              <w:bottom w:val="none" w:color="FFFFFF" w:sz="0"/>
+              <w:right w:val="none" w:color="FFFFFF" w:sz="0"/>
+            </w:tcBorders>
+            <w:tcMar>
+              <w:top w:type="dxa" w:w="40"/>
+              <w:left w:type="dxa" w:w="80"/>
+              <w:bottom w:type="dxa" w:w="40"/>
+              <w:right w:type="dxa" w:w="80"/>
+            </w:tcMar>
+          </w:tcPr>
+          <w:p>
+            <w:pPr>
+              <w:spacing w:line="240"/>
+            </w:pPr>
+            <w:r>
+              <w:rPr>
+                <w:sz w:val="21"/>
+                <w:szCs w:val="21"/>
+              </w:rPr>
+              <w:t xml:space="preserve">Correcto</w:t>
+            </w:r>
+          </w:p>
+        </w:tc>
+        <w:tc>
+          <w:tcPr>
+            <w:tcW w:type="dxa" w:w="1000"/>
+            <w:tcBorders>
+              <w:top w:val="none" w:color="FFFFFF" w:sz="0"/>
+              <w:left w:val="none" w:color="FFFFFF" w:sz="0"/>
+              <w:bottom w:val="none" w:color="FFFFFF" w:sz="0"/>
+              <w:right w:val="none" w:color="FFFFFF" w:sz="0"/>
+            </w:tcBorders>
+            <w:tcMar>
+              <w:top w:type="dxa" w:w="40"/>
+              <w:left w:type="dxa" w:w="80"/>
+              <w:bottom w:type="dxa" w:w="40"/>
+              <w:right w:type="dxa" w:w="80"/>
+            </w:tcMar>
+          </w:tcPr>
+          <w:p>
+            <w:pPr>
+              <w:spacing w:line="240"/>
+            </w:pPr>
+            <w:r>
+              <w:rPr>
+                <w:sz w:val="21"/>
+                <w:szCs w:val="21"/>
+              </w:rPr>
+              <w:t xml:space="preserve">5, 6</w:t>
             </w:r>
           </w:p>
         </w:tc>
@@ -12446,7 +13227,7 @@
         </w:tc>
         <w:tc>
           <w:tcPr>
-            <w:tcW w:type="dxa" w:w="4300"/>
+            <w:tcW w:type="dxa" w:w="3300"/>
             <w:tcBorders>
               <w:top w:val="none" w:color="FFFFFF" w:sz="0"/>
               <w:left w:val="none" w:color="FFFFFF" w:sz="0"/>
@@ -12475,7 +13256,7 @@
         </w:tc>
         <w:tc>
           <w:tcPr>
-            <w:tcW w:type="dxa" w:w="3000"/>
+            <w:tcW w:type="dxa" w:w="2500"/>
             <w:tcBorders>
               <w:top w:val="none" w:color="FFFFFF" w:sz="0"/>
               <w:left w:val="none" w:color="FFFFFF" w:sz="0"/>
@@ -12504,30 +13285,59 @@
         </w:tc>
         <w:tc>
           <w:tcPr>
-            <w:tcW w:type="dxa" w:w="1560"/>
-            <w:tcBorders>
-              <w:top w:val="none" w:color="FFFFFF" w:sz="0"/>
-              <w:left w:val="none" w:color="FFFFFF" w:sz="0"/>
-              <w:bottom w:val="none" w:color="FFFFFF" w:sz="0"/>
-              <w:right w:val="none" w:color="FFFFFF" w:sz="0"/>
-            </w:tcBorders>
-            <w:tcMar>
-              <w:top w:type="dxa" w:w="40"/>
-              <w:left w:type="dxa" w:w="80"/>
-              <w:bottom w:type="dxa" w:w="40"/>
-              <w:right w:type="dxa" w:w="80"/>
-            </w:tcMar>
-          </w:tcPr>
-          <w:p>
-            <w:pPr>
-              <w:spacing w:line="240"/>
-            </w:pPr>
-            <w:r>
-              <w:rPr>
-                <w:sz w:val="21"/>
-                <w:szCs w:val="21"/>
-              </w:rPr>
-              <w:t xml:space="preserve">Pendiente</w:t>
+            <w:tcW w:type="dxa" w:w="2060"/>
+            <w:tcBorders>
+              <w:top w:val="none" w:color="FFFFFF" w:sz="0"/>
+              <w:left w:val="none" w:color="FFFFFF" w:sz="0"/>
+              <w:bottom w:val="none" w:color="FFFFFF" w:sz="0"/>
+              <w:right w:val="none" w:color="FFFFFF" w:sz="0"/>
+            </w:tcBorders>
+            <w:tcMar>
+              <w:top w:type="dxa" w:w="40"/>
+              <w:left w:type="dxa" w:w="80"/>
+              <w:bottom w:type="dxa" w:w="40"/>
+              <w:right w:type="dxa" w:w="80"/>
+            </w:tcMar>
+          </w:tcPr>
+          <w:p>
+            <w:pPr>
+              <w:spacing w:line="240"/>
+            </w:pPr>
+            <w:r>
+              <w:rPr>
+                <w:sz w:val="21"/>
+                <w:szCs w:val="21"/>
+              </w:rPr>
+              <w:t xml:space="preserve">4 de 4; traducción a 203.0.113.1</w:t>
+            </w:r>
+          </w:p>
+        </w:tc>
+        <w:tc>
+          <w:tcPr>
+            <w:tcW w:type="dxa" w:w="1000"/>
+            <w:tcBorders>
+              <w:top w:val="none" w:color="FFFFFF" w:sz="0"/>
+              <w:left w:val="none" w:color="FFFFFF" w:sz="0"/>
+              <w:bottom w:val="none" w:color="FFFFFF" w:sz="0"/>
+              <w:right w:val="none" w:color="FFFFFF" w:sz="0"/>
+            </w:tcBorders>
+            <w:tcMar>
+              <w:top w:type="dxa" w:w="40"/>
+              <w:left w:type="dxa" w:w="80"/>
+              <w:bottom w:type="dxa" w:w="40"/>
+              <w:right w:type="dxa" w:w="80"/>
+            </w:tcMar>
+          </w:tcPr>
+          <w:p>
+            <w:pPr>
+              <w:spacing w:line="240"/>
+            </w:pPr>
+            <w:r>
+              <w:rPr>
+                <w:sz w:val="21"/>
+                <w:szCs w:val="21"/>
+              </w:rPr>
+              <w:t xml:space="preserve">13, 14</w:t>
             </w:r>
           </w:p>
         </w:tc>
@@ -12567,7 +13377,7 @@
         </w:tc>
         <w:tc>
           <w:tcPr>
-            <w:tcW w:type="dxa" w:w="4300"/>
+            <w:tcW w:type="dxa" w:w="3300"/>
             <w:tcBorders>
               <w:top w:val="none" w:color="FFFFFF" w:sz="0"/>
               <w:left w:val="none" w:color="FFFFFF" w:sz="0"/>
@@ -12596,7 +13406,7 @@
         </w:tc>
         <w:tc>
           <w:tcPr>
-            <w:tcW w:type="dxa" w:w="3000"/>
+            <w:tcW w:type="dxa" w:w="2500"/>
             <w:tcBorders>
               <w:top w:val="none" w:color="FFFFFF" w:sz="0"/>
               <w:left w:val="none" w:color="FFFFFF" w:sz="0"/>
@@ -12625,7 +13435,7 @@
         </w:tc>
         <w:tc>
           <w:tcPr>
-            <w:tcW w:type="dxa" w:w="1560"/>
+            <w:tcW w:type="dxa" w:w="2060"/>
             <w:tcBorders>
               <w:top w:val="none" w:color="FFFFFF" w:sz="0"/>
               <w:left w:val="none" w:color="FFFFFF" w:sz="0"/>
@@ -12648,7 +13458,36 @@
                 <w:sz w:val="21"/>
                 <w:szCs w:val="21"/>
               </w:rPr>
-              <w:t xml:space="preserve">Pendiente</w:t>
+              <w:t xml:space="preserve">12 asignaciones</w:t>
+            </w:r>
+          </w:p>
+        </w:tc>
+        <w:tc>
+          <w:tcPr>
+            <w:tcW w:type="dxa" w:w="1000"/>
+            <w:tcBorders>
+              <w:top w:val="none" w:color="FFFFFF" w:sz="0"/>
+              <w:left w:val="none" w:color="FFFFFF" w:sz="0"/>
+              <w:bottom w:val="single" w:color="000000" w:sz="6"/>
+              <w:right w:val="none" w:color="FFFFFF" w:sz="0"/>
+            </w:tcBorders>
+            <w:tcMar>
+              <w:top w:type="dxa" w:w="40"/>
+              <w:left w:type="dxa" w:w="80"/>
+              <w:bottom w:type="dxa" w:w="40"/>
+              <w:right w:type="dxa" w:w="80"/>
+            </w:tcMar>
+          </w:tcPr>
+          <w:p>
+            <w:pPr>
+              <w:spacing w:line="240"/>
+            </w:pPr>
+            <w:r>
+              <w:rPr>
+                <w:sz w:val="21"/>
+                <w:szCs w:val="21"/>
+              </w:rPr>
+              <w:t xml:space="preserve">8</w:t>
             </w:r>
           </w:p>
         </w:tc>
@@ -12666,7 +13505,467 @@
         <w:t xml:space="preserve">Nota.</w:t>
       </w:r>
       <w:r>
-        <w:t xml:space="preserve"> Cuando se ejecuten las pruebas en Packet Tracer, cada resultado se registra en la columna «Observado» y se respalda con una captura de pantalla.</w:t>
+        <w:t xml:space="preserve"> Las nueve pruebas dieron el resultado esperado.</w:t>
+      </w:r>
+    </w:p>
+    <w:p>
+      <w:pPr>
+        <w:keepNext/>
+      </w:pPr>
+      <w:r>
+        <w:rPr>
+          <w:b/>
+          <w:bCs/>
+        </w:rPr>
+        <w:t xml:space="preserve">Figura 9</w:t>
+      </w:r>
+    </w:p>
+    <w:p>
+      <w:pPr>
+        <w:keepNext/>
+      </w:pPr>
+      <w:r>
+        <w:rPr>
+          <w:i/>
+          <w:iCs/>
+        </w:rPr>
+        <w:t xml:space="preserve">Ping de PC-VEN1 a su gateway</w:t>
+      </w:r>
+    </w:p>
+    <w:p>
+      <w:pPr>
+        <w:keepNext/>
+        <w:spacing w:after="0" w:line="240"/>
+      </w:pPr>
+      <w:r>
+        <w:drawing>
+          <wp:inline distT="0" distB="0" distL="0" distR="0">
+            <wp:extent cx="4000000" cy="2040000"/>
+            <wp:effectExtent t="0" r="0" b="0" l="0"/>
+            <wp:docPr id="1009" name=""/>
+            <wp:cNvGraphicFramePr>
+              <a:graphicFrameLocks xmlns:a="http://schemas.openxmlformats.org/drawingml/2006/main" noChangeAspect="1"/>
+            </wp:cNvGraphicFramePr>
+            <a:graphic xmlns:a="http://schemas.openxmlformats.org/drawingml/2006/main">
+              <a:graphicData uri="http://schemas.openxmlformats.org/drawingml/2006/picture">
+                <pic:pic xmlns:pic="http://schemas.openxmlformats.org/drawingml/2006/picture">
+                  <pic:nvPicPr>
+                    <pic:cNvPr id="0" name="" descr=""/>
+                    <pic:cNvPicPr>
+                      <a:picLocks noChangeAspect="1" noChangeArrowheads="1"/>
+                    </pic:cNvPicPr>
+                  </pic:nvPicPr>
+                  <pic:blipFill>
+                    <a:blip r:embed="rIdFig9" cstate="none"/>
+                    <a:srcRect/>
+                    <a:stretch>
+                      <a:fillRect/>
+                    </a:stretch>
+                  </pic:blipFill>
+                  <pic:spPr bwMode="auto">
+                    <a:xfrm>
+                      <a:off x="0" y="0"/>
+                      <a:ext cx="4000000" cy="2040000"/>
+                    </a:xfrm>
+                    <a:prstGeom prst="rect">
+                      <a:avLst/>
+                    </a:prstGeom>
+                  </pic:spPr>
+                </pic:pic>
+              </a:graphicData>
+            </a:graphic>
+          </wp:inline>
+        </w:drawing>
+      </w:r>
+    </w:p>
+    <w:p>
+      <w:pPr>
+        <w:spacing w:after="240"/>
+      </w:pPr>
+    </w:p>
+    <w:p>
+      <w:pPr>
+        <w:keepNext/>
+      </w:pPr>
+      <w:r>
+        <w:rPr>
+          <w:b/>
+          <w:bCs/>
+        </w:rPr>
+        <w:t xml:space="preserve">Figura 10</w:t>
+      </w:r>
+    </w:p>
+    <w:p>
+      <w:pPr>
+        <w:keepNext/>
+      </w:pPr>
+      <w:r>
+        <w:rPr>
+          <w:i/>
+          <w:iCs/>
+        </w:rPr>
+        <w:t xml:space="preserve">Ping de PC-VEN1 a PC-OPE1 (otra subred del mismo router de piso)</w:t>
+      </w:r>
+    </w:p>
+    <w:p>
+      <w:pPr>
+        <w:keepNext/>
+        <w:spacing w:after="0" w:line="240"/>
+      </w:pPr>
+      <w:r>
+        <w:drawing>
+          <wp:inline distT="0" distB="0" distL="0" distR="0">
+            <wp:extent cx="4000000" cy="2040000"/>
+            <wp:effectExtent t="0" r="0" b="0" l="0"/>
+            <wp:docPr id="1010" name=""/>
+            <wp:cNvGraphicFramePr>
+              <a:graphicFrameLocks xmlns:a="http://schemas.openxmlformats.org/drawingml/2006/main" noChangeAspect="1"/>
+            </wp:cNvGraphicFramePr>
+            <a:graphic xmlns:a="http://schemas.openxmlformats.org/drawingml/2006/main">
+              <a:graphicData uri="http://schemas.openxmlformats.org/drawingml/2006/picture">
+                <pic:pic xmlns:pic="http://schemas.openxmlformats.org/drawingml/2006/picture">
+                  <pic:nvPicPr>
+                    <pic:cNvPr id="0" name="" descr=""/>
+                    <pic:cNvPicPr>
+                      <a:picLocks noChangeAspect="1" noChangeArrowheads="1"/>
+                    </pic:cNvPicPr>
+                  </pic:nvPicPr>
+                  <pic:blipFill>
+                    <a:blip r:embed="rIdFig10" cstate="none"/>
+                    <a:srcRect/>
+                    <a:stretch>
+                      <a:fillRect/>
+                    </a:stretch>
+                  </pic:blipFill>
+                  <pic:spPr bwMode="auto">
+                    <a:xfrm>
+                      <a:off x="0" y="0"/>
+                      <a:ext cx="4000000" cy="2040000"/>
+                    </a:xfrm>
+                    <a:prstGeom prst="rect">
+                      <a:avLst/>
+                    </a:prstGeom>
+                  </pic:spPr>
+                </pic:pic>
+              </a:graphicData>
+            </a:graphic>
+          </wp:inline>
+        </w:drawing>
+      </w:r>
+    </w:p>
+    <w:p>
+      <w:pPr>
+        <w:spacing w:after="240"/>
+      </w:pPr>
+    </w:p>
+    <w:p>
+      <w:pPr>
+        <w:keepNext/>
+      </w:pPr>
+      <w:r>
+        <w:rPr>
+          <w:b/>
+          <w:bCs/>
+        </w:rPr>
+        <w:t xml:space="preserve">Figura 11</w:t>
+      </w:r>
+    </w:p>
+    <w:p>
+      <w:pPr>
+        <w:keepNext/>
+      </w:pPr>
+      <w:r>
+        <w:rPr>
+          <w:i/>
+          <w:iCs/>
+        </w:rPr>
+        <w:t xml:space="preserve">Ping de PC-VEN1 al servidor SRV-TI</w:t>
+      </w:r>
+    </w:p>
+    <w:p>
+      <w:pPr>
+        <w:keepNext/>
+        <w:spacing w:after="0" w:line="240"/>
+      </w:pPr>
+      <w:r>
+        <w:drawing>
+          <wp:inline distT="0" distB="0" distL="0" distR="0">
+            <wp:extent cx="4000000" cy="2040000"/>
+            <wp:effectExtent t="0" r="0" b="0" l="0"/>
+            <wp:docPr id="1011" name=""/>
+            <wp:cNvGraphicFramePr>
+              <a:graphicFrameLocks xmlns:a="http://schemas.openxmlformats.org/drawingml/2006/main" noChangeAspect="1"/>
+            </wp:cNvGraphicFramePr>
+            <a:graphic xmlns:a="http://schemas.openxmlformats.org/drawingml/2006/main">
+              <a:graphicData uri="http://schemas.openxmlformats.org/drawingml/2006/picture">
+                <pic:pic xmlns:pic="http://schemas.openxmlformats.org/drawingml/2006/picture">
+                  <pic:nvPicPr>
+                    <pic:cNvPr id="0" name="" descr=""/>
+                    <pic:cNvPicPr>
+                      <a:picLocks noChangeAspect="1" noChangeArrowheads="1"/>
+                    </pic:cNvPicPr>
+                  </pic:nvPicPr>
+                  <pic:blipFill>
+                    <a:blip r:embed="rIdFig11" cstate="none"/>
+                    <a:srcRect/>
+                    <a:stretch>
+                      <a:fillRect/>
+                    </a:stretch>
+                  </pic:blipFill>
+                  <pic:spPr bwMode="auto">
+                    <a:xfrm>
+                      <a:off x="0" y="0"/>
+                      <a:ext cx="4000000" cy="2040000"/>
+                    </a:xfrm>
+                    <a:prstGeom prst="rect">
+                      <a:avLst/>
+                    </a:prstGeom>
+                  </pic:spPr>
+                </pic:pic>
+              </a:graphicData>
+            </a:graphic>
+          </wp:inline>
+        </w:drawing>
+      </w:r>
+    </w:p>
+    <w:p>
+      <w:pPr>
+        <w:spacing w:after="240"/>
+      </w:pPr>
+    </w:p>
+    <w:p>
+      <w:pPr>
+        <w:keepNext/>
+      </w:pPr>
+      <w:r>
+        <w:rPr>
+          <w:b/>
+          <w:bCs/>
+        </w:rPr>
+        <w:t xml:space="preserve">Figura 12</w:t>
+      </w:r>
+    </w:p>
+    <w:p>
+      <w:pPr>
+        <w:keepNext/>
+      </w:pPr>
+      <w:r>
+        <w:rPr>
+          <w:i/>
+          <w:iCs/>
+        </w:rPr>
+        <w:t xml:space="preserve">Ping de PC-CAP1 a PC-FIN1 (routers de piso distintos)</w:t>
+      </w:r>
+    </w:p>
+    <w:p>
+      <w:pPr>
+        <w:keepNext/>
+        <w:spacing w:after="0" w:line="240"/>
+      </w:pPr>
+      <w:r>
+        <w:drawing>
+          <wp:inline distT="0" distB="0" distL="0" distR="0">
+            <wp:extent cx="3860000" cy="2040000"/>
+            <wp:effectExtent t="0" r="0" b="0" l="0"/>
+            <wp:docPr id="1012" name=""/>
+            <wp:cNvGraphicFramePr>
+              <a:graphicFrameLocks xmlns:a="http://schemas.openxmlformats.org/drawingml/2006/main" noChangeAspect="1"/>
+            </wp:cNvGraphicFramePr>
+            <a:graphic xmlns:a="http://schemas.openxmlformats.org/drawingml/2006/main">
+              <a:graphicData uri="http://schemas.openxmlformats.org/drawingml/2006/picture">
+                <pic:pic xmlns:pic="http://schemas.openxmlformats.org/drawingml/2006/picture">
+                  <pic:nvPicPr>
+                    <pic:cNvPr id="0" name="" descr=""/>
+                    <pic:cNvPicPr>
+                      <a:picLocks noChangeAspect="1" noChangeArrowheads="1"/>
+                    </pic:cNvPicPr>
+                  </pic:nvPicPr>
+                  <pic:blipFill>
+                    <a:blip r:embed="rIdFig12" cstate="none"/>
+                    <a:srcRect/>
+                    <a:stretch>
+                      <a:fillRect/>
+                    </a:stretch>
+                  </pic:blipFill>
+                  <pic:spPr bwMode="auto">
+                    <a:xfrm>
+                      <a:off x="0" y="0"/>
+                      <a:ext cx="3860000" cy="2040000"/>
+                    </a:xfrm>
+                    <a:prstGeom prst="rect">
+                      <a:avLst/>
+                    </a:prstGeom>
+                  </pic:spPr>
+                </pic:pic>
+              </a:graphicData>
+            </a:graphic>
+          </wp:inline>
+        </w:drawing>
+      </w:r>
+    </w:p>
+    <w:p>
+      <w:pPr>
+        <w:spacing w:after="240"/>
+      </w:pPr>
+    </w:p>
+    <w:p>
+      <w:pPr>
+        <w:keepNext/>
+      </w:pPr>
+      <w:r>
+        <w:rPr>
+          <w:b/>
+          <w:bCs/>
+        </w:rPr>
+        <w:t xml:space="preserve">Figura 13</w:t>
+      </w:r>
+    </w:p>
+    <w:p>
+      <w:pPr>
+        <w:keepNext/>
+      </w:pPr>
+      <w:r>
+        <w:rPr>
+          <w:i/>
+          <w:iCs/>
+        </w:rPr>
+        <w:t xml:space="preserve">Ping de PC-VEN1 al servidor externo WEB-EXT</w:t>
+      </w:r>
+    </w:p>
+    <w:p>
+      <w:pPr>
+        <w:keepNext/>
+        <w:spacing w:after="0" w:line="240"/>
+      </w:pPr>
+      <w:r>
+        <w:drawing>
+          <wp:inline distT="0" distB="0" distL="0" distR="0">
+            <wp:extent cx="4000000" cy="2040000"/>
+            <wp:effectExtent t="0" r="0" b="0" l="0"/>
+            <wp:docPr id="1013" name=""/>
+            <wp:cNvGraphicFramePr>
+              <a:graphicFrameLocks xmlns:a="http://schemas.openxmlformats.org/drawingml/2006/main" noChangeAspect="1"/>
+            </wp:cNvGraphicFramePr>
+            <a:graphic xmlns:a="http://schemas.openxmlformats.org/drawingml/2006/main">
+              <a:graphicData uri="http://schemas.openxmlformats.org/drawingml/2006/picture">
+                <pic:pic xmlns:pic="http://schemas.openxmlformats.org/drawingml/2006/picture">
+                  <pic:nvPicPr>
+                    <pic:cNvPr id="0" name="" descr=""/>
+                    <pic:cNvPicPr>
+                      <a:picLocks noChangeAspect="1" noChangeArrowheads="1"/>
+                    </pic:cNvPicPr>
+                  </pic:nvPicPr>
+                  <pic:blipFill>
+                    <a:blip r:embed="rIdFig13" cstate="none"/>
+                    <a:srcRect/>
+                    <a:stretch>
+                      <a:fillRect/>
+                    </a:stretch>
+                  </pic:blipFill>
+                  <pic:spPr bwMode="auto">
+                    <a:xfrm>
+                      <a:off x="0" y="0"/>
+                      <a:ext cx="4000000" cy="2040000"/>
+                    </a:xfrm>
+                    <a:prstGeom prst="rect">
+                      <a:avLst/>
+                    </a:prstGeom>
+                  </pic:spPr>
+                </pic:pic>
+              </a:graphicData>
+            </a:graphic>
+          </wp:inline>
+        </w:drawing>
+      </w:r>
+    </w:p>
+    <w:p>
+      <w:pPr>
+        <w:spacing w:after="240"/>
+      </w:pPr>
+    </w:p>
+    <w:p>
+      <w:pPr>
+        <w:keepNext/>
+      </w:pPr>
+      <w:r>
+        <w:rPr>
+          <w:b/>
+          <w:bCs/>
+        </w:rPr>
+        <w:t xml:space="preserve">Figura 14</w:t>
+      </w:r>
+    </w:p>
+    <w:p>
+      <w:pPr>
+        <w:keepNext/>
+      </w:pPr>
+      <w:r>
+        <w:rPr>
+          <w:i/>
+          <w:iCs/>
+        </w:rPr>
+        <w:t xml:space="preserve">Tabla de traducciones NAT en R-CRG</w:t>
+      </w:r>
+    </w:p>
+    <w:p>
+      <w:pPr>
+        <w:keepNext/>
+        <w:spacing w:after="0" w:line="240"/>
+      </w:pPr>
+      <w:r>
+        <w:drawing>
+          <wp:inline distT="0" distB="0" distL="0" distR="0">
+            <wp:extent cx="5280000" cy="1040000"/>
+            <wp:effectExtent t="0" r="0" b="0" l="0"/>
+            <wp:docPr id="1014" name=""/>
+            <wp:cNvGraphicFramePr>
+              <a:graphicFrameLocks xmlns:a="http://schemas.openxmlformats.org/drawingml/2006/main" noChangeAspect="1"/>
+            </wp:cNvGraphicFramePr>
+            <a:graphic xmlns:a="http://schemas.openxmlformats.org/drawingml/2006/main">
+              <a:graphicData uri="http://schemas.openxmlformats.org/drawingml/2006/picture">
+                <pic:pic xmlns:pic="http://schemas.openxmlformats.org/drawingml/2006/picture">
+                  <pic:nvPicPr>
+                    <pic:cNvPr id="0" name="" descr=""/>
+                    <pic:cNvPicPr>
+                      <a:picLocks noChangeAspect="1" noChangeArrowheads="1"/>
+                    </pic:cNvPicPr>
+                  </pic:nvPicPr>
+                  <pic:blipFill>
+                    <a:blip r:embed="rIdFig14" cstate="none"/>
+                    <a:srcRect/>
+                    <a:stretch>
+                      <a:fillRect/>
+                    </a:stretch>
+                  </pic:blipFill>
+                  <pic:spPr bwMode="auto">
+                    <a:xfrm>
+                      <a:off x="0" y="0"/>
+                      <a:ext cx="5280000" cy="1040000"/>
+                    </a:xfrm>
+                    <a:prstGeom prst="rect">
+                      <a:avLst/>
+                    </a:prstGeom>
+                  </pic:spPr>
+                </pic:pic>
+              </a:graphicData>
+            </a:graphic>
+          </wp:inline>
+        </w:drawing>
+      </w:r>
+    </w:p>
+    <w:p>
+      <w:pPr>
+        <w:spacing w:after="360"/>
+      </w:pPr>
+      <w:r>
+        <w:rPr>
+          <w:i/>
+          <w:iCs/>
+        </w:rPr>
+        <w:t xml:space="preserve">Nota.</w:t>
+      </w:r>
+      <w:r>
+        <w:t xml:space="preserve"> La dirección privada 10.20.0.6 (PC-VEN1) sale hacia afuera como 203.0.113.1.</w:t>
       </w:r>
     </w:p>
     <w:p>
@@ -14372,7 +15671,7 @@
         <w:ind w:firstLine="720"/>
       </w:pPr>
       <w:r>
-        <w:t xml:space="preserve">Se diseñó la red de Crestline Group para 300 computadoras en seis áreas: diez subredes calculadas con VLSM (seis de área y cuatro enlaces punto a punto), un router central con tres routers de piso unidos por rutas estáticas, DHCP centralizado con reenvío desde los routers de piso y NAT hacia una red externa simulada. Las nueve pruebas de la matriz de aceptación se ejecutarán sobre la red construida en Packet Tracer.</w:t>
+        <w:t xml:space="preserve">Se diseñó la red de Crestline Group para 300 computadoras en seis áreas: diez subredes calculadas con VLSM (seis de área y cuatro enlaces punto a punto), un router central con tres routers de piso unidos por rutas estáticas, DHCP centralizado con reenvío desde los routers de piso y NAT hacia una red externa simulada. Las nueve pruebas de la matriz de aceptación dieron el resultado esperado y quedaron registradas con capturas.</w:t>
       </w:r>
     </w:p>
     <w:p>
@@ -14812,14 +16111,14 @@
         <w:tblW w:type="dxa" w:w="9360"/>
       </w:tblPr>
       <w:tblGrid>
-        <w:gridCol w:w="440"/>
-        <w:gridCol w:w="2350"/>
-        <w:gridCol w:w="1060"/>
-        <w:gridCol w:w="860"/>
-        <w:gridCol w:w="1800"/>
-        <w:gridCol w:w="1220"/>
-        <w:gridCol w:w="1080"/>
-        <w:gridCol w:w="550"/>
+        <w:gridCol w:w="420"/>
+        <w:gridCol w:w="2150"/>
+        <w:gridCol w:w="1000"/>
+        <w:gridCol w:w="820"/>
+        <w:gridCol w:w="1750"/>
+        <w:gridCol w:w="1200"/>
+        <w:gridCol w:w="1100"/>
+        <w:gridCol w:w="920"/>
       </w:tblGrid>
       <w:tr>
         <w:trPr>
@@ -14827,7 +16126,7 @@
         </w:trPr>
         <w:tc>
           <w:tcPr>
-            <w:tcW w:type="dxa" w:w="440"/>
+            <w:tcW w:type="dxa" w:w="420"/>
             <w:tcBorders>
               <w:top w:val="single" w:color="000000" w:sz="6"/>
               <w:left w:val="none" w:color="FFFFFF" w:sz="0"/>
@@ -14858,7 +16157,7 @@
         </w:tc>
         <w:tc>
           <w:tcPr>
-            <w:tcW w:type="dxa" w:w="2350"/>
+            <w:tcW w:type="dxa" w:w="2150"/>
             <w:tcBorders>
               <w:top w:val="single" w:color="000000" w:sz="6"/>
               <w:left w:val="none" w:color="FFFFFF" w:sz="0"/>
@@ -14889,7 +16188,7 @@
         </w:tc>
         <w:tc>
           <w:tcPr>
-            <w:tcW w:type="dxa" w:w="1060"/>
+            <w:tcW w:type="dxa" w:w="1000"/>
             <w:tcBorders>
               <w:top w:val="single" w:color="000000" w:sz="6"/>
               <w:left w:val="none" w:color="FFFFFF" w:sz="0"/>
@@ -14920,7 +16219,7 @@
         </w:tc>
         <w:tc>
           <w:tcPr>
-            <w:tcW w:type="dxa" w:w="860"/>
+            <w:tcW w:type="dxa" w:w="820"/>
             <w:tcBorders>
               <w:top w:val="single" w:color="000000" w:sz="6"/>
               <w:left w:val="none" w:color="FFFFFF" w:sz="0"/>
@@ -14951,7 +16250,7 @@
         </w:tc>
         <w:tc>
           <w:tcPr>
-            <w:tcW w:type="dxa" w:w="1800"/>
+            <w:tcW w:type="dxa" w:w="1750"/>
             <w:tcBorders>
               <w:top w:val="single" w:color="000000" w:sz="6"/>
               <w:left w:val="none" w:color="FFFFFF" w:sz="0"/>
@@ -14982,7 +16281,7 @@
         </w:tc>
         <w:tc>
           <w:tcPr>
-            <w:tcW w:type="dxa" w:w="1220"/>
+            <w:tcW w:type="dxa" w:w="1200"/>
             <w:tcBorders>
               <w:top w:val="single" w:color="000000" w:sz="6"/>
               <w:left w:val="none" w:color="FFFFFF" w:sz="0"/>
@@ -15013,7 +16312,7 @@
         </w:tc>
         <w:tc>
           <w:tcPr>
-            <w:tcW w:type="dxa" w:w="1080"/>
+            <w:tcW w:type="dxa" w:w="1100"/>
             <w:tcBorders>
               <w:top w:val="single" w:color="000000" w:sz="6"/>
               <w:left w:val="none" w:color="FFFFFF" w:sz="0"/>
@@ -15044,7 +16343,7 @@
         </w:tc>
         <w:tc>
           <w:tcPr>
-            <w:tcW w:type="dxa" w:w="550"/>
+            <w:tcW w:type="dxa" w:w="920"/>
             <w:tcBorders>
               <w:top w:val="single" w:color="000000" w:sz="6"/>
               <w:left w:val="none" w:color="FFFFFF" w:sz="0"/>
@@ -15080,7 +16379,7 @@
         </w:trPr>
         <w:tc>
           <w:tcPr>
-            <w:tcW w:type="dxa" w:w="440"/>
+            <w:tcW w:type="dxa" w:w="420"/>
             <w:tcBorders>
               <w:top w:val="none" w:color="FFFFFF" w:sz="0"/>
               <w:left w:val="none" w:color="FFFFFF" w:sz="0"/>
@@ -15109,7 +16408,7 @@
         </w:tc>
         <w:tc>
           <w:tcPr>
-            <w:tcW w:type="dxa" w:w="2350"/>
+            <w:tcW w:type="dxa" w:w="2150"/>
             <w:tcBorders>
               <w:top w:val="none" w:color="FFFFFF" w:sz="0"/>
               <w:left w:val="none" w:color="FFFFFF" w:sz="0"/>
@@ -15138,7 +16437,7 @@
         </w:tc>
         <w:tc>
           <w:tcPr>
-            <w:tcW w:type="dxa" w:w="1060"/>
+            <w:tcW w:type="dxa" w:w="1000"/>
             <w:tcBorders>
               <w:top w:val="none" w:color="FFFFFF" w:sz="0"/>
               <w:left w:val="none" w:color="FFFFFF" w:sz="0"/>
@@ -15167,7 +16466,7 @@
         </w:tc>
         <w:tc>
           <w:tcPr>
-            <w:tcW w:type="dxa" w:w="860"/>
+            <w:tcW w:type="dxa" w:w="820"/>
             <w:tcBorders>
               <w:top w:val="none" w:color="FFFFFF" w:sz="0"/>
               <w:left w:val="none" w:color="FFFFFF" w:sz="0"/>
@@ -15196,7 +16495,7 @@
         </w:tc>
         <w:tc>
           <w:tcPr>
-            <w:tcW w:type="dxa" w:w="1800"/>
+            <w:tcW w:type="dxa" w:w="1750"/>
             <w:tcBorders>
               <w:top w:val="none" w:color="FFFFFF" w:sz="0"/>
               <w:left w:val="none" w:color="FFFFFF" w:sz="0"/>
@@ -15225,7 +16524,7 @@
         </w:tc>
         <w:tc>
           <w:tcPr>
-            <w:tcW w:type="dxa" w:w="1220"/>
+            <w:tcW w:type="dxa" w:w="1200"/>
             <w:tcBorders>
               <w:top w:val="none" w:color="FFFFFF" w:sz="0"/>
               <w:left w:val="none" w:color="FFFFFF" w:sz="0"/>
@@ -15254,7 +16553,7 @@
         </w:tc>
         <w:tc>
           <w:tcPr>
-            <w:tcW w:type="dxa" w:w="1080"/>
+            <w:tcW w:type="dxa" w:w="1100"/>
             <w:tcBorders>
               <w:top w:val="none" w:color="FFFFFF" w:sz="0"/>
               <w:left w:val="none" w:color="FFFFFF" w:sz="0"/>
@@ -15283,7 +16582,7 @@
         </w:tc>
         <w:tc>
           <w:tcPr>
-            <w:tcW w:type="dxa" w:w="550"/>
+            <w:tcW w:type="dxa" w:w="920"/>
             <w:tcBorders>
               <w:top w:val="none" w:color="FFFFFF" w:sz="0"/>
               <w:left w:val="none" w:color="FFFFFF" w:sz="0"/>
@@ -15317,7 +16616,7 @@
         </w:trPr>
         <w:tc>
           <w:tcPr>
-            <w:tcW w:type="dxa" w:w="440"/>
+            <w:tcW w:type="dxa" w:w="420"/>
             <w:tcBorders>
               <w:top w:val="none" w:color="FFFFFF" w:sz="0"/>
               <w:left w:val="none" w:color="FFFFFF" w:sz="0"/>
@@ -15346,7 +16645,7 @@
         </w:tc>
         <w:tc>
           <w:tcPr>
-            <w:tcW w:type="dxa" w:w="2350"/>
+            <w:tcW w:type="dxa" w:w="2150"/>
             <w:tcBorders>
               <w:top w:val="none" w:color="FFFFFF" w:sz="0"/>
               <w:left w:val="none" w:color="FFFFFF" w:sz="0"/>
@@ -15375,7 +16674,7 @@
         </w:tc>
         <w:tc>
           <w:tcPr>
-            <w:tcW w:type="dxa" w:w="1060"/>
+            <w:tcW w:type="dxa" w:w="1000"/>
             <w:tcBorders>
               <w:top w:val="none" w:color="FFFFFF" w:sz="0"/>
               <w:left w:val="none" w:color="FFFFFF" w:sz="0"/>
@@ -15404,7 +16703,7 @@
         </w:tc>
         <w:tc>
           <w:tcPr>
-            <w:tcW w:type="dxa" w:w="860"/>
+            <w:tcW w:type="dxa" w:w="820"/>
             <w:tcBorders>
               <w:top w:val="none" w:color="FFFFFF" w:sz="0"/>
               <w:left w:val="none" w:color="FFFFFF" w:sz="0"/>
@@ -15433,7 +16732,7 @@
         </w:tc>
         <w:tc>
           <w:tcPr>
-            <w:tcW w:type="dxa" w:w="1800"/>
+            <w:tcW w:type="dxa" w:w="1750"/>
             <w:tcBorders>
               <w:top w:val="none" w:color="FFFFFF" w:sz="0"/>
               <w:left w:val="none" w:color="FFFFFF" w:sz="0"/>
@@ -15462,7 +16761,7 @@
         </w:tc>
         <w:tc>
           <w:tcPr>
-            <w:tcW w:type="dxa" w:w="1220"/>
+            <w:tcW w:type="dxa" w:w="1200"/>
             <w:tcBorders>
               <w:top w:val="none" w:color="FFFFFF" w:sz="0"/>
               <w:left w:val="none" w:color="FFFFFF" w:sz="0"/>
@@ -15491,7 +16790,7 @@
         </w:tc>
         <w:tc>
           <w:tcPr>
-            <w:tcW w:type="dxa" w:w="1080"/>
+            <w:tcW w:type="dxa" w:w="1100"/>
             <w:tcBorders>
               <w:top w:val="none" w:color="FFFFFF" w:sz="0"/>
               <w:left w:val="none" w:color="FFFFFF" w:sz="0"/>
@@ -15520,7 +16819,7 @@
         </w:tc>
         <w:tc>
           <w:tcPr>
-            <w:tcW w:type="dxa" w:w="550"/>
+            <w:tcW w:type="dxa" w:w="920"/>
             <w:tcBorders>
               <w:top w:val="none" w:color="FFFFFF" w:sz="0"/>
               <w:left w:val="none" w:color="FFFFFF" w:sz="0"/>
@@ -15554,7 +16853,7 @@
         </w:trPr>
         <w:tc>
           <w:tcPr>
-            <w:tcW w:type="dxa" w:w="440"/>
+            <w:tcW w:type="dxa" w:w="420"/>
             <w:tcBorders>
               <w:top w:val="none" w:color="FFFFFF" w:sz="0"/>
               <w:left w:val="none" w:color="FFFFFF" w:sz="0"/>
@@ -15583,7 +16882,7 @@
         </w:tc>
         <w:tc>
           <w:tcPr>
-            <w:tcW w:type="dxa" w:w="2350"/>
+            <w:tcW w:type="dxa" w:w="2150"/>
             <w:tcBorders>
               <w:top w:val="none" w:color="FFFFFF" w:sz="0"/>
               <w:left w:val="none" w:color="FFFFFF" w:sz="0"/>
@@ -15612,7 +16911,7 @@
         </w:tc>
         <w:tc>
           <w:tcPr>
-            <w:tcW w:type="dxa" w:w="1060"/>
+            <w:tcW w:type="dxa" w:w="1000"/>
             <w:tcBorders>
               <w:top w:val="none" w:color="FFFFFF" w:sz="0"/>
               <w:left w:val="none" w:color="FFFFFF" w:sz="0"/>
@@ -15641,7 +16940,7 @@
         </w:tc>
         <w:tc>
           <w:tcPr>
-            <w:tcW w:type="dxa" w:w="860"/>
+            <w:tcW w:type="dxa" w:w="820"/>
             <w:tcBorders>
               <w:top w:val="none" w:color="FFFFFF" w:sz="0"/>
               <w:left w:val="none" w:color="FFFFFF" w:sz="0"/>
@@ -15670,7 +16969,7 @@
         </w:tc>
         <w:tc>
           <w:tcPr>
-            <w:tcW w:type="dxa" w:w="1800"/>
+            <w:tcW w:type="dxa" w:w="1750"/>
             <w:tcBorders>
               <w:top w:val="none" w:color="FFFFFF" w:sz="0"/>
               <w:left w:val="none" w:color="FFFFFF" w:sz="0"/>
@@ -15699,7 +16998,7 @@
         </w:tc>
         <w:tc>
           <w:tcPr>
-            <w:tcW w:type="dxa" w:w="1220"/>
+            <w:tcW w:type="dxa" w:w="1200"/>
             <w:tcBorders>
               <w:top w:val="none" w:color="FFFFFF" w:sz="0"/>
               <w:left w:val="none" w:color="FFFFFF" w:sz="0"/>
@@ -15728,7 +17027,7 @@
         </w:tc>
         <w:tc>
           <w:tcPr>
-            <w:tcW w:type="dxa" w:w="1080"/>
+            <w:tcW w:type="dxa" w:w="1100"/>
             <w:tcBorders>
               <w:top w:val="none" w:color="FFFFFF" w:sz="0"/>
               <w:left w:val="none" w:color="FFFFFF" w:sz="0"/>
@@ -15757,7 +17056,7 @@
         </w:tc>
         <w:tc>
           <w:tcPr>
-            <w:tcW w:type="dxa" w:w="550"/>
+            <w:tcW w:type="dxa" w:w="920"/>
             <w:tcBorders>
               <w:top w:val="none" w:color="FFFFFF" w:sz="0"/>
               <w:left w:val="none" w:color="FFFFFF" w:sz="0"/>
@@ -15791,7 +17090,7 @@
         </w:trPr>
         <w:tc>
           <w:tcPr>
-            <w:tcW w:type="dxa" w:w="440"/>
+            <w:tcW w:type="dxa" w:w="420"/>
             <w:tcBorders>
               <w:top w:val="none" w:color="FFFFFF" w:sz="0"/>
               <w:left w:val="none" w:color="FFFFFF" w:sz="0"/>
@@ -15820,7 +17119,7 @@
         </w:tc>
         <w:tc>
           <w:tcPr>
-            <w:tcW w:type="dxa" w:w="2350"/>
+            <w:tcW w:type="dxa" w:w="2150"/>
             <w:tcBorders>
               <w:top w:val="none" w:color="FFFFFF" w:sz="0"/>
               <w:left w:val="none" w:color="FFFFFF" w:sz="0"/>
@@ -15849,7 +17148,7 @@
         </w:tc>
         <w:tc>
           <w:tcPr>
-            <w:tcW w:type="dxa" w:w="1060"/>
+            <w:tcW w:type="dxa" w:w="1000"/>
             <w:tcBorders>
               <w:top w:val="none" w:color="FFFFFF" w:sz="0"/>
               <w:left w:val="none" w:color="FFFFFF" w:sz="0"/>
@@ -15878,7 +17177,7 @@
         </w:tc>
         <w:tc>
           <w:tcPr>
-            <w:tcW w:type="dxa" w:w="860"/>
+            <w:tcW w:type="dxa" w:w="820"/>
             <w:tcBorders>
               <w:top w:val="none" w:color="FFFFFF" w:sz="0"/>
               <w:left w:val="none" w:color="FFFFFF" w:sz="0"/>
@@ -15907,7 +17206,7 @@
         </w:tc>
         <w:tc>
           <w:tcPr>
-            <w:tcW w:type="dxa" w:w="1800"/>
+            <w:tcW w:type="dxa" w:w="1750"/>
             <w:tcBorders>
               <w:top w:val="none" w:color="FFFFFF" w:sz="0"/>
               <w:left w:val="none" w:color="FFFFFF" w:sz="0"/>
@@ -15936,7 +17235,7 @@
         </w:tc>
         <w:tc>
           <w:tcPr>
-            <w:tcW w:type="dxa" w:w="1220"/>
+            <w:tcW w:type="dxa" w:w="1200"/>
             <w:tcBorders>
               <w:top w:val="none" w:color="FFFFFF" w:sz="0"/>
               <w:left w:val="none" w:color="FFFFFF" w:sz="0"/>
@@ -15965,7 +17264,7 @@
         </w:tc>
         <w:tc>
           <w:tcPr>
-            <w:tcW w:type="dxa" w:w="1080"/>
+            <w:tcW w:type="dxa" w:w="1100"/>
             <w:tcBorders>
               <w:top w:val="none" w:color="FFFFFF" w:sz="0"/>
               <w:left w:val="none" w:color="FFFFFF" w:sz="0"/>
@@ -15994,7 +17293,7 @@
         </w:tc>
         <w:tc>
           <w:tcPr>
-            <w:tcW w:type="dxa" w:w="550"/>
+            <w:tcW w:type="dxa" w:w="920"/>
             <w:tcBorders>
               <w:top w:val="none" w:color="FFFFFF" w:sz="0"/>
               <w:left w:val="none" w:color="FFFFFF" w:sz="0"/>
@@ -16028,7 +17327,7 @@
         </w:trPr>
         <w:tc>
           <w:tcPr>
-            <w:tcW w:type="dxa" w:w="440"/>
+            <w:tcW w:type="dxa" w:w="420"/>
             <w:tcBorders>
               <w:top w:val="none" w:color="FFFFFF" w:sz="0"/>
               <w:left w:val="none" w:color="FFFFFF" w:sz="0"/>
@@ -16057,7 +17356,7 @@
         </w:tc>
         <w:tc>
           <w:tcPr>
-            <w:tcW w:type="dxa" w:w="2350"/>
+            <w:tcW w:type="dxa" w:w="2150"/>
             <w:tcBorders>
               <w:top w:val="none" w:color="FFFFFF" w:sz="0"/>
               <w:left w:val="none" w:color="FFFFFF" w:sz="0"/>
@@ -16086,7 +17385,7 @@
         </w:tc>
         <w:tc>
           <w:tcPr>
-            <w:tcW w:type="dxa" w:w="1060"/>
+            <w:tcW w:type="dxa" w:w="1000"/>
             <w:tcBorders>
               <w:top w:val="none" w:color="FFFFFF" w:sz="0"/>
               <w:left w:val="none" w:color="FFFFFF" w:sz="0"/>
@@ -16115,7 +17414,7 @@
         </w:tc>
         <w:tc>
           <w:tcPr>
-            <w:tcW w:type="dxa" w:w="860"/>
+            <w:tcW w:type="dxa" w:w="820"/>
             <w:tcBorders>
               <w:top w:val="none" w:color="FFFFFF" w:sz="0"/>
               <w:left w:val="none" w:color="FFFFFF" w:sz="0"/>
@@ -16144,7 +17443,7 @@
         </w:tc>
         <w:tc>
           <w:tcPr>
-            <w:tcW w:type="dxa" w:w="1800"/>
+            <w:tcW w:type="dxa" w:w="1750"/>
             <w:tcBorders>
               <w:top w:val="none" w:color="FFFFFF" w:sz="0"/>
               <w:left w:val="none" w:color="FFFFFF" w:sz="0"/>
@@ -16173,7 +17472,7 @@
         </w:tc>
         <w:tc>
           <w:tcPr>
-            <w:tcW w:type="dxa" w:w="1220"/>
+            <w:tcW w:type="dxa" w:w="1200"/>
             <w:tcBorders>
               <w:top w:val="none" w:color="FFFFFF" w:sz="0"/>
               <w:left w:val="none" w:color="FFFFFF" w:sz="0"/>
@@ -16202,7 +17501,7 @@
         </w:tc>
         <w:tc>
           <w:tcPr>
-            <w:tcW w:type="dxa" w:w="1080"/>
+            <w:tcW w:type="dxa" w:w="1100"/>
             <w:tcBorders>
               <w:top w:val="none" w:color="FFFFFF" w:sz="0"/>
               <w:left w:val="none" w:color="FFFFFF" w:sz="0"/>
@@ -16231,7 +17530,7 @@
         </w:tc>
         <w:tc>
           <w:tcPr>
-            <w:tcW w:type="dxa" w:w="550"/>
+            <w:tcW w:type="dxa" w:w="920"/>
             <w:tcBorders>
               <w:top w:val="none" w:color="FFFFFF" w:sz="0"/>
               <w:left w:val="none" w:color="FFFFFF" w:sz="0"/>
@@ -16265,7 +17564,7 @@
         </w:trPr>
         <w:tc>
           <w:tcPr>
-            <w:tcW w:type="dxa" w:w="440"/>
+            <w:tcW w:type="dxa" w:w="420"/>
             <w:tcBorders>
               <w:top w:val="none" w:color="FFFFFF" w:sz="0"/>
               <w:left w:val="none" w:color="FFFFFF" w:sz="0"/>
@@ -16294,7 +17593,7 @@
         </w:tc>
         <w:tc>
           <w:tcPr>
-            <w:tcW w:type="dxa" w:w="2350"/>
+            <w:tcW w:type="dxa" w:w="2150"/>
             <w:tcBorders>
               <w:top w:val="none" w:color="FFFFFF" w:sz="0"/>
               <w:left w:val="none" w:color="FFFFFF" w:sz="0"/>
@@ -16323,7 +17622,7 @@
         </w:tc>
         <w:tc>
           <w:tcPr>
-            <w:tcW w:type="dxa" w:w="1060"/>
+            <w:tcW w:type="dxa" w:w="1000"/>
             <w:tcBorders>
               <w:top w:val="none" w:color="FFFFFF" w:sz="0"/>
               <w:left w:val="none" w:color="FFFFFF" w:sz="0"/>
@@ -16352,7 +17651,7 @@
         </w:tc>
         <w:tc>
           <w:tcPr>
-            <w:tcW w:type="dxa" w:w="860"/>
+            <w:tcW w:type="dxa" w:w="820"/>
             <w:tcBorders>
               <w:top w:val="none" w:color="FFFFFF" w:sz="0"/>
               <w:left w:val="none" w:color="FFFFFF" w:sz="0"/>
@@ -16381,7 +17680,7 @@
         </w:tc>
         <w:tc>
           <w:tcPr>
-            <w:tcW w:type="dxa" w:w="1800"/>
+            <w:tcW w:type="dxa" w:w="1750"/>
             <w:tcBorders>
               <w:top w:val="none" w:color="FFFFFF" w:sz="0"/>
               <w:left w:val="none" w:color="FFFFFF" w:sz="0"/>
@@ -16410,7 +17709,7 @@
         </w:tc>
         <w:tc>
           <w:tcPr>
-            <w:tcW w:type="dxa" w:w="1220"/>
+            <w:tcW w:type="dxa" w:w="1200"/>
             <w:tcBorders>
               <w:top w:val="none" w:color="FFFFFF" w:sz="0"/>
               <w:left w:val="none" w:color="FFFFFF" w:sz="0"/>
@@ -16439,7 +17738,7 @@
         </w:tc>
         <w:tc>
           <w:tcPr>
-            <w:tcW w:type="dxa" w:w="1080"/>
+            <w:tcW w:type="dxa" w:w="1100"/>
             <w:tcBorders>
               <w:top w:val="none" w:color="FFFFFF" w:sz="0"/>
               <w:left w:val="none" w:color="FFFFFF" w:sz="0"/>
@@ -16468,7 +17767,7 @@
         </w:tc>
         <w:tc>
           <w:tcPr>
-            <w:tcW w:type="dxa" w:w="550"/>
+            <w:tcW w:type="dxa" w:w="920"/>
             <w:tcBorders>
               <w:top w:val="none" w:color="FFFFFF" w:sz="0"/>
               <w:left w:val="none" w:color="FFFFFF" w:sz="0"/>
@@ -16502,7 +17801,7 @@
         </w:trPr>
         <w:tc>
           <w:tcPr>
-            <w:tcW w:type="dxa" w:w="440"/>
+            <w:tcW w:type="dxa" w:w="420"/>
             <w:tcBorders>
               <w:top w:val="none" w:color="FFFFFF" w:sz="0"/>
               <w:left w:val="none" w:color="FFFFFF" w:sz="0"/>
@@ -16531,7 +17830,7 @@
         </w:tc>
         <w:tc>
           <w:tcPr>
-            <w:tcW w:type="dxa" w:w="2350"/>
+            <w:tcW w:type="dxa" w:w="2150"/>
             <w:tcBorders>
               <w:top w:val="none" w:color="FFFFFF" w:sz="0"/>
               <w:left w:val="none" w:color="FFFFFF" w:sz="0"/>
@@ -16560,7 +17859,7 @@
         </w:tc>
         <w:tc>
           <w:tcPr>
-            <w:tcW w:type="dxa" w:w="1060"/>
+            <w:tcW w:type="dxa" w:w="1000"/>
             <w:tcBorders>
               <w:top w:val="none" w:color="FFFFFF" w:sz="0"/>
               <w:left w:val="none" w:color="FFFFFF" w:sz="0"/>
@@ -16589,7 +17888,7 @@
         </w:tc>
         <w:tc>
           <w:tcPr>
-            <w:tcW w:type="dxa" w:w="860"/>
+            <w:tcW w:type="dxa" w:w="820"/>
             <w:tcBorders>
               <w:top w:val="none" w:color="FFFFFF" w:sz="0"/>
               <w:left w:val="none" w:color="FFFFFF" w:sz="0"/>
@@ -16618,7 +17917,7 @@
         </w:tc>
         <w:tc>
           <w:tcPr>
-            <w:tcW w:type="dxa" w:w="1800"/>
+            <w:tcW w:type="dxa" w:w="1750"/>
             <w:tcBorders>
               <w:top w:val="none" w:color="FFFFFF" w:sz="0"/>
               <w:left w:val="none" w:color="FFFFFF" w:sz="0"/>
@@ -16647,7 +17946,7 @@
         </w:tc>
         <w:tc>
           <w:tcPr>
-            <w:tcW w:type="dxa" w:w="1220"/>
+            <w:tcW w:type="dxa" w:w="1200"/>
             <w:tcBorders>
               <w:top w:val="none" w:color="FFFFFF" w:sz="0"/>
               <w:left w:val="none" w:color="FFFFFF" w:sz="0"/>
@@ -16676,7 +17975,7 @@
         </w:tc>
         <w:tc>
           <w:tcPr>
-            <w:tcW w:type="dxa" w:w="1080"/>
+            <w:tcW w:type="dxa" w:w="1100"/>
             <w:tcBorders>
               <w:top w:val="none" w:color="FFFFFF" w:sz="0"/>
               <w:left w:val="none" w:color="FFFFFF" w:sz="0"/>
@@ -16705,7 +18004,7 @@
         </w:tc>
         <w:tc>
           <w:tcPr>
-            <w:tcW w:type="dxa" w:w="550"/>
+            <w:tcW w:type="dxa" w:w="920"/>
             <w:tcBorders>
               <w:top w:val="none" w:color="FFFFFF" w:sz="0"/>
               <w:left w:val="none" w:color="FFFFFF" w:sz="0"/>
@@ -16739,7 +18038,7 @@
         </w:trPr>
         <w:tc>
           <w:tcPr>
-            <w:tcW w:type="dxa" w:w="440"/>
+            <w:tcW w:type="dxa" w:w="420"/>
             <w:tcBorders>
               <w:top w:val="none" w:color="FFFFFF" w:sz="0"/>
               <w:left w:val="none" w:color="FFFFFF" w:sz="0"/>
@@ -16768,7 +18067,7 @@
         </w:tc>
         <w:tc>
           <w:tcPr>
-            <w:tcW w:type="dxa" w:w="2350"/>
+            <w:tcW w:type="dxa" w:w="2150"/>
             <w:tcBorders>
               <w:top w:val="none" w:color="FFFFFF" w:sz="0"/>
               <w:left w:val="none" w:color="FFFFFF" w:sz="0"/>
@@ -16797,7 +18096,7 @@
         </w:tc>
         <w:tc>
           <w:tcPr>
-            <w:tcW w:type="dxa" w:w="1060"/>
+            <w:tcW w:type="dxa" w:w="1000"/>
             <w:tcBorders>
               <w:top w:val="none" w:color="FFFFFF" w:sz="0"/>
               <w:left w:val="none" w:color="FFFFFF" w:sz="0"/>
@@ -16826,7 +18125,7 @@
         </w:tc>
         <w:tc>
           <w:tcPr>
-            <w:tcW w:type="dxa" w:w="860"/>
+            <w:tcW w:type="dxa" w:w="820"/>
             <w:tcBorders>
               <w:top w:val="none" w:color="FFFFFF" w:sz="0"/>
               <w:left w:val="none" w:color="FFFFFF" w:sz="0"/>
@@ -16855,7 +18154,7 @@
         </w:tc>
         <w:tc>
           <w:tcPr>
-            <w:tcW w:type="dxa" w:w="1800"/>
+            <w:tcW w:type="dxa" w:w="1750"/>
             <w:tcBorders>
               <w:top w:val="none" w:color="FFFFFF" w:sz="0"/>
               <w:left w:val="none" w:color="FFFFFF" w:sz="0"/>
@@ -16884,7 +18183,7 @@
         </w:tc>
         <w:tc>
           <w:tcPr>
-            <w:tcW w:type="dxa" w:w="1220"/>
+            <w:tcW w:type="dxa" w:w="1200"/>
             <w:tcBorders>
               <w:top w:val="none" w:color="FFFFFF" w:sz="0"/>
               <w:left w:val="none" w:color="FFFFFF" w:sz="0"/>
@@ -16913,7 +18212,7 @@
         </w:tc>
         <w:tc>
           <w:tcPr>
-            <w:tcW w:type="dxa" w:w="1080"/>
+            <w:tcW w:type="dxa" w:w="1100"/>
             <w:tcBorders>
               <w:top w:val="none" w:color="FFFFFF" w:sz="0"/>
               <w:left w:val="none" w:color="FFFFFF" w:sz="0"/>
@@ -16942,7 +18241,7 @@
         </w:tc>
         <w:tc>
           <w:tcPr>
-            <w:tcW w:type="dxa" w:w="550"/>
+            <w:tcW w:type="dxa" w:w="920"/>
             <w:tcBorders>
               <w:top w:val="none" w:color="FFFFFF" w:sz="0"/>
               <w:left w:val="none" w:color="FFFFFF" w:sz="0"/>
@@ -16976,7 +18275,7 @@
         </w:trPr>
         <w:tc>
           <w:tcPr>
-            <w:tcW w:type="dxa" w:w="440"/>
+            <w:tcW w:type="dxa" w:w="420"/>
             <w:tcBorders>
               <w:top w:val="none" w:color="FFFFFF" w:sz="0"/>
               <w:left w:val="none" w:color="FFFFFF" w:sz="0"/>
@@ -17005,7 +18304,7 @@
         </w:tc>
         <w:tc>
           <w:tcPr>
-            <w:tcW w:type="dxa" w:w="2350"/>
+            <w:tcW w:type="dxa" w:w="2150"/>
             <w:tcBorders>
               <w:top w:val="none" w:color="FFFFFF" w:sz="0"/>
               <w:left w:val="none" w:color="FFFFFF" w:sz="0"/>
@@ -17034,7 +18333,7 @@
         </w:tc>
         <w:tc>
           <w:tcPr>
-            <w:tcW w:type="dxa" w:w="1060"/>
+            <w:tcW w:type="dxa" w:w="1000"/>
             <w:tcBorders>
               <w:top w:val="none" w:color="FFFFFF" w:sz="0"/>
               <w:left w:val="none" w:color="FFFFFF" w:sz="0"/>
@@ -17063,7 +18362,7 @@
         </w:tc>
         <w:tc>
           <w:tcPr>
-            <w:tcW w:type="dxa" w:w="860"/>
+            <w:tcW w:type="dxa" w:w="820"/>
             <w:tcBorders>
               <w:top w:val="none" w:color="FFFFFF" w:sz="0"/>
               <w:left w:val="none" w:color="FFFFFF" w:sz="0"/>
@@ -17092,7 +18391,7 @@
         </w:tc>
         <w:tc>
           <w:tcPr>
-            <w:tcW w:type="dxa" w:w="1800"/>
+            <w:tcW w:type="dxa" w:w="1750"/>
             <w:tcBorders>
               <w:top w:val="none" w:color="FFFFFF" w:sz="0"/>
               <w:left w:val="none" w:color="FFFFFF" w:sz="0"/>
@@ -17121,7 +18420,7 @@
         </w:tc>
         <w:tc>
           <w:tcPr>
-            <w:tcW w:type="dxa" w:w="1220"/>
+            <w:tcW w:type="dxa" w:w="1200"/>
             <w:tcBorders>
               <w:top w:val="none" w:color="FFFFFF" w:sz="0"/>
               <w:left w:val="none" w:color="FFFFFF" w:sz="0"/>
@@ -17150,7 +18449,7 @@
         </w:tc>
         <w:tc>
           <w:tcPr>
-            <w:tcW w:type="dxa" w:w="1080"/>
+            <w:tcW w:type="dxa" w:w="1100"/>
             <w:tcBorders>
               <w:top w:val="none" w:color="FFFFFF" w:sz="0"/>
               <w:left w:val="none" w:color="FFFFFF" w:sz="0"/>
@@ -17179,7 +18478,7 @@
         </w:tc>
         <w:tc>
           <w:tcPr>
-            <w:tcW w:type="dxa" w:w="550"/>
+            <w:tcW w:type="dxa" w:w="920"/>
             <w:tcBorders>
               <w:top w:val="none" w:color="FFFFFF" w:sz="0"/>
               <w:left w:val="none" w:color="FFFFFF" w:sz="0"/>
@@ -17213,7 +18512,7 @@
         </w:trPr>
         <w:tc>
           <w:tcPr>
-            <w:tcW w:type="dxa" w:w="440"/>
+            <w:tcW w:type="dxa" w:w="420"/>
             <w:tcBorders>
               <w:top w:val="none" w:color="FFFFFF" w:sz="0"/>
               <w:left w:val="none" w:color="FFFFFF" w:sz="0"/>
@@ -17242,7 +18541,7 @@
         </w:tc>
         <w:tc>
           <w:tcPr>
-            <w:tcW w:type="dxa" w:w="2350"/>
+            <w:tcW w:type="dxa" w:w="2150"/>
             <w:tcBorders>
               <w:top w:val="none" w:color="FFFFFF" w:sz="0"/>
               <w:left w:val="none" w:color="FFFFFF" w:sz="0"/>
@@ -17271,7 +18570,7 @@
         </w:tc>
         <w:tc>
           <w:tcPr>
-            <w:tcW w:type="dxa" w:w="1060"/>
+            <w:tcW w:type="dxa" w:w="1000"/>
             <w:tcBorders>
               <w:top w:val="none" w:color="FFFFFF" w:sz="0"/>
               <w:left w:val="none" w:color="FFFFFF" w:sz="0"/>
@@ -17300,7 +18599,7 @@
         </w:tc>
         <w:tc>
           <w:tcPr>
-            <w:tcW w:type="dxa" w:w="860"/>
+            <w:tcW w:type="dxa" w:w="820"/>
             <w:tcBorders>
               <w:top w:val="none" w:color="FFFFFF" w:sz="0"/>
               <w:left w:val="none" w:color="FFFFFF" w:sz="0"/>
@@ -17329,7 +18628,7 @@
         </w:tc>
         <w:tc>
           <w:tcPr>
-            <w:tcW w:type="dxa" w:w="1800"/>
+            <w:tcW w:type="dxa" w:w="1750"/>
             <w:tcBorders>
               <w:top w:val="none" w:color="FFFFFF" w:sz="0"/>
               <w:left w:val="none" w:color="FFFFFF" w:sz="0"/>
@@ -17358,7 +18657,7 @@
         </w:tc>
         <w:tc>
           <w:tcPr>
-            <w:tcW w:type="dxa" w:w="1220"/>
+            <w:tcW w:type="dxa" w:w="1200"/>
             <w:tcBorders>
               <w:top w:val="none" w:color="FFFFFF" w:sz="0"/>
               <w:left w:val="none" w:color="FFFFFF" w:sz="0"/>
@@ -17387,7 +18686,7 @@
         </w:tc>
         <w:tc>
           <w:tcPr>
-            <w:tcW w:type="dxa" w:w="1080"/>
+            <w:tcW w:type="dxa" w:w="1100"/>
             <w:tcBorders>
               <w:top w:val="none" w:color="FFFFFF" w:sz="0"/>
               <w:left w:val="none" w:color="FFFFFF" w:sz="0"/>
@@ -17416,7 +18715,7 @@
         </w:tc>
         <w:tc>
           <w:tcPr>
-            <w:tcW w:type="dxa" w:w="550"/>
+            <w:tcW w:type="dxa" w:w="920"/>
             <w:tcBorders>
               <w:top w:val="none" w:color="FFFFFF" w:sz="0"/>
               <w:left w:val="none" w:color="FFFFFF" w:sz="0"/>

</xml_diff>

<commit_message>
Explicar cada comando del bloque de configuración básica en el Paso 4
Co-Authored-By: Claude Sonnet 5.5 <noreply@anthropic.com>
</commit_message>
<xml_diff>
--- a/ProyectoFinal-Redes-ACT6-APA7.docx
+++ b/ProyectoFinal-Redes-ACT6-APA7.docx
@@ -528,7 +528,7 @@
               <w:tab/>
             </w:r>
             <w:r>
-              <w:t>16</w:t>
+              <w:t>17</w:t>
             </w:r>
           </w:hyperlink>
         </w:p>
@@ -568,7 +568,7 @@
               <w:tab/>
             </w:r>
             <w:r>
-              <w:t>19</w:t>
+              <w:t>20</w:t>
             </w:r>
           </w:hyperlink>
         </w:p>
@@ -588,7 +588,7 @@
               <w:tab/>
             </w:r>
             <w:r>
-              <w:t>20</w:t>
+              <w:t>21</w:t>
             </w:r>
           </w:hyperlink>
         </w:p>
@@ -608,7 +608,7 @@
               <w:tab/>
             </w:r>
             <w:r>
-              <w:t>20</w:t>
+              <w:t>21</w:t>
             </w:r>
           </w:hyperlink>
         </w:p>
@@ -628,7 +628,7 @@
               <w:tab/>
             </w:r>
             <w:r>
-              <w:t>21</w:t>
+              <w:t>22</w:t>
             </w:r>
           </w:hyperlink>
         </w:p>
@@ -648,7 +648,7 @@
               <w:tab/>
             </w:r>
             <w:r>
-              <w:t>22</w:t>
+              <w:t>23</w:t>
             </w:r>
           </w:hyperlink>
         </w:p>
@@ -668,7 +668,7 @@
               <w:tab/>
             </w:r>
             <w:r>
-              <w:t>22</w:t>
+              <w:t>23</w:t>
             </w:r>
           </w:hyperlink>
         </w:p>
@@ -688,7 +688,7 @@
               <w:tab/>
             </w:r>
             <w:r>
-              <w:t>26</w:t>
+              <w:t>27</w:t>
             </w:r>
           </w:hyperlink>
         </w:p>
@@ -708,7 +708,7 @@
               <w:tab/>
             </w:r>
             <w:r>
-              <w:t>26</w:t>
+              <w:t>27</w:t>
             </w:r>
           </w:hyperlink>
         </w:p>
@@ -728,7 +728,7 @@
               <w:tab/>
             </w:r>
             <w:r>
-              <w:t>27</w:t>
+              <w:t>28</w:t>
             </w:r>
           </w:hyperlink>
         </w:p>
@@ -748,7 +748,7 @@
               <w:tab/>
             </w:r>
             <w:r>
-              <w:t>28</w:t>
+              <w:t>29</w:t>
             </w:r>
           </w:hyperlink>
         </w:p>
@@ -768,7 +768,7 @@
               <w:tab/>
             </w:r>
             <w:r>
-              <w:t>30</w:t>
+              <w:t>31</w:t>
             </w:r>
           </w:hyperlink>
         </w:p>
@@ -788,7 +788,7 @@
               <w:tab/>
             </w:r>
             <w:r>
-              <w:t>32</w:t>
+              <w:t>33</w:t>
             </w:r>
           </w:hyperlink>
           <w:r>
@@ -8665,6 +8665,181 @@
           <w:szCs w:val="19"/>
         </w:rPr>
         <w:t xml:space="preserve"> exit</w:t>
+      </w:r>
+    </w:p>
+    <w:p>
+      <w:pPr>
+        <w:spacing w:before="0" w:after="0" w:line="240" w:lineRule="exact"/>
+      </w:pPr>
+    </w:p>
+    <w:p>
+      <w:pPr/>
+      <w:r>
+        <w:t xml:space="preserve">Qué hace cada línea del bloque:</w:t>
+      </w:r>
+    </w:p>
+    <w:p>
+      <w:pPr/>
+      <w:r>
+        <w:rPr>
+          <w:rFonts w:ascii="Courier New" w:cs="Courier New" w:eastAsia="Courier New" w:hAnsi="Courier New"/>
+          <w:sz w:val="22"/>
+          <w:szCs w:val="22"/>
+        </w:rPr>
+        <w:t xml:space="preserve">hostname</w:t>
+      </w:r>
+      <w:r>
+        <w:t xml:space="preserve">: le pone nombre al equipo; es el que aparece en el símbolo de la CLI (por ejemplo </w:t>
+      </w:r>
+      <w:r>
+        <w:rPr>
+          <w:rFonts w:ascii="Courier New" w:cs="Courier New" w:eastAsia="Courier New" w:hAnsi="Courier New"/>
+          <w:sz w:val="22"/>
+          <w:szCs w:val="22"/>
+        </w:rPr>
+        <w:t xml:space="preserve">R-CRG#</w:t>
+      </w:r>
+      <w:r>
+        <w:t xml:space="preserve">).</w:t>
+      </w:r>
+    </w:p>
+    <w:p>
+      <w:pPr/>
+      <w:r>
+        <w:rPr>
+          <w:rFonts w:ascii="Courier New" w:cs="Courier New" w:eastAsia="Courier New" w:hAnsi="Courier New"/>
+          <w:sz w:val="22"/>
+          <w:szCs w:val="22"/>
+        </w:rPr>
+        <w:t xml:space="preserve">no ip domain-lookup</w:t>
+      </w:r>
+      <w:r>
+        <w:t xml:space="preserve">: apaga la búsqueda de nombres por DNS. Sin esta línea, si escribes algo que no es un comando, el equipo lo toma como el nombre de una computadora, intenta resolverlo y se queda trabado unos segundos.</w:t>
+      </w:r>
+    </w:p>
+    <w:p>
+      <w:pPr/>
+      <w:r>
+        <w:rPr>
+          <w:rFonts w:ascii="Courier New" w:cs="Courier New" w:eastAsia="Courier New" w:hAnsi="Courier New"/>
+          <w:sz w:val="22"/>
+          <w:szCs w:val="22"/>
+        </w:rPr>
+        <w:t xml:space="preserve">enable secret CLAVE</w:t>
+      </w:r>
+      <w:r>
+        <w:t xml:space="preserve">: pone la contraseña que se pide al escribir </w:t>
+      </w:r>
+      <w:r>
+        <w:rPr>
+          <w:rFonts w:ascii="Courier New" w:cs="Courier New" w:eastAsia="Courier New" w:hAnsi="Courier New"/>
+          <w:sz w:val="22"/>
+          <w:szCs w:val="22"/>
+        </w:rPr>
+        <w:t xml:space="preserve">enable</w:t>
+      </w:r>
+      <w:r>
+        <w:t xml:space="preserve"> para entrar al modo privilegiado. </w:t>
+      </w:r>
+      <w:r>
+        <w:rPr>
+          <w:rFonts w:ascii="Courier New" w:cs="Courier New" w:eastAsia="Courier New" w:hAnsi="Courier New"/>
+          <w:sz w:val="22"/>
+          <w:szCs w:val="22"/>
+        </w:rPr>
+        <w:t xml:space="preserve">secret</w:t>
+      </w:r>
+      <w:r>
+        <w:t xml:space="preserve"> la guarda cifrada.</w:t>
+      </w:r>
+    </w:p>
+    <w:p>
+      <w:pPr/>
+      <w:r>
+        <w:rPr>
+          <w:rFonts w:ascii="Courier New" w:cs="Courier New" w:eastAsia="Courier New" w:hAnsi="Courier New"/>
+          <w:sz w:val="22"/>
+          <w:szCs w:val="22"/>
+        </w:rPr>
+        <w:t xml:space="preserve">service password-encryption</w:t>
+      </w:r>
+      <w:r>
+        <w:t xml:space="preserve">: cifra las contraseñas que el equipo guarda en texto plano, para que no se lean en la configuración.</w:t>
+      </w:r>
+    </w:p>
+    <w:p>
+      <w:pPr/>
+      <w:r>
+        <w:rPr>
+          <w:rFonts w:ascii="Courier New" w:cs="Courier New" w:eastAsia="Courier New" w:hAnsi="Courier New"/>
+          <w:sz w:val="22"/>
+          <w:szCs w:val="22"/>
+        </w:rPr>
+        <w:t xml:space="preserve">username admin privilege 15 secret CLAVE</w:t>
+      </w:r>
+      <w:r>
+        <w:t xml:space="preserve">: crea un usuario local llamado </w:t>
+      </w:r>
+      <w:r>
+        <w:rPr>
+          <w:rFonts w:ascii="Courier New" w:cs="Courier New" w:eastAsia="Courier New" w:hAnsi="Courier New"/>
+          <w:sz w:val="22"/>
+          <w:szCs w:val="22"/>
+        </w:rPr>
+        <w:t xml:space="preserve">admin</w:t>
+      </w:r>
+      <w:r>
+        <w:t xml:space="preserve"> con el nivel de privilegio más alto (15, de 0 a 15) y su contraseña cifrada. En este proyecto no se usa para entrar; queda listo para cuando se configure el acceso remoto por Telnet o SSH.</w:t>
+      </w:r>
+    </w:p>
+    <w:p>
+      <w:pPr/>
+      <w:r>
+        <w:rPr>
+          <w:rFonts w:ascii="Courier New" w:cs="Courier New" w:eastAsia="Courier New" w:hAnsi="Courier New"/>
+          <w:sz w:val="22"/>
+          <w:szCs w:val="22"/>
+        </w:rPr>
+        <w:t xml:space="preserve">banner motd</w:t>
+      </w:r>
+      <w:r>
+        <w:t xml:space="preserve">: muestra un aviso legal a quien entra al equipo. Lo que va entre los símbolos </w:t>
+      </w:r>
+      <w:r>
+        <w:rPr>
+          <w:rFonts w:ascii="Courier New" w:cs="Courier New" w:eastAsia="Courier New" w:hAnsi="Courier New"/>
+          <w:sz w:val="22"/>
+          <w:szCs w:val="22"/>
+        </w:rPr>
+        <w:t xml:space="preserve">#</w:t>
+      </w:r>
+      <w:r>
+        <w:t xml:space="preserve"> es el texto del aviso.</w:t>
+      </w:r>
+    </w:p>
+    <w:p>
+      <w:pPr/>
+      <w:r>
+        <w:rPr>
+          <w:rFonts w:ascii="Courier New" w:cs="Courier New" w:eastAsia="Courier New" w:hAnsi="Courier New"/>
+          <w:sz w:val="22"/>
+          <w:szCs w:val="22"/>
+        </w:rPr>
+        <w:t xml:space="preserve">line console 0</w:t>
+      </w:r>
+      <w:r>
+        <w:t xml:space="preserve"> y </w:t>
+      </w:r>
+      <w:r>
+        <w:rPr>
+          <w:rFonts w:ascii="Courier New" w:cs="Courier New" w:eastAsia="Courier New" w:hAnsi="Courier New"/>
+          <w:sz w:val="22"/>
+          <w:szCs w:val="22"/>
+        </w:rPr>
+        <w:t xml:space="preserve">logging synchronous</w:t>
+      </w:r>
+      <w:r>
+        <w:t xml:space="preserve">: entran a la configuración del cable de consola y evitan que los mensajes del equipo se mezclen con lo que estás escribiendo.</w:t>
       </w:r>
     </w:p>
     <w:p>

</xml_diff>

<commit_message>
Quitar ISP, WEB-EXT y NAT del documento; subred 10 pasa a ser una reserva /28
Co-Authored-By: Claude Sonnet 5.5 <noreply@anthropic.com>
</commit_message>
<xml_diff>
--- a/ProyectoFinal-Redes-ACT6-APA7.docx
+++ b/ProyectoFinal-Redes-ACT6-APA7.docx
@@ -308,7 +308,7 @@
               <w:tab/>
             </w:r>
             <w:r>
-              <w:t>9</w:t>
+              <w:t>8</w:t>
             </w:r>
           </w:hyperlink>
         </w:p>
@@ -328,7 +328,7 @@
               <w:tab/>
             </w:r>
             <w:r>
-              <w:t>9</w:t>
+              <w:t>8</w:t>
             </w:r>
           </w:hyperlink>
         </w:p>
@@ -348,7 +348,7 @@
               <w:tab/>
             </w:r>
             <w:r>
-              <w:t>10</w:t>
+              <w:t>9</w:t>
             </w:r>
           </w:hyperlink>
         </w:p>
@@ -408,27 +408,7 @@
               <w:tab/>
             </w:r>
             <w:r>
-              <w:t>12</w:t>
-            </w:r>
-          </w:hyperlink>
-        </w:p>
-        <w:p>
-          <w:pPr>
-            <w:pStyle w:val="TOC2"/>
-            <w:tabs>
-              <w:tab w:val="right" w:leader="dot" w:pos="9350"/>
-            </w:tabs>
-            <w:spacing w:line="360" w:lineRule="auto"/>
-          </w:pPr>
-          <w:hyperlink w:anchor="_Toc10" w:history="1">
-            <w:r>
-              <w:t xml:space="preserve">Paso 2. Agregar las tarjetas seriales a R-CRG y al ISP</w:t>
-            </w:r>
-            <w:r>
-              <w:tab/>
-            </w:r>
-            <w:r>
-              <w:t>12</w:t>
+              <w:t>11</w:t>
             </w:r>
           </w:hyperlink>
         </w:p>
@@ -442,13 +422,13 @@
           </w:pPr>
           <w:hyperlink w:anchor="_Toc11" w:history="1">
             <w:r>
-              <w:t xml:space="preserve">Paso 3. Conectar los cables</w:t>
+              <w:t xml:space="preserve">Paso 2. Conectar los cables</w:t>
             </w:r>
             <w:r>
               <w:tab/>
             </w:r>
             <w:r>
-              <w:t>13</w:t>
+              <w:t>12</w:t>
             </w:r>
           </w:hyperlink>
         </w:p>
@@ -462,13 +442,13 @@
           </w:pPr>
           <w:hyperlink w:anchor="_Toc12" w:history="1">
             <w:r>
-              <w:t xml:space="preserve">Paso 4. Configuración básica de todos los routers y switches</w:t>
+              <w:t xml:space="preserve">Paso 3. Configuración básica de todos los routers y switches</w:t>
             </w:r>
             <w:r>
               <w:tab/>
             </w:r>
             <w:r>
-              <w:t>15</w:t>
+              <w:t>13</w:t>
             </w:r>
           </w:hyperlink>
         </w:p>
@@ -482,13 +462,13 @@
           </w:pPr>
           <w:hyperlink w:anchor="_Toc212" w:history="1">
             <w:r>
-              <w:t xml:space="preserve">Paso 5. Los switches de área</w:t>
+              <w:t xml:space="preserve">Paso 4. Los switches de área</w:t>
             </w:r>
             <w:r>
               <w:tab/>
             </w:r>
             <w:r>
-              <w:t>16</w:t>
+              <w:t>14</w:t>
             </w:r>
           </w:hyperlink>
         </w:p>
@@ -502,13 +482,13 @@
           </w:pPr>
           <w:hyperlink w:anchor="_Toc213" w:history="1">
             <w:r>
-              <w:t xml:space="preserve">Paso 6. Enlaces de R-CRG con los routers de piso</w:t>
+              <w:t xml:space="preserve">Paso 5. Enlaces de R-CRG con los routers de piso</w:t>
             </w:r>
             <w:r>
               <w:tab/>
             </w:r>
             <w:r>
-              <w:t>16</w:t>
+              <w:t>14</w:t>
             </w:r>
           </w:hyperlink>
         </w:p>
@@ -522,13 +502,13 @@
           </w:pPr>
           <w:hyperlink w:anchor="_Toc214" w:history="1">
             <w:r>
-              <w:t xml:space="preserve">Paso 7. Routers de piso</w:t>
+              <w:t xml:space="preserve">Paso 6. Routers de piso</w:t>
             </w:r>
             <w:r>
               <w:tab/>
             </w:r>
             <w:r>
-              <w:t>17</w:t>
+              <w:t>15</w:t>
             </w:r>
           </w:hyperlink>
         </w:p>
@@ -542,13 +522,13 @@
           </w:pPr>
           <w:hyperlink w:anchor="_Toc210" w:history="1">
             <w:r>
-              <w:t xml:space="preserve">Paso 8. Rutas estáticas</w:t>
+              <w:t xml:space="preserve">Paso 7. Rutas estáticas</w:t>
             </w:r>
             <w:r>
               <w:tab/>
             </w:r>
             <w:r>
-              <w:t>18</w:t>
+              <w:t>16</w:t>
             </w:r>
           </w:hyperlink>
         </w:p>
@@ -562,13 +542,13 @@
           </w:pPr>
           <w:hyperlink w:anchor="_Toc17" w:history="1">
             <w:r>
-              <w:t xml:space="preserve">Paso 9. DHCP centralizado en R-CRG</w:t>
+              <w:t xml:space="preserve">Paso 8. DHCP centralizado en R-CRG</w:t>
             </w:r>
             <w:r>
               <w:tab/>
             </w:r>
             <w:r>
-              <w:t>20</w:t>
+              <w:t>18</w:t>
             </w:r>
           </w:hyperlink>
         </w:p>
@@ -582,13 +562,13 @@
           </w:pPr>
           <w:hyperlink w:anchor="_Toc216" w:history="1">
             <w:r>
-              <w:t xml:space="preserve">Paso 10. IP fija de los servidores</w:t>
+              <w:t xml:space="preserve">Paso 9. IP fija de los servidores</w:t>
             </w:r>
             <w:r>
               <w:tab/>
             </w:r>
             <w:r>
-              <w:t>21</w:t>
+              <w:t>18</w:t>
             </w:r>
           </w:hyperlink>
         </w:p>
@@ -602,13 +582,13 @@
           </w:pPr>
           <w:hyperlink w:anchor="_Toc217" w:history="1">
             <w:r>
-              <w:t xml:space="preserve">Paso 11. La red externa (ISP) y el NAT</w:t>
+              <w:t xml:space="preserve">Paso 10. Poner las PC en DHCP</w:t>
             </w:r>
             <w:r>
               <w:tab/>
             </w:r>
             <w:r>
-              <w:t>21</w:t>
+              <w:t>19</w:t>
             </w:r>
           </w:hyperlink>
         </w:p>
@@ -620,35 +600,15 @@
             </w:tabs>
             <w:spacing w:line="360" w:lineRule="auto"/>
           </w:pPr>
-          <w:hyperlink w:anchor="_Toc220" w:history="1">
-            <w:r>
-              <w:t xml:space="preserve">Paso 12. Poner las PC en DHCP</w:t>
+          <w:hyperlink w:anchor="_Toc218" w:history="1">
+            <w:r>
+              <w:t xml:space="preserve">Paso 11. Guardar</w:t>
             </w:r>
             <w:r>
               <w:tab/>
             </w:r>
             <w:r>
-              <w:t>22</w:t>
-            </w:r>
-          </w:hyperlink>
-        </w:p>
-        <w:p>
-          <w:pPr>
-            <w:pStyle w:val="TOC2"/>
-            <w:tabs>
-              <w:tab w:val="right" w:leader="dot" w:pos="9350"/>
-            </w:tabs>
-            <w:spacing w:line="360" w:lineRule="auto"/>
-          </w:pPr>
-          <w:hyperlink w:anchor="_Toc221" w:history="1">
-            <w:r>
-              <w:t xml:space="preserve">Paso 13. Guardar</w:t>
-            </w:r>
-            <w:r>
-              <w:tab/>
-            </w:r>
-            <w:r>
-              <w:t>23</w:t>
+              <w:t>20</w:t>
             </w:r>
           </w:hyperlink>
         </w:p>
@@ -668,7 +628,7 @@
               <w:tab/>
             </w:r>
             <w:r>
-              <w:t>23</w:t>
+              <w:t>20</w:t>
             </w:r>
           </w:hyperlink>
         </w:p>
@@ -688,7 +648,7 @@
               <w:tab/>
             </w:r>
             <w:r>
-              <w:t>27</w:t>
+              <w:t>23</w:t>
             </w:r>
           </w:hyperlink>
         </w:p>
@@ -700,7 +660,7 @@
             </w:tabs>
             <w:spacing w:line="360" w:lineRule="auto"/>
           </w:pPr>
-          <w:hyperlink w:anchor="_Toc222" w:history="1">
+          <w:hyperlink w:anchor="_Toc219" w:history="1">
             <w:r>
               <w:t xml:space="preserve">Dimensionamiento de equipos para una implementación real</w:t>
             </w:r>
@@ -708,7 +668,7 @@
               <w:tab/>
             </w:r>
             <w:r>
-              <w:t>27</w:t>
+              <w:t>23</w:t>
             </w:r>
           </w:hyperlink>
         </w:p>
@@ -728,7 +688,7 @@
               <w:tab/>
             </w:r>
             <w:r>
-              <w:t>28</w:t>
+              <w:t>24</w:t>
             </w:r>
           </w:hyperlink>
         </w:p>
@@ -740,7 +700,7 @@
             </w:tabs>
             <w:spacing w:line="360" w:lineRule="auto"/>
           </w:pPr>
-          <w:hyperlink w:anchor="_Toc223" w:history="1">
+          <w:hyperlink w:anchor="_Toc220" w:history="1">
             <w:r>
               <w:t xml:space="preserve">Recomendaciones</w:t>
             </w:r>
@@ -748,7 +708,7 @@
               <w:tab/>
             </w:r>
             <w:r>
-              <w:t>29</w:t>
+              <w:t>25</w:t>
             </w:r>
           </w:hyperlink>
         </w:p>
@@ -768,7 +728,7 @@
               <w:tab/>
             </w:r>
             <w:r>
-              <w:t>31</w:t>
+              <w:t>27</w:t>
             </w:r>
           </w:hyperlink>
         </w:p>
@@ -780,7 +740,7 @@
             </w:tabs>
             <w:spacing w:line="360" w:lineRule="auto"/>
           </w:pPr>
-          <w:hyperlink w:anchor="_Toc224" w:history="1">
+          <w:hyperlink w:anchor="_Toc221" w:history="1">
             <w:r>
               <w:t xml:space="preserve">Anexo A</w:t>
             </w:r>
@@ -788,7 +748,7 @@
               <w:tab/>
             </w:r>
             <w:r>
-              <w:t>33</w:t>
+              <w:t>28</w:t>
             </w:r>
           </w:hyperlink>
           <w:r>
@@ -815,7 +775,7 @@
     <w:p>
       <w:pPr/>
       <w:r>
-        <w:t xml:space="preserve">El presente trabajo documenta el diseño de la red de Crestline Group, una empresa ficticia de servicios corporativos que llega del extranjero para abrir su oficina en Bolivia con 300 computadoras repartidas en seis áreas. Como el local es nuevo y no existe una red previa, el diseño parte de cero y busca evitar desde el inicio los problemas de una red plana: exceso de tráfico de difusión, direcciones IP repetidas y falta de separación entre áreas. La solución divide la red en diez subredes calculadas con VLSM a partir del bloque 10.20.0.0/23: seis redes de área y cuatro enlaces punto a punto. Un router central y tres routers de piso se comunican mediante rutas estáticas, el DHCP es centralizado con reenvío desde los routers de piso y la salida a una red externa simulada se hace con NAT. El documento describe la construcción paso a paso en Cisco Packet Tracer con los comandos utilizados y capturas del archivo terminado, registra nueve pruebas de aceptación, todas con el resultado esperado, y estima los equipos necesarios para una instalación física. Se concluye que el diseño cubre la demanda de 300 equipos con direcciones sobrantes para crecer; también se señalan las limitaciones de la simulación y las mejoras recomendadas para un despliegue real.</w:t>
+        <w:t xml:space="preserve">El presente trabajo documenta el diseño de la red de Crestline Group, una empresa ficticia de servicios corporativos que llega del extranjero para abrir su oficina en Bolivia con 300 computadoras repartidas en seis áreas. Como el local es nuevo y no existe una red previa, el diseño parte de cero y busca evitar desde el inicio los problemas de una red plana: exceso de tráfico de difusión, direcciones IP repetidas y falta de separación entre áreas. La solución divide la red en diez subredes calculadas con VLSM a partir del bloque 10.20.0.0/23: seis redes de área, tres enlaces punto a punto y una subred de reserva. Un router central y tres routers de piso se comunican mediante rutas estáticas y el DHCP es centralizado, con reenvío desde los routers de piso. El documento describe la construcción paso a paso en Cisco Packet Tracer con los comandos utilizados y capturas del archivo terminado, registra ocho pruebas de aceptación, todas con el resultado esperado, y estima los equipos necesarios para una instalación física. Se concluye que el diseño cubre la demanda de 300 equipos con direcciones sobrantes para crecer; también se señalan las limitaciones de la simulación y las mejoras recomendadas para un despliegue real.</w:t>
       </w:r>
     </w:p>
     <w:p>
@@ -830,7 +790,7 @@
         <w:t xml:space="preserve">Palabras clave:</w:t>
       </w:r>
       <w:r>
-        <w:t xml:space="preserve"> VLSM, subredes, rutas estáticas, DHCP, NAT, Packet Tracer</w:t>
+        <w:t xml:space="preserve"> VLSM, subredes, rutas estáticas, DHCP, Packet Tracer</w:t>
       </w:r>
     </w:p>
     <w:p>
@@ -1673,7 +1633,7 @@
         <w:ind w:firstLine="720"/>
       </w:pPr>
       <w:r>
-        <w:t xml:space="preserve">La casa matriz exige además condiciones que la red debe cumplir desde el primer día: que cada área tenga su propia subred, que las direcciones se asignen de forma automática y que las computadoras puedan salir a una red externa.</w:t>
+        <w:t xml:space="preserve">La casa matriz exige además condiciones que la red debe cumplir desde el primer día: que cada área tenga su propia subred, que las direcciones se asignen de forma automática y que quede espacio reservado para crecer.</w:t>
       </w:r>
     </w:p>
     <w:p>
@@ -1707,7 +1667,7 @@
         <w:ind w:firstLine="720"/>
       </w:pPr>
       <w:r>
-        <w:t xml:space="preserve">A partir del contexto se definieron los requisitos de la nueva red: atender a 300 computadoras repartidas en seis áreas, dar a cada área una subred propia calculada con VLSM, comunicar todas las subredes entre sí, entregar las direcciones de forma automática y permitir la salida hacia una red externa. En total, el diseño necesita diez subredes: seis redes de área y cuatro enlaces punto a punto.</w:t>
+        <w:t xml:space="preserve">A partir del contexto se definieron los requisitos de la nueva red: atender a 300 computadoras repartidas en seis áreas, dar a cada área una subred propia calculada con VLSM, comunicar todas las subredes entre sí, entregar las direcciones de forma automática y dejar una subred de reserva para crecer. En total, el diseño necesita diez subredes: seis redes de área, tres enlaces punto a punto y una subred de reserva.</w:t>
       </w:r>
     </w:p>
     <w:p>
@@ -1735,7 +1695,7 @@
         <w:ind w:firstLine="720"/>
       </w:pPr>
       <w:r>
-        <w:t xml:space="preserve">Diseñar, implementar y validar en Cisco Packet Tracer una red LAN empresarial dividida en diez subredes mediante VLSM, con enrutamiento estático, DHCP y NAT, que mejore la organización, la administración y el funcionamiento de la red de CRG.</w:t>
+        <w:t xml:space="preserve">Diseñar, implementar y validar en Cisco Packet Tracer una red LAN empresarial dividida en diez subredes mediante VLSM, con enrutamiento estático y DHCP, que mejore la organización, la administración y el funcionamiento de la red de CRG.</w:t>
       </w:r>
     </w:p>
     <w:p>
@@ -1769,7 +1729,7 @@
         </w:numPr>
       </w:pPr>
       <w:r>
-        <w:t xml:space="preserve">Calcular con VLSM diez subredes (seis de área y cuatro enlaces punto a punto) a partir del bloque 10.20.0.0/23.</w:t>
+        <w:t xml:space="preserve">Calcular con VLSM diez subredes (seis de área, tres enlaces punto a punto y una de reserva) a partir del bloque 10.20.0.0/23.</w:t>
       </w:r>
     </w:p>
     <w:p>
@@ -1793,7 +1753,7 @@
         </w:numPr>
       </w:pPr>
       <w:r>
-        <w:t xml:space="preserve">Implementar un servicio DHCP centralizado con reenvío desde los routers de piso y NAT hacia una red externa simulada.</w:t>
+        <w:t xml:space="preserve">Implementar un servicio DHCP centralizado con reenvío desde los routers de piso.</w:t>
       </w:r>
     </w:p>
     <w:p>
@@ -1843,7 +1803,7 @@
         <w:ind w:firstLine="720"/>
       </w:pPr>
       <w:r>
-        <w:t xml:space="preserve">Se eligió un modelo jerárquico: un router central y tres routers de piso que agrupan dos áreas cada uno. Este modelo separa funciones, facilita localizar fallas y permite crecer agregando un router de piso sin rediseñar el resto de la red (Cisco, 2024). Para el enrutamiento se usaron rutas estáticas: como los routers de piso se conectan solo con el router central, cada uno necesita una única ruta por defecto y el router central una ruta por área, lo que mantiene la configuración simple y fácil de verificar. Por último, el DHCP centralizado evita las direcciones duplicadas (Droms, 1997) y NAT permite que todas las computadoras compartan una sola dirección pública (Srisuresh &amp; Egevang, 2001).</w:t>
+        <w:t xml:space="preserve">Se eligió un modelo jerárquico: un router central y tres routers de piso que agrupan dos áreas cada uno. Este modelo separa funciones, facilita localizar fallas y permite crecer agregando un router de piso sin rediseñar el resto de la red (Cisco, 2024). Para el enrutamiento se usaron rutas estáticas: como los routers de piso se conectan solo con el router central, cada uno necesita una única ruta por defecto y el router central una ruta por área, lo que mantiene la configuración simple y fácil de verificar. Por último, el DHCP centralizado evita las direcciones duplicadas (Droms, 1997).</w:t>
       </w:r>
     </w:p>
     <w:p>
@@ -1861,7 +1821,7 @@
         <w:ind w:firstLine="720"/>
       </w:pPr>
       <w:r>
-        <w:t xml:space="preserve">El proyecto abarca el diseño lógico, la configuración y las pruebas de la red en Cisco Packet Tracer 9.0.1 (Cisco Networking Academy, s. f.). Comprende IPv4, VLSM, rutas estáticas, DHCP y NAT. Para mantener la simulación manejable se colocan dos computadoras por área en lugar de las 25 a 75 reales; el plan de direccionamiento, en cambio, está calculado para la cantidad total de equipos.</w:t>
+        <w:t xml:space="preserve">El proyecto abarca el diseño lógico, la configuración y las pruebas de la red en Cisco Packet Tracer 9.0.1 (Cisco Networking Academy, s. f.). Comprende IPv4, VLSM, rutas estáticas y DHCP. Para mantener la simulación manejable se colocan dos computadoras por área en lugar de las 25 a 75 reales; el plan de direccionamiento, en cambio, está calculado para la cantidad total de equipos.</w:t>
       </w:r>
     </w:p>
     <w:p>
@@ -2476,7 +2436,7 @@
             <w:tcBorders>
               <w:top w:val="none" w:color="FFFFFF" w:sz="0"/>
               <w:left w:val="none" w:color="FFFFFF" w:sz="0"/>
-              <w:bottom w:val="none" w:color="FFFFFF" w:sz="0"/>
+              <w:bottom w:val="single" w:color="000000" w:sz="6"/>
               <w:right w:val="none" w:color="FFFFFF" w:sz="0"/>
             </w:tcBorders>
             <w:tcMar>
@@ -2505,7 +2465,7 @@
             <w:tcBorders>
               <w:top w:val="none" w:color="FFFFFF" w:sz="0"/>
               <w:left w:val="none" w:color="FFFFFF" w:sz="0"/>
-              <w:bottom w:val="none" w:color="FFFFFF" w:sz="0"/>
+              <w:bottom w:val="single" w:color="000000" w:sz="6"/>
               <w:right w:val="none" w:color="FFFFFF" w:sz="0"/>
             </w:tcBorders>
             <w:tcMar>
@@ -2525,66 +2485,6 @@
                 <w:szCs w:val="21"/>
               </w:rPr>
               <w:t xml:space="preserve">La ruta que se usa cuando ninguna otra coincide (0.0.0.0/0). Suele apuntar a la salida principal.</w:t>
-            </w:r>
-          </w:p>
-        </w:tc>
-      </w:tr>
-      <w:tr>
-        <w:tc>
-          <w:tcPr>
-            <w:tcW w:type="dxa" w:w="2300"/>
-            <w:tcBorders>
-              <w:top w:val="none" w:color="FFFFFF" w:sz="0"/>
-              <w:left w:val="none" w:color="FFFFFF" w:sz="0"/>
-              <w:bottom w:val="single" w:color="000000" w:sz="6"/>
-              <w:right w:val="none" w:color="FFFFFF" w:sz="0"/>
-            </w:tcBorders>
-            <w:tcMar>
-              <w:top w:type="dxa" w:w="40"/>
-              <w:left w:type="dxa" w:w="80"/>
-              <w:bottom w:type="dxa" w:w="40"/>
-              <w:right w:type="dxa" w:w="80"/>
-            </w:tcMar>
-          </w:tcPr>
-          <w:p>
-            <w:pPr>
-              <w:spacing w:line="240"/>
-            </w:pPr>
-            <w:r>
-              <w:rPr>
-                <w:sz w:val="21"/>
-                <w:szCs w:val="21"/>
-              </w:rPr>
-              <w:t xml:space="preserve">NAT</w:t>
-            </w:r>
-          </w:p>
-        </w:tc>
-        <w:tc>
-          <w:tcPr>
-            <w:tcW w:type="dxa" w:w="7060"/>
-            <w:tcBorders>
-              <w:top w:val="none" w:color="FFFFFF" w:sz="0"/>
-              <w:left w:val="none" w:color="FFFFFF" w:sz="0"/>
-              <w:bottom w:val="single" w:color="000000" w:sz="6"/>
-              <w:right w:val="none" w:color="FFFFFF" w:sz="0"/>
-            </w:tcBorders>
-            <w:tcMar>
-              <w:top w:type="dxa" w:w="40"/>
-              <w:left w:type="dxa" w:w="80"/>
-              <w:bottom w:type="dxa" w:w="40"/>
-              <w:right w:type="dxa" w:w="80"/>
-            </w:tcMar>
-          </w:tcPr>
-          <w:p>
-            <w:pPr>
-              <w:spacing w:line="240"/>
-            </w:pPr>
-            <w:r>
-              <w:rPr>
-                <w:sz w:val="21"/>
-                <w:szCs w:val="21"/>
-              </w:rPr>
-              <w:t xml:space="preserve">Cambia la IP privada de la PC por la IP pública del router cuando sale hacia afuera (Srisuresh &amp; Egevang, 2001).</w:t>
             </w:r>
           </w:p>
         </w:tc>
@@ -2616,7 +2516,7 @@
         <w:ind w:firstLine="720"/>
       </w:pPr>
       <w:r>
-        <w:t xml:space="preserve">La red tiene un router central (R-CRG, por Crestline Group) y tres routers de piso (R-P1, R-P2 y R-P3, por «router de piso» 1, 2 y 3). Cada router de piso atiende a dos áreas, y cada área tiene su propio switch con sus computadoras. Además, hay un router ISP con un servidor WEB-EXT que hacen de «Internet de mentira» para probar el NAT. En el simulador se colocan dos PC por área como muestra; en la realidad cada área tendría entre 25 y 75 computadoras. La Figura 1 muestra el diseño.</w:t>
+        <w:t xml:space="preserve">La red tiene un router central (R-CRG, por Crestline Group) y tres routers de piso (R-P1, R-P2 y R-P3, por «router de piso» 1, 2 y 3). Cada router de piso atiende a dos áreas, y cada área tiene su propio switch con sus computadoras. En el simulador se colocan dos PC por área como muestra; en la realidad cada área tendría entre 25 y 75 computadoras. La Figura 1 muestra el diseño.</w:t>
       </w:r>
     </w:p>
     <w:p>
@@ -2651,7 +2551,7 @@
       <w:r>
         <w:drawing>
           <wp:inline distT="0" distB="0" distL="0" distR="0">
-            <wp:extent cx="5810250" cy="2973000"/>
+            <wp:extent cx="5810250" cy="2376000"/>
             <wp:effectExtent t="0" r="0" b="0" l="0"/>
             <wp:docPr id="1" name=""/>
             <wp:cNvGraphicFramePr>
@@ -2676,7 +2576,7 @@
                   <pic:spPr bwMode="auto">
                     <a:xfrm>
                       <a:off x="0" y="0"/>
-                      <a:ext cx="5810250" cy="2973000"/>
+                      <a:ext cx="5810250" cy="2376000"/>
                     </a:xfrm>
                     <a:prstGeom prst="rect">
                       <a:avLst/>
@@ -3761,7 +3661,7 @@
                 <w:sz w:val="21"/>
                 <w:szCs w:val="21"/>
               </w:rPr>
-              <w:t xml:space="preserve">Enlace con el ISP</w:t>
+              <w:t xml:space="preserve">Subred de reserva (crecimiento)</w:t>
             </w:r>
           </w:p>
         </w:tc>
@@ -3790,7 +3690,7 @@
                 <w:sz w:val="21"/>
                 <w:szCs w:val="21"/>
               </w:rPr>
-              <w:t xml:space="preserve">2 routers</w:t>
+              <w:t xml:space="preserve">—</w:t>
             </w:r>
           </w:p>
         </w:tc>
@@ -3819,7 +3719,7 @@
                 <w:sz w:val="21"/>
                 <w:szCs w:val="21"/>
               </w:rPr>
-              <w:t xml:space="preserve">/30</w:t>
+              <w:t xml:space="preserve">/28</w:t>
             </w:r>
           </w:p>
         </w:tc>
@@ -3848,7 +3748,7 @@
                 <w:sz w:val="21"/>
                 <w:szCs w:val="21"/>
               </w:rPr>
-              <w:t xml:space="preserve">2</w:t>
+              <w:t xml:space="preserve">14</w:t>
             </w:r>
           </w:p>
         </w:tc>
@@ -4975,7 +4875,7 @@
         <w:t xml:space="preserve">Nota.</w:t>
       </w:r>
       <w:r>
-        <w:t xml:space="preserve"> Las primeras cinco direcciones de cada subred (por ejemplo 10.20.0.1 a 10.20.0.5) se reservan para el gateway, impresoras y servidores; por eso el DHCP empieza más arriba. Quedan libres las direcciones 10.20.1.236 – 10.20.1.255 para crecer.</w:t>
+        <w:t xml:space="preserve"> Las primeras cinco direcciones de cada subred (por ejemplo 10.20.0.1 a 10.20.0.5) se reservan para el gateway, impresoras y servidores; por eso el DHCP empieza más arriba. La subred 10.20.1.240/28 queda reservada para crecer y las direcciones 10.20.1.236 – 10.20.1.239 siguen libres.</w:t>
       </w:r>
     </w:p>
     <w:p>
@@ -4999,7 +4899,7 @@
           <w:i/>
           <w:iCs/>
         </w:rPr>
-        <w:t xml:space="preserve">Enlaces entre routers y red externa simulada</w:t>
+        <w:t xml:space="preserve">Direcciones de los enlaces entre routers</w:t>
       </w:r>
     </w:p>
     <w:tbl>
@@ -5393,7 +5293,7 @@
             <w:tcBorders>
               <w:top w:val="none" w:color="FFFFFF" w:sz="0"/>
               <w:left w:val="none" w:color="FFFFFF" w:sz="0"/>
-              <w:bottom w:val="none" w:color="FFFFFF" w:sz="0"/>
+              <w:bottom w:val="single" w:color="000000" w:sz="6"/>
               <w:right w:val="none" w:color="FFFFFF" w:sz="0"/>
             </w:tcBorders>
             <w:tcMar>
@@ -5422,7 +5322,7 @@
             <w:tcBorders>
               <w:top w:val="none" w:color="FFFFFF" w:sz="0"/>
               <w:left w:val="none" w:color="FFFFFF" w:sz="0"/>
-              <w:bottom w:val="none" w:color="FFFFFF" w:sz="0"/>
+              <w:bottom w:val="single" w:color="000000" w:sz="6"/>
               <w:right w:val="none" w:color="FFFFFF" w:sz="0"/>
             </w:tcBorders>
             <w:tcMar>
@@ -5451,7 +5351,7 @@
             <w:tcBorders>
               <w:top w:val="none" w:color="FFFFFF" w:sz="0"/>
               <w:left w:val="none" w:color="FFFFFF" w:sz="0"/>
-              <w:bottom w:val="none" w:color="FFFFFF" w:sz="0"/>
+              <w:bottom w:val="single" w:color="000000" w:sz="6"/>
               <w:right w:val="none" w:color="FFFFFF" w:sz="0"/>
             </w:tcBorders>
             <w:tcMar>
@@ -5480,7 +5380,7 @@
             <w:tcBorders>
               <w:top w:val="none" w:color="FFFFFF" w:sz="0"/>
               <w:left w:val="none" w:color="FFFFFF" w:sz="0"/>
-              <w:bottom w:val="none" w:color="FFFFFF" w:sz="0"/>
+              <w:bottom w:val="single" w:color="000000" w:sz="6"/>
               <w:right w:val="none" w:color="FFFFFF" w:sz="0"/>
             </w:tcBorders>
             <w:tcMar>
@@ -5500,248 +5400,6 @@
                 <w:szCs w:val="21"/>
               </w:rPr>
               <w:t xml:space="preserve">R-P3 G0/0: 10.20.1.234</w:t>
-            </w:r>
-          </w:p>
-        </w:tc>
-      </w:tr>
-      <w:tr>
-        <w:trPr>
-          <w:cantSplit/>
-        </w:trPr>
-        <w:tc>
-          <w:tcPr>
-            <w:tcW w:type="dxa" w:w="2300"/>
-            <w:tcBorders>
-              <w:top w:val="none" w:color="FFFFFF" w:sz="0"/>
-              <w:left w:val="none" w:color="FFFFFF" w:sz="0"/>
-              <w:bottom w:val="none" w:color="FFFFFF" w:sz="0"/>
-              <w:right w:val="none" w:color="FFFFFF" w:sz="0"/>
-            </w:tcBorders>
-            <w:tcMar>
-              <w:top w:type="dxa" w:w="40"/>
-              <w:left w:type="dxa" w:w="80"/>
-              <w:bottom w:type="dxa" w:w="40"/>
-              <w:right w:type="dxa" w:w="80"/>
-            </w:tcMar>
-          </w:tcPr>
-          <w:p>
-            <w:pPr>
-              <w:spacing w:line="240"/>
-            </w:pPr>
-            <w:r>
-              <w:rPr>
-                <w:sz w:val="21"/>
-                <w:szCs w:val="21"/>
-              </w:rPr>
-              <w:t xml:space="preserve">R-CRG – ISP</w:t>
-            </w:r>
-          </w:p>
-        </w:tc>
-        <w:tc>
-          <w:tcPr>
-            <w:tcW w:type="dxa" w:w="1900"/>
-            <w:tcBorders>
-              <w:top w:val="none" w:color="FFFFFF" w:sz="0"/>
-              <w:left w:val="none" w:color="FFFFFF" w:sz="0"/>
-              <w:bottom w:val="none" w:color="FFFFFF" w:sz="0"/>
-              <w:right w:val="none" w:color="FFFFFF" w:sz="0"/>
-            </w:tcBorders>
-            <w:tcMar>
-              <w:top w:type="dxa" w:w="40"/>
-              <w:left w:type="dxa" w:w="80"/>
-              <w:bottom w:type="dxa" w:w="40"/>
-              <w:right w:type="dxa" w:w="80"/>
-            </w:tcMar>
-          </w:tcPr>
-          <w:p>
-            <w:pPr>
-              <w:spacing w:line="240"/>
-            </w:pPr>
-            <w:r>
-              <w:rPr>
-                <w:sz w:val="21"/>
-                <w:szCs w:val="21"/>
-              </w:rPr>
-              <w:t xml:space="preserve">203.0.113.0/30</w:t>
-            </w:r>
-          </w:p>
-        </w:tc>
-        <w:tc>
-          <w:tcPr>
-            <w:tcW w:type="dxa" w:w="2580"/>
-            <w:tcBorders>
-              <w:top w:val="none" w:color="FFFFFF" w:sz="0"/>
-              <w:left w:val="none" w:color="FFFFFF" w:sz="0"/>
-              <w:bottom w:val="none" w:color="FFFFFF" w:sz="0"/>
-              <w:right w:val="none" w:color="FFFFFF" w:sz="0"/>
-            </w:tcBorders>
-            <w:tcMar>
-              <w:top w:type="dxa" w:w="40"/>
-              <w:left w:type="dxa" w:w="80"/>
-              <w:bottom w:type="dxa" w:w="40"/>
-              <w:right w:type="dxa" w:w="80"/>
-            </w:tcMar>
-          </w:tcPr>
-          <w:p>
-            <w:pPr>
-              <w:spacing w:line="240"/>
-            </w:pPr>
-            <w:r>
-              <w:rPr>
-                <w:sz w:val="21"/>
-                <w:szCs w:val="21"/>
-              </w:rPr>
-              <w:t xml:space="preserve">S0/0/0: 203.0.113.1</w:t>
-            </w:r>
-          </w:p>
-        </w:tc>
-        <w:tc>
-          <w:tcPr>
-            <w:tcW w:type="dxa" w:w="2580"/>
-            <w:tcBorders>
-              <w:top w:val="none" w:color="FFFFFF" w:sz="0"/>
-              <w:left w:val="none" w:color="FFFFFF" w:sz="0"/>
-              <w:bottom w:val="none" w:color="FFFFFF" w:sz="0"/>
-              <w:right w:val="none" w:color="FFFFFF" w:sz="0"/>
-            </w:tcBorders>
-            <w:tcMar>
-              <w:top w:type="dxa" w:w="40"/>
-              <w:left w:type="dxa" w:w="80"/>
-              <w:bottom w:type="dxa" w:w="40"/>
-              <w:right w:type="dxa" w:w="80"/>
-            </w:tcMar>
-          </w:tcPr>
-          <w:p>
-            <w:pPr>
-              <w:spacing w:line="240"/>
-            </w:pPr>
-            <w:r>
-              <w:rPr>
-                <w:sz w:val="21"/>
-                <w:szCs w:val="21"/>
-              </w:rPr>
-              <w:t xml:space="preserve">ISP S0/0/0: 203.0.113.2</w:t>
-            </w:r>
-          </w:p>
-        </w:tc>
-      </w:tr>
-      <w:tr>
-        <w:trPr>
-          <w:cantSplit/>
-        </w:trPr>
-        <w:tc>
-          <w:tcPr>
-            <w:tcW w:type="dxa" w:w="2300"/>
-            <w:tcBorders>
-              <w:top w:val="none" w:color="FFFFFF" w:sz="0"/>
-              <w:left w:val="none" w:color="FFFFFF" w:sz="0"/>
-              <w:bottom w:val="single" w:color="000000" w:sz="6"/>
-              <w:right w:val="none" w:color="FFFFFF" w:sz="0"/>
-            </w:tcBorders>
-            <w:tcMar>
-              <w:top w:type="dxa" w:w="40"/>
-              <w:left w:type="dxa" w:w="80"/>
-              <w:bottom w:type="dxa" w:w="40"/>
-              <w:right w:type="dxa" w:w="80"/>
-            </w:tcMar>
-          </w:tcPr>
-          <w:p>
-            <w:pPr>
-              <w:spacing w:line="240"/>
-            </w:pPr>
-            <w:r>
-              <w:rPr>
-                <w:sz w:val="21"/>
-                <w:szCs w:val="21"/>
-              </w:rPr>
-              <w:t xml:space="preserve">ISP – WEB-EXT</w:t>
-            </w:r>
-          </w:p>
-        </w:tc>
-        <w:tc>
-          <w:tcPr>
-            <w:tcW w:type="dxa" w:w="1900"/>
-            <w:tcBorders>
-              <w:top w:val="none" w:color="FFFFFF" w:sz="0"/>
-              <w:left w:val="none" w:color="FFFFFF" w:sz="0"/>
-              <w:bottom w:val="single" w:color="000000" w:sz="6"/>
-              <w:right w:val="none" w:color="FFFFFF" w:sz="0"/>
-            </w:tcBorders>
-            <w:tcMar>
-              <w:top w:type="dxa" w:w="40"/>
-              <w:left w:type="dxa" w:w="80"/>
-              <w:bottom w:type="dxa" w:w="40"/>
-              <w:right w:type="dxa" w:w="80"/>
-            </w:tcMar>
-          </w:tcPr>
-          <w:p>
-            <w:pPr>
-              <w:spacing w:line="240"/>
-            </w:pPr>
-            <w:r>
-              <w:rPr>
-                <w:sz w:val="21"/>
-                <w:szCs w:val="21"/>
-              </w:rPr>
-              <w:t xml:space="preserve">198.51.100.0/24</w:t>
-            </w:r>
-          </w:p>
-        </w:tc>
-        <w:tc>
-          <w:tcPr>
-            <w:tcW w:type="dxa" w:w="2580"/>
-            <w:tcBorders>
-              <w:top w:val="none" w:color="FFFFFF" w:sz="0"/>
-              <w:left w:val="none" w:color="FFFFFF" w:sz="0"/>
-              <w:bottom w:val="single" w:color="000000" w:sz="6"/>
-              <w:right w:val="none" w:color="FFFFFF" w:sz="0"/>
-            </w:tcBorders>
-            <w:tcMar>
-              <w:top w:type="dxa" w:w="40"/>
-              <w:left w:type="dxa" w:w="80"/>
-              <w:bottom w:type="dxa" w:w="40"/>
-              <w:right w:type="dxa" w:w="80"/>
-            </w:tcMar>
-          </w:tcPr>
-          <w:p>
-            <w:pPr>
-              <w:spacing w:line="240"/>
-            </w:pPr>
-            <w:r>
-              <w:rPr>
-                <w:sz w:val="21"/>
-                <w:szCs w:val="21"/>
-              </w:rPr>
-              <w:t xml:space="preserve">ISP G0/0: 198.51.100.1</w:t>
-            </w:r>
-          </w:p>
-        </w:tc>
-        <w:tc>
-          <w:tcPr>
-            <w:tcW w:type="dxa" w:w="2580"/>
-            <w:tcBorders>
-              <w:top w:val="none" w:color="FFFFFF" w:sz="0"/>
-              <w:left w:val="none" w:color="FFFFFF" w:sz="0"/>
-              <w:bottom w:val="single" w:color="000000" w:sz="6"/>
-              <w:right w:val="none" w:color="FFFFFF" w:sz="0"/>
-            </w:tcBorders>
-            <w:tcMar>
-              <w:top w:type="dxa" w:w="40"/>
-              <w:left w:type="dxa" w:w="80"/>
-              <w:bottom w:type="dxa" w:w="40"/>
-              <w:right w:type="dxa" w:w="80"/>
-            </w:tcMar>
-          </w:tcPr>
-          <w:p>
-            <w:pPr>
-              <w:spacing w:line="240"/>
-            </w:pPr>
-            <w:r>
-              <w:rPr>
-                <w:sz w:val="21"/>
-                <w:szCs w:val="21"/>
-              </w:rPr>
-              <w:t xml:space="preserve">WEB-EXT: 198.51.100.10</w:t>
             </w:r>
           </w:p>
         </w:tc>
@@ -5757,7 +5415,7 @@
         <w:t xml:space="preserve">Nota.</w:t>
       </w:r>
       <w:r>
-        <w:t xml:space="preserve"> Se usa /30 en los enlaces punto a punto porque solo hacen falta dos direcciones; el prefijo /31 también sería válido en estos enlaces (Retana et al., 2000), pero /30 es la opción más compatible en el laboratorio. Las redes 203.0.113.0 y 198.51.100.0 son rangos reservados para documentación (Arkko et al., 2010), ideales para simular «Internet».</w:t>
+        <w:t xml:space="preserve"> Se usa /30 en los enlaces punto a punto porque solo hacen falta dos direcciones; el prefijo /31 también sería válido en estos enlaces (Retana et al., 2000), pero /30 es la opción más compatible en el laboratorio.</w:t>
       </w:r>
     </w:p>
     <w:p>
@@ -6223,7 +5881,7 @@
                 <w:sz w:val="21"/>
                 <w:szCs w:val="21"/>
               </w:rPr>
-              <w:t xml:space="preserve">5</w:t>
+              <w:t xml:space="preserve">4</w:t>
             </w:r>
           </w:p>
         </w:tc>
@@ -6252,7 +5910,7 @@
                 <w:sz w:val="21"/>
                 <w:szCs w:val="21"/>
               </w:rPr>
-              <w:t xml:space="preserve">R-CRG, R-P1, R-P2, R-P3, ISP</w:t>
+              <w:t xml:space="preserve">R-CRG, R-P1, R-P2, R-P3</w:t>
             </w:r>
           </w:p>
         </w:tc>
@@ -6586,7 +6244,7 @@
                 <w:sz w:val="21"/>
                 <w:szCs w:val="21"/>
               </w:rPr>
-              <w:t xml:space="preserve">2</w:t>
+              <w:t xml:space="preserve">1</w:t>
             </w:r>
           </w:p>
         </w:tc>
@@ -6615,7 +6273,7 @@
                 <w:sz w:val="21"/>
                 <w:szCs w:val="21"/>
               </w:rPr>
-              <w:t xml:space="preserve">SRV-TI, WEB-EXT</w:t>
+              <w:t xml:space="preserve">SRV-TI</w:t>
             </w:r>
           </w:p>
         </w:tc>
@@ -6626,206 +6284,9 @@
       <w:pPr>
         <w:pStyle w:val="Heading2"/>
       </w:pPr>
-      <w:bookmarkStart w:name="_Toc10" w:id="10"/>
-      <w:r>
-        <w:t xml:space="preserve">Paso 2. Agregar las tarjetas seriales a R-CRG y al ISP</w:t>
-      </w:r>
-      <w:bookmarkEnd w:id="10"/>
-    </w:p>
-    <w:p>
-      <w:pPr>
-        <w:ind w:firstLine="720"/>
-      </w:pPr>
-      <w:r>
-        <w:t xml:space="preserve">El router 2911 no trae puertos seriales. Solo R-CRG e ISP los usan, para el enlace hacia «Internet»: a cada uno hay que ponerle una tarjeta HWIC-2T (cada una trae 2 puertos seriales). Los routers de piso no la necesitan.</w:t>
-      </w:r>
-    </w:p>
-    <w:p>
-      <w:pPr>
-        <w:pStyle w:val="ListParagraph"/>
-        <w:numPr>
-          <w:ilvl w:val="0"/>
-          <w:numId w:val="4"/>
-        </w:numPr>
-      </w:pPr>
-      <w:r>
-        <w:t xml:space="preserve">Haz clic en el router y entra a la pestaña </w:t>
-      </w:r>
-      <w:r>
-        <w:rPr>
-          <w:b/>
-          <w:bCs/>
-        </w:rPr>
-        <w:t xml:space="preserve">Physical</w:t>
-      </w:r>
-      <w:r>
-        <w:t xml:space="preserve">.</w:t>
-      </w:r>
-    </w:p>
-    <w:p>
-      <w:pPr>
-        <w:pStyle w:val="ListParagraph"/>
-        <w:numPr>
-          <w:ilvl w:val="0"/>
-          <w:numId w:val="4"/>
-        </w:numPr>
-      </w:pPr>
-      <w:r>
-        <w:t xml:space="preserve">Apaga el router: haz clic en el interruptor (el botoncito al lado del enchufe en la imagen del router). La luz verde se apaga.</w:t>
-      </w:r>
-    </w:p>
-    <w:p>
-      <w:pPr>
-        <w:pStyle w:val="ListParagraph"/>
-        <w:numPr>
-          <w:ilvl w:val="0"/>
-          <w:numId w:val="4"/>
-        </w:numPr>
-      </w:pPr>
-      <w:r>
-        <w:t xml:space="preserve">En la lista </w:t>
-      </w:r>
-      <w:r>
-        <w:rPr>
-          <w:b/>
-          <w:bCs/>
-        </w:rPr>
-        <w:t xml:space="preserve">MODULES</w:t>
-      </w:r>
-      <w:r>
-        <w:t xml:space="preserve"> de la izquierda busca </w:t>
-      </w:r>
-      <w:r>
-        <w:rPr>
-          <w:b/>
-          <w:bCs/>
-        </w:rPr>
-        <w:t xml:space="preserve">HWIC-2T</w:t>
-      </w:r>
-      <w:r>
-        <w:t xml:space="preserve">.</w:t>
-      </w:r>
-    </w:p>
-    <w:p>
-      <w:pPr>
-        <w:ind w:firstLine="720"/>
-      </w:pPr>
-      <w:r>
-        <w:t xml:space="preserve">Arrástrala a la primera ranura vacía de la parte trasera del router (ranura 0). Haz lo mismo en R-CRG y en ISP.</w:t>
-      </w:r>
-    </w:p>
-    <w:p>
-      <w:pPr>
-        <w:pStyle w:val="ListParagraph"/>
-        <w:numPr>
-          <w:ilvl w:val="0"/>
-          <w:numId w:val="4"/>
-        </w:numPr>
-      </w:pPr>
-      <w:r>
-        <w:t xml:space="preserve">Vuelve a encender el router con el mismo interruptor.</w:t>
-      </w:r>
-    </w:p>
-    <w:p>
-      <w:pPr>
-        <w:ind w:firstLine="720"/>
-      </w:pPr>
-      <w:r>
-        <w:t xml:space="preserve">El puerto queda con el nombre Serial0/0/0. La Figura 2 muestra la tarjeta instalada en la ranura 0 de R-CRG.</w:t>
-      </w:r>
-    </w:p>
-    <w:p>
-      <w:pPr>
-        <w:keepNext/>
-      </w:pPr>
-      <w:r>
-        <w:rPr>
-          <w:b/>
-          <w:bCs/>
-        </w:rPr>
-        <w:t xml:space="preserve">Figura 2</w:t>
-      </w:r>
-    </w:p>
-    <w:p>
-      <w:pPr>
-        <w:keepNext/>
-      </w:pPr>
-      <w:r>
-        <w:rPr>
-          <w:i/>
-          <w:iCs/>
-        </w:rPr>
-        <w:t xml:space="preserve">Router R-CRG con la tarjeta HWIC-2T instalada</w:t>
-      </w:r>
-    </w:p>
-    <w:p>
-      <w:pPr>
-        <w:keepNext/>
-        <w:spacing w:after="0" w:line="240"/>
-      </w:pPr>
-      <w:r>
-        <w:drawing>
-          <wp:inline distT="0" distB="0" distL="0" distR="0">
-            <wp:extent cx="5810250" cy="2727260"/>
-            <wp:effectExtent t="0" r="0" b="0" l="0"/>
-            <wp:docPr id="1002" name=""/>
-            <wp:cNvGraphicFramePr>
-              <a:graphicFrameLocks xmlns:a="http://schemas.openxmlformats.org/drawingml/2006/main" noChangeAspect="1"/>
-            </wp:cNvGraphicFramePr>
-            <a:graphic xmlns:a="http://schemas.openxmlformats.org/drawingml/2006/main">
-              <a:graphicData uri="http://schemas.openxmlformats.org/drawingml/2006/picture">
-                <pic:pic xmlns:pic="http://schemas.openxmlformats.org/drawingml/2006/picture">
-                  <pic:nvPicPr>
-                    <pic:cNvPr id="0" name="" descr=""/>
-                    <pic:cNvPicPr>
-                      <a:picLocks noChangeAspect="1" noChangeArrowheads="1"/>
-                    </pic:cNvPicPr>
-                  </pic:nvPicPr>
-                  <pic:blipFill>
-                    <a:blip r:embed="rIdFig2" cstate="none"/>
-                    <a:srcRect/>
-                    <a:stretch>
-                      <a:fillRect/>
-                    </a:stretch>
-                  </pic:blipFill>
-                  <pic:spPr bwMode="auto">
-                    <a:xfrm>
-                      <a:off x="0" y="0"/>
-                      <a:ext cx="5810250" cy="2727260"/>
-                    </a:xfrm>
-                    <a:prstGeom prst="rect">
-                      <a:avLst/>
-                    </a:prstGeom>
-                  </pic:spPr>
-                </pic:pic>
-              </a:graphicData>
-            </a:graphic>
-          </wp:inline>
-        </w:drawing>
-      </w:r>
-    </w:p>
-    <w:p>
-      <w:pPr>
-        <w:spacing w:after="360"/>
-      </w:pPr>
-      <w:r>
-        <w:rPr>
-          <w:i/>
-          <w:iCs/>
-        </w:rPr>
-        <w:t xml:space="preserve">Nota.</w:t>
-      </w:r>
-      <w:r>
-        <w:t xml:space="preserve"> La tarjeta aparece en la ranura eHWIC 0, a la derecha de la vista trasera del router.</w:t>
-      </w:r>
-    </w:p>
-    <w:p>
-      <w:pPr>
-        <w:pStyle w:val="Heading2"/>
-      </w:pPr>
       <w:bookmarkStart w:name="_Toc11" w:id="11"/>
       <w:r>
-        <w:t xml:space="preserve">Paso 3. Conectar los cables</w:t>
+        <w:t xml:space="preserve">Paso 2. Conectar los cables</w:t>
       </w:r>
       <w:bookmarkEnd w:id="11"/>
     </w:p>
@@ -7283,7 +6744,7 @@
                 <w:sz w:val="21"/>
                 <w:szCs w:val="21"/>
               </w:rPr>
-              <w:t xml:space="preserve">R-CRG Serial0/0/0</w:t>
+              <w:t xml:space="preserve">R-P1 G0/1 y G0/2</w:t>
             </w:r>
           </w:p>
         </w:tc>
@@ -7312,7 +6773,7 @@
                 <w:sz w:val="21"/>
                 <w:szCs w:val="21"/>
               </w:rPr>
-              <w:t xml:space="preserve">ISP Serial0/0/0</w:t>
+              <w:t xml:space="preserve">SW-VEN G0/1 y SW-OPE G0/1</w:t>
             </w:r>
           </w:p>
         </w:tc>
@@ -7341,7 +6802,7 @@
                 <w:sz w:val="21"/>
                 <w:szCs w:val="21"/>
               </w:rPr>
-              <w:t xml:space="preserve">Serial DCE (clic primero en R-CRG)</w:t>
+              <w:t xml:space="preserve">Copper Straight-Through</w:t>
             </w:r>
           </w:p>
         </w:tc>
@@ -7375,7 +6836,7 @@
                 <w:sz w:val="21"/>
                 <w:szCs w:val="21"/>
               </w:rPr>
-              <w:t xml:space="preserve">ISP GigabitEthernet0/0</w:t>
+              <w:t xml:space="preserve">R-P2 G0/1 y G0/2</w:t>
             </w:r>
           </w:p>
         </w:tc>
@@ -7404,7 +6865,7 @@
                 <w:sz w:val="21"/>
                 <w:szCs w:val="21"/>
               </w:rPr>
-              <w:t xml:space="preserve">WEB-EXT FastEthernet0</w:t>
+              <w:t xml:space="preserve">SW-CAP G0/1 y SW-ADM G0/1</w:t>
             </w:r>
           </w:p>
         </w:tc>
@@ -7467,7 +6928,7 @@
                 <w:sz w:val="21"/>
                 <w:szCs w:val="21"/>
               </w:rPr>
-              <w:t xml:space="preserve">R-P1 G0/1 y G0/2</w:t>
+              <w:t xml:space="preserve">R-P3 G0/1 y G0/2</w:t>
             </w:r>
           </w:p>
         </w:tc>
@@ -7496,7 +6957,7 @@
                 <w:sz w:val="21"/>
                 <w:szCs w:val="21"/>
               </w:rPr>
-              <w:t xml:space="preserve">SW-VEN G0/1 y SW-OPE G0/1</w:t>
+              <w:t xml:space="preserve">SW-FIN G0/1 y SW-TI G0/1</w:t>
             </w:r>
           </w:p>
         </w:tc>
@@ -7559,7 +7020,7 @@
                 <w:sz w:val="21"/>
                 <w:szCs w:val="21"/>
               </w:rPr>
-              <w:t xml:space="preserve">R-P2 G0/1 y G0/2</w:t>
+              <w:t xml:space="preserve">SW-VEN Fa0/1 y Fa0/2</w:t>
             </w:r>
           </w:p>
         </w:tc>
@@ -7588,7 +7049,7 @@
                 <w:sz w:val="21"/>
                 <w:szCs w:val="21"/>
               </w:rPr>
-              <w:t xml:space="preserve">SW-CAP G0/1 y SW-ADM G0/1</w:t>
+              <w:t xml:space="preserve">PC-VEN1 y PC-VEN2 (FastEthernet0)</w:t>
             </w:r>
           </w:p>
         </w:tc>
@@ -7651,7 +7112,7 @@
                 <w:sz w:val="21"/>
                 <w:szCs w:val="21"/>
               </w:rPr>
-              <w:t xml:space="preserve">R-P3 G0/1 y G0/2</w:t>
+              <w:t xml:space="preserve">SW-OPE Fa0/1 y Fa0/2</w:t>
             </w:r>
           </w:p>
         </w:tc>
@@ -7680,7 +7141,7 @@
                 <w:sz w:val="21"/>
                 <w:szCs w:val="21"/>
               </w:rPr>
-              <w:t xml:space="preserve">SW-FIN G0/1 y SW-TI G0/1</w:t>
+              <w:t xml:space="preserve">PC-OPE1 y PC-OPE2</w:t>
             </w:r>
           </w:p>
         </w:tc>
@@ -7743,7 +7204,7 @@
                 <w:sz w:val="21"/>
                 <w:szCs w:val="21"/>
               </w:rPr>
-              <w:t xml:space="preserve">SW-VEN Fa0/1 y Fa0/2</w:t>
+              <w:t xml:space="preserve">SW-CAP Fa0/1 y Fa0/2</w:t>
             </w:r>
           </w:p>
         </w:tc>
@@ -7772,7 +7233,7 @@
                 <w:sz w:val="21"/>
                 <w:szCs w:val="21"/>
               </w:rPr>
-              <w:t xml:space="preserve">PC-VEN1 y PC-VEN2 (FastEthernet0)</w:t>
+              <w:t xml:space="preserve">PC-CAP1 y PC-CAP2</w:t>
             </w:r>
           </w:p>
         </w:tc>
@@ -7835,7 +7296,7 @@
                 <w:sz w:val="21"/>
                 <w:szCs w:val="21"/>
               </w:rPr>
-              <w:t xml:space="preserve">SW-OPE Fa0/1 y Fa0/2</w:t>
+              <w:t xml:space="preserve">SW-ADM Fa0/1 y Fa0/2</w:t>
             </w:r>
           </w:p>
         </w:tc>
@@ -7864,7 +7325,7 @@
                 <w:sz w:val="21"/>
                 <w:szCs w:val="21"/>
               </w:rPr>
-              <w:t xml:space="preserve">PC-OPE1 y PC-OPE2</w:t>
+              <w:t xml:space="preserve">PC-ADM1 y PC-ADM2</w:t>
             </w:r>
           </w:p>
         </w:tc>
@@ -7927,7 +7388,7 @@
                 <w:sz w:val="21"/>
                 <w:szCs w:val="21"/>
               </w:rPr>
-              <w:t xml:space="preserve">SW-CAP Fa0/1 y Fa0/2</w:t>
+              <w:t xml:space="preserve">SW-FIN Fa0/1 y Fa0/2</w:t>
             </w:r>
           </w:p>
         </w:tc>
@@ -7956,7 +7417,7 @@
                 <w:sz w:val="21"/>
                 <w:szCs w:val="21"/>
               </w:rPr>
-              <w:t xml:space="preserve">PC-CAP1 y PC-CAP2</w:t>
+              <w:t xml:space="preserve">PC-FIN1 y PC-FIN2</w:t>
             </w:r>
           </w:p>
         </w:tc>
@@ -8019,7 +7480,7 @@
                 <w:sz w:val="21"/>
                 <w:szCs w:val="21"/>
               </w:rPr>
-              <w:t xml:space="preserve">SW-ADM Fa0/1 y Fa0/2</w:t>
+              <w:t xml:space="preserve">SW-TI Fa0/1 y Fa0/2</w:t>
             </w:r>
           </w:p>
         </w:tc>
@@ -8048,7 +7509,7 @@
                 <w:sz w:val="21"/>
                 <w:szCs w:val="21"/>
               </w:rPr>
-              <w:t xml:space="preserve">PC-ADM1 y PC-ADM2</w:t>
+              <w:t xml:space="preserve">PC-TI1 y PC-TI2</w:t>
             </w:r>
           </w:p>
         </w:tc>
@@ -8092,190 +7553,6 @@
             <w:tcBorders>
               <w:top w:val="none" w:color="FFFFFF" w:sz="0"/>
               <w:left w:val="none" w:color="FFFFFF" w:sz="0"/>
-              <w:bottom w:val="none" w:color="FFFFFF" w:sz="0"/>
-              <w:right w:val="none" w:color="FFFFFF" w:sz="0"/>
-            </w:tcBorders>
-            <w:tcMar>
-              <w:top w:type="dxa" w:w="40"/>
-              <w:left w:type="dxa" w:w="80"/>
-              <w:bottom w:type="dxa" w:w="40"/>
-              <w:right w:type="dxa" w:w="80"/>
-            </w:tcMar>
-          </w:tcPr>
-          <w:p>
-            <w:pPr>
-              <w:spacing w:line="240"/>
-            </w:pPr>
-            <w:r>
-              <w:rPr>
-                <w:sz w:val="21"/>
-                <w:szCs w:val="21"/>
-              </w:rPr>
-              <w:t xml:space="preserve">SW-FIN Fa0/1 y Fa0/2</w:t>
-            </w:r>
-          </w:p>
-        </w:tc>
-        <w:tc>
-          <w:tcPr>
-            <w:tcW w:type="dxa" w:w="3500"/>
-            <w:tcBorders>
-              <w:top w:val="none" w:color="FFFFFF" w:sz="0"/>
-              <w:left w:val="none" w:color="FFFFFF" w:sz="0"/>
-              <w:bottom w:val="none" w:color="FFFFFF" w:sz="0"/>
-              <w:right w:val="none" w:color="FFFFFF" w:sz="0"/>
-            </w:tcBorders>
-            <w:tcMar>
-              <w:top w:type="dxa" w:w="40"/>
-              <w:left w:type="dxa" w:w="80"/>
-              <w:bottom w:type="dxa" w:w="40"/>
-              <w:right w:type="dxa" w:w="80"/>
-            </w:tcMar>
-          </w:tcPr>
-          <w:p>
-            <w:pPr>
-              <w:spacing w:line="240"/>
-            </w:pPr>
-            <w:r>
-              <w:rPr>
-                <w:sz w:val="21"/>
-                <w:szCs w:val="21"/>
-              </w:rPr>
-              <w:t xml:space="preserve">PC-FIN1 y PC-FIN2</w:t>
-            </w:r>
-          </w:p>
-        </w:tc>
-        <w:tc>
-          <w:tcPr>
-            <w:tcW w:type="dxa" w:w="2360"/>
-            <w:tcBorders>
-              <w:top w:val="none" w:color="FFFFFF" w:sz="0"/>
-              <w:left w:val="none" w:color="FFFFFF" w:sz="0"/>
-              <w:bottom w:val="none" w:color="FFFFFF" w:sz="0"/>
-              <w:right w:val="none" w:color="FFFFFF" w:sz="0"/>
-            </w:tcBorders>
-            <w:tcMar>
-              <w:top w:type="dxa" w:w="40"/>
-              <w:left w:type="dxa" w:w="80"/>
-              <w:bottom w:type="dxa" w:w="40"/>
-              <w:right w:type="dxa" w:w="80"/>
-            </w:tcMar>
-          </w:tcPr>
-          <w:p>
-            <w:pPr>
-              <w:spacing w:line="240"/>
-            </w:pPr>
-            <w:r>
-              <w:rPr>
-                <w:sz w:val="21"/>
-                <w:szCs w:val="21"/>
-              </w:rPr>
-              <w:t xml:space="preserve">Copper Straight-Through</w:t>
-            </w:r>
-          </w:p>
-        </w:tc>
-      </w:tr>
-      <w:tr>
-        <w:trPr>
-          <w:cantSplit/>
-        </w:trPr>
-        <w:tc>
-          <w:tcPr>
-            <w:tcW w:type="dxa" w:w="3500"/>
-            <w:tcBorders>
-              <w:top w:val="none" w:color="FFFFFF" w:sz="0"/>
-              <w:left w:val="none" w:color="FFFFFF" w:sz="0"/>
-              <w:bottom w:val="none" w:color="FFFFFF" w:sz="0"/>
-              <w:right w:val="none" w:color="FFFFFF" w:sz="0"/>
-            </w:tcBorders>
-            <w:tcMar>
-              <w:top w:type="dxa" w:w="40"/>
-              <w:left w:type="dxa" w:w="80"/>
-              <w:bottom w:type="dxa" w:w="40"/>
-              <w:right w:type="dxa" w:w="80"/>
-            </w:tcMar>
-          </w:tcPr>
-          <w:p>
-            <w:pPr>
-              <w:spacing w:line="240"/>
-            </w:pPr>
-            <w:r>
-              <w:rPr>
-                <w:sz w:val="21"/>
-                <w:szCs w:val="21"/>
-              </w:rPr>
-              <w:t xml:space="preserve">SW-TI Fa0/1 y Fa0/2</w:t>
-            </w:r>
-          </w:p>
-        </w:tc>
-        <w:tc>
-          <w:tcPr>
-            <w:tcW w:type="dxa" w:w="3500"/>
-            <w:tcBorders>
-              <w:top w:val="none" w:color="FFFFFF" w:sz="0"/>
-              <w:left w:val="none" w:color="FFFFFF" w:sz="0"/>
-              <w:bottom w:val="none" w:color="FFFFFF" w:sz="0"/>
-              <w:right w:val="none" w:color="FFFFFF" w:sz="0"/>
-            </w:tcBorders>
-            <w:tcMar>
-              <w:top w:type="dxa" w:w="40"/>
-              <w:left w:type="dxa" w:w="80"/>
-              <w:bottom w:type="dxa" w:w="40"/>
-              <w:right w:type="dxa" w:w="80"/>
-            </w:tcMar>
-          </w:tcPr>
-          <w:p>
-            <w:pPr>
-              <w:spacing w:line="240"/>
-            </w:pPr>
-            <w:r>
-              <w:rPr>
-                <w:sz w:val="21"/>
-                <w:szCs w:val="21"/>
-              </w:rPr>
-              <w:t xml:space="preserve">PC-TI1 y PC-TI2</w:t>
-            </w:r>
-          </w:p>
-        </w:tc>
-        <w:tc>
-          <w:tcPr>
-            <w:tcW w:type="dxa" w:w="2360"/>
-            <w:tcBorders>
-              <w:top w:val="none" w:color="FFFFFF" w:sz="0"/>
-              <w:left w:val="none" w:color="FFFFFF" w:sz="0"/>
-              <w:bottom w:val="none" w:color="FFFFFF" w:sz="0"/>
-              <w:right w:val="none" w:color="FFFFFF" w:sz="0"/>
-            </w:tcBorders>
-            <w:tcMar>
-              <w:top w:type="dxa" w:w="40"/>
-              <w:left w:type="dxa" w:w="80"/>
-              <w:bottom w:type="dxa" w:w="40"/>
-              <w:right w:type="dxa" w:w="80"/>
-            </w:tcMar>
-          </w:tcPr>
-          <w:p>
-            <w:pPr>
-              <w:spacing w:line="240"/>
-            </w:pPr>
-            <w:r>
-              <w:rPr>
-                <w:sz w:val="21"/>
-                <w:szCs w:val="21"/>
-              </w:rPr>
-              <w:t xml:space="preserve">Copper Straight-Through</w:t>
-            </w:r>
-          </w:p>
-        </w:tc>
-      </w:tr>
-      <w:tr>
-        <w:trPr>
-          <w:cantSplit/>
-        </w:trPr>
-        <w:tc>
-          <w:tcPr>
-            <w:tcW w:type="dxa" w:w="3500"/>
-            <w:tcBorders>
-              <w:top w:val="none" w:color="FFFFFF" w:sz="0"/>
-              <w:left w:val="none" w:color="FFFFFF" w:sz="0"/>
               <w:bottom w:val="single" w:color="000000" w:sz="6"/>
               <w:right w:val="none" w:color="FFFFFF" w:sz="0"/>
             </w:tcBorders>
@@ -8388,7 +7665,7 @@
         <w:t xml:space="preserve">iguales</w:t>
       </w:r>
       <w:r>
-        <w:t xml:space="preserve"> (switch–switch, router–router) van con cable cruzado (Cross-Over). En el cable serial, el extremo donde haces clic primero es el DCE, el que marca el «reloj» del enlace.</w:t>
+        <w:t xml:space="preserve"> (switch–switch, router–router) van con cable cruzado (Cross-Over).</w:t>
       </w:r>
     </w:p>
     <w:p>
@@ -8396,7 +7673,7 @@
         <w:ind w:firstLine="720"/>
       </w:pPr>
       <w:r>
-        <w:t xml:space="preserve">Al terminar de conectar, la red queda como en la Figura 3. Los triángulos se ponen verdes cuando cada interfaz se configura en los pasos siguientes.</w:t>
+        <w:t xml:space="preserve">Al terminar de conectar, la red queda como en la Figura 2. Los triángulos se ponen verdes cuando cada interfaz se configura en los pasos siguientes.</w:t>
       </w:r>
     </w:p>
     <w:p>
@@ -8408,7 +7685,7 @@
           <w:b/>
           <w:bCs/>
         </w:rPr>
-        <w:t xml:space="preserve">Figura 3</w:t>
+        <w:t xml:space="preserve">Figura 2</w:t>
       </w:r>
     </w:p>
     <w:p>
@@ -8431,7 +7708,7 @@
       <w:r>
         <w:drawing>
           <wp:inline distT="0" distB="0" distL="0" distR="0">
-            <wp:extent cx="5810250" cy="2257787"/>
+            <wp:extent cx="5810250" cy="1720970"/>
             <wp:effectExtent t="0" r="0" b="0" l="0"/>
             <wp:docPr id="1003" name=""/>
             <wp:cNvGraphicFramePr>
@@ -8456,7 +7733,7 @@
                   <pic:spPr bwMode="auto">
                     <a:xfrm>
                       <a:off x="0" y="0"/>
-                      <a:ext cx="5810250" cy="2257787"/>
+                      <a:ext cx="5810250" cy="1720970"/>
                     </a:xfrm>
                     <a:prstGeom prst="rect">
                       <a:avLst/>
@@ -8481,7 +7758,7 @@
         <w:t xml:space="preserve">Nota.</w:t>
       </w:r>
       <w:r>
-        <w:t xml:space="preserve"> Las líneas punteadas son cables cruzados entre routers; la línea roja en zigzag es el enlace serial con el ISP. Las etiquetas indican la subred de cada área y de cada enlace.</w:t>
+        <w:t xml:space="preserve"> Las líneas punteadas son cables cruzados entre routers. Las etiquetas indican la subred de cada área y de cada enlace.</w:t>
       </w:r>
     </w:p>
     <w:p>
@@ -8490,7 +7767,7 @@
       </w:pPr>
       <w:bookmarkStart w:name="_Toc12" w:id="12"/>
       <w:r>
-        <w:t xml:space="preserve">Paso 4. Configuración básica de todos los routers y switches</w:t>
+        <w:t xml:space="preserve">Paso 3. Configuración básica de todos los routers y switches</w:t>
       </w:r>
       <w:bookmarkEnd w:id="12"/>
     </w:p>
@@ -8499,7 +7776,7 @@
         <w:ind w:firstLine="720"/>
       </w:pPr>
       <w:r>
-        <w:t xml:space="preserve">Esto se hace en los 11 equipos de red (5 routers y 6 switches). Lo único que cambia es la línea hostname: escribe el nombre de cada equipo. Este bloque pone nombre, contraseñas, un aviso legal y evita que el equipo se quede «pensando» cuando escribes mal un comando.</w:t>
+        <w:t xml:space="preserve">Esto se hace en los 10 equipos de red (4 routers y 6 switches). Lo único que cambia es la línea hostname: escribe el nombre de cada equipo. Este bloque pone nombre, contraseñas, un aviso legal y evita que el equipo se quede «pensando» cuando escribes mal un comando.</w:t>
       </w:r>
     </w:p>
     <w:p>
@@ -8848,7 +8125,7 @@
       </w:pPr>
       <w:bookmarkStart w:name="_Toc212" w:id="212"/>
       <w:r>
-        <w:t xml:space="preserve">Paso 5. Los switches de área</w:t>
+        <w:t xml:space="preserve">Paso 4. Los switches de área</w:t>
       </w:r>
       <w:bookmarkEnd w:id="212"/>
     </w:p>
@@ -8857,7 +8134,7 @@
         <w:ind w:firstLine="720"/>
       </w:pPr>
       <w:r>
-        <w:t xml:space="preserve">Los seis switches no necesitan más configuración que la del Paso 4: cada uno conecta las PC de una sola área y sube por un único cable a su router. Comprueba que las luces de los enlaces pasen a verde.</w:t>
+        <w:t xml:space="preserve">Los seis switches no necesitan más configuración que la del Paso 3: cada uno conecta las PC de una sola área y sube por un único cable a su router. Comprueba que las luces de los enlaces pasen a verde.</w:t>
       </w:r>
     </w:p>
     <w:p>
@@ -8866,7 +8143,7 @@
       </w:pPr>
       <w:bookmarkStart w:name="_Toc213" w:id="213"/>
       <w:r>
-        <w:t xml:space="preserve">Paso 6. Enlaces de R-CRG con los routers de piso</w:t>
+        <w:t xml:space="preserve">Paso 5. Enlaces de R-CRG con los routers de piso</w:t>
       </w:r>
       <w:bookmarkEnd w:id="213"/>
     </w:p>
@@ -8875,18 +8152,7 @@
         <w:ind w:firstLine="720"/>
       </w:pPr>
       <w:r>
-        <w:t xml:space="preserve">R-CRG usa un puerto Gigabit por cada router de piso, y cada enlace es una subred /30 (Tabla 5). La línea </w:t>
-      </w:r>
-      <w:r>
-        <w:rPr>
-          <w:rFonts w:ascii="Courier New" w:cs="Courier New" w:eastAsia="Courier New" w:hAnsi="Courier New"/>
-          <w:sz w:val="22"/>
-          <w:szCs w:val="22"/>
-        </w:rPr>
-        <w:t xml:space="preserve">ip nat inside</w:t>
-      </w:r>
-      <w:r>
-        <w:t xml:space="preserve"> se explica en el Paso 11; ponla ya para no volver después.</w:t>
+        <w:t xml:space="preserve">R-CRG usa un puerto Gigabit por cada router de piso, y cada enlace es una subred /30 (Tabla 5).</w:t>
       </w:r>
     </w:p>
     <w:p>
@@ -8946,7 +8212,52 @@
           <w:sz w:val="19"/>
           <w:szCs w:val="19"/>
         </w:rPr>
-        <w:t xml:space="preserve"> ip nat inside</w:t>
+        <w:t xml:space="preserve"> no shutdown</w:t>
+      </w:r>
+    </w:p>
+    <w:p>
+      <w:pPr>
+        <w:shd w:fill="EDEDED" w:color="auto" w:val="clear"/>
+        <w:spacing w:after="0" w:before="0" w:line="240"/>
+        <w:ind w:left="360"/>
+      </w:pPr>
+      <w:r>
+        <w:rPr>
+          <w:rFonts w:ascii="Courier New" w:cs="Courier New" w:eastAsia="Courier New" w:hAnsi="Courier New"/>
+          <w:sz w:val="19"/>
+          <w:szCs w:val="19"/>
+        </w:rPr>
+        <w:t xml:space="preserve">interface GigabitEthernet0/1</w:t>
+      </w:r>
+    </w:p>
+    <w:p>
+      <w:pPr>
+        <w:shd w:fill="EDEDED" w:color="auto" w:val="clear"/>
+        <w:spacing w:after="0" w:before="0" w:line="240"/>
+        <w:ind w:left="360"/>
+      </w:pPr>
+      <w:r>
+        <w:rPr>
+          <w:rFonts w:ascii="Courier New" w:cs="Courier New" w:eastAsia="Courier New" w:hAnsi="Courier New"/>
+          <w:sz w:val="19"/>
+          <w:szCs w:val="19"/>
+        </w:rPr>
+        <w:t xml:space="preserve"> description Enlace a R-P2</w:t>
+      </w:r>
+    </w:p>
+    <w:p>
+      <w:pPr>
+        <w:shd w:fill="EDEDED" w:color="auto" w:val="clear"/>
+        <w:spacing w:after="0" w:before="0" w:line="240"/>
+        <w:ind w:left="360"/>
+      </w:pPr>
+      <w:r>
+        <w:rPr>
+          <w:rFonts w:ascii="Courier New" w:cs="Courier New" w:eastAsia="Courier New" w:hAnsi="Courier New"/>
+          <w:sz w:val="19"/>
+          <w:szCs w:val="19"/>
+        </w:rPr>
+        <w:t xml:space="preserve"> ip address 10.20.1.229 255.255.255.252</w:t>
       </w:r>
     </w:p>
     <w:p>
@@ -8976,7 +8287,7 @@
           <w:sz w:val="19"/>
           <w:szCs w:val="19"/>
         </w:rPr>
-        <w:t xml:space="preserve">interface GigabitEthernet0/1</w:t>
+        <w:t xml:space="preserve">interface GigabitEthernet0/2</w:t>
       </w:r>
     </w:p>
     <w:p>
@@ -8991,7 +8302,7 @@
           <w:sz w:val="19"/>
           <w:szCs w:val="19"/>
         </w:rPr>
-        <w:t xml:space="preserve"> description Enlace a R-P2</w:t>
+        <w:t xml:space="preserve"> description Enlace a R-P3</w:t>
       </w:r>
     </w:p>
     <w:p>
@@ -9006,22 +8317,7 @@
           <w:sz w:val="19"/>
           <w:szCs w:val="19"/>
         </w:rPr>
-        <w:t xml:space="preserve"> ip address 10.20.1.229 255.255.255.252</w:t>
-      </w:r>
-    </w:p>
-    <w:p>
-      <w:pPr>
-        <w:shd w:fill="EDEDED" w:color="auto" w:val="clear"/>
-        <w:spacing w:after="0" w:before="0" w:line="240"/>
-        <w:ind w:left="360"/>
-      </w:pPr>
-      <w:r>
-        <w:rPr>
-          <w:rFonts w:ascii="Courier New" w:cs="Courier New" w:eastAsia="Courier New" w:hAnsi="Courier New"/>
-          <w:sz w:val="19"/>
-          <w:szCs w:val="19"/>
-        </w:rPr>
-        <w:t xml:space="preserve"> ip nat inside</w:t>
+        <w:t xml:space="preserve"> ip address 10.20.1.233 255.255.255.252</w:t>
       </w:r>
     </w:p>
     <w:p>
@@ -9051,81 +8347,6 @@
           <w:sz w:val="19"/>
           <w:szCs w:val="19"/>
         </w:rPr>
-        <w:t xml:space="preserve">interface GigabitEthernet0/2</w:t>
-      </w:r>
-    </w:p>
-    <w:p>
-      <w:pPr>
-        <w:shd w:fill="EDEDED" w:color="auto" w:val="clear"/>
-        <w:spacing w:after="0" w:before="0" w:line="240"/>
-        <w:ind w:left="360"/>
-      </w:pPr>
-      <w:r>
-        <w:rPr>
-          <w:rFonts w:ascii="Courier New" w:cs="Courier New" w:eastAsia="Courier New" w:hAnsi="Courier New"/>
-          <w:sz w:val="19"/>
-          <w:szCs w:val="19"/>
-        </w:rPr>
-        <w:t xml:space="preserve"> description Enlace a R-P3</w:t>
-      </w:r>
-    </w:p>
-    <w:p>
-      <w:pPr>
-        <w:shd w:fill="EDEDED" w:color="auto" w:val="clear"/>
-        <w:spacing w:after="0" w:before="0" w:line="240"/>
-        <w:ind w:left="360"/>
-      </w:pPr>
-      <w:r>
-        <w:rPr>
-          <w:rFonts w:ascii="Courier New" w:cs="Courier New" w:eastAsia="Courier New" w:hAnsi="Courier New"/>
-          <w:sz w:val="19"/>
-          <w:szCs w:val="19"/>
-        </w:rPr>
-        <w:t xml:space="preserve"> ip address 10.20.1.233 255.255.255.252</w:t>
-      </w:r>
-    </w:p>
-    <w:p>
-      <w:pPr>
-        <w:shd w:fill="EDEDED" w:color="auto" w:val="clear"/>
-        <w:spacing w:after="0" w:before="0" w:line="240"/>
-        <w:ind w:left="360"/>
-      </w:pPr>
-      <w:r>
-        <w:rPr>
-          <w:rFonts w:ascii="Courier New" w:cs="Courier New" w:eastAsia="Courier New" w:hAnsi="Courier New"/>
-          <w:sz w:val="19"/>
-          <w:szCs w:val="19"/>
-        </w:rPr>
-        <w:t xml:space="preserve"> ip nat inside</w:t>
-      </w:r>
-    </w:p>
-    <w:p>
-      <w:pPr>
-        <w:shd w:fill="EDEDED" w:color="auto" w:val="clear"/>
-        <w:spacing w:after="0" w:before="0" w:line="240"/>
-        <w:ind w:left="360"/>
-      </w:pPr>
-      <w:r>
-        <w:rPr>
-          <w:rFonts w:ascii="Courier New" w:cs="Courier New" w:eastAsia="Courier New" w:hAnsi="Courier New"/>
-          <w:sz w:val="19"/>
-          <w:szCs w:val="19"/>
-        </w:rPr>
-        <w:t xml:space="preserve"> no shutdown</w:t>
-      </w:r>
-    </w:p>
-    <w:p>
-      <w:pPr>
-        <w:shd w:fill="EDEDED" w:color="auto" w:val="clear"/>
-        <w:spacing w:after="0" w:before="0" w:line="240"/>
-        <w:ind w:left="360"/>
-      </w:pPr>
-      <w:r>
-        <w:rPr>
-          <w:rFonts w:ascii="Courier New" w:cs="Courier New" w:eastAsia="Courier New" w:hAnsi="Courier New"/>
-          <w:sz w:val="19"/>
-          <w:szCs w:val="19"/>
-        </w:rPr>
         <w:t xml:space="preserve"> exit</w:t>
       </w:r>
     </w:p>
@@ -9140,7 +8361,7 @@
       </w:pPr>
       <w:bookmarkStart w:name="_Toc214" w:id="214"/>
       <w:r>
-        <w:t xml:space="preserve">Paso 7. Routers de piso</w:t>
+        <w:t xml:space="preserve">Paso 6. Routers de piso</w:t>
       </w:r>
       <w:bookmarkEnd w:id="214"/>
     </w:p>
@@ -9160,7 +8381,7 @@
         <w:t xml:space="preserve">ip helper-address</w:t>
       </w:r>
       <w:r>
-        <w:t xml:space="preserve"> hace que las PC pidan su IP al DHCP de R-CRG (se explica en el Paso 9).</w:t>
+        <w:t xml:space="preserve"> hace que las PC pidan su IP al DHCP de R-CRG (se explica en el Paso 8).</w:t>
       </w:r>
     </w:p>
     <w:p>
@@ -10058,7 +9279,7 @@
       </w:pPr>
       <w:bookmarkStart w:name="_Toc215" w:id="215"/>
       <w:r>
-        <w:t xml:space="preserve">7.1 Comprobar las interfaces</w:t>
+        <w:t xml:space="preserve">6.1 Comprobar las interfaces</w:t>
       </w:r>
       <w:bookmarkEnd w:id="215"/>
     </w:p>
@@ -10078,7 +9299,7 @@
         <w:t xml:space="preserve">show ip interface brief</w:t>
       </w:r>
       <w:r>
-        <w:t xml:space="preserve">. Todas las interfaces que usamos deben decir up / up. La Figura 4 muestra R-CRG (con el enlace serial que se configura en el Paso 11) y la Figura 5, R-P1.</w:t>
+        <w:t xml:space="preserve">. Todas las interfaces que usamos deben decir up / up. La Figura 3 muestra R-CRG y la Figura 4, R-P1.</w:t>
       </w:r>
     </w:p>
     <w:p>
@@ -10090,7 +9311,7 @@
           <w:b/>
           <w:bCs/>
         </w:rPr>
-        <w:t xml:space="preserve">Figura 4</w:t>
+        <w:t xml:space="preserve">Figura 3</w:t>
       </w:r>
     </w:p>
     <w:p>
@@ -10113,7 +9334,7 @@
       <w:r>
         <w:drawing>
           <wp:inline distT="0" distB="0" distL="0" distR="0">
-            <wp:extent cx="5480000" cy="1150000"/>
+            <wp:extent cx="5480000" cy="890000"/>
             <wp:effectExtent t="0" r="0" b="0" l="0"/>
             <wp:docPr id="1004" name=""/>
             <wp:cNvGraphicFramePr>
@@ -10138,7 +9359,7 @@
                   <pic:spPr bwMode="auto">
                     <a:xfrm>
                       <a:off x="0" y="0"/>
-                      <a:ext cx="5480000" cy="1150000"/>
+                      <a:ext cx="5480000" cy="890000"/>
                     </a:xfrm>
                     <a:prstGeom prst="rect">
                       <a:avLst/>
@@ -10165,7 +9386,7 @@
           <w:b/>
           <w:bCs/>
         </w:rPr>
-        <w:t xml:space="preserve">Figura 5</w:t>
+        <w:t xml:space="preserve">Figura 4</w:t>
       </w:r>
     </w:p>
     <w:p>
@@ -10237,7 +9458,7 @@
       </w:pPr>
       <w:bookmarkStart w:name="_Toc210" w:id="210"/>
       <w:r>
-        <w:t xml:space="preserve">Paso 8. Rutas estáticas</w:t>
+        <w:t xml:space="preserve">Paso 7. Rutas estáticas</w:t>
       </w:r>
       <w:bookmarkEnd w:id="210"/>
     </w:p>
@@ -10265,28 +9486,13 @@
         <w:ind w:firstLine="720"/>
       </w:pPr>
       <w:r>
-        <w:t xml:space="preserve">R-CRG necesita una ruta hacia cada red de área, por el enlace del router de piso que la atiende, y una ruta por defecto hacia el ISP para todo lo demás.</w:t>
+        <w:t xml:space="preserve">R-CRG necesita una ruta hacia cada red de área, por el enlace del router de piso que la atiende. No necesita ruta por defecto porque la red no tiene salida hacia afuera.</w:t>
       </w:r>
     </w:p>
     <w:p>
       <w:pPr>
         <w:shd w:fill="EDEDED" w:color="auto" w:val="clear"/>
         <w:spacing w:after="0" w:before="120" w:line="240"/>
-        <w:ind w:left="360"/>
-      </w:pPr>
-      <w:r>
-        <w:rPr>
-          <w:rFonts w:ascii="Courier New" w:cs="Courier New" w:eastAsia="Courier New" w:hAnsi="Courier New"/>
-          <w:sz w:val="19"/>
-          <w:szCs w:val="19"/>
-        </w:rPr>
-        <w:t xml:space="preserve">ip route 0.0.0.0 0.0.0.0 203.0.113.2</w:t>
-      </w:r>
-    </w:p>
-    <w:p>
-      <w:pPr>
-        <w:shd w:fill="EDEDED" w:color="auto" w:val="clear"/>
-        <w:spacing w:after="0" w:before="0" w:line="240"/>
         <w:ind w:left="360"/>
       </w:pPr>
       <w:r>
@@ -10445,7 +9651,7 @@
       </w:pPr>
       <w:bookmarkStart w:name="_Toc211" w:id="211"/>
       <w:r>
-        <w:t xml:space="preserve">8.1 Comprobar las rutas</w:t>
+        <w:t xml:space="preserve">7.1 Comprobar las rutas</w:t>
       </w:r>
       <w:bookmarkEnd w:id="211"/>
     </w:p>
@@ -10476,18 +9682,7 @@
         <w:t xml:space="preserve">S</w:t>
       </w:r>
       <w:r>
-        <w:t xml:space="preserve"> y la ruta por defecto con </w:t>
-      </w:r>
-      <w:r>
-        <w:rPr>
-          <w:rFonts w:ascii="Courier New" w:cs="Courier New" w:eastAsia="Courier New" w:hAnsi="Courier New"/>
-          <w:sz w:val="22"/>
-          <w:szCs w:val="22"/>
-        </w:rPr>
-        <w:t xml:space="preserve">S*</w:t>
-      </w:r>
-      <w:r>
-        <w:t xml:space="preserve"> (Figura 6). En cada router de piso, el mismo comando muestra solo la ruta por defecto hacia R-CRG (Figura 5).</w:t>
+        <w:t xml:space="preserve"> (Figura 5). En cada router de piso, el mismo comando muestra solo la ruta por defecto hacia R-CRG (Figura 3).</w:t>
       </w:r>
     </w:p>
     <w:p>
@@ -10499,7 +9694,7 @@
           <w:b/>
           <w:bCs/>
         </w:rPr>
-        <w:t xml:space="preserve">Figura 6</w:t>
+        <w:t xml:space="preserve">Figura 5</w:t>
       </w:r>
     </w:p>
     <w:p>
@@ -10522,7 +9717,7 @@
       <w:r>
         <w:drawing>
           <wp:inline distT="0" distB="0" distL="0" distR="0">
-            <wp:extent cx="4030000" cy="1410000"/>
+            <wp:extent cx="4030000" cy="1270000"/>
             <wp:effectExtent t="0" r="0" b="0" l="0"/>
             <wp:docPr id="1006" name=""/>
             <wp:cNvGraphicFramePr>
@@ -10547,7 +9742,7 @@
                   <pic:spPr bwMode="auto">
                     <a:xfrm>
                       <a:off x="0" y="0"/>
-                      <a:ext cx="4030000" cy="1410000"/>
+                      <a:ext cx="4030000" cy="1270000"/>
                     </a:xfrm>
                     <a:prstGeom prst="rect">
                       <a:avLst/>
@@ -10571,7 +9766,7 @@
       </w:pPr>
       <w:bookmarkStart w:name="_Toc17" w:id="17"/>
       <w:r>
-        <w:t xml:space="preserve">Paso 9. DHCP centralizado en R-CRG</w:t>
+        <w:t xml:space="preserve">Paso 8. DHCP centralizado en R-CRG</w:t>
       </w:r>
       <w:bookmarkEnd w:id="17"/>
     </w:p>
@@ -11448,7 +10643,7 @@
         <w:ind w:firstLine="720"/>
       </w:pPr>
       <w:r>
-        <w:t xml:space="preserve">¿Cómo llega el DHCP a las PC de los routers de piso si R-CRG está en otra red? Gracias al ip helper-address del Paso 7: el router de piso recibe el pedido de la PC y lo reenvía a R-CRG por el enlace entre ambos.</w:t>
+        <w:t xml:space="preserve">¿Cómo llega el DHCP a las PC de los routers de piso si R-CRG está en otra red? Gracias al ip helper-address del Paso 6: el router de piso recibe el pedido de la PC y lo reenvía a R-CRG por el enlace entre ambos.</w:t>
       </w:r>
     </w:p>
     <w:p>
@@ -11457,7 +10652,7 @@
       </w:pPr>
       <w:bookmarkStart w:name="_Toc216" w:id="216"/>
       <w:r>
-        <w:t xml:space="preserve">Paso 10. IP fija de los servidores</w:t>
+        <w:t xml:space="preserve">Paso 9. IP fija de los servidores</w:t>
       </w:r>
       <w:bookmarkEnd w:id="216"/>
     </w:p>
@@ -11466,7 +10661,7 @@
         <w:ind w:firstLine="720"/>
       </w:pPr>
       <w:r>
-        <w:t xml:space="preserve">Haz clic en SRV-TI &gt; pestaña Desktop &gt; IP Configuration. Elige Static y escribe: IP 10.20.1.194, máscara 255.255.255.224, gateway 10.20.1.193. Haz lo mismo con WEB-EXT: IP 198.51.100.10, máscara 255.255.255.0, gateway 198.51.100.1.</w:t>
+        <w:t xml:space="preserve">Haz clic en SRV-TI &gt; pestaña Desktop &gt; IP Configuration. Elige Static y escribe: IP 10.20.1.194, máscara 255.255.255.224, gateway 10.20.1.193.</w:t>
       </w:r>
     </w:p>
     <w:p>
@@ -11475,410 +10670,9 @@
       </w:pPr>
       <w:bookmarkStart w:name="_Toc217" w:id="217"/>
       <w:r>
-        <w:t xml:space="preserve">Paso 11. La red externa (ISP) y el NAT</w:t>
+        <w:t xml:space="preserve">Paso 10. Poner las PC en DHCP</w:t>
       </w:r>
       <w:bookmarkEnd w:id="217"/>
-    </w:p>
-    <w:p>
-      <w:pPr>
-        <w:pStyle w:val="Heading3"/>
-      </w:pPr>
-      <w:bookmarkStart w:name="_Toc218" w:id="218"/>
-      <w:r>
-        <w:t xml:space="preserve">11.1 Router ISP</w:t>
-      </w:r>
-      <w:bookmarkEnd w:id="218"/>
-    </w:p>
-    <w:p>
-      <w:pPr>
-        <w:ind w:firstLine="720"/>
-      </w:pPr>
-      <w:r>
-        <w:t xml:space="preserve">El ISP no conoce las redes 10.20.x.x. Por eso, sin NAT, las PC no podrían recibir respuestas de afuera. Así se comporta Internet de verdad con las direcciones privadas.</w:t>
-      </w:r>
-    </w:p>
-    <w:p>
-      <w:pPr>
-        <w:shd w:fill="EDEDED" w:color="auto" w:val="clear"/>
-        <w:spacing w:after="0" w:before="120" w:line="240"/>
-        <w:ind w:left="360"/>
-      </w:pPr>
-      <w:r>
-        <w:rPr>
-          <w:rFonts w:ascii="Courier New" w:cs="Courier New" w:eastAsia="Courier New" w:hAnsi="Courier New"/>
-          <w:sz w:val="19"/>
-          <w:szCs w:val="19"/>
-        </w:rPr>
-        <w:t xml:space="preserve">interface Serial0/0/0</w:t>
-      </w:r>
-    </w:p>
-    <w:p>
-      <w:pPr>
-        <w:shd w:fill="EDEDED" w:color="auto" w:val="clear"/>
-        <w:spacing w:after="0" w:before="0" w:line="240"/>
-        <w:ind w:left="360"/>
-      </w:pPr>
-      <w:r>
-        <w:rPr>
-          <w:rFonts w:ascii="Courier New" w:cs="Courier New" w:eastAsia="Courier New" w:hAnsi="Courier New"/>
-          <w:sz w:val="19"/>
-          <w:szCs w:val="19"/>
-        </w:rPr>
-        <w:t xml:space="preserve"> description Enlace a R-CRG</w:t>
-      </w:r>
-    </w:p>
-    <w:p>
-      <w:pPr>
-        <w:shd w:fill="EDEDED" w:color="auto" w:val="clear"/>
-        <w:spacing w:after="0" w:before="0" w:line="240"/>
-        <w:ind w:left="360"/>
-      </w:pPr>
-      <w:r>
-        <w:rPr>
-          <w:rFonts w:ascii="Courier New" w:cs="Courier New" w:eastAsia="Courier New" w:hAnsi="Courier New"/>
-          <w:sz w:val="19"/>
-          <w:szCs w:val="19"/>
-        </w:rPr>
-        <w:t xml:space="preserve"> ip address 203.0.113.2 255.255.255.252</w:t>
-      </w:r>
-    </w:p>
-    <w:p>
-      <w:pPr>
-        <w:shd w:fill="EDEDED" w:color="auto" w:val="clear"/>
-        <w:spacing w:after="0" w:before="0" w:line="240"/>
-        <w:ind w:left="360"/>
-      </w:pPr>
-      <w:r>
-        <w:rPr>
-          <w:rFonts w:ascii="Courier New" w:cs="Courier New" w:eastAsia="Courier New" w:hAnsi="Courier New"/>
-          <w:sz w:val="19"/>
-          <w:szCs w:val="19"/>
-        </w:rPr>
-        <w:t xml:space="preserve"> no shutdown</w:t>
-      </w:r>
-    </w:p>
-    <w:p>
-      <w:pPr>
-        <w:shd w:fill="EDEDED" w:color="auto" w:val="clear"/>
-        <w:spacing w:after="0" w:before="0" w:line="240"/>
-        <w:ind w:left="360"/>
-      </w:pPr>
-      <w:r>
-        <w:rPr>
-          <w:rFonts w:ascii="Courier New" w:cs="Courier New" w:eastAsia="Courier New" w:hAnsi="Courier New"/>
-          <w:sz w:val="19"/>
-          <w:szCs w:val="19"/>
-        </w:rPr>
-        <w:t xml:space="preserve">interface GigabitEthernet0/0</w:t>
-      </w:r>
-    </w:p>
-    <w:p>
-      <w:pPr>
-        <w:shd w:fill="EDEDED" w:color="auto" w:val="clear"/>
-        <w:spacing w:after="0" w:before="0" w:line="240"/>
-        <w:ind w:left="360"/>
-      </w:pPr>
-      <w:r>
-        <w:rPr>
-          <w:rFonts w:ascii="Courier New" w:cs="Courier New" w:eastAsia="Courier New" w:hAnsi="Courier New"/>
-          <w:sz w:val="19"/>
-          <w:szCs w:val="19"/>
-        </w:rPr>
-        <w:t xml:space="preserve"> description Red externa simulada</w:t>
-      </w:r>
-    </w:p>
-    <w:p>
-      <w:pPr>
-        <w:shd w:fill="EDEDED" w:color="auto" w:val="clear"/>
-        <w:spacing w:after="0" w:before="0" w:line="240"/>
-        <w:ind w:left="360"/>
-      </w:pPr>
-      <w:r>
-        <w:rPr>
-          <w:rFonts w:ascii="Courier New" w:cs="Courier New" w:eastAsia="Courier New" w:hAnsi="Courier New"/>
-          <w:sz w:val="19"/>
-          <w:szCs w:val="19"/>
-        </w:rPr>
-        <w:t xml:space="preserve"> ip address 198.51.100.1 255.255.255.0</w:t>
-      </w:r>
-    </w:p>
-    <w:p>
-      <w:pPr>
-        <w:shd w:fill="EDEDED" w:color="auto" w:val="clear"/>
-        <w:spacing w:after="0" w:before="0" w:line="240"/>
-        <w:ind w:left="360"/>
-      </w:pPr>
-      <w:r>
-        <w:rPr>
-          <w:rFonts w:ascii="Courier New" w:cs="Courier New" w:eastAsia="Courier New" w:hAnsi="Courier New"/>
-          <w:sz w:val="19"/>
-          <w:szCs w:val="19"/>
-        </w:rPr>
-        <w:t xml:space="preserve"> no shutdown</w:t>
-      </w:r>
-    </w:p>
-    <w:p>
-      <w:pPr>
-        <w:shd w:fill="EDEDED" w:color="auto" w:val="clear"/>
-        <w:spacing w:after="0" w:before="0" w:line="240"/>
-        <w:ind w:left="360"/>
-      </w:pPr>
-      <w:r>
-        <w:rPr>
-          <w:rFonts w:ascii="Courier New" w:cs="Courier New" w:eastAsia="Courier New" w:hAnsi="Courier New"/>
-          <w:sz w:val="19"/>
-          <w:szCs w:val="19"/>
-        </w:rPr>
-        <w:t xml:space="preserve">end</w:t>
-      </w:r>
-    </w:p>
-    <w:p>
-      <w:pPr>
-        <w:shd w:fill="EDEDED" w:color="auto" w:val="clear"/>
-        <w:spacing w:after="0" w:before="0" w:line="240"/>
-        <w:ind w:left="360"/>
-      </w:pPr>
-      <w:r>
-        <w:rPr>
-          <w:rFonts w:ascii="Courier New" w:cs="Courier New" w:eastAsia="Courier New" w:hAnsi="Courier New"/>
-          <w:sz w:val="19"/>
-          <w:szCs w:val="19"/>
-        </w:rPr>
-        <w:t xml:space="preserve">write memory</w:t>
-      </w:r>
-    </w:p>
-    <w:p>
-      <w:pPr>
-        <w:spacing w:before="0" w:after="0" w:line="240" w:lineRule="exact"/>
-      </w:pPr>
-    </w:p>
-    <w:p>
-      <w:pPr>
-        <w:pStyle w:val="Heading3"/>
-      </w:pPr>
-      <w:bookmarkStart w:name="_Toc219" w:id="219"/>
-      <w:r>
-        <w:t xml:space="preserve">11.2 NAT en R-CRG</w:t>
-      </w:r>
-      <w:bookmarkEnd w:id="219"/>
-    </w:p>
-    <w:p>
-      <w:pPr>
-        <w:ind w:firstLine="720"/>
-      </w:pPr>
-      <w:r>
-        <w:t xml:space="preserve">Las interfaces «de adentro» ya tienen ip nat inside (Paso 6). Falta configurar y marcar la de afuera, decir qué direcciones se traducen (ACL-NAT) y activar el NAT con overload (muchas PC comparten una sola IP pública). Como R-CRG es el lado DCE del cable serial, también lleva clock rate 64000.</w:t>
-      </w:r>
-    </w:p>
-    <w:p>
-      <w:pPr>
-        <w:shd w:fill="EDEDED" w:color="auto" w:val="clear"/>
-        <w:spacing w:after="0" w:before="120" w:line="240"/>
-        <w:ind w:left="360"/>
-      </w:pPr>
-      <w:r>
-        <w:rPr>
-          <w:rFonts w:ascii="Courier New" w:cs="Courier New" w:eastAsia="Courier New" w:hAnsi="Courier New"/>
-          <w:sz w:val="19"/>
-          <w:szCs w:val="19"/>
-        </w:rPr>
-        <w:t xml:space="preserve">interface Serial0/0/0</w:t>
-      </w:r>
-    </w:p>
-    <w:p>
-      <w:pPr>
-        <w:shd w:fill="EDEDED" w:color="auto" w:val="clear"/>
-        <w:spacing w:after="0" w:before="0" w:line="240"/>
-        <w:ind w:left="360"/>
-      </w:pPr>
-      <w:r>
-        <w:rPr>
-          <w:rFonts w:ascii="Courier New" w:cs="Courier New" w:eastAsia="Courier New" w:hAnsi="Courier New"/>
-          <w:sz w:val="19"/>
-          <w:szCs w:val="19"/>
-        </w:rPr>
-        <w:t xml:space="preserve"> description Salida externa (ISP simulado)</w:t>
-      </w:r>
-    </w:p>
-    <w:p>
-      <w:pPr>
-        <w:shd w:fill="EDEDED" w:color="auto" w:val="clear"/>
-        <w:spacing w:after="0" w:before="0" w:line="240"/>
-        <w:ind w:left="360"/>
-      </w:pPr>
-      <w:r>
-        <w:rPr>
-          <w:rFonts w:ascii="Courier New" w:cs="Courier New" w:eastAsia="Courier New" w:hAnsi="Courier New"/>
-          <w:sz w:val="19"/>
-          <w:szCs w:val="19"/>
-        </w:rPr>
-        <w:t xml:space="preserve"> ip address 203.0.113.1 255.255.255.252</w:t>
-      </w:r>
-    </w:p>
-    <w:p>
-      <w:pPr>
-        <w:shd w:fill="EDEDED" w:color="auto" w:val="clear"/>
-        <w:spacing w:after="0" w:before="0" w:line="240"/>
-        <w:ind w:left="360"/>
-      </w:pPr>
-      <w:r>
-        <w:rPr>
-          <w:rFonts w:ascii="Courier New" w:cs="Courier New" w:eastAsia="Courier New" w:hAnsi="Courier New"/>
-          <w:sz w:val="19"/>
-          <w:szCs w:val="19"/>
-        </w:rPr>
-        <w:t xml:space="preserve"> clock rate 64000</w:t>
-      </w:r>
-    </w:p>
-    <w:p>
-      <w:pPr>
-        <w:shd w:fill="EDEDED" w:color="auto" w:val="clear"/>
-        <w:spacing w:after="0" w:before="0" w:line="240"/>
-        <w:ind w:left="360"/>
-      </w:pPr>
-      <w:r>
-        <w:rPr>
-          <w:rFonts w:ascii="Courier New" w:cs="Courier New" w:eastAsia="Courier New" w:hAnsi="Courier New"/>
-          <w:sz w:val="19"/>
-          <w:szCs w:val="19"/>
-        </w:rPr>
-        <w:t xml:space="preserve"> ip nat outside</w:t>
-      </w:r>
-    </w:p>
-    <w:p>
-      <w:pPr>
-        <w:shd w:fill="EDEDED" w:color="auto" w:val="clear"/>
-        <w:spacing w:after="0" w:before="0" w:line="240"/>
-        <w:ind w:left="360"/>
-      </w:pPr>
-      <w:r>
-        <w:rPr>
-          <w:rFonts w:ascii="Courier New" w:cs="Courier New" w:eastAsia="Courier New" w:hAnsi="Courier New"/>
-          <w:sz w:val="19"/>
-          <w:szCs w:val="19"/>
-        </w:rPr>
-        <w:t xml:space="preserve"> no shutdown</w:t>
-      </w:r>
-    </w:p>
-    <w:p>
-      <w:pPr>
-        <w:shd w:fill="EDEDED" w:color="auto" w:val="clear"/>
-        <w:spacing w:after="0" w:before="0" w:line="240"/>
-        <w:ind w:left="360"/>
-      </w:pPr>
-      <w:r>
-        <w:rPr>
-          <w:rFonts w:ascii="Courier New" w:cs="Courier New" w:eastAsia="Courier New" w:hAnsi="Courier New"/>
-          <w:sz w:val="19"/>
-          <w:szCs w:val="19"/>
-        </w:rPr>
-        <w:t xml:space="preserve"> exit</w:t>
-      </w:r>
-    </w:p>
-    <w:p>
-      <w:pPr>
-        <w:shd w:fill="EDEDED" w:color="auto" w:val="clear"/>
-        <w:spacing w:after="0" w:before="0" w:line="240"/>
-        <w:ind w:left="360"/>
-      </w:pPr>
-      <w:r>
-        <w:rPr>
-          <w:rFonts w:ascii="Courier New" w:cs="Courier New" w:eastAsia="Courier New" w:hAnsi="Courier New"/>
-          <w:sz w:val="19"/>
-          <w:szCs w:val="19"/>
-        </w:rPr>
-        <w:t xml:space="preserve">ip access-list standard ACL-NAT</w:t>
-      </w:r>
-    </w:p>
-    <w:p>
-      <w:pPr>
-        <w:shd w:fill="EDEDED" w:color="auto" w:val="clear"/>
-        <w:spacing w:after="0" w:before="0" w:line="240"/>
-        <w:ind w:left="360"/>
-      </w:pPr>
-      <w:r>
-        <w:rPr>
-          <w:rFonts w:ascii="Courier New" w:cs="Courier New" w:eastAsia="Courier New" w:hAnsi="Courier New"/>
-          <w:sz w:val="19"/>
-          <w:szCs w:val="19"/>
-        </w:rPr>
-        <w:t xml:space="preserve"> permit 10.20.0.0 0.0.1.255</w:t>
-      </w:r>
-    </w:p>
-    <w:p>
-      <w:pPr>
-        <w:shd w:fill="EDEDED" w:color="auto" w:val="clear"/>
-        <w:spacing w:after="0" w:before="0" w:line="240"/>
-        <w:ind w:left="360"/>
-      </w:pPr>
-      <w:r>
-        <w:rPr>
-          <w:rFonts w:ascii="Courier New" w:cs="Courier New" w:eastAsia="Courier New" w:hAnsi="Courier New"/>
-          <w:sz w:val="19"/>
-          <w:szCs w:val="19"/>
-        </w:rPr>
-        <w:t xml:space="preserve"> exit</w:t>
-      </w:r>
-    </w:p>
-    <w:p>
-      <w:pPr>
-        <w:shd w:fill="EDEDED" w:color="auto" w:val="clear"/>
-        <w:spacing w:after="0" w:before="0" w:line="240"/>
-        <w:ind w:left="360"/>
-      </w:pPr>
-      <w:r>
-        <w:rPr>
-          <w:rFonts w:ascii="Courier New" w:cs="Courier New" w:eastAsia="Courier New" w:hAnsi="Courier New"/>
-          <w:sz w:val="19"/>
-          <w:szCs w:val="19"/>
-        </w:rPr>
-        <w:t xml:space="preserve">ip nat inside source list ACL-NAT interface Serial0/0/0 overload</w:t>
-      </w:r>
-    </w:p>
-    <w:p>
-      <w:pPr>
-        <w:shd w:fill="EDEDED" w:color="auto" w:val="clear"/>
-        <w:spacing w:after="0" w:before="0" w:line="240"/>
-        <w:ind w:left="360"/>
-      </w:pPr>
-      <w:r>
-        <w:rPr>
-          <w:rFonts w:ascii="Courier New" w:cs="Courier New" w:eastAsia="Courier New" w:hAnsi="Courier New"/>
-          <w:sz w:val="19"/>
-          <w:szCs w:val="19"/>
-        </w:rPr>
-        <w:t xml:space="preserve">end</w:t>
-      </w:r>
-    </w:p>
-    <w:p>
-      <w:pPr>
-        <w:shd w:fill="EDEDED" w:color="auto" w:val="clear"/>
-        <w:spacing w:after="0" w:before="0" w:line="240"/>
-        <w:ind w:left="360"/>
-      </w:pPr>
-      <w:r>
-        <w:rPr>
-          <w:rFonts w:ascii="Courier New" w:cs="Courier New" w:eastAsia="Courier New" w:hAnsi="Courier New"/>
-          <w:sz w:val="19"/>
-          <w:szCs w:val="19"/>
-        </w:rPr>
-        <w:t xml:space="preserve">write memory</w:t>
-      </w:r>
-    </w:p>
-    <w:p>
-      <w:pPr>
-        <w:spacing w:before="0" w:after="0" w:line="240" w:lineRule="exact"/>
-      </w:pPr>
-    </w:p>
-    <w:p>
-      <w:pPr>
-        <w:pStyle w:val="Heading2"/>
-      </w:pPr>
-      <w:bookmarkStart w:name="_Toc220" w:id="220"/>
-      <w:r>
-        <w:t xml:space="preserve">Paso 12. Poner las PC en DHCP</w:t>
-      </w:r>
-      <w:bookmarkEnd w:id="220"/>
     </w:p>
     <w:p>
       <w:pPr>
@@ -11917,7 +10711,7 @@
         <w:ind w:firstLine="720"/>
       </w:pPr>
       <w:r>
-        <w:t xml:space="preserve">Marca DHCP. En unos segundos aparecen la IP, la máscara y el gateway (Figura 7).</w:t>
+        <w:t xml:space="preserve">Marca DHCP. En unos segundos aparecen la IP, la máscara y el gateway (Figura 6).</w:t>
       </w:r>
     </w:p>
     <w:p>
@@ -11929,7 +10723,7 @@
           <w:b/>
           <w:bCs/>
         </w:rPr>
-        <w:t xml:space="preserve">Figura 7</w:t>
+        <w:t xml:space="preserve">Figura 6</w:t>
       </w:r>
     </w:p>
     <w:p>
@@ -12008,7 +10802,7 @@
         <w:ind w:firstLine="720"/>
       </w:pPr>
       <w:r>
-        <w:t xml:space="preserve">En R-CRG, show ip dhcp binding muestra todas las direcciones entregadas. Las 12 PC recibieron una IP dentro de la subred de su área (Figura 8).</w:t>
+        <w:t xml:space="preserve">En R-CRG, show ip dhcp binding muestra todas las direcciones entregadas. Las 12 PC recibieron una IP dentro de la subred de su área (Figura 7).</w:t>
       </w:r>
     </w:p>
     <w:p>
@@ -12020,7 +10814,7 @@
           <w:b/>
           <w:bCs/>
         </w:rPr>
-        <w:t xml:space="preserve">Figura 8</w:t>
+        <w:t xml:space="preserve">Figura 7</w:t>
       </w:r>
     </w:p>
     <w:p>
@@ -12090,11 +10884,11 @@
       <w:pPr>
         <w:pStyle w:val="Heading2"/>
       </w:pPr>
-      <w:bookmarkStart w:name="_Toc221" w:id="221"/>
-      <w:r>
-        <w:t xml:space="preserve">Paso 13. Guardar</w:t>
-      </w:r>
-      <w:bookmarkEnd w:id="221"/>
+      <w:bookmarkStart w:name="_Toc218" w:id="218"/>
+      <w:r>
+        <w:t xml:space="preserve">Paso 11. Guardar</w:t>
+      </w:r>
+      <w:bookmarkEnd w:id="218"/>
     </w:p>
     <w:p>
       <w:pPr>
@@ -12462,7 +11256,7 @@
                 <w:sz w:val="21"/>
                 <w:szCs w:val="21"/>
               </w:rPr>
-              <w:t xml:space="preserve">7, 8</w:t>
+              <w:t xml:space="preserve">6, 7</w:t>
             </w:r>
           </w:p>
         </w:tc>
@@ -12612,7 +11406,7 @@
                 <w:sz w:val="21"/>
                 <w:szCs w:val="21"/>
               </w:rPr>
-              <w:t xml:space="preserve">9</w:t>
+              <w:t xml:space="preserve">8</w:t>
             </w:r>
           </w:p>
         </w:tc>
@@ -12762,7 +11556,7 @@
                 <w:sz w:val="21"/>
                 <w:szCs w:val="21"/>
               </w:rPr>
-              <w:t xml:space="preserve">10</w:t>
+              <w:t xml:space="preserve">9</w:t>
             </w:r>
           </w:p>
         </w:tc>
@@ -12912,7 +11706,7 @@
                 <w:sz w:val="21"/>
                 <w:szCs w:val="21"/>
               </w:rPr>
-              <w:t xml:space="preserve">11</w:t>
+              <w:t xml:space="preserve">10</w:t>
             </w:r>
           </w:p>
         </w:tc>
@@ -13062,7 +11856,7 @@
                 <w:sz w:val="21"/>
                 <w:szCs w:val="21"/>
               </w:rPr>
-              <w:t xml:space="preserve">12</w:t>
+              <w:t xml:space="preserve">11</w:t>
             </w:r>
           </w:p>
         </w:tc>
@@ -13125,7 +11919,7 @@
                 <w:sz w:val="21"/>
                 <w:szCs w:val="21"/>
               </w:rPr>
-              <w:t xml:space="preserve">Los enlaces con los routers de piso y con el ISP están activos</w:t>
+              <w:t xml:space="preserve">Los enlaces con los routers de piso están activos</w:t>
             </w:r>
           </w:p>
         </w:tc>
@@ -13212,7 +12006,7 @@
                 <w:sz w:val="21"/>
                 <w:szCs w:val="21"/>
               </w:rPr>
-              <w:t xml:space="preserve">4, 5</w:t>
+              <w:t xml:space="preserve">3, 4</w:t>
             </w:r>
           </w:p>
         </w:tc>
@@ -13304,7 +12098,7 @@
                 <w:sz w:val="21"/>
                 <w:szCs w:val="21"/>
               </w:rPr>
-              <w:t xml:space="preserve">Seis rutas S y ruta por defecto S*</w:t>
+              <w:t xml:space="preserve">Seis rutas S en R-CRG y ruta por defecto S* en cada router de piso</w:t>
             </w:r>
           </w:p>
         </w:tc>
@@ -13362,7 +12156,7 @@
                 <w:sz w:val="21"/>
                 <w:szCs w:val="21"/>
               </w:rPr>
-              <w:t xml:space="preserve">5, 6</w:t>
+              <w:t xml:space="preserve">4, 5</w:t>
             </w:r>
           </w:p>
         </w:tc>
@@ -13377,7 +12171,7 @@
             <w:tcBorders>
               <w:top w:val="none" w:color="FFFFFF" w:sz="0"/>
               <w:left w:val="none" w:color="FFFFFF" w:sz="0"/>
-              <w:bottom w:val="none" w:color="FFFFFF" w:sz="0"/>
+              <w:bottom w:val="single" w:color="000000" w:sz="6"/>
               <w:right w:val="none" w:color="FFFFFF" w:sz="0"/>
             </w:tcBorders>
             <w:tcMar>
@@ -13406,26 +12200,26 @@
             <w:tcBorders>
               <w:top w:val="none" w:color="FFFFFF" w:sz="0"/>
               <w:left w:val="none" w:color="FFFFFF" w:sz="0"/>
-              <w:bottom w:val="none" w:color="FFFFFF" w:sz="0"/>
-              <w:right w:val="none" w:color="FFFFFF" w:sz="0"/>
-            </w:tcBorders>
-            <w:tcMar>
-              <w:top w:type="dxa" w:w="40"/>
-              <w:left w:type="dxa" w:w="80"/>
-              <w:bottom w:type="dxa" w:w="40"/>
-              <w:right w:type="dxa" w:w="80"/>
-            </w:tcMar>
-          </w:tcPr>
-          <w:p>
-            <w:pPr>
-              <w:spacing w:line="240"/>
-            </w:pPr>
-            <w:r>
-              <w:rPr>
-                <w:sz w:val="21"/>
-                <w:szCs w:val="21"/>
-              </w:rPr>
-              <w:t xml:space="preserve">PC-VEN1 llega a WEB-EXT (198.51.100.10) con NAT</w:t>
+              <w:bottom w:val="single" w:color="000000" w:sz="6"/>
+              <w:right w:val="none" w:color="FFFFFF" w:sz="0"/>
+            </w:tcBorders>
+            <w:tcMar>
+              <w:top w:type="dxa" w:w="40"/>
+              <w:left w:type="dxa" w:w="80"/>
+              <w:bottom w:type="dxa" w:w="40"/>
+              <w:right w:type="dxa" w:w="80"/>
+            </w:tcMar>
+          </w:tcPr>
+          <w:p>
+            <w:pPr>
+              <w:spacing w:line="240"/>
+            </w:pPr>
+            <w:r>
+              <w:rPr>
+                <w:sz w:val="21"/>
+                <w:szCs w:val="21"/>
+              </w:rPr>
+              <w:t xml:space="preserve">R-CRG entregó las direcciones por DHCP</w:t>
             </w:r>
           </w:p>
         </w:tc>
@@ -13435,26 +12229,26 @@
             <w:tcBorders>
               <w:top w:val="none" w:color="FFFFFF" w:sz="0"/>
               <w:left w:val="none" w:color="FFFFFF" w:sz="0"/>
-              <w:bottom w:val="none" w:color="FFFFFF" w:sz="0"/>
-              <w:right w:val="none" w:color="FFFFFF" w:sz="0"/>
-            </w:tcBorders>
-            <w:tcMar>
-              <w:top w:type="dxa" w:w="40"/>
-              <w:left w:type="dxa" w:w="80"/>
-              <w:bottom w:type="dxa" w:w="40"/>
-              <w:right w:type="dxa" w:w="80"/>
-            </w:tcMar>
-          </w:tcPr>
-          <w:p>
-            <w:pPr>
-              <w:spacing w:line="240"/>
-            </w:pPr>
-            <w:r>
-              <w:rPr>
-                <w:sz w:val="21"/>
-                <w:szCs w:val="21"/>
-              </w:rPr>
-              <w:t xml:space="preserve">Responde y aparece en la tabla NAT</w:t>
+              <w:bottom w:val="single" w:color="000000" w:sz="6"/>
+              <w:right w:val="none" w:color="FFFFFF" w:sz="0"/>
+            </w:tcBorders>
+            <w:tcMar>
+              <w:top w:type="dxa" w:w="40"/>
+              <w:left w:type="dxa" w:w="80"/>
+              <w:bottom w:type="dxa" w:w="40"/>
+              <w:right w:type="dxa" w:w="80"/>
+            </w:tcMar>
+          </w:tcPr>
+          <w:p>
+            <w:pPr>
+              <w:spacing w:line="240"/>
+            </w:pPr>
+            <w:r>
+              <w:rPr>
+                <w:sz w:val="21"/>
+                <w:szCs w:val="21"/>
+              </w:rPr>
+              <w:t xml:space="preserve">12 asignaciones en show ip dhcp binding</w:t>
             </w:r>
           </w:p>
         </w:tc>
@@ -13464,26 +12258,26 @@
             <w:tcBorders>
               <w:top w:val="none" w:color="FFFFFF" w:sz="0"/>
               <w:left w:val="none" w:color="FFFFFF" w:sz="0"/>
-              <w:bottom w:val="none" w:color="FFFFFF" w:sz="0"/>
-              <w:right w:val="none" w:color="FFFFFF" w:sz="0"/>
-            </w:tcBorders>
-            <w:tcMar>
-              <w:top w:type="dxa" w:w="40"/>
-              <w:left w:type="dxa" w:w="80"/>
-              <w:bottom w:type="dxa" w:w="40"/>
-              <w:right w:type="dxa" w:w="80"/>
-            </w:tcMar>
-          </w:tcPr>
-          <w:p>
-            <w:pPr>
-              <w:spacing w:line="240"/>
-            </w:pPr>
-            <w:r>
-              <w:rPr>
-                <w:sz w:val="21"/>
-                <w:szCs w:val="21"/>
-              </w:rPr>
-              <w:t xml:space="preserve">4 de 4; traducción a 203.0.113.1</w:t>
+              <w:bottom w:val="single" w:color="000000" w:sz="6"/>
+              <w:right w:val="none" w:color="FFFFFF" w:sz="0"/>
+            </w:tcBorders>
+            <w:tcMar>
+              <w:top w:type="dxa" w:w="40"/>
+              <w:left w:type="dxa" w:w="80"/>
+              <w:bottom w:type="dxa" w:w="40"/>
+              <w:right w:type="dxa" w:w="80"/>
+            </w:tcMar>
+          </w:tcPr>
+          <w:p>
+            <w:pPr>
+              <w:spacing w:line="240"/>
+            </w:pPr>
+            <w:r>
+              <w:rPr>
+                <w:sz w:val="21"/>
+                <w:szCs w:val="21"/>
+              </w:rPr>
+              <w:t xml:space="preserve">12 asignaciones</w:t>
             </w:r>
           </w:p>
         </w:tc>
@@ -13493,40 +12287,6 @@
             <w:tcBorders>
               <w:top w:val="none" w:color="FFFFFF" w:sz="0"/>
               <w:left w:val="none" w:color="FFFFFF" w:sz="0"/>
-              <w:bottom w:val="none" w:color="FFFFFF" w:sz="0"/>
-              <w:right w:val="none" w:color="FFFFFF" w:sz="0"/>
-            </w:tcBorders>
-            <w:tcMar>
-              <w:top w:type="dxa" w:w="40"/>
-              <w:left w:type="dxa" w:w="80"/>
-              <w:bottom w:type="dxa" w:w="40"/>
-              <w:right w:type="dxa" w:w="80"/>
-            </w:tcMar>
-          </w:tcPr>
-          <w:p>
-            <w:pPr>
-              <w:spacing w:line="240"/>
-            </w:pPr>
-            <w:r>
-              <w:rPr>
-                <w:sz w:val="21"/>
-                <w:szCs w:val="21"/>
-              </w:rPr>
-              <w:t xml:space="preserve">13, 14</w:t>
-            </w:r>
-          </w:p>
-        </w:tc>
-      </w:tr>
-      <w:tr>
-        <w:trPr>
-          <w:cantSplit/>
-        </w:trPr>
-        <w:tc>
-          <w:tcPr>
-            <w:tcW w:type="dxa" w:w="500"/>
-            <w:tcBorders>
-              <w:top w:val="none" w:color="FFFFFF" w:sz="0"/>
-              <w:left w:val="none" w:color="FFFFFF" w:sz="0"/>
               <w:bottom w:val="single" w:color="000000" w:sz="6"/>
               <w:right w:val="none" w:color="FFFFFF" w:sz="0"/>
             </w:tcBorders>
@@ -13546,123 +12306,7 @@
                 <w:sz w:val="21"/>
                 <w:szCs w:val="21"/>
               </w:rPr>
-              <w:t xml:space="preserve">9</w:t>
-            </w:r>
-          </w:p>
-        </w:tc>
-        <w:tc>
-          <w:tcPr>
-            <w:tcW w:type="dxa" w:w="3300"/>
-            <w:tcBorders>
-              <w:top w:val="none" w:color="FFFFFF" w:sz="0"/>
-              <w:left w:val="none" w:color="FFFFFF" w:sz="0"/>
-              <w:bottom w:val="single" w:color="000000" w:sz="6"/>
-              <w:right w:val="none" w:color="FFFFFF" w:sz="0"/>
-            </w:tcBorders>
-            <w:tcMar>
-              <w:top w:type="dxa" w:w="40"/>
-              <w:left w:type="dxa" w:w="80"/>
-              <w:bottom w:type="dxa" w:w="40"/>
-              <w:right w:type="dxa" w:w="80"/>
-            </w:tcMar>
-          </w:tcPr>
-          <w:p>
-            <w:pPr>
-              <w:spacing w:line="240"/>
-            </w:pPr>
-            <w:r>
-              <w:rPr>
-                <w:sz w:val="21"/>
-                <w:szCs w:val="21"/>
-              </w:rPr>
-              <w:t xml:space="preserve">R-CRG entregó las direcciones por DHCP</w:t>
-            </w:r>
-          </w:p>
-        </w:tc>
-        <w:tc>
-          <w:tcPr>
-            <w:tcW w:type="dxa" w:w="2500"/>
-            <w:tcBorders>
-              <w:top w:val="none" w:color="FFFFFF" w:sz="0"/>
-              <w:left w:val="none" w:color="FFFFFF" w:sz="0"/>
-              <w:bottom w:val="single" w:color="000000" w:sz="6"/>
-              <w:right w:val="none" w:color="FFFFFF" w:sz="0"/>
-            </w:tcBorders>
-            <w:tcMar>
-              <w:top w:type="dxa" w:w="40"/>
-              <w:left w:type="dxa" w:w="80"/>
-              <w:bottom w:type="dxa" w:w="40"/>
-              <w:right w:type="dxa" w:w="80"/>
-            </w:tcMar>
-          </w:tcPr>
-          <w:p>
-            <w:pPr>
-              <w:spacing w:line="240"/>
-            </w:pPr>
-            <w:r>
-              <w:rPr>
-                <w:sz w:val="21"/>
-                <w:szCs w:val="21"/>
-              </w:rPr>
-              <w:t xml:space="preserve">12 asignaciones en show ip dhcp binding</w:t>
-            </w:r>
-          </w:p>
-        </w:tc>
-        <w:tc>
-          <w:tcPr>
-            <w:tcW w:type="dxa" w:w="2060"/>
-            <w:tcBorders>
-              <w:top w:val="none" w:color="FFFFFF" w:sz="0"/>
-              <w:left w:val="none" w:color="FFFFFF" w:sz="0"/>
-              <w:bottom w:val="single" w:color="000000" w:sz="6"/>
-              <w:right w:val="none" w:color="FFFFFF" w:sz="0"/>
-            </w:tcBorders>
-            <w:tcMar>
-              <w:top w:type="dxa" w:w="40"/>
-              <w:left w:type="dxa" w:w="80"/>
-              <w:bottom w:type="dxa" w:w="40"/>
-              <w:right w:type="dxa" w:w="80"/>
-            </w:tcMar>
-          </w:tcPr>
-          <w:p>
-            <w:pPr>
-              <w:spacing w:line="240"/>
-            </w:pPr>
-            <w:r>
-              <w:rPr>
-                <w:sz w:val="21"/>
-                <w:szCs w:val="21"/>
-              </w:rPr>
-              <w:t xml:space="preserve">12 asignaciones</w:t>
-            </w:r>
-          </w:p>
-        </w:tc>
-        <w:tc>
-          <w:tcPr>
-            <w:tcW w:type="dxa" w:w="1000"/>
-            <w:tcBorders>
-              <w:top w:val="none" w:color="FFFFFF" w:sz="0"/>
-              <w:left w:val="none" w:color="FFFFFF" w:sz="0"/>
-              <w:bottom w:val="single" w:color="000000" w:sz="6"/>
-              <w:right w:val="none" w:color="FFFFFF" w:sz="0"/>
-            </w:tcBorders>
-            <w:tcMar>
-              <w:top w:type="dxa" w:w="40"/>
-              <w:left w:type="dxa" w:w="80"/>
-              <w:bottom w:type="dxa" w:w="40"/>
-              <w:right w:type="dxa" w:w="80"/>
-            </w:tcMar>
-          </w:tcPr>
-          <w:p>
-            <w:pPr>
-              <w:spacing w:line="240"/>
-            </w:pPr>
-            <w:r>
-              <w:rPr>
-                <w:sz w:val="21"/>
-                <w:szCs w:val="21"/>
-              </w:rPr>
-              <w:t xml:space="preserve">8</w:t>
+              <w:t xml:space="preserve">7</w:t>
             </w:r>
           </w:p>
         </w:tc>
@@ -13680,7 +12324,7 @@
         <w:t xml:space="preserve">Nota.</w:t>
       </w:r>
       <w:r>
-        <w:t xml:space="preserve"> Las nueve pruebas dieron el resultado esperado.</w:t>
+        <w:t xml:space="preserve"> Las ocho pruebas dieron el resultado esperado.</w:t>
       </w:r>
     </w:p>
     <w:p>
@@ -13692,7 +12336,7 @@
           <w:b/>
           <w:bCs/>
         </w:rPr>
-        <w:t xml:space="preserve">Figura 9</w:t>
+        <w:t xml:space="preserve">Figura 8</w:t>
       </w:r>
     </w:p>
     <w:p>
@@ -13767,7 +12411,7 @@
           <w:b/>
           <w:bCs/>
         </w:rPr>
-        <w:t xml:space="preserve">Figura 10</w:t>
+        <w:t xml:space="preserve">Figura 9</w:t>
       </w:r>
     </w:p>
     <w:p>
@@ -13842,7 +12486,7 @@
           <w:b/>
           <w:bCs/>
         </w:rPr>
-        <w:t xml:space="preserve">Figura 11</w:t>
+        <w:t xml:space="preserve">Figura 10</w:t>
       </w:r>
     </w:p>
     <w:p>
@@ -13917,7 +12561,7 @@
           <w:b/>
           <w:bCs/>
         </w:rPr>
-        <w:t xml:space="preserve">Figura 12</w:t>
+        <w:t xml:space="preserve">Figura 11</w:t>
       </w:r>
     </w:p>
     <w:p>
@@ -13985,166 +12629,6 @@
     </w:p>
     <w:p>
       <w:pPr>
-        <w:keepNext/>
-      </w:pPr>
-      <w:r>
-        <w:rPr>
-          <w:b/>
-          <w:bCs/>
-        </w:rPr>
-        <w:t xml:space="preserve">Figura 13</w:t>
-      </w:r>
-    </w:p>
-    <w:p>
-      <w:pPr>
-        <w:keepNext/>
-      </w:pPr>
-      <w:r>
-        <w:rPr>
-          <w:i/>
-          <w:iCs/>
-        </w:rPr>
-        <w:t xml:space="preserve">Ping de PC-VEN1 al servidor externo WEB-EXT</w:t>
-      </w:r>
-    </w:p>
-    <w:p>
-      <w:pPr>
-        <w:keepNext/>
-        <w:spacing w:after="0" w:line="240"/>
-      </w:pPr>
-      <w:r>
-        <w:drawing>
-          <wp:inline distT="0" distB="0" distL="0" distR="0">
-            <wp:extent cx="4000000" cy="2040000"/>
-            <wp:effectExtent t="0" r="0" b="0" l="0"/>
-            <wp:docPr id="1013" name=""/>
-            <wp:cNvGraphicFramePr>
-              <a:graphicFrameLocks xmlns:a="http://schemas.openxmlformats.org/drawingml/2006/main" noChangeAspect="1"/>
-            </wp:cNvGraphicFramePr>
-            <a:graphic xmlns:a="http://schemas.openxmlformats.org/drawingml/2006/main">
-              <a:graphicData uri="http://schemas.openxmlformats.org/drawingml/2006/picture">
-                <pic:pic xmlns:pic="http://schemas.openxmlformats.org/drawingml/2006/picture">
-                  <pic:nvPicPr>
-                    <pic:cNvPr id="0" name="" descr=""/>
-                    <pic:cNvPicPr>
-                      <a:picLocks noChangeAspect="1" noChangeArrowheads="1"/>
-                    </pic:cNvPicPr>
-                  </pic:nvPicPr>
-                  <pic:blipFill>
-                    <a:blip r:embed="rIdFig13" cstate="none"/>
-                    <a:srcRect/>
-                    <a:stretch>
-                      <a:fillRect/>
-                    </a:stretch>
-                  </pic:blipFill>
-                  <pic:spPr bwMode="auto">
-                    <a:xfrm>
-                      <a:off x="0" y="0"/>
-                      <a:ext cx="4000000" cy="2040000"/>
-                    </a:xfrm>
-                    <a:prstGeom prst="rect">
-                      <a:avLst/>
-                    </a:prstGeom>
-                  </pic:spPr>
-                </pic:pic>
-              </a:graphicData>
-            </a:graphic>
-          </wp:inline>
-        </w:drawing>
-      </w:r>
-    </w:p>
-    <w:p>
-      <w:pPr>
-        <w:spacing w:after="240"/>
-      </w:pPr>
-    </w:p>
-    <w:p>
-      <w:pPr>
-        <w:keepNext/>
-      </w:pPr>
-      <w:r>
-        <w:rPr>
-          <w:b/>
-          <w:bCs/>
-        </w:rPr>
-        <w:t xml:space="preserve">Figura 14</w:t>
-      </w:r>
-    </w:p>
-    <w:p>
-      <w:pPr>
-        <w:keepNext/>
-      </w:pPr>
-      <w:r>
-        <w:rPr>
-          <w:i/>
-          <w:iCs/>
-        </w:rPr>
-        <w:t xml:space="preserve">Tabla de traducciones NAT en R-CRG</w:t>
-      </w:r>
-    </w:p>
-    <w:p>
-      <w:pPr>
-        <w:keepNext/>
-        <w:spacing w:after="0" w:line="240"/>
-      </w:pPr>
-      <w:r>
-        <w:drawing>
-          <wp:inline distT="0" distB="0" distL="0" distR="0">
-            <wp:extent cx="5280000" cy="1040000"/>
-            <wp:effectExtent t="0" r="0" b="0" l="0"/>
-            <wp:docPr id="1014" name=""/>
-            <wp:cNvGraphicFramePr>
-              <a:graphicFrameLocks xmlns:a="http://schemas.openxmlformats.org/drawingml/2006/main" noChangeAspect="1"/>
-            </wp:cNvGraphicFramePr>
-            <a:graphic xmlns:a="http://schemas.openxmlformats.org/drawingml/2006/main">
-              <a:graphicData uri="http://schemas.openxmlformats.org/drawingml/2006/picture">
-                <pic:pic xmlns:pic="http://schemas.openxmlformats.org/drawingml/2006/picture">
-                  <pic:nvPicPr>
-                    <pic:cNvPr id="0" name="" descr=""/>
-                    <pic:cNvPicPr>
-                      <a:picLocks noChangeAspect="1" noChangeArrowheads="1"/>
-                    </pic:cNvPicPr>
-                  </pic:nvPicPr>
-                  <pic:blipFill>
-                    <a:blip r:embed="rIdFig14" cstate="none"/>
-                    <a:srcRect/>
-                    <a:stretch>
-                      <a:fillRect/>
-                    </a:stretch>
-                  </pic:blipFill>
-                  <pic:spPr bwMode="auto">
-                    <a:xfrm>
-                      <a:off x="0" y="0"/>
-                      <a:ext cx="5280000" cy="1040000"/>
-                    </a:xfrm>
-                    <a:prstGeom prst="rect">
-                      <a:avLst/>
-                    </a:prstGeom>
-                  </pic:spPr>
-                </pic:pic>
-              </a:graphicData>
-            </a:graphic>
-          </wp:inline>
-        </w:drawing>
-      </w:r>
-    </w:p>
-    <w:p>
-      <w:pPr>
-        <w:spacing w:after="360"/>
-      </w:pPr>
-      <w:r>
-        <w:rPr>
-          <w:i/>
-          <w:iCs/>
-        </w:rPr>
-        <w:t xml:space="preserve">Nota.</w:t>
-      </w:r>
-      <w:r>
-        <w:t xml:space="preserve"> La dirección privada 10.20.0.6 (PC-VEN1) sale hacia afuera como 203.0.113.1.</w:t>
-      </w:r>
-    </w:p>
-    <w:p>
-      <w:pPr>
         <w:pStyle w:val="Heading1"/>
       </w:pPr>
       <w:bookmarkStart w:name="_Toc24" w:id="24"/>
@@ -14405,7 +12889,7 @@
                 <w:sz w:val="21"/>
                 <w:szCs w:val="21"/>
               </w:rPr>
-              <w:t xml:space="preserve">El enlace serial con el ISP queda en rojo</w:t>
+              <w:t xml:space="preserve">Un enlace entre routers queda en rojo</w:t>
             </w:r>
           </w:p>
         </w:tc>
@@ -14434,7 +12918,7 @@
                 <w:sz w:val="21"/>
                 <w:szCs w:val="21"/>
               </w:rPr>
-              <w:t xml:space="preserve">Falta no shutdown o falta clock rate en el lado DCE (R-CRG)</w:t>
+              <w:t xml:space="preserve">Falta no shutdown en alguno de los dos lados o el cable es del tipo equivocado</w:t>
             </w:r>
           </w:p>
         </w:tc>
@@ -14463,7 +12947,7 @@
                 <w:sz w:val="21"/>
                 <w:szCs w:val="21"/>
               </w:rPr>
-              <w:t xml:space="preserve">Revisa con show ip interface brief y show running-config | section Serial.</w:t>
+              <w:t xml:space="preserve">Revisa con show ip interface brief y usa cable Cross-Over entre routers.</w:t>
             </w:r>
           </w:p>
         </w:tc>
@@ -14555,7 +13039,7 @@
                 <w:sz w:val="21"/>
                 <w:szCs w:val="21"/>
               </w:rPr>
-              <w:t xml:space="preserve">Revisa show running-config | section helper y el Paso 7.</w:t>
+              <w:t xml:space="preserve">Revisa show running-config | section helper y el Paso 6.</w:t>
             </w:r>
           </w:p>
         </w:tc>
@@ -14647,7 +13131,7 @@
                 <w:sz w:val="21"/>
                 <w:szCs w:val="21"/>
               </w:rPr>
-              <w:t xml:space="preserve">Revisa show ip route y el Paso 8.</w:t>
+              <w:t xml:space="preserve">Revisa show ip route y el Paso 7.</w:t>
             </w:r>
           </w:p>
         </w:tc>
@@ -14842,11 +13326,11 @@
       <w:pPr>
         <w:pStyle w:val="Heading1"/>
       </w:pPr>
-      <w:bookmarkStart w:name="_Toc222" w:id="222"/>
+      <w:bookmarkStart w:name="_Toc219" w:id="219"/>
       <w:r>
         <w:t xml:space="preserve">Dimensionamiento de equipos para una implementación real</w:t>
       </w:r>
-      <w:bookmarkEnd w:id="222"/>
+      <w:bookmarkEnd w:id="219"/>
     </w:p>
     <w:p>
       <w:pPr>
@@ -15166,7 +13650,7 @@
                 <w:sz w:val="21"/>
                 <w:szCs w:val="21"/>
               </w:rPr>
-              <w:t xml:space="preserve">R-CRG y tres routers de piso; R-CRG también hace NAT y DHCP.</w:t>
+              <w:t xml:space="preserve">R-CRG y tres routers de piso; R-CRG también hace de servidor DHCP.</w:t>
             </w:r>
           </w:p>
         </w:tc>
@@ -15641,7 +14125,7 @@
             <w:tcBorders>
               <w:top w:val="none" w:color="FFFFFF" w:sz="0"/>
               <w:left w:val="none" w:color="FFFFFF" w:sz="0"/>
-              <w:bottom w:val="none" w:color="FFFFFF" w:sz="0"/>
+              <w:bottom w:val="single" w:color="000000" w:sz="6"/>
               <w:right w:val="none" w:color="FFFFFF" w:sz="0"/>
             </w:tcBorders>
             <w:tcMar>
@@ -15670,7 +14154,7 @@
             <w:tcBorders>
               <w:top w:val="none" w:color="FFFFFF" w:sz="0"/>
               <w:left w:val="none" w:color="FFFFFF" w:sz="0"/>
-              <w:bottom w:val="none" w:color="FFFFFF" w:sz="0"/>
+              <w:bottom w:val="single" w:color="000000" w:sz="6"/>
               <w:right w:val="none" w:color="FFFFFF" w:sz="0"/>
             </w:tcBorders>
             <w:tcMar>
@@ -15699,7 +14183,7 @@
             <w:tcBorders>
               <w:top w:val="none" w:color="FFFFFF" w:sz="0"/>
               <w:left w:val="none" w:color="FFFFFF" w:sz="0"/>
-              <w:bottom w:val="none" w:color="FFFFFF" w:sz="0"/>
+              <w:bottom w:val="single" w:color="000000" w:sz="6"/>
               <w:right w:val="none" w:color="FFFFFF" w:sz="0"/>
             </w:tcBorders>
             <w:tcMar>
@@ -15719,98 +14203,6 @@
                 <w:szCs w:val="21"/>
               </w:rPr>
               <w:t xml:space="preserve">Respaldo eléctrico de los equipos de red.</w:t>
-            </w:r>
-          </w:p>
-        </w:tc>
-      </w:tr>
-      <w:tr>
-        <w:trPr>
-          <w:cantSplit/>
-        </w:trPr>
-        <w:tc>
-          <w:tcPr>
-            <w:tcW w:type="dxa" w:w="3200"/>
-            <w:tcBorders>
-              <w:top w:val="none" w:color="FFFFFF" w:sz="0"/>
-              <w:left w:val="none" w:color="FFFFFF" w:sz="0"/>
-              <w:bottom w:val="single" w:color="000000" w:sz="6"/>
-              <w:right w:val="none" w:color="FFFFFF" w:sz="0"/>
-            </w:tcBorders>
-            <w:tcMar>
-              <w:top w:type="dxa" w:w="40"/>
-              <w:left w:type="dxa" w:w="80"/>
-              <w:bottom w:type="dxa" w:w="40"/>
-              <w:right w:type="dxa" w:w="80"/>
-            </w:tcMar>
-          </w:tcPr>
-          <w:p>
-            <w:pPr>
-              <w:spacing w:line="240"/>
-            </w:pPr>
-            <w:r>
-              <w:rPr>
-                <w:sz w:val="21"/>
-                <w:szCs w:val="21"/>
-              </w:rPr>
-              <w:t xml:space="preserve">Enlace de Internet contratado</w:t>
-            </w:r>
-          </w:p>
-        </w:tc>
-        <w:tc>
-          <w:tcPr>
-            <w:tcW w:type="dxa" w:w="1200"/>
-            <w:tcBorders>
-              <w:top w:val="none" w:color="FFFFFF" w:sz="0"/>
-              <w:left w:val="none" w:color="FFFFFF" w:sz="0"/>
-              <w:bottom w:val="single" w:color="000000" w:sz="6"/>
-              <w:right w:val="none" w:color="FFFFFF" w:sz="0"/>
-            </w:tcBorders>
-            <w:tcMar>
-              <w:top w:type="dxa" w:w="40"/>
-              <w:left w:type="dxa" w:w="80"/>
-              <w:bottom w:type="dxa" w:w="40"/>
-              <w:right w:type="dxa" w:w="80"/>
-            </w:tcMar>
-          </w:tcPr>
-          <w:p>
-            <w:pPr>
-              <w:spacing w:line="240"/>
-            </w:pPr>
-            <w:r>
-              <w:rPr>
-                <w:sz w:val="21"/>
-                <w:szCs w:val="21"/>
-              </w:rPr>
-              <w:t xml:space="preserve">1</w:t>
-            </w:r>
-          </w:p>
-        </w:tc>
-        <w:tc>
-          <w:tcPr>
-            <w:tcW w:type="dxa" w:w="4960"/>
-            <w:tcBorders>
-              <w:top w:val="none" w:color="FFFFFF" w:sz="0"/>
-              <w:left w:val="none" w:color="FFFFFF" w:sz="0"/>
-              <w:bottom w:val="single" w:color="000000" w:sz="6"/>
-              <w:right w:val="none" w:color="FFFFFF" w:sz="0"/>
-            </w:tcBorders>
-            <w:tcMar>
-              <w:top w:type="dxa" w:w="40"/>
-              <w:left w:type="dxa" w:w="80"/>
-              <w:bottom w:type="dxa" w:w="40"/>
-              <w:right w:type="dxa" w:w="80"/>
-            </w:tcMar>
-          </w:tcPr>
-          <w:p>
-            <w:pPr>
-              <w:spacing w:line="240"/>
-            </w:pPr>
-            <w:r>
-              <w:rPr>
-                <w:sz w:val="21"/>
-                <w:szCs w:val="21"/>
-              </w:rPr>
-              <w:t xml:space="preserve">Reemplaza al cable serial hacia el ISP de la simulación.</w:t>
             </w:r>
           </w:p>
         </w:tc>
@@ -15828,7 +14220,7 @@
         <w:t xml:space="preserve">Nota.</w:t>
       </w:r>
       <w:r>
-        <w:t xml:space="preserve"> Los precios dependen del proveedor, de la ciudad y de la fecha, por lo que deben obtenerse mediante cotizaciones formales antes de la compra. En una red real el enlace de Internet suele ser Ethernet o fibra óptica provistos por el operador, no un cable serial.</w:t>
+        <w:t xml:space="preserve"> Los precios dependen del proveedor, de la ciudad y de la fecha, por lo que deben obtenerse mediante cotizaciones formales antes de la compra.</w:t>
       </w:r>
     </w:p>
     <w:p>
@@ -15846,7 +14238,7 @@
         <w:ind w:firstLine="720"/>
       </w:pPr>
       <w:r>
-        <w:t xml:space="preserve">Se diseñó la red de Crestline Group para 300 computadoras en seis áreas: diez subredes calculadas con VLSM (seis de área y cuatro enlaces punto a punto), un router central con tres routers de piso unidos por rutas estáticas, DHCP centralizado con reenvío desde los routers de piso y NAT hacia una red externa simulada. Las nueve pruebas de la matriz de aceptación dieron el resultado esperado y quedaron registradas con capturas.</w:t>
+        <w:t xml:space="preserve">Se diseñó la red de Crestline Group para 300 computadoras en seis áreas: diez subredes calculadas con VLSM (seis de área, tres enlaces punto a punto y una de reserva), un router central con tres routers de piso unidos por rutas estáticas, DHCP centralizado con reenvío desde los routers de piso. Las ocho pruebas de la matriz de aceptación dieron el resultado esperado y quedaron registradas con capturas.</w:t>
       </w:r>
     </w:p>
     <w:p>
@@ -15854,18 +14246,18 @@
         <w:ind w:firstLine="720"/>
       </w:pPr>
       <w:r>
-        <w:t xml:space="preserve">En relación con los objetivos, el análisis del contexto definió los requisitos de la red; el plan VLSM de la Tabla 4 cubre la demanda de 300 equipos y deja libres 20 direcciones al final del bloque; y la Tabla 12 estima los equipos para una instalación real. El modelo de un router central y routers de piso limita el tamaño de cada dominio de difusión, el DHCP evita las direcciones duplicadas y las rutas estáticas mantienen el enrutamiento simple, porque todos los routers de piso dependen del router central. Como limitación, el simulador usa dos PC por área en lugar de 300 equipos y no mide rendimiento real; para una instalación real haría falta un estudio del sitio, cotizaciones formales y pruebas de carga.</w:t>
+        <w:t xml:space="preserve">En relación con los objetivos, el análisis del contexto definió los requisitos de la red; el plan VLSM de la Tabla 4 cubre la demanda de 300 equipos y reserva la subred 10.20.1.240/28 para crecer; y la Tabla 12 estima los equipos para una instalación real. El modelo de un router central y routers de piso limita el tamaño de cada dominio de difusión, el DHCP evita las direcciones duplicadas y las rutas estáticas mantienen el enrutamiento simple, porque todos los routers de piso dependen del router central. Como limitación, el simulador usa dos PC por área en lugar de 300 equipos y no mide rendimiento real; para una instalación real haría falta un estudio del sitio, cotizaciones formales y pruebas de carga.</w:t>
       </w:r>
     </w:p>
     <w:p>
       <w:pPr>
         <w:pStyle w:val="Heading1"/>
       </w:pPr>
-      <w:bookmarkStart w:name="_Toc223" w:id="223"/>
+      <w:bookmarkStart w:name="_Toc220" w:id="220"/>
       <w:r>
         <w:t xml:space="preserve">Recomendaciones</w:t>
       </w:r>
-      <w:bookmarkEnd w:id="223"/>
+      <w:bookmarkEnd w:id="220"/>
     </w:p>
     <w:p>
       <w:pPr>
@@ -15879,7 +14271,7 @@
         <w:t xml:space="preserve">Dejar margen en los rangos DHCP.</w:t>
       </w:r>
       <w:r>
-        <w:t xml:space="preserve"> Las subredes se calcularon justas: el pool de Soporte TI entrega 25 direcciones para 25 computadoras (Anexo A). Si esa área crece, conviene darle una subred mayor tomada de un bloque nuevo, por ejemplo 10.20.2.0/24, porque el espacio libre del bloque actual es de solo 20 direcciones.</w:t>
+        <w:t xml:space="preserve"> Las subredes se calcularon justas: el pool de Soporte TI entrega 25 direcciones para 25 computadoras (Anexo A). Si esa área crece, conviene darle una subred mayor tomada de un bloque nuevo, por ejemplo 10.20.2.0/24, porque el espacio libre del bloque actual es mínimo.</w:t>
       </w:r>
     </w:p>
     <w:p>
@@ -16029,24 +14421,6 @@
         <w:ind w:left="720" w:hanging="720"/>
       </w:pPr>
       <w:r>
-        <w:t xml:space="preserve">Arkko, J., Cotton, M., &amp; Vegoda, L. (2010). </w:t>
-      </w:r>
-      <w:r>
-        <w:rPr>
-          <w:i/>
-          <w:iCs/>
-        </w:rPr>
-        <w:t xml:space="preserve">IPv4 address blocks reserved for documentation</w:t>
-      </w:r>
-      <w:r>
-        <w:t xml:space="preserve"> (RFC 5737). RFC Editor. https://www.rfc-editor.org/rfc/rfc5737.html</w:t>
-      </w:r>
-    </w:p>
-    <w:p>
-      <w:pPr>
-        <w:ind w:left="720" w:hanging="720"/>
-      </w:pPr>
-      <w:r>
         <w:t xml:space="preserve">Cisco. (2024, 27 de agosto). </w:t>
       </w:r>
       <w:r>
@@ -16205,24 +14579,6 @@
       </w:r>
     </w:p>
     <w:p>
-      <w:pPr>
-        <w:ind w:left="720" w:hanging="720"/>
-      </w:pPr>
-      <w:r>
-        <w:t xml:space="preserve">Srisuresh, P., &amp; Egevang, K. (2001). </w:t>
-      </w:r>
-      <w:r>
-        <w:rPr>
-          <w:i/>
-          <w:iCs/>
-        </w:rPr>
-        <w:t xml:space="preserve">Traditional IP network address translator (Traditional NAT)</w:t>
-      </w:r>
-      <w:r>
-        <w:t xml:space="preserve"> (RFC 3022). RFC Editor. https://www.rfc-editor.org/rfc/rfc3022.html</w:t>
-      </w:r>
-    </w:p>
-    <w:p>
       <w:r>
         <w:br w:type="page"/>
       </w:r>
@@ -16231,11 +14587,11 @@
       <w:pPr>
         <w:pStyle w:val="Heading1"/>
       </w:pPr>
-      <w:bookmarkStart w:name="_Toc224" w:id="224"/>
+      <w:bookmarkStart w:name="_Toc221" w:id="221"/>
       <w:r>
         <w:t xml:space="preserve">Anexo A</w:t>
       </w:r>
-      <w:bookmarkEnd w:id="224"/>
+      <w:bookmarkEnd w:id="221"/>
     </w:p>
     <w:p>
       <w:pPr>
@@ -18739,7 +17095,7 @@
                 <w:sz w:val="21"/>
                 <w:szCs w:val="21"/>
               </w:rPr>
-              <w:t xml:space="preserve">Enlace R-CRG – ISP</w:t>
+              <w:t xml:space="preserve">Reserva (crecimiento)</w:t>
             </w:r>
           </w:p>
         </w:tc>
@@ -18768,7 +17124,7 @@
                 <w:sz w:val="21"/>
                 <w:szCs w:val="21"/>
               </w:rPr>
-              <w:t xml:space="preserve">2</w:t>
+              <w:t xml:space="preserve">—</w:t>
             </w:r>
           </w:p>
         </w:tc>
@@ -18797,7 +17153,7 @@
                 <w:sz w:val="21"/>
                 <w:szCs w:val="21"/>
               </w:rPr>
-              <w:t xml:space="preserve">/30</w:t>
+              <w:t xml:space="preserve">/28</w:t>
             </w:r>
           </w:p>
         </w:tc>
@@ -18826,7 +17182,7 @@
                 <w:sz w:val="21"/>
                 <w:szCs w:val="21"/>
               </w:rPr>
-              <w:t xml:space="preserve">203.0.113.1 – .2</w:t>
+              <w:t xml:space="preserve">10.20.1.241 – .254</w:t>
             </w:r>
           </w:p>
         </w:tc>
@@ -18855,7 +17211,7 @@
                 <w:sz w:val="21"/>
                 <w:szCs w:val="21"/>
               </w:rPr>
-              <w:t xml:space="preserve">203.0.113.3</w:t>
+              <w:t xml:space="preserve">10.20.1.255</w:t>
             </w:r>
           </w:p>
         </w:tc>
@@ -18884,7 +17240,7 @@
                 <w:sz w:val="21"/>
                 <w:szCs w:val="21"/>
               </w:rPr>
-              <w:t xml:space="preserve">2</w:t>
+              <w:t xml:space="preserve">14</w:t>
             </w:r>
           </w:p>
         </w:tc>
@@ -18929,7 +17285,7 @@
         <w:t xml:space="preserve">Nota.</w:t>
       </w:r>
       <w:r>
-        <w:t xml:space="preserve"> Del bloque 10.20.0.0/23 (512 direcciones) se ocupan 492 (480 en las seis áreas y 12 en los tres enlaces) y quedan libres 20 (10.20.1.236 – 10.20.1.255). El enlace con el ISP usa el bloque público 203.0.113.0/30, fuera del 10.20.0.0/23. En las seis áreas el pool DHCP cubre la demanda; en Soporte TI la cubre sin margen.</w:t>
+        <w:t xml:space="preserve"> Del bloque 10.20.0.0/23 (512 direcciones) se ocupan 508 (480 en las seis áreas, 12 en los tres enlaces y 16 en la subred de reserva) y quedan libres 4 (10.20.1.236 – 10.20.1.239). En las seis áreas el pool DHCP cubre la demanda; en Soporte TI la cubre sin margen.</w:t>
       </w:r>
     </w:p>
     <w:sectPr>

</xml_diff>